<commit_message>
docs: update group B recheck report after chunking fixes
</commit_message>
<xml_diff>
--- a/docs/sprint6_issue_recheck_after_merge.docx
+++ b/docs/sprint6_issue_recheck_after_merge.docx
@@ -25,7 +25,7 @@
         <w:rPr>
           <w:sz w:val="19"/>
         </w:rPr>
-        <w:t>Người lập: Dev 5 (Reranker &amp; Packaging Lead)   ·   Ngày: 22/10/2026   ·   Phạm vi: nhánh testing, commit 75dd586 (gộp CTM 5b62b35 và NMA f8e8311); nhóm A kiểm lại trên e9ee31d, e64c49a và 72a7377; nhóm C kiểm lại trên bafe1e8</w:t>
+        <w:t>Người lập: Dev 5 (Reranker &amp; Packaging Lead)   ·   Ngày: 22/10/2026   ·   Phạm vi: nhánh testing, commit 75dd586 (gộp CTM 5b62b35 và NMA f8e8311); nhóm A kiểm lại trên e9ee31d, e64c49a và 72a7377; nhóm C kiểm lại trên bafe1e8; nhóm B kiểm lại và sửa trên nhánh chunking_test (1c40712)</w:t>
       </w:r>
     </w:p>
     <w:p>
@@ -34,7 +34,7 @@
         <w:rPr>
           <w:sz w:val="19"/>
         </w:rPr>
-        <w:t>Cập nhật 23/10/2026: kiểm lại sau khi gộp origin/CTM ee755a5 vào testing (commit e64c49a). Mục 3 chỉ ghi phần còn lỗi tính tới e64c49a, gồm cả 7 lỗi mới. Cùng ngày, nhóm A được kiểm lại toàn bộ trên e64c49a (Phụ lục C); A24 và Phụ lục B (kết quả kiểm nhóm A trên e9ee31d ngày 22/10) bị mất trong lần cập nhật trước nên được ghi lại. Cũng ngày 23/10, nhóm C được kiểm lại toàn bộ trên bafe1e8, gồm phân tích lại C6 (Phụ lục D). Ngày 24/10/2026, sau khi kéo nhánh NMA mới nhất (testing fast-forward lên 72a7377), nhóm A được kiểm lại toàn bộ (Phụ lục E): A13, A23, A24 đã sửa và được bỏ khỏi bảng; thêm 2 lỗi mới A25, A26.</w:t>
+        <w:t>Cập nhật 23/10/2026: kiểm lại sau khi gộp origin/CTM ee755a5 vào testing (commit e64c49a). Mục 3 chỉ ghi phần còn lỗi tính tới e64c49a, gồm cả 7 lỗi mới. Cùng ngày, nhóm A được kiểm lại toàn bộ trên e64c49a (Phụ lục C); A24 và Phụ lục B (kết quả kiểm nhóm A trên e9ee31d ngày 22/10) bị mất trong lần cập nhật trước nên được ghi lại. Cũng ngày 23/10, nhóm C được kiểm lại toàn bộ trên bafe1e8, gồm phân tích lại C6 (Phụ lục D). Ngày 24/10/2026, sau khi kéo nhánh NMA mới nhất (testing fast-forward lên 72a7377), nhóm A được kiểm lại toàn bộ (Phụ lục E): A13, A23, A24 đã sửa và được bỏ khỏi bảng; thêm 2 lỗi mới A25, A26. Cũng ngày 24/10, nhóm B được kiểm lại và sửa trên nhánh chunking_test (Phụ lục F): B9, B12 đã sửa và được bỏ khỏi bảng; B1, B10, B13 đã sửa trong code nhưng còn trong bảng cho tới khi corpus trong repo được sinh lại; thêm 3 lỗi mới B14, B15, B16, đều đã sửa.</w:t>
       </w:r>
     </w:p>
     <w:p>
@@ -50,7 +50,7 @@
         <w:spacing w:after="80"/>
       </w:pPr>
       <w:r>
-        <w:t>Trong 67 lỗi của register v2, tính tới commit e64c49a (nhóm A tính tới 72a7377, nhóm C tính tới bafe1e8): 20 đã sửa, 1 đóng, 14 còn một phần, 3 đổi tính chất, 3 nặng hơn, 26 còn nguyên. Phát hiện thêm 14 lỗi mới: A22, A23, A24, B11, B12 (22/10; A22, A23, A24 và B11 nay đã sửa), B13, C6, C7, C8, C9, D5, H9 (23/10, sau khi gộp CTM; C7 nay sửa một phần ở af8ee9a) và A25, A26 (24/10, sau khi kéo NMA 72a7377). Trong 15 lỗi mức Cao, 6 đã sửa (A1, A12, A13, A14, E15, C1), 9 còn mở. Nhóm A, B, C đã được kiểm lại lần 2 trên commit 75dd586; các chỗ đính chính ghi ở Phụ lục A. Nhóm A được kiểm lại lần 3 trên e9ee31d (Phụ lục B), lần 4 trên e64c49a (Phụ lục C) và lần 5 trên 72a7377 (Phụ lục E). Ngày 23/10 kiểm lại các lỗi liên quan tới thay đổi của CTM và toàn bộ nhóm A; nhóm C được kiểm lại toàn bộ trên bafe1e8 (Phụ lục D); các lỗi còn lại giữ kết quả ngày 22/10.</w:t>
+        <w:t>Trong 67 lỗi của register v2, tính tới commit e64c49a (nhóm A tính tới 72a7377, nhóm B tính tới bản sửa chunking ngày 24/10, nhóm C tính tới bafe1e8): 21 đã sửa, 1 đóng, 17 còn một phần, 3 đổi tính chất, 2 nặng hơn, 23 còn nguyên. Phát hiện thêm 17 lỗi mới: A22, A23, A24, B11, B12 (22/10; A22, A23, A24, B11 và B12 nay đã sửa), B13 (nay sửa trong code, chờ sinh lại corpus), C6, C7, C8, C9, D5, H9 (23/10, sau khi gộp CTM; C7 nay sửa một phần ở af8ee9a), A25, A26 (24/10, sau khi kéo NMA 72a7377) và B14, B15, B16 (24/10, khi kiểm lại nhóm B; đã sửa). Trong 15 lỗi mức Cao, 6 đã sửa (A1, A12, A13, A14, E15, C1), 9 còn mở. Nhóm A, B, C đã được kiểm lại lần 2 trên commit 75dd586; các chỗ đính chính ghi ở Phụ lục A. Nhóm A được kiểm lại lần 3 trên e9ee31d (Phụ lục B), lần 4 trên e64c49a (Phụ lục C) và lần 5 trên 72a7377 (Phụ lục E). Ngày 23/10 kiểm lại các lỗi liên quan tới thay đổi của CTM và toàn bộ nhóm A; nhóm C được kiểm lại toàn bộ trên bafe1e8 (Phụ lục D); ngày 24/10 nhóm B được kiểm lại và sửa trên nhánh chunking_test (Phụ lục F); các lỗi còn lại giữ kết quả ngày 22/10.</w:t>
       </w:r>
     </w:p>
     <w:p>
@@ -68,7 +68,17 @@
       </w:pPr>
       <w:r>
         <w:rPr/>
-        <w:t>Bản sửa parser mới nhất xóa nhầm nội dung (A25, Cao). NMA 72a7377 đã sửa A24, A23, A13, và corpus trong repo được sinh lại từ bản parse mới. Nhưng mẫu cắt chú thích VBHN trong cleaner xóa luôn khoản 4, 5 của Luật 52/2014 Điều 2 (nguyên tắc cơ bản), còn mẫu xóa nhãn “Hướng dẫn” xóa cả chữ “hướng dẫn” thật ở 5 chỗ. Test parser đã fail vì lỗi này nhưng commit vẫn được đẩy lên. 10 văn bản bổ sung chưa vào corpus vì exporter dừng ở NĐ 68/2002 (A26). Phải sửa A25, A26 và sinh lại corpus trước khi map gold (D1, D4) và dựng lại index.</w:t>
+        <w:t>Bản sửa parser mới nhất xóa nhầm nội dung (A25, Cao). NMA 72a7377 đã sửa A24, A23, A13, và corpus trong repo được sinh lại từ bản parse mới. Nhưng mẫu cắt chú thích VBHN trong cleaner xóa luôn khoản 4, 5 của Luật 52/2014 Điều 2 (nguyên tắc cơ bản), còn mẫu xóa nhãn “Hướng dẫn” xóa cả chữ “hướng dẫn” thật ở 5 chỗ. Test parser đã fail vì lỗi này nhưng commit vẫn được đẩy lên. 10 văn bản bổ sung chưa vào corpus vì parse lỗi (A26). Phải sửa A25, A26 và sinh lại corpus trước khi map gold (D1, D4) và dựng lại index.</w:t>
+      </w:r>
+    </w:p>
+    <w:p>
+      <w:pPr>
+        <w:pStyle w:val="ListBullet"/>
+        <w:spacing w:after="80"/>
+      </w:pPr>
+      <w:r>
+        <w:rPr/>
+        <w:t>Chunker đã sửa nhóm B nhưng corpus chưa sinh lại. Merge 1c40712 trên chunking_test làm chunking_rules.py lỗi cú pháp (B14), nên exporter, test và các script import chunker đều không chạy. Chunker được lấy lại từ testing rồi sửa: 0 “Khoản 1” giả (trước 130 chunk), 0 breadcrumb sai Khoản (trước 234), intro của 41/41 Điều nay có trong embed_text (trước 0, B15), Khoản dài có danh sách Điểm được cắt tại ranh giới Điểm (B9), exporter không còn dừng vì Parent vượt ngưỡng (B16) và dừng khi thiếu underthesea (B2). Quy ước chunk_id không đổi; 20 chunk của 10 Khoản dài đổi ranh giới (B3). Corpus trong repo vẫn là bản 72a7377 (fallback_whitespace) cho tới khi sinh lại ở bước 3 (Phụ lục F).</w:t>
       </w:r>
     </w:p>
     <w:p>
@@ -479,10 +489,9 @@
             </w:pPr>
             <w:r>
               <w:rPr>
-                <w:b w:val="0"/>
-                <w:sz w:val="17"/>
-              </w:rPr>
-              <w:t>2</w:t>
+                <w:sz w:val="17"/>
+              </w:rPr>
+              <w:t>3</w:t>
             </w:r>
           </w:p>
         </w:tc>
@@ -497,7 +506,6 @@
             </w:pPr>
             <w:r>
               <w:rPr>
-                <w:b w:val="0"/>
                 <w:sz w:val="17"/>
               </w:rPr>
               <w:t>0</w:t>
@@ -515,10 +523,9 @@
             </w:pPr>
             <w:r>
               <w:rPr>
-                <w:b w:val="0"/>
-                <w:sz w:val="17"/>
-              </w:rPr>
-              <w:t>3</w:t>
+                <w:sz w:val="17"/>
+              </w:rPr>
+              <w:t>6</w:t>
             </w:r>
           </w:p>
         </w:tc>
@@ -533,7 +540,6 @@
             </w:pPr>
             <w:r>
               <w:rPr>
-                <w:b w:val="0"/>
                 <w:sz w:val="17"/>
               </w:rPr>
               <w:t>0</w:t>
@@ -551,10 +557,9 @@
             </w:pPr>
             <w:r>
               <w:rPr>
-                <w:b w:val="0"/>
-                <w:sz w:val="17"/>
-              </w:rPr>
-              <w:t>1</w:t>
+                <w:sz w:val="17"/>
+              </w:rPr>
+              <w:t>0</w:t>
             </w:r>
           </w:p>
         </w:tc>
@@ -569,10 +574,9 @@
             </w:pPr>
             <w:r>
               <w:rPr>
-                <w:b w:val="0"/>
-                <w:sz w:val="17"/>
-              </w:rPr>
-              <w:t>3</w:t>
+                <w:sz w:val="17"/>
+              </w:rPr>
+              <w:t>0</w:t>
             </w:r>
           </w:p>
         </w:tc>
@@ -587,7 +591,6 @@
             </w:pPr>
             <w:r>
               <w:rPr>
-                <w:b w:val="0"/>
                 <w:sz w:val="17"/>
               </w:rPr>
               <w:t>9</w:t>
@@ -1553,7 +1556,7 @@
                 <w:b/>
                 <w:sz w:val="17"/>
               </w:rPr>
-              <w:t>20</w:t>
+              <w:t>21</w:t>
             </w:r>
           </w:p>
         </w:tc>
@@ -1589,7 +1592,7 @@
                 <w:b/>
                 <w:sz w:val="17"/>
               </w:rPr>
-              <w:t>14</w:t>
+              <w:t>17</w:t>
             </w:r>
           </w:p>
         </w:tc>
@@ -1625,7 +1628,7 @@
                 <w:b/>
                 <w:sz w:val="17"/>
               </w:rPr>
-              <w:t>3</w:t>
+              <w:t>2</w:t>
             </w:r>
           </w:p>
         </w:tc>
@@ -1643,7 +1646,7 @@
                 <w:b/>
                 <w:sz w:val="17"/>
               </w:rPr>
-              <w:t>26</w:t>
+              <w:t>23</w:t>
             </w:r>
           </w:p>
         </w:tc>
@@ -1677,7 +1680,7 @@
         <w:spacing w:after="80"/>
       </w:pPr>
       <w:r>
-        <w:t>“Đã sửa” ở nhóm A và B nghĩa là đã sửa trong code và trong parser/parsed_jsons; từ e64c49a corpus trong repo cũng được sinh lại từ parsed_jsons hiện tại (B11). Các lỗi “Còn” ở nhóm E–H phần lớn là do file liên quan không đổi kể từ commit ae1ce0d mà register v2 đã rà soát; số đo trong register cho các lỗi này được đo trên corpus cũ và cần đo lại.</w:t>
+        <w:t>“Đã sửa” ở nhóm A và B nghĩa là đã sửa trong code và trong parser/parsed_jsons; từ e64c49a corpus trong repo cũng được sinh lại từ parsed_jsons hiện tại (B11). Riêng B9, B12 (sửa ngày 24/10) mới sửa trong code chunking và được kiểm trên corpus sinh lại trong thư mục tạm; B1, B10, B13 cũng đã sửa trong code nhưng giữ trong bảng cho tới khi corpus trong repo được sinh lại ở bước 3. Các lỗi “Còn” ở nhóm E–H phần lớn là do file liên quan không đổi kể từ commit ae1ce0d mà register v2 đã rà soát; số đo trong register cho các lỗi này được đo trên corpus cũ và cần đo lại.</w:t>
       </w:r>
     </w:p>
     <w:p>
@@ -1693,7 +1696,7 @@
         <w:spacing w:after="80"/>
       </w:pPr>
       <w:r>
-        <w:t>Mốc so sánh là commit ae1ce0d (register v2) và commit 75dd586 (nhánh testing); lần kiểm lại ngày 23/10 đo trên commit e64c49a; nhóm A kiểm lại ngày 24/10 trên 72a7377. Thay đổi giữa các mốc:</w:t>
+        <w:t>Mốc so sánh là commit ae1ce0d (register v2) và commit 75dd586 (nhánh testing); lần kiểm lại ngày 23/10 đo trên commit e64c49a; nhóm A kiểm lại ngày 24/10 trên 72a7377; nhóm B kiểm lại và sửa ngày 24/10 trên nhánh chunking_test (1c40712). Thay đổi giữa các mốc:</w:t>
       </w:r>
     </w:p>
     <w:p>
@@ -1769,6 +1772,16 @@
       <w:r>
         <w:rPr/>
         <w:t>NMA aba586d, cb0e758, 72a7377 (kéo vào testing ngày 24/10 bằng fast-forward; 4a7bb6d gộp testing vào NMA và giữ parser của NMA): cleaner.py thêm mẫu xóa header bản in của ND04, ND05, nhãn “Hướng dẫn” và chú thích VBHN nhắc Luật 81/2025; parser.py viết lại phần tách tiêu đề theo dòng, thêm mẫu cắt khối xác thực VBHN và 3 tên người ký, nhận số hiệu kiểu cũ “21-LCT/HĐNN7”; thêm 12 PDF vào data/raw_data/additional_documents/ và 10 file parsed_jsons; registry đổi bản ghi Luật HNGĐ 1986; sinh lại chunks.jsonl (11 văn bản, 1.156 chunk, 508 parent) và kết quả BM25 trong evaluation/results. Commit cũng đưa lại parser/__pycache__/*.pyc và một file output git diff 46 MB ở thư mục gốc.</w:t>
+      </w:r>
+    </w:p>
+    <w:p>
+      <w:pPr>
+        <w:pStyle w:val="ListBullet"/>
+        <w:spacing w:after="80"/>
+      </w:pPr>
+      <w:r>
+        <w:rPr/>
+        <w:t>chunking_test 1c40712 (24/10, gộp testing f0a7007 vào chunking_test 16e4495 của ngày 17/10) và bản sửa nhóm B chưa commit: merge trộn hai thiết kế chunker nên chunking_rules.py lỗi cú pháp (B14); chunking_rules.py và run_experiment.py được lấy lại từ f0a7007 rồi sửa; export_legal_chunks.py bỏ nhánh sửa nhãn TT 02a và thêm kiểm tra; test/test_chunking.py viết lại; chunking_strategy.md, chunking_evaluation.xlsx, chunking_examples.json sinh lại; requirements.txt ghim underthesea==9.5.0. data/chunking_output không đổi.</w:t>
       </w:r>
     </w:p>
     <w:p>
@@ -1948,6 +1961,45 @@
     </w:p>
     <w:p>
       <w:pPr>
+        <w:spacing w:after="80"/>
+      </w:pPr>
+      <w:r>
+        <w:rPr/>
+        <w:t>Ngày 24/10, kiểm lại và sửa nhóm B trên nhánh chunking_test:</w:t>
+      </w:r>
+    </w:p>
+    <w:p>
+      <w:pPr>
+        <w:pStyle w:val="ListBullet"/>
+        <w:spacing w:after="80"/>
+      </w:pPr>
+      <w:r>
+        <w:rPr/>
+        <w:t>đo các chỉ số nhóm B trên chunks.jsonl trong repo và trên corpus export lại trong thư mục tạm bằng chunker f0a7007 (11 văn bản cũ; 20 văn bản, bỏ NĐ 68/2002): Khoản giả, breadcrumb, intro, Điểm, chunk ngắn, trường trùng; đối chiếu candidate của ground_truth.json;</w:t>
+      </w:r>
+    </w:p>
+    <w:p>
+      <w:pPr>
+        <w:pStyle w:val="ListBullet"/>
+        <w:spacing w:after="80"/>
+      </w:pPr>
+      <w:r>
+        <w:rPr/>
+        <w:t>sau khi sửa, export lại trong thư mục tạm trên 11 văn bản cũ và đủ 21 parsed_jsons của 72a7377; so chunk_id và nội dung với corpus của chunker f0a7007; validate theo chunk_payload_schema.json và vector_store.normalize_chunk_record; chạy run_experiment.py --export-reports;</w:t>
+      </w:r>
+    </w:p>
+    <w:p>
+      <w:pPr>
+        <w:pStyle w:val="ListBullet"/>
+        <w:spacing w:after="80"/>
+      </w:pPr>
+      <w:r>
+        <w:rPr/>
+        <w:t>chạy pytest từng file trong parser/, tests/, test/ (.venv, Python 3.14); chạy test_chunking.py mới trên chunker f0a7007 để kiểm test bắt được lỗi cũ (9 test và 1 subtest fail).</w:t>
+      </w:r>
+    </w:p>
+    <w:p>
+      <w:pPr>
         <w:pStyle w:val="Heading1"/>
       </w:pPr>
       <w:r>
@@ -1959,7 +2011,7 @@
         <w:spacing w:after="80"/>
       </w:pPr>
       <w:r>
-        <w:t>Mỗi nhóm có một bảng gồm các lỗi của register v2 còn việc phải làm và các lỗi mới, chỉ ghi phần còn lỗi tính tới e64c49a (nhóm A tính tới 72a7377). Trong mỗi bảng, lỗi xếp theo mức độ; cùng mức thì lỗi mới đứng trước. Cột Vấn đề và đề xuất gồm phần còn lỗi, “Đề xuất” và, khi có, “Kiểm chứng”. Lỗi của register v2 giữ mức độ như register; Vị trí và Owner của chúng lấy từ register v2 (commit ae1ce0d), nên số dòng có thể đã lệch. Lỗi có trạng thái “Còn” giữ nguyên mô tả, đề xuất và kiểm chứng của register v2 vì file liên quan chưa đổi; số đo trong đó được đo trên corpus cũ.</w:t>
+        <w:t>Mỗi nhóm có một bảng gồm các lỗi của register v2 còn việc phải làm và các lỗi mới, chỉ ghi phần còn lỗi tính tới e64c49a (nhóm A tính tới 72a7377, nhóm B tính tới bản sửa chunking ngày 24/10). Trong mỗi bảng, lỗi xếp theo mức độ; cùng mức thì lỗi mới đứng trước. Cột Vấn đề và đề xuất gồm phần còn lỗi, “Đề xuất” và, khi có, “Kiểm chứng”. Lỗi của register v2 giữ mức độ như register; Vị trí và Owner của chúng lấy từ register v2 (commit ae1ce0d), nên số dòng có thể đã lệch. Lỗi có trạng thái “Còn” giữ nguyên mô tả, đề xuất và kiểm chứng của register v2 vì file liên quan chưa đổi; số đo trong đó được đo trên corpus cũ.</w:t>
       </w:r>
     </w:p>
     <w:p>
@@ -1967,7 +2019,7 @@
         <w:spacing w:after="80"/>
       </w:pPr>
       <w:r>
-        <w:t>Lỗi mới (trạng thái “Mới”) là mười bốn lỗi chưa có trong register v2, mã nối tiếp register v2 theo nhóm. Năm lỗi tìm thấy ngày 22/10 khi kiểm lại sau lần gộp CTM và NMA (A22–A24 thuộc Parser; B11, B12 thuộc Chunking; A24 tìm thấy khi kiểm lại e9ee31d, do bản sửa A23 ở NMA 41802ab gây ra). Bảy lỗi tìm thấy ngày 23/10 sau khi gộp CTM ee755a5 (B13 thuộc Chunking; C6–C9, D5, H9 thuộc CTM). Hai lỗi tìm thấy ngày 24/10 sau khi kéo NMA 72a7377 (A25, A26 thuộc Parser; A25 do chính bản sửa A6 và A13 gây ra).</w:t>
+        <w:t>Lỗi mới (trạng thái “Mới”) là mười bảy lỗi chưa có trong register v2, mã nối tiếp register v2 theo nhóm. Năm lỗi tìm thấy ngày 22/10 khi kiểm lại sau lần gộp CTM và NMA (A22–A24 thuộc Parser; B11, B12 thuộc Chunking; A24 tìm thấy khi kiểm lại e9ee31d, do bản sửa A23 ở NMA 41802ab gây ra). Bảy lỗi tìm thấy ngày 23/10 sau khi gộp CTM ee755a5 (B13 thuộc Chunking; C6–C9, D5, H9 thuộc CTM). Hai lỗi tìm thấy ngày 24/10 sau khi kéo NMA 72a7377 (A25, A26 thuộc Parser; A25 do chính bản sửa A6 và A13 gây ra). Ba lỗi tìm thấy ngày 24/10 khi kiểm lại nhóm B trên nhánh chunking_test (B14, B15, B16 thuộc Chunking) đã sửa cùng đợt nên không có trong bảng (Phụ lục F).</w:t>
       </w:r>
     </w:p>
     <w:p>
@@ -1975,7 +2027,7 @@
         <w:spacing w:after="80"/>
       </w:pPr>
       <w:r>
-        <w:t>Các lỗi đã sửa hoặc đã đóng mà không còn việc gì được bỏ khỏi bảng (vẫn tính trong thống kê ở mục 1; kết quả kiểm nhóm A ở Phụ lục C và Phụ lục E): A1, A5, A10, A12, A13, A14, A15, A17, A18, A19, A20, A22, A23, A24, B8, B11, C1, E5. Phần còn lại của A22 (thông báo lỗi in chữ \n) và việc thêm test cho A23, A24 nằm ở A7; đề xuất kiểm tra CI của B11 nằm ở bước 3 mục 5.</w:t>
+        <w:t>Các lỗi đã sửa hoặc đã đóng mà không còn việc gì được bỏ khỏi bảng (vẫn tính trong thống kê ở mục 1; kết quả kiểm nhóm A ở Phụ lục C và Phụ lục E, nhóm B ở Phụ lục F): A1, A5, A10, A12, A13, A14, A15, A17, A18, A19, A20, A22, A23, A24, B8, B9, B11, B12, B14, B15, B16, C1, E5. Phần còn lại của A22 (thông báo lỗi in chữ \n) và việc thêm test cho A23, A24 nằm ở A7; đề xuất kiểm tra CI của B11 nằm ở bước 3 mục 5.</w:t>
       </w:r>
     </w:p>
     <w:p>
@@ -2313,7 +2365,7 @@
               <w:rPr>
                 <w:sz w:val="17"/>
               </w:rPr>
-              <w:t>10 văn bản bổ sung (NMA 72a7377) parse lỗi và làm exporter dừng, nên chưa văn bản nào vào corpus. 72a7377 thêm 12 PDF vào data/raw_data/additional_documents/ cho các văn bản trước đây chỉ có trong registry, và 10 file parsed_jsons (nay 21 file). 11 câu benchmark trích 8 văn bản trong số này, đều not_mapped (vd HN_039 NĐ 68/2002, HN_044 TT 38/2025, HN_060 NĐ 123/2015). Xếp mức Cao vì lỗi (1) chặn việc sinh lại corpus ở bước 3. (1) Exporter dừng trên bộ parsed_jsons hiện tại với “Parent vượt giới hạn 1500 ký tự: ['nd_68_2002_nd_cp_art_39_p1']”; chunks.jsonl trong commit vẫn chỉ có 11 văn bản cũ. Nguyên nhân: NĐ 68/2002 viết Khoản bằng chữ thường (“1. ủy ban nhân dân tỉnh…”, “1. ở nước Cộng hòa…”), clause_regex không nhận các Khoản này. Điều 3 có tiêu đề 69 từ, nuốt cả khoản 1; Điều 2 và 39 không có tiêu đề, tiêu đề và Khoản nằm lẫn trong intro; Điều 39 thành một khối không tách được. (2) Luật HNGĐ 1986 (21-LCT/HĐNN7) không có tiêu đề Điều (TXT chỉ có dòng “Điều 1.”), nhưng parser lấy câu đầu làm tiêu đề ở 25/57 Điều, tổng 895 từ. Khi chunk, breadcrumb rút gọn tiêu đề bằng “...”, nên câu này mất khỏi text ở cả 25 Điều và khỏi mọi trường ở 18 Điều; vd Điều 1 mất câu “Nhà nước bảo đảm thực sự chế độ hôn nhân tự nguyện, tiến bộ, một vợ một chồng…”. Đây là cùng cơ chế của A24. Điều 7 có tiêu đề “Cấm kết hôn trong những trường hợp sau đây : a)”; Điều 57 kết thúc bằng tên người ký “Trường Chinh” (A21). (3) TT 07/2001/TT-BTP và TT 07/2002/TT-BTP chia theo mục La Mã (I., II., 1.1-), không có Điều: parser dừng với “Không tìm thấy Điều nào”, nên 2/12 PDF không có parsed_jsons; HN_048 hỏi về TT 07/2002. (4) Bản ghi registry của Luật 1986 đổi document_number thành “ 21-LCT/HĐNN7” (có dấu cách ở đầu, đã vào metadata của parsed_jsons) và document_id thành l_21_LCT_HDND7: có chữ hoa, và ghi HDND (Hội đồng nhân dân) thay cho HĐNN (Hội đồng Nhà nước). ID này trái quy tắc chỉ gồm [a-z0-9_] đề xuất ở C6 và khác ngoại lệ l_hngd_1986 ghi ở C6; tên file parsed_jsons theo ID này.</w:t>
+              <w:t>10 văn bản bổ sung (NMA 72a7377) parse lỗi, nên chưa văn bản nào vào corpus. 72a7377 thêm 12 PDF vào data/raw_data/additional_documents/ cho các văn bản trước đây chỉ có trong registry, và 10 file parsed_jsons (nay 21 file). 11 câu benchmark trích 8 văn bản trong số này, đều not_mapped (vd HN_039 NĐ 68/2002, HN_044 TT 38/2025, HN_060 NĐ 123/2015). Xếp mức Cao vì 8 văn bản được benchmark trích chưa vào được corpus. (1) NĐ 68/2002 viết Khoản bằng chữ thường (“1. ủy ban nhân dân tỉnh…”, “1. ở nước Cộng hòa…”), clause_regex không nhận các Khoản này. Điều 3 có tiêu đề 69 từ, nuốt cả khoản 1; Điều 2 và 39 không có tiêu đề, tiêu đề và Khoản nằm lẫn trong intro; Điều 39 thành một khối không tách được, intro trùng nguyên văn khoản 1 (chunker của testing vì thế sinh Parent vượt 1.500 ký tự và exporter dừng; bản sửa chunking 24/10 bỏ intro trùng, xem B16 ở Phụ lục F). (2) Luật HNGĐ 1986 (21-LCT/HĐNN7) không có tiêu đề Điều (TXT chỉ có dòng “Điều 1.”), nhưng parser lấy câu đầu làm tiêu đề ở 25/57 Điều, tổng 895 từ. Khi chunk, breadcrumb rút gọn tiêu đề bằng “...”, nên câu này mất khỏi text ở cả 25 Điều và khỏi mọi trường của chunk con ở 18 Điều (từ bản sửa chunking 24/10, header của Parent giữ tiêu đề đầy đủ); vd Điều 1 mất câu “Nhà nước bảo đảm thực sự chế độ hôn nhân tự nguyện, tiến bộ, một vợ một chồng…”. Đây là cùng cơ chế của A24. Điều 7 có tiêu đề “Cấm kết hôn trong những trường hợp sau đây : a)”; Điều 57 kết thúc bằng tên người ký “Trường Chinh” (A21). (3) TT 07/2001/TT-BTP và TT 07/2002/TT-BTP chia theo mục La Mã (I., II., 1.1-), không có Điều: parser dừng với “Không tìm thấy Điều nào”, nên 2/12 PDF không có parsed_jsons; HN_048 hỏi về TT 07/2002. (4) Bản ghi registry của Luật 1986 đổi document_number thành “ 21-LCT/HĐNN7” (có dấu cách ở đầu, đã vào metadata của parsed_jsons) và document_id thành l_21_LCT_HDND7: có chữ hoa, và ghi HDND (Hội đồng nhân dân) thay cho HĐNN (Hội đồng Nhà nước). ID này trái quy tắc chỉ gồm [a-z0-9_] đề xuất ở C6 và khác ngoại lệ l_hngd_1986 ghi ở C6; tên file parsed_jsons theo ID này.</w:t>
             </w:r>
           </w:p>
           <w:p>
@@ -2349,7 +2401,7 @@
               <w:rPr>
                 <w:sz w:val="17"/>
               </w:rPr>
-              <w:t>Chạy lại parser trên bản sao 72a7377 (không đặt biến môi trường): 21/21 file giống hệt parsed_jsons, 2 file lỗi “Không tìm thấy Điều nào”. Chạy export_legal_chunks.py trên 21 file: ValueError ở dòng 260; bỏ riêng NĐ 68/2002 thì export được 20 văn bản, 819 parent, 1.775 chunk. So số dòng “N.” trong TXT với số Khoản trong JSON theo từng Điều: ngoài Điều cuối có phụ lục, chỉ lệch ở NĐ 68/2002 Điều 2 (2/0), 3 (3/1), 39 (1/0). Trong corpus thử 20 văn bản: 19 breadcrumb của Luật 1986 có “...”; Trường Chinh ở l_21_LCT_HDND7_art_57_clause_1_chunk_1. Đối chiếu citations của ground_truth.json theo số hiệu: 11 câu trích 8 văn bản mới.</w:t>
+              <w:t>Chạy lại parser trên bản sao 72a7377 (không đặt biến môi trường): 21/21 file giống hệt parsed_jsons, 2 file lỗi “Không tìm thấy Điều nào”. Chạy export_legal_chunks.py trên 21 file bằng chunker của testing: ValueError ở dòng 260; bỏ riêng NĐ 68/2002 thì export được 20 văn bản, 819 parent, 1.775 chunk. Bằng chunker đã sửa (24/10): 21 văn bản, 923 parent, 2.003 chunk. So số dòng “N.” trong TXT với số Khoản trong JSON theo từng Điều: ngoài Điều cuối có phụ lục, chỉ lệch ở NĐ 68/2002 Điều 2 (2/0), 3 (3/1), 39 (1/0). Trong corpus thử 20 văn bản: 19 breadcrumb của Luật 1986 có “...”; Trường Chinh ở l_21_LCT_HDND7_art_57_clause_1_chunk_1. Đối chiếu citations của ground_truth.json theo số hiệu: 11 câu trích 8 văn bản mới.</w:t>
             </w:r>
           </w:p>
         </w:tc>
@@ -2366,7 +2418,7 @@
               <w:rPr>
                 <w:sz w:val="17"/>
               </w:rPr>
-              <w:t>parser/parser.py: clause_regex (dòng 172), split_title_best (dòng 374), detect_title_and_intro (dòng 380), split_head (dòng 615); chunking/export_legal_chunks.py (dòng 255–260); data/reference/document_versions.json (bản ghi L03); parser/parsed_jsons/l_21_LCT_HDND7.json, nd_68_2002_nd_cp.json; parser/cleaned_texts/07_2001_TT-BTP_48707.txt, 07_2002_TT-BTP_50377.txt</w:t>
+              <w:t>parser/parser.py: clause_regex (dòng 172), split_title_best (dòng 374), detect_title_and_intro (dòng 380), split_head (dòng 615); data/reference/document_versions.json (bản ghi L03); parser/parsed_jsons/l_21_LCT_HDND7.json, nd_68_2002_nd_cp.json; parser/cleaned_texts/07_2001_TT-BTP_48707.txt, 07_2002_TT-BTP_50377.txt</w:t>
             </w:r>
           </w:p>
         </w:tc>
@@ -3366,7 +3418,7 @@
               <w:rPr>
                 <w:sz w:val="17"/>
               </w:rPr>
-              <w:t>1.189/1.189 chunk có article_id, clause_id, parent_clause_id (= clause_id). Không còn chunk gộp nhiều Khoản, không còn “(phần n)”. vector_store.normalize_chunk_record nhận 1.189/1.189 (trước 0). Còn ý (3) của B1: Điều không chia Khoản vẫn ghi “Khoản 1” vào clause_ref, breadcrumb và embed_text (130 chunk trong repo, 131 khi sinh lại). Ý (4) mới làm một nửa: export_legal_chunks.py vẫn chỉ kiểm theo Điều; việc kiểm parent_clause_id có trong parser nằm ở tests/schema_test.py. 59/1.189 clause_id của corpus trong repo không còn trong parser hiện tại (do corpus cũ).</w:t>
+              <w:t>Code chunking đã sửa ngày 24/10 (Phụ lục F), nhưng corpus trong repo (bản 72a7377) chưa sinh lại: 130/1.156 chunk của Điều không chia Khoản vẫn ghi “Khoản 1” vào clause_ref, breadcrumb, embed_text và metadata.clause_number.</w:t>
             </w:r>
           </w:p>
           <w:p>
@@ -3384,7 +3436,25 @@
               <w:rPr>
                 <w:sz w:val="17"/>
               </w:rPr>
-              <w:t>Không ghi “Khoản N” khi Điều không đánh số Khoản; sinh lại corpus.</w:t>
+              <w:t>Sinh lại corpus ở bước 3 (sau khi parser sửa A25, A26 và C3 được chốt) bằng chunker đã sửa; exporter nay dừng nếu lỗi này còn.</w:t>
+            </w:r>
+          </w:p>
+          <w:p>
+            <w:pPr>
+              <w:spacing w:after="20" w:line="252" w:lineRule="auto"/>
+            </w:pPr>
+            <w:r>
+              <w:rPr>
+                <w:b/>
+                <w:sz w:val="17"/>
+              </w:rPr>
+              <w:t xml:space="preserve">Kiểm chứng: </w:t>
+            </w:r>
+            <w:r>
+              <w:rPr>
+                <w:sz w:val="17"/>
+              </w:rPr>
+              <w:t>Corpus export lại trong thư mục tạm bằng chunker đã sửa: 0/1.157 chunk (21 văn bản: 0/2.003) còn “Khoản 1” giả; test_implicit_clause_has_no_khoan pass.</w:t>
             </w:r>
           </w:p>
         </w:tc>
@@ -3401,7 +3471,7 @@
               <w:rPr>
                 <w:sz w:val="17"/>
               </w:rPr>
-              <w:t>chunking/chunking_rules.py: _ClauseUnit (dòng 270–275), _create_child_chunks_from_units (dòng 450–553), _chunk_structured_document (dòng 644–650); chunking/export_legal_chunks.py (dòng 33–91, 146–153)</w:t>
+              <w:t>data/chunking_output/chunks.jsonl; chunking/export_legal_chunks.py: _assert_breadcrumb</w:t>
             </w:r>
           </w:p>
         </w:tc>
@@ -3491,7 +3561,7 @@
               <w:rPr>
                 <w:sz w:val="17"/>
               </w:rPr>
-              <w:t>chunks.jsonl: seg_text giống text ở 1.189/1.189; report ghi tokenization_backend = fallback_whitespace. word_segment vẫn trả text gốc khi thiếu underthesea, export không dừng. Hai file requirements vẫn mâu thuẫn (underthesea &lt;10 và &lt;9). Chạy lại exporter trên .venv có underthesea 9.5.0: seg_text khác text ở 1.161/1.161 (1.160 chunk có từ nối “_”); embed_text được tách từ, còn embed_text_raw (CTM mới thêm) giữ bản thô, đúng hướng E4.</w:t>
+              <w:t>Corpus trong repo vẫn là bản 72a7377: chunking_report ghi tokenization_backend = fallback_whitespace, seg_text giống text ở 1.156/1.156 chunk, cho tới khi sinh lại ở bước 3. embedding/requirements-bkai.txt vẫn ghi underthesea&gt;=8.3,&lt;9, mâu thuẫn với requirements.txt (ghim underthesea==9.5.0). Phía truy vấn chưa tách từ cùng phiên bản với corpus: ElasticsearchBM25Retriever tìm trên content_segmented bằng câu hỏi thô; dense_retriever tự tắt tách từ câu hỏi khi thiếu underthesea (E4).</w:t>
             </w:r>
           </w:p>
           <w:p>
@@ -3509,7 +3579,25 @@
               <w:rPr>
                 <w:sz w:val="17"/>
               </w:rPr>
-              <w:t>Bắt buộc underthesea (dừng khi thiếu); xử lý phía BM25 và Dense theo E4.</w:t>
+              <w:t>Dev 3 ghim underthesea==9.5.0 trong requirements-bkai.txt. Dev 4 tách từ câu hỏi bằng cùng phiên bản, truy vấn cả content (câu hỏi thô) lẫn content_segmented (câu hỏi tách từ); Dense chọn embed_text hoặc embed_text_raw theo cờ của model (E4). Sinh lại corpus ở bước 3 và kiểm tokenization_version trong report.</w:t>
+            </w:r>
+          </w:p>
+          <w:p>
+            <w:pPr>
+              <w:spacing w:after="20" w:line="252" w:lineRule="auto"/>
+            </w:pPr>
+            <w:r>
+              <w:rPr>
+                <w:b/>
+                <w:sz w:val="17"/>
+              </w:rPr>
+              <w:t xml:space="preserve">Kiểm chứng: </w:t>
+            </w:r>
+            <w:r>
+              <w:rPr>
+                <w:sz w:val="17"/>
+              </w:rPr>
+              <w:t>Corpus export lại bằng chunker đã sửa (thư mục tạm, 11 và 21 văn bản): seg_text khác text ở 100% chunk, report ghi tokenization_version = 9.5.0. Khi không import được underthesea, word_segment báo RuntimeError (test_word_segment_requires_underthesea).</w:t>
             </w:r>
           </w:p>
         </w:tc>
@@ -3526,7 +3614,7 @@
               <w:rPr>
                 <w:sz w:val="17"/>
               </w:rPr>
-              <w:t>chunking/chunking_rules.py: word_segment (dòng 191–213); chunking/export_legal_chunks.py (dòng 206–210); retrieval/hybrid_retriever.py: ElasticsearchBM25Retriever.search; requirements.txt; embedding/requirements-bkai.txt</w:t>
+              <w:t>embedding/requirements-bkai.txt; retrieval/hybrid_retriever.py: ElasticsearchBM25Retriever.search; embedding/dense_retriever.py (dòng 80–102); data/chunking_output/chunks.jsonl</w:t>
             </w:r>
           </w:p>
         </w:tc>
@@ -3543,7 +3631,7 @@
               <w:rPr>
                 <w:sz w:val="17"/>
               </w:rPr>
-              <w:t>Chunking + Dev 4</w:t>
+              <w:t>Dev 3 + Dev 4</w:t>
             </w:r>
           </w:p>
         </w:tc>
@@ -3551,17 +3639,17 @@
           <w:tcPr>
             <w:tcW w:type="dxa" w:w="964"/>
             <w:vAlign w:val="top"/>
-            <w:shd w:val="clear" w:color="auto" w:fill="FBE5D6"/>
-          </w:tcPr>
-          <w:p>
-            <w:pPr>
-              <w:spacing w:after="20" w:line="252" w:lineRule="auto"/>
-            </w:pPr>
-            <w:r>
-              <w:rPr>
-                <w:sz w:val="17"/>
-              </w:rPr>
-              <w:t>Còn</w:t>
+            <w:shd w:val="clear" w:color="auto" w:fill="FFF2CC"/>
+          </w:tcPr>
+          <w:p>
+            <w:pPr>
+              <w:spacing w:after="20" w:line="252" w:lineRule="auto"/>
+            </w:pPr>
+            <w:r>
+              <w:rPr>
+                <w:sz w:val="17"/>
+              </w:rPr>
+              <w:t>Còn một phần</w:t>
             </w:r>
           </w:p>
         </w:tc>
@@ -3616,7 +3704,7 @@
               <w:rPr>
                 <w:sz w:val="17"/>
               </w:rPr>
-              <w:t>Corpus có 3 chunk dưới 10 ký tự, vi phạm minLength 10 của chunk_payload_schema: “quy định.” (l_22_2000_qh10_art_5_clause_1_chunk_1), “ở cơ sở.” (l_52_2014_qh13_art_52_clause_1_chunk_1), “có lại.” (l_52_2014_qh13_art_124_clause_1_chunk_1). Đây là phần đuôi còn lại của Luật 22/2000 Điều 5, Luật 52/2014 Điều 52 và 124 sau khi A24 nuốt câu đầu vào tiêu đề. data_contract.md §5.2 yêu cầu gộp đoạn đuôi dưới 10 ký tự vào chunk liền trước, nhưng chunking_rules chưa làm, nên không có bước nào chặn các chunk này; tests/schema_test.py::test_corpus_chunks_jsonl fail.</w:t>
+              <w:t>chunks.jsonl trong repo hiện có 0 chunk dưới 10 ký tự (schema_test pass) nhờ A24 đã sửa, nhưng chưa được sinh bằng exporter mới, vốn dừng khi còn chunk dưới 10 ký tự (data_contract.md mục 5.2). Chưa có gì chặn lỗi quay lại trong corpus đang commit.</w:t>
             </w:r>
           </w:p>
           <w:p>
@@ -3634,7 +3722,7 @@
               <w:rPr>
                 <w:sz w:val="17"/>
               </w:rPr>
-              <w:t>Sửa A24 rồi sinh lại corpus; chỉ việc này đã đủ để test pass. Ngoài ra gộp đuôi ngắn vào chunk trước trong _create_child_chunks_from_units theo §5.2 và thêm test, để chặn các trường hợp khác.</w:t>
+              <w:t>Sinh lại corpus ở bước 3 bằng exporter mới.</w:t>
             </w:r>
           </w:p>
           <w:p>
@@ -3652,7 +3740,7 @@
               <w:rPr>
                 <w:sz w:val="17"/>
               </w:rPr>
-              <w:t>Validate data/chunking_output/chunks.jsonl ở e64c49a theo chunk_payload_schema.json: đúng 3 lỗi minLength. Corpus dựng bằng chunker hiện tại từ bản parse 75dd586, hoặc từ parser có bản mẫu sửa A24: 0 chunk dưới 10 ký tự, 1.160/1.160 chunk pass schema.</w:t>
+              <w:t>Corpus export lại trong thư mục tạm: 0 chunk dưới 10 ký tự ở 11 và 21 văn bản.</w:t>
             </w:r>
           </w:p>
         </w:tc>
@@ -3669,7 +3757,7 @@
               <w:rPr>
                 <w:sz w:val="17"/>
               </w:rPr>
-              <w:t>chunking/chunking_rules.py: _create_child_chunks_from_units; data/chunking_output/chunks.jsonl</w:t>
+              <w:t>data/chunking_output/chunks.jsonl; chunking/export_legal_chunks.py: main (kiểm CHILD_MIN_CHARS)</w:t>
             </w:r>
           </w:p>
         </w:tc>
@@ -3758,7 +3846,7 @@
               <w:rPr>
                 <w:sz w:val="17"/>
               </w:rPr>
-              <w:t>chunk_id = {clause_id}_chunk_{n} ở 1.189/1.189, không trùng. Hệ quả: gold, proposal và production_chunk_index chưa đổi sang ID mới (D4).</w:t>
+              <w:t>Gold, proposal và production_chunk_index chưa đổi sang chunk_id = {clause_id}_chunk_{n} (D4). Bản sửa chunking 24/10 giữ quy ước ID nhưng dời ranh giới phần ở 10 Khoản dài: 20 chunk giữ ID mà đổi nội dung, thêm nd_207_2025_nd_cp_art_9_clause_2_chunk_3; candidate của HN_244, HN_253, HN_255, HN_260 trỏ các Khoản này (đủ các phần của Khoản, nên Parent Match không đổi). data_contract.md tự mâu thuẫn ở dòng 14: câu chữ yêu cầu ID viết thường nhưng regex ở dòng 14, 30 và chunk_payload_schema.json cho [a-zA-Z0-9_]; khi đưa đủ 21 văn bản, 57 chunk_id có chữ hoa (l_21_LCT_HDND7_…, A26) vẫn qua exporter và schema.</w:t>
             </w:r>
           </w:p>
           <w:p>
@@ -3776,7 +3864,25 @@
               <w:rPr>
                 <w:sz w:val="17"/>
               </w:rPr>
-              <w:t>Map lại dữ liệu benchmark (D4).</w:t>
+              <w:t>Map lại dữ liệu benchmark theo nội dung chunk, không theo ID cũ (D4). CTM sửa regex ID trong data_contract.md và chunk_payload_schema.json thành ^[a-z0-9_]+$ cùng lúc Dev 1 sửa ID registry của Luật 1986 (A26, C6); exporter dùng cùng regex.</w:t>
+            </w:r>
+          </w:p>
+          <w:p>
+            <w:pPr>
+              <w:spacing w:after="20" w:line="252" w:lineRule="auto"/>
+            </w:pPr>
+            <w:r>
+              <w:rPr>
+                <w:b/>
+                <w:sz w:val="17"/>
+              </w:rPr>
+              <w:t xml:space="preserve">Kiểm chứng: </w:t>
+            </w:r>
+            <w:r>
+              <w:rPr>
+                <w:sz w:val="17"/>
+              </w:rPr>
+              <w:t>So corpus 11 văn bản sinh bằng chunker f0a7007 và chunker đã sửa: 0 ID mất, 1 ID mới, 20 ID đổi nội dung.</w:t>
             </w:r>
           </w:p>
         </w:tc>
@@ -3793,7 +3899,7 @@
               <w:rPr>
                 <w:sz w:val="17"/>
               </w:rPr>
-              <w:t>chunking/chunking_rules.py: _create_child_chunks_from_units (dòng 462–468, 520, 560–577), _chunk_structured_document (dòng 663); docs/data_contract.md (dòng 20)</w:t>
+              <w:t>docs/data_contract.md (dòng 14, 30); schemas/chunk_payload_schema.json (dòng 38–62); chunking/export_legal_chunks.py: main (kiểm chunk_id); data/benchmark/ground_truth.json</w:t>
             </w:r>
           </w:p>
         </w:tc>
@@ -3810,7 +3916,7 @@
               <w:rPr>
                 <w:sz w:val="17"/>
               </w:rPr>
-              <w:t>Chunking</w:t>
+              <w:t>Dev 1 + CTM</w:t>
             </w:r>
           </w:p>
         </w:tc>
@@ -4008,7 +4114,7 @@
               <w:rPr>
                 <w:sz w:val="17"/>
               </w:rPr>
-              <w:t>Bản ghi có 29 trường cấp gốc (trước 25) và 5 bản nội dung (thêm embed_text_raw); metadata có 16 trường. Đã thêm document_title, clause_number, source_url, nhưng source_url rỗng ở 1.189/1.189 (sinh lại: 1.161/1.161) dù registry có source_url cho 11/11 văn bản, vì parser không chuyển trường này (xem C1).</w:t>
+              <w:t>Bản ghi chunk có 29 trường cấp gốc và metadata 16 trường, lưu cùng thông tin nhiều lần: 3 cặp alias (id/chunk_id, doc_id/document_id, text/chunk_text), thông tin văn bản và Điều lặp ở cấp gốc và trong metadata, nội dung luật có 5 bản (text, chunk_text, seg_text, embed_text, embed_text_raw). effective_from, effective_to, source_url chỉ nằm trong metadata (effective_to có giá trị ở 445/1.157 chunk, 21 văn bản: 907/2.003); mỗi consumer tự viết bộ chuyển đổi (build_bm25_index.load_chunks, vector_store.normalize_chunk_record, build_index._adapt_chunk_for_vector_store).</w:t>
             </w:r>
           </w:p>
           <w:p>
@@ -4068,17 +4174,17 @@
           <w:tcPr>
             <w:tcW w:type="dxa" w:w="964"/>
             <w:vAlign w:val="top"/>
-            <w:shd w:val="clear" w:color="auto" w:fill="F8CBAD"/>
-          </w:tcPr>
-          <w:p>
-            <w:pPr>
-              <w:spacing w:after="20" w:line="252" w:lineRule="auto"/>
-            </w:pPr>
-            <w:r>
-              <w:rPr>
-                <w:sz w:val="17"/>
-              </w:rPr>
-              <w:t>Nặng hơn</w:t>
+            <w:shd w:val="clear" w:color="auto" w:fill="FFF2CC"/>
+          </w:tcPr>
+          <w:p>
+            <w:pPr>
+              <w:spacing w:after="20" w:line="252" w:lineRule="auto"/>
+            </w:pPr>
+            <w:r>
+              <w:rPr>
+                <w:sz w:val="17"/>
+              </w:rPr>
+              <w:t>Còn một phần</w:t>
             </w:r>
           </w:p>
         </w:tc>
@@ -4098,7 +4204,7 @@
                 <w:b/>
                 <w:sz w:val="17"/>
               </w:rPr>
-              <w:t>B9</w:t>
+              <w:t>B10</w:t>
             </w:r>
           </w:p>
         </w:tc>
@@ -4133,7 +4239,7 @@
               <w:rPr>
                 <w:sz w:val="17"/>
               </w:rPr>
-              <w:t>point_ref rỗng ở 1.189/1.189. 24 chunk (sinh lại: 25) bắt đầu giữa danh sách điểm (“e) …”) mà không có câu dẫn; register v2 đếm 60, bản mẫu B8 còn 43. Số giảm nhờ B8 tách theo câu, nhưng câu dẫn vẫn chưa được chép vào embed_text của phần sau.</w:t>
+              <w:t>Code chunking đã sửa ngày 24/10 (Phụ lục F), nhưng corpus trong repo chưa sinh lại: 132 breadcrumb lặp dải Khoản (“Khoản 1-10 &gt; Khoản 2”) và 102 chunk không có Khoản của chính nó (breadcrumb dừng ở “Khoản 1-10”, “Khoản 11-14”). Breadcrumb này đi vào embed_text của Dense.</w:t>
             </w:r>
           </w:p>
           <w:p>
@@ -4151,7 +4257,25 @@
               <w:rPr>
                 <w:sz w:val="17"/>
               </w:rPr>
-              <w:t>Như đề xuất trong register v2.</w:t>
+              <w:t>Sinh lại corpus ở bước 3 (sau khi parser sửa A25, A26 và C3 được chốt) bằng chunker đã sửa; exporter nay dừng nếu lỗi này còn.</w:t>
+            </w:r>
+          </w:p>
+          <w:p>
+            <w:pPr>
+              <w:spacing w:after="20" w:line="252" w:lineRule="auto"/>
+            </w:pPr>
+            <w:r>
+              <w:rPr>
+                <w:b/>
+                <w:sz w:val="17"/>
+              </w:rPr>
+              <w:t xml:space="preserve">Kiểm chứng: </w:t>
+            </w:r>
+            <w:r>
+              <w:rPr>
+                <w:sz w:val="17"/>
+              </w:rPr>
+              <w:t>Corpus export lại trong thư mục tạm: 0 breadcrumb sai Khoản ở 11 và 21 văn bản; test_child_breadcrumb_has_only_own_clause pass.</w:t>
             </w:r>
           </w:p>
         </w:tc>
@@ -4168,7 +4292,7 @@
               <w:rPr>
                 <w:sz w:val="17"/>
               </w:rPr>
-              <w:t>chunking/chunking_rules.py: _chunk_structured_document (dòng 649), _split_long_clause_unit (dòng 278–332), _create_child_chunks_from_units (dòng 457–466, 534); parser/parser.py: build_clauses (dòng 444–470)</w:t>
+              <w:t>data/chunking_output/chunks.jsonl; chunking/export_legal_chunks.py: _assert_breadcrumb</w:t>
             </w:r>
           </w:p>
         </w:tc>
@@ -4193,17 +4317,17 @@
           <w:tcPr>
             <w:tcW w:type="dxa" w:w="964"/>
             <w:vAlign w:val="top"/>
-            <w:shd w:val="clear" w:color="auto" w:fill="FBE5D6"/>
-          </w:tcPr>
-          <w:p>
-            <w:pPr>
-              <w:spacing w:after="20" w:line="252" w:lineRule="auto"/>
-            </w:pPr>
-            <w:r>
-              <w:rPr>
-                <w:sz w:val="17"/>
-              </w:rPr>
-              <w:t>Còn</w:t>
+            <w:shd w:val="clear" w:color="auto" w:fill="FFF2CC"/>
+          </w:tcPr>
+          <w:p>
+            <w:pPr>
+              <w:spacing w:after="20" w:line="252" w:lineRule="auto"/>
+            </w:pPr>
+            <w:r>
+              <w:rPr>
+                <w:sz w:val="17"/>
+              </w:rPr>
+              <w:t>Còn một phần</w:t>
             </w:r>
           </w:p>
         </w:tc>
@@ -4223,7 +4347,7 @@
                 <w:b/>
                 <w:sz w:val="17"/>
               </w:rPr>
-              <w:t>B10</w:t>
+              <w:t>B5</w:t>
             </w:r>
           </w:p>
         </w:tc>
@@ -4231,17 +4355,17 @@
           <w:tcPr>
             <w:tcW w:type="dxa" w:w="1020"/>
             <w:vAlign w:val="top"/>
-            <w:shd w:val="clear" w:color="auto" w:fill="FCE8B2"/>
-          </w:tcPr>
-          <w:p>
-            <w:pPr>
-              <w:spacing w:after="20" w:line="252" w:lineRule="auto"/>
-            </w:pPr>
-            <w:r>
-              <w:rPr>
-                <w:sz w:val="17"/>
-              </w:rPr>
-              <w:t>Trung bình</w:t>
+            <w:shd w:val="clear" w:color="auto" w:fill="E2EFDA"/>
+          </w:tcPr>
+          <w:p>
+            <w:pPr>
+              <w:spacing w:after="20" w:line="252" w:lineRule="auto"/>
+            </w:pPr>
+            <w:r>
+              <w:rPr>
+                <w:sz w:val="17"/>
+              </w:rPr>
+              <w:t>Thấp</w:t>
             </w:r>
           </w:p>
         </w:tc>
@@ -4258,7 +4382,7 @@
               <w:rPr>
                 <w:sz w:val="17"/>
               </w:rPr>
-              <w:t>Cả corpus trong repo lẫn corpus sinh lại đều không còn “(phần n)” trong breadcrumb (CTM bỏ khi đổi chunk_id). Còn breadcrumb lặp dạng “Khoản 1-10 &gt; Khoản 2”: 138 chunk trong repo, 137 khi sinh lại (register v2: 229), vì điều kiện cl_ref_str not in child_bc chỉ so chuỗi con.</w:t>
+              <w:t>Nhóm chunk trùng nội dung: 12 nhóm (24 chunk) ở 11 văn bản, 31 nhóm khi đủ 21 văn bản; đều là văn bản mới chép quy định của văn bản cũ (vd Luật 22/2000 Điều 53 và Luật 52/2014 Điều 116 “Mức cấp dưỡng”) nên phải giữ, nhưng benchmark chưa có câu hỏi phân biệt văn bản cũ và mới để kiểm bộ lọc hiệu lực. 82 chunk dưới 20 từ (21 văn bản: 134) đều là Khoản ngắn trọn vẹn. Khối chữ ký và “Nơi nhận” lọt vào Điều cuối xử lý ở A21.</w:t>
             </w:r>
           </w:p>
           <w:p>
@@ -4276,7 +4400,7 @@
               <w:rPr>
                 <w:sz w:val="17"/>
               </w:rPr>
-              <w:t>Bỏ dải Khoản khỏi breadcrumb của Parent khi tạo child.</w:t>
+              <w:t>Dev 1 thêm vài câu benchmark cho các cặp trùng; theo dõi số chunk ngắn và nhóm trùng sau mỗi lần sinh lại.</w:t>
             </w:r>
           </w:p>
         </w:tc>
@@ -4293,7 +4417,7 @@
               <w:rPr>
                 <w:sz w:val="17"/>
               </w:rPr>
-              <w:t>chunking/chunking_rules.py: _create_child_chunks_from_units (dòng 459–474, 521), _chunk_structured_document (dòng 712–718)</w:t>
+              <w:t>data/benchmark/ground_truth.json; data/chunking_output/chunks.jsonl</w:t>
             </w:r>
           </w:p>
         </w:tc>
@@ -4310,7 +4434,7 @@
               <w:rPr>
                 <w:sz w:val="17"/>
               </w:rPr>
-              <w:t>Chunking</w:t>
+              <w:t>Dev 1</w:t>
             </w:r>
           </w:p>
         </w:tc>
@@ -4329,278 +4453,20 @@
                 <w:sz w:val="17"/>
               </w:rPr>
               <w:t>Còn một phần</w:t>
-            </w:r>
-          </w:p>
-        </w:tc>
-      </w:tr>
-      <w:tr>
-        <w:tc>
-          <w:tcPr>
-            <w:tcW w:type="dxa" w:w="624"/>
-            <w:vAlign w:val="top"/>
-          </w:tcPr>
-          <w:p>
-            <w:pPr>
-              <w:spacing w:after="20" w:line="252" w:lineRule="auto"/>
-            </w:pPr>
-            <w:r>
-              <w:rPr>
-                <w:b/>
-                <w:sz w:val="17"/>
-              </w:rPr>
-              <w:t>B12</w:t>
-            </w:r>
-          </w:p>
-        </w:tc>
-        <w:tc>
-          <w:tcPr>
-            <w:tcW w:type="dxa" w:w="1020"/>
-            <w:vAlign w:val="top"/>
-            <w:shd w:val="clear" w:color="auto" w:fill="E2EFDA"/>
-          </w:tcPr>
-          <w:p>
-            <w:pPr>
-              <w:spacing w:after="20" w:line="252" w:lineRule="auto"/>
-            </w:pPr>
-            <w:r>
-              <w:rPr>
-                <w:sz w:val="17"/>
-              </w:rPr>
-              <w:t>Thấp</w:t>
-            </w:r>
-          </w:p>
-        </w:tc>
-        <w:tc>
-          <w:tcPr>
-            <w:tcW w:type="dxa" w:w="4479"/>
-            <w:vAlign w:val="top"/>
-          </w:tcPr>
-          <w:p>
-            <w:pPr>
-              <w:spacing w:after="20" w:line="252" w:lineRule="auto"/>
-            </w:pPr>
-            <w:r>
-              <w:rPr>
-                <w:sz w:val="17"/>
-              </w:rPr>
-              <w:t>export_legal_chunks.py còn code sửa nhãn TT 02a/2015 (BAD_NAME, create_corrected_source ghi validity “Hết hiệu lực” và expiry_date cứng), chỉ chạy khi có parser/parsed_jsons/nd_158_2005_nd_cp.json, file không còn tồn tại. chunking_report.json vẫn ghi cảnh báo lỗi thời: “l_52_2014_qh13 chỉ có 131 điều”, “NQ01 Điều 8 chỉ có một khoản”. Nếu file cũ quay lại, code này ghi đè metadata của registry bằng giá trị cứng và ghi vào data/parser_validated/ (B4).</w:t>
-            </w:r>
-          </w:p>
-          <w:p>
-            <w:pPr>
-              <w:spacing w:after="20" w:line="252" w:lineRule="auto"/>
-            </w:pPr>
-            <w:r>
-              <w:rPr>
-                <w:b/>
-                <w:sz w:val="17"/>
-              </w:rPr>
-              <w:t xml:space="preserve">Đề xuất: </w:t>
-            </w:r>
-            <w:r>
-              <w:rPr>
-                <w:sz w:val="17"/>
-              </w:rPr>
-              <w:t>Xóa nhánh BAD_NAME và danh sách cảnh báo viết cứng; cảnh báo trong report sinh từ kiểm tra thật.</w:t>
-            </w:r>
-          </w:p>
-          <w:p>
-            <w:pPr>
-              <w:spacing w:after="20" w:line="252" w:lineRule="auto"/>
-            </w:pPr>
-            <w:r>
-              <w:rPr>
-                <w:b/>
-                <w:sz w:val="17"/>
-              </w:rPr>
-              <w:t xml:space="preserve">Kiểm chứng: </w:t>
-            </w:r>
-            <w:r>
-              <w:rPr>
-                <w:sz w:val="17"/>
-              </w:rPr>
-              <w:t>parsed_jsons không có nd_158_2005_nd_cp.json; parser hiện tại cho Luật 52/2014 133 Điều, NQ 01/2024 Điều 8 có 7 Khoản; các cảnh báo nằm cứng trong code ở dòng 294–299.</w:t>
-            </w:r>
-          </w:p>
-        </w:tc>
-        <w:tc>
-          <w:tcPr>
-            <w:tcW w:type="dxa" w:w="1701"/>
-            <w:vAlign w:val="top"/>
-          </w:tcPr>
-          <w:p>
-            <w:pPr>
-              <w:spacing w:after="20" w:line="252" w:lineRule="auto"/>
-            </w:pPr>
-            <w:r>
-              <w:rPr>
-                <w:sz w:val="17"/>
-              </w:rPr>
-              <w:t>chunking/export_legal_chunks.py (dòng 28–80, 154–162, 294–299); data/chunking_output/chunking_report.json</w:t>
-            </w:r>
-          </w:p>
-        </w:tc>
-        <w:tc>
-          <w:tcPr>
-            <w:tcW w:type="dxa" w:w="1077"/>
-            <w:vAlign w:val="top"/>
-          </w:tcPr>
-          <w:p>
-            <w:pPr>
-              <w:spacing w:after="20" w:line="252" w:lineRule="auto"/>
-            </w:pPr>
-            <w:r>
-              <w:rPr>
-                <w:sz w:val="17"/>
-              </w:rPr>
-              <w:t>Chunking</w:t>
-            </w:r>
-          </w:p>
-        </w:tc>
-        <w:tc>
-          <w:tcPr>
-            <w:tcW w:type="dxa" w:w="964"/>
-            <w:vAlign w:val="top"/>
-          </w:tcPr>
-          <w:p>
-            <w:pPr>
-              <w:spacing w:after="20" w:line="252" w:lineRule="auto"/>
-            </w:pPr>
-            <w:r>
-              <w:rPr>
-                <w:sz w:val="17"/>
-              </w:rPr>
-              <w:t>Mới</w:t>
-            </w:r>
-          </w:p>
-        </w:tc>
-      </w:tr>
-      <w:tr>
-        <w:tc>
-          <w:tcPr>
-            <w:tcW w:type="dxa" w:w="624"/>
-            <w:vAlign w:val="top"/>
-          </w:tcPr>
-          <w:p>
-            <w:pPr>
-              <w:spacing w:after="20" w:line="252" w:lineRule="auto"/>
-            </w:pPr>
-            <w:r>
-              <w:rPr>
-                <w:b/>
-                <w:sz w:val="17"/>
-              </w:rPr>
-              <w:t>B5</w:t>
-            </w:r>
-          </w:p>
-        </w:tc>
-        <w:tc>
-          <w:tcPr>
-            <w:tcW w:type="dxa" w:w="1020"/>
-            <w:vAlign w:val="top"/>
-            <w:shd w:val="clear" w:color="auto" w:fill="E2EFDA"/>
-          </w:tcPr>
-          <w:p>
-            <w:pPr>
-              <w:spacing w:after="20" w:line="252" w:lineRule="auto"/>
-            </w:pPr>
-            <w:r>
-              <w:rPr>
-                <w:sz w:val="17"/>
-              </w:rPr>
-              <w:t>Thấp</w:t>
-            </w:r>
-          </w:p>
-        </w:tc>
-        <w:tc>
-          <w:tcPr>
-            <w:tcW w:type="dxa" w:w="4479"/>
-            <w:vAlign w:val="top"/>
-          </w:tcPr>
-          <w:p>
-            <w:pPr>
-              <w:spacing w:after="20" w:line="252" w:lineRule="auto"/>
-            </w:pPr>
-            <w:r>
-              <w:rPr>
-                <w:sz w:val="17"/>
-              </w:rPr>
-              <w:t>Chunk dưới 20 từ tăng từ 51 lên 86 (sinh lại: 84) vì không còn gộp Khoản, đúng hướng B1. Nhóm trùng nội dung: 7 (sinh lại: 12), vẫn là cặp văn bản cũ/mới hợp lệ.</w:t>
-            </w:r>
-          </w:p>
-          <w:p>
-            <w:pPr>
-              <w:spacing w:after="20" w:line="252" w:lineRule="auto"/>
-            </w:pPr>
-            <w:r>
-              <w:rPr>
-                <w:b/>
-                <w:sz w:val="17"/>
-              </w:rPr>
-              <w:t xml:space="preserve">Đề xuất: </w:t>
-            </w:r>
-            <w:r>
-              <w:rPr>
-                <w:sz w:val="17"/>
-              </w:rPr>
-              <w:t>Giữ nguyên, theo dõi.</w:t>
-            </w:r>
-          </w:p>
-        </w:tc>
-        <w:tc>
-          <w:tcPr>
-            <w:tcW w:type="dxa" w:w="1701"/>
-            <w:vAlign w:val="top"/>
-          </w:tcPr>
-          <w:p>
-            <w:pPr>
-              <w:spacing w:after="20" w:line="252" w:lineRule="auto"/>
-            </w:pPr>
-            <w:r>
-              <w:rPr>
-                <w:sz w:val="17"/>
-              </w:rPr>
-              <w:t>chunking/chunking_rules.py: _create_child_chunks_from_units (dòng 540–558); chunking/chunking_strategy.md; data/chunking_output/chunks.jsonl</w:t>
-            </w:r>
-          </w:p>
-        </w:tc>
-        <w:tc>
-          <w:tcPr>
-            <w:tcW w:type="dxa" w:w="1077"/>
-            <w:vAlign w:val="top"/>
-          </w:tcPr>
-          <w:p>
-            <w:pPr>
-              <w:spacing w:after="20" w:line="252" w:lineRule="auto"/>
-            </w:pPr>
-            <w:r>
-              <w:rPr>
-                <w:sz w:val="17"/>
-              </w:rPr>
-              <w:t>Chunking</w:t>
-            </w:r>
-          </w:p>
-        </w:tc>
-        <w:tc>
-          <w:tcPr>
-            <w:tcW w:type="dxa" w:w="964"/>
-            <w:vAlign w:val="top"/>
-            <w:shd w:val="clear" w:color="auto" w:fill="FBE5D6"/>
-          </w:tcPr>
-          <w:p>
-            <w:pPr>
-              <w:spacing w:after="20" w:line="252" w:lineRule="auto"/>
-            </w:pPr>
-            <w:r>
-              <w:rPr>
-                <w:sz w:val="17"/>
-              </w:rPr>
-              <w:t>Còn</w:t>
             </w:r>
           </w:p>
         </w:tc>
       </w:tr>
     </w:tbl>
+    <w:p>
+      <w:pPr>
+        <w:spacing w:after="80"/>
+      </w:pPr>
+      <w:r>
+        <w:rPr/>
+        <w:t>Nhóm B đo ngày 24/10 trên nhánh chunking_test sau bản sửa chunking. B9, B12 đã sửa và được bỏ khỏi bảng. B1, B10, B13 đã sửa trong code nhưng giữ trong bảng vì corpus trong repo chưa sinh lại (parser A25, A26 và contract C3 chưa xong). Ba lỗi mới B14 (merge 1c40712 làm chunker lỗi cú pháp), B15 (intro của Điều không vào chunk con), B16 (Parent vượt ngưỡng khi intro trùng Khoản đầu dài) tìm thấy và sửa cùng đợt. Số liệu đo trên corpus sinh lại trong thư mục tạm ở Phụ lục F.</w:t>
+      </w:r>
+    </w:p>
     <w:p>
       <w:pPr>
         <w:spacing w:after="0"/>
@@ -12552,6 +12418,109 @@
             </w:pPr>
             <w:r>
               <w:rPr>
+                <w:sz w:val="17"/>
+              </w:rPr>
+              <w:t>test/test_chunking.py (chunking_test)</w:t>
+            </w:r>
+          </w:p>
+        </w:tc>
+        <w:tc>
+          <w:tcPr>
+            <w:tcW w:type="dxa" w:w="1300"/>
+            <w:vAlign w:val="top"/>
+          </w:tcPr>
+          <w:p>
+            <w:pPr>
+              <w:spacing w:after="20" w:line="252" w:lineRule="auto"/>
+            </w:pPr>
+            <w:r>
+              <w:rPr>
+                <w:sz w:val="17"/>
+              </w:rPr>
+              <w:t>—</w:t>
+            </w:r>
+          </w:p>
+        </w:tc>
+        <w:tc>
+          <w:tcPr>
+            <w:tcW w:type="dxa" w:w="1300"/>
+            <w:vAlign w:val="top"/>
+          </w:tcPr>
+          <w:p>
+            <w:pPr>
+              <w:spacing w:after="20" w:line="252" w:lineRule="auto"/>
+            </w:pPr>
+            <w:r>
+              <w:rPr>
+                <w:sz w:val="17"/>
+              </w:rPr>
+              <w:t>—</w:t>
+            </w:r>
+          </w:p>
+        </w:tc>
+        <w:tc>
+          <w:tcPr>
+            <w:tcW w:type="dxa" w:w="1300"/>
+            <w:vAlign w:val="top"/>
+          </w:tcPr>
+          <w:p>
+            <w:pPr>
+              <w:spacing w:after="20" w:line="252" w:lineRule="auto"/>
+            </w:pPr>
+            <w:r>
+              <w:rPr>
+                <w:sz w:val="17"/>
+              </w:rPr>
+              <w:t>1c40712: lỗi collect (SyntaxError); sau bản sửa: 14 pass, 21 subtest pass</w:t>
+            </w:r>
+          </w:p>
+        </w:tc>
+        <w:tc>
+          <w:tcPr>
+            <w:tcW w:type="dxa" w:w="2600"/>
+            <w:vAlign w:val="top"/>
+          </w:tcPr>
+          <w:p>
+            <w:pPr>
+              <w:spacing w:after="20" w:line="252" w:lineRule="auto"/>
+            </w:pPr>
+            <w:r>
+              <w:rPr>
+                <w:sz w:val="17"/>
+              </w:rPr>
+            </w:r>
+          </w:p>
+        </w:tc>
+        <w:tc>
+          <w:tcPr>
+            <w:tcW w:type="dxa" w:w="1166"/>
+            <w:vAlign w:val="top"/>
+          </w:tcPr>
+          <w:p>
+            <w:pPr>
+              <w:spacing w:after="20" w:line="252" w:lineRule="auto"/>
+            </w:pPr>
+            <w:r>
+              <w:rPr>
+                <w:sz w:val="17"/>
+              </w:rPr>
+              <w:t>B14</w:t>
+            </w:r>
+          </w:p>
+        </w:tc>
+      </w:tr>
+      <w:tr>
+        <w:tc>
+          <w:tcPr>
+            <w:tcW w:type="dxa" w:w="2200"/>
+            <w:vAlign w:val="top"/>
+          </w:tcPr>
+          <w:p>
+            <w:pPr>
+              <w:spacing w:after="20" w:line="252" w:lineRule="auto"/>
+            </w:pPr>
+            <w:r>
+              <w:rPr>
                 <w:b/>
                 <w:sz w:val="17"/>
               </w:rPr>
@@ -12624,7 +12593,7 @@
               <w:rPr>
                 <w:sz w:val="17"/>
               </w:rPr>
-              <w:t>Chạy riêng từng file; chạy chung tests/ và test/ vẫn lỗi collect. Chạy test làm bẩn git trở lại vì 72a7377 commit lại parser/__pycache__/*.pyc (H5).</w:t>
+              <w:t>Chạy riêng từng file; chạy chung tests/ và test/ vẫn lỗi collect. Chạy test làm bẩn git trở lại vì 72a7377 commit lại parser/__pycache__/*.pyc (H5). Sau bản sửa chunking 24/10 (chunking_test): 218 pass, 2 fail (thêm 14 test của test_chunking.py; 2 fail như trên).</w:t>
             </w:r>
           </w:p>
         </w:tc>
@@ -12663,7 +12632,7 @@
     <w:p>
       <w:pPr/>
       <w:r>
-        <w:t>Bảng dưới đây là thứ tự làm cho các lỗi còn mở sau khi gộp CTM và NMA, tính cả các lỗi mới A25, A26, B12. Mỗi bước ghi việc cụ thể, owner, điều kiện để bắt đầu và tiêu chí để coi là xong. Màu ở cột Bước: đỏ là đang chặn các bước sau, vàng là làm ngay khi có điều kiện, xanh là làm sau. Những lỗi đã sửa (mục 3) không có trong bảng.</w:t>
+        <w:t>Bảng dưới đây là thứ tự làm cho các lỗi còn mở sau khi gộp CTM và NMA, tính cả các lỗi mới A25, A26. Mỗi bước ghi việc cụ thể, owner, điều kiện để bắt đầu và tiêu chí để coi là xong. Màu ở cột Bước: đỏ là đang chặn các bước sau, vàng là làm ngay khi có điều kiện, xanh là làm sau. Những lỗi đã sửa (mục 3) không có trong bảng.</w:t>
       </w:r>
     </w:p>
     <w:tbl>
@@ -13131,10 +13100,9 @@
             </w:pPr>
             <w:r>
               <w:rPr>
-                <w:b w:val="0"/>
-                <w:sz w:val="17"/>
-              </w:rPr>
-              <w:t>Không ghi “Khoản 1” cho Điều không chia Khoản (B1). Breadcrumb của chunk = breadcrumb cấp Điều + “Khoản N” (B10). Exporter dừng khi thiếu underthesea; thống nhất phiên bản underthesea ở 2 file requirements (B2). Xóa code sửa nhãn TT 02a và cảnh báo lỗi thời (B12). Chạy export_legal_chunks.py và commit cùng PR với parser; CI kiểm chunks.jsonl khớp parsed_jsons (B11). Xóa corpus cũ, data/parser_validated/ và các mặc định trỏ file smoke (B4). Nếu kịp: chép câu dẫn của danh sách điểm vào embed_text (B9).</w:t>
+                <w:sz w:val="17"/>
+              </w:rPr>
+              <w:t>Code chunker đã sửa ngày 24/10 (Phụ lục F). Còn: chạy export_legal_chunks.py và commit cùng PR với parser, để corpus hết “Khoản 1” giả (B1), breadcrumb sai Khoản (B10) và được exporter mới kiểm chunk dưới 10 ký tự (B13); CI kiểm chunks.jsonl khớp parsed_jsons (B11). Xóa corpus cũ, data/parser_validated/ và các mặc định trỏ file smoke (B4). Ghim underthesea ở requirements-bkai.txt, tách từ câu hỏi cùng phiên bản (B2).</w:t>
             </w:r>
           </w:p>
         </w:tc>
@@ -13148,10 +13116,9 @@
             </w:pPr>
             <w:r>
               <w:rPr>
-                <w:b w:val="0"/>
-                <w:sz w:val="17"/>
-              </w:rPr>
-              <w:t>B11, B1, B10, B2, B12, B4, B9</w:t>
+                <w:sz w:val="17"/>
+              </w:rPr>
+              <w:t>B11, B1, B10, B13, B2, B4</w:t>
             </w:r>
           </w:p>
         </w:tc>
@@ -13165,10 +13132,9 @@
             </w:pPr>
             <w:r>
               <w:rPr>
-                <w:b w:val="0"/>
-                <w:sz w:val="17"/>
-              </w:rPr>
-              <w:t>Chunking (B2, B4 cùng Dev 4)</w:t>
+                <w:sz w:val="17"/>
+              </w:rPr>
+              <w:t>Chunking (B2: Dev 3 + Dev 4; B4 cùng Dev 4)</w:t>
             </w:r>
           </w:p>
         </w:tc>
@@ -13182,10 +13148,9 @@
             </w:pPr>
             <w:r>
               <w:rPr>
-                <w:b w:val="0"/>
-                <w:sz w:val="17"/>
-              </w:rPr>
-              <w:t>Sửa code: ngay. Chạy export và commit: sau bước 1 và 2.</w:t>
+                <w:sz w:val="17"/>
+              </w:rPr>
+              <w:t>Chạy export và commit: sau bước 1 và 2.</w:t>
             </w:r>
           </w:p>
         </w:tc>
@@ -13199,10 +13164,9 @@
             </w:pPr>
             <w:r>
               <w:rPr>
-                <w:b w:val="0"/>
-                <w:sz w:val="17"/>
-              </w:rPr>
-              <w:t>Report ghi tokenization_backend = underthesea; schema_test pass; 0 “CÔNG BÁO”, 0 “Khoản 1” giả, 0 breadcrumb lặp Khoản; 100% clause_id có trong parser.</w:t>
+                <w:sz w:val="17"/>
+              </w:rPr>
+              <w:t>Report ghi tokenization_backend = underthesea và tokenization_version; schema_test và test_chunking pass; 0 “CÔNG BÁO”, 0 “Khoản 1” giả, 0 breadcrumb lặp Khoản; 100% clause_id có trong parser.</w:t>
             </w:r>
           </w:p>
         </w:tc>
@@ -13802,7 +13766,7 @@
               <w:rPr>
                 <w:sz w:val="17"/>
               </w:rPr>
-              <w:t>A25 (corpus đang dùng thiếu khoản 4, 5 của Luật 52/2014 Điều 2) và A26 (exporter dừng ở NĐ 68/2002), rồi A8, A6, A21, A7.</w:t>
+              <w:t>A25 (corpus đang dùng thiếu khoản 4, 5 của Luật 52/2014 Điều 2) và A26 (Khoản viết thường của NĐ 68/2002, tiêu đề giả của Luật 1986), rồi A8, A6, A21, A7.</w:t>
             </w:r>
           </w:p>
         </w:tc>
@@ -13852,10 +13816,9 @@
             </w:pPr>
             <w:r>
               <w:rPr>
-                <w:b w:val="0"/>
-                <w:sz w:val="17"/>
-              </w:rPr>
-              <w:t>Sửa B1, B10, B2 ngay; chạy export khi bước 1 và 2 xong.</w:t>
+                <w:sz w:val="17"/>
+              </w:rPr>
+              <w:t>Code chunker đã sửa (24/10); chạy export và commit corpus khi bước 1 và 2 xong; xóa corpus cũ cùng Dev 4 (B4).</w:t>
             </w:r>
           </w:p>
         </w:tc>
@@ -13905,10 +13868,9 @@
             </w:pPr>
             <w:r>
               <w:rPr>
-                <w:b w:val="0"/>
-                <w:sz w:val="17"/>
-              </w:rPr>
-              <w:t>E12, E4, E3.</w:t>
+                <w:sz w:val="17"/>
+              </w:rPr>
+              <w:t>E12, E4, E3; ghim underthesea==9.5.0 trong requirements-bkai.txt (B2).</w:t>
             </w:r>
           </w:p>
         </w:tc>
@@ -14106,7 +14068,7 @@
     <w:p>
       <w:pPr/>
       <w:r>
-        <w:t>Chạy từ thư mục gốc repo, trên môi trường có underthesea:</w:t>
+        <w:t>Chạy từ thư mục gốc repo, trên môi trường có underthesea (exporter dừng nếu thiếu):</w:t>
       </w:r>
     </w:p>
     <w:p>
@@ -14144,7 +14106,7 @@
     <w:p>
       <w:pPr/>
       <w:r>
-        <w:t>Trước khi commit, kiểm 4 điều: report ghi tokenization_backend = “underthesea”; số chunk và parent hợp lý (parser 72a7377 cho 1.156 / 508 trên 11 văn bản cũ; trên đủ 21 văn bản exporter hiện dừng ở NĐ 68/2002, xem A26); Luật 52/2014 Điều 2 có đủ 5 Khoản (A25); tests/schema_test.py pass; git status không có file .pyc bị đổi (nếu có thì git checkout -- các thư mục __pycache__). Sau khi commit corpus phải làm tiếp bước 4 (map gold) và dựng lại index ở bước 5. Trước đó mọi số đo retrieval đều không chấm được.</w:t>
+        <w:t>Trước khi commit, kiểm 4 điều: report ghi tokenization_backend = “underthesea” và tokenization_version khớp phiên bản ghim; số chunk và parent hợp lý (chunker đã sửa trên parser 72a7377 cho 1.157 / 508 với 11 văn bản cũ và 2.003 / 923 với đủ 21 văn bản); Luật 52/2014 Điều 2 có đủ 5 Khoản (A25); tests/schema_test.py và test/test_chunking.py pass; git status không có file .pyc bị đổi (nếu có thì git checkout -- các thư mục __pycache__). Sau khi commit corpus phải làm tiếp bước 4 (map gold) và dựng lại index ở bước 5. Trước đó mọi số đo retrieval đều không chấm được.</w:t>
       </w:r>
     </w:p>
     <w:p>
@@ -16333,6 +16295,636 @@
                 <w:sz w:val="17"/>
               </w:rPr>
               <w:t>parser/ 32 pass, 1 fail (A25); schema_test 11 pass. Chạy test lại làm bẩn git vì parser/__pycache__/*.pyc được commit lại (H5).</w:t>
+            </w:r>
+          </w:p>
+        </w:tc>
+      </w:tr>
+    </w:tbl>
+    <w:p>
+      <w:pPr>
+        <w:spacing w:after="40"/>
+      </w:pPr>
+    </w:p>
+    <w:p>
+      <w:pPr>
+        <w:pStyle w:val="Heading1"/>
+      </w:pPr>
+      <w:r>
+        <w:rPr/>
+        <w:t>Phụ lục F. Kiểm lại và sửa nhóm B trên nhánh chunking_test</w:t>
+      </w:r>
+    </w:p>
+    <w:p>
+      <w:r>
+        <w:rPr/>
+        <w:t>Kiểm lại và sửa ngày 24/10/2026 trên nhánh chunking_test, commit 1c40712 (gộp testing f0a7007 vào chunking_test 16e4495). Code chunking được lấy lại từ f0a7007 rồi sửa theo đặc tả Sprint 5 (Chunking Engine: chia theo Điều/Khoản, Parent ≤ 1.500 ký tự, Child ≤ 256 token, tách từ bắt buộc, không nuốt lỗi), Sprint 6 (chunk_id là khóa xuyên suốt, chunk_text dùng để trích dẫn, Strict/Parent Match theo parent_clause_id), sơ đồ kiến trúc (Vietnamese NLP Pipeline → Hierarchical Parent-child Chunking → Qdrant, Elasticsearch, Parent-Context Resolver) và đề xuất của register v2 cho B5, B9, B10. Với intro của Điều, hai dự án trong RAG/ làm theo hai cách: Legal-RAG ghép phần dẫn của Điều vào text của chunk, Vietnamese-Legal-RAG-Assistant tạo chunk intro riêng và gắn tiền tố Chương–Điều–Khoản cho từng Khoản. Bản sửa chọn đưa intro vào embed_text vì contract yêu cầu parent_clause_id có trong parser (không có clause cho intro) và chunk_text phải giữ nguyên văn. File đổi: chunking/chunking_rules.py, export_legal_chunks.py, run_experiment.py, chunking_strategy.md, chunking_evaluation.xlsx, chunking_examples.json, test/test_chunking.py, requirements.txt (chưa commit). Cách kiểm: export trong thư mục tạm trên 11 văn bản cũ và đủ 21 parsed_jsons của 72a7377, so với corpus sinh bằng chunker f0a7007 từ cùng parsed_jsons; validate theo chunk_payload_schema.json và vector_store.normalize_chunk_record; chạy pytest từng file. Corpus trong repo không đổi. Số không ngoặc đo trên 11 văn bản cũ; số trong ngoặc đo trên 20 văn bản ở cột trước (chunker f0a7007 dừng ở NĐ 68/2002) và trên đủ 21 văn bản ở cột sau.</w:t>
+      </w:r>
+    </w:p>
+    <w:tbl>
+      <w:tblPr>
+        <w:tblStyle w:val="TableGrid"/>
+        <w:tblW w:type="auto" w:w="0"/>
+        <w:jc w:val="center"/>
+        <w:tblLayout w:type="fixed"/>
+        <w:tblLook w:firstColumn="1" w:firstRow="1" w:lastColumn="0" w:lastRow="0" w:noHBand="0" w:noVBand="1" w:val="04A0"/>
+      </w:tblPr>
+      <w:tblGrid>
+        <w:gridCol w:w="3289"/>
+        <w:gridCol w:w="3289"/>
+        <w:gridCol w:w="3289"/>
+      </w:tblGrid>
+      <w:tr>
+        <w:trPr>
+          <w:tblHeader w:val="true"/>
+        </w:trPr>
+        <w:tc>
+          <w:tcPr>
+            <w:tcW w:type="dxa" w:w="1100"/>
+            <w:shd w:val="clear" w:color="auto" w:fill="DCE6F1"/>
+          </w:tcPr>
+          <w:p>
+            <w:r>
+              <w:rPr>
+                <w:b/>
+                <w:sz w:val="17"/>
+              </w:rPr>
+              <w:t>#</w:t>
+            </w:r>
+          </w:p>
+        </w:tc>
+        <w:tc>
+          <w:tcPr>
+            <w:tcW w:type="dxa" w:w="3200"/>
+            <w:shd w:val="clear" w:color="auto" w:fill="DCE6F1"/>
+          </w:tcPr>
+          <w:p>
+            <w:r>
+              <w:rPr>
+                <w:b/>
+                <w:sz w:val="17"/>
+              </w:rPr>
+              <w:t>Chunker f0a7007 (testing)</w:t>
+            </w:r>
+          </w:p>
+        </w:tc>
+        <w:tc>
+          <w:tcPr>
+            <w:tcW w:type="dxa" w:w="5566"/>
+            <w:shd w:val="clear" w:color="auto" w:fill="DCE6F1"/>
+          </w:tcPr>
+          <w:p>
+            <w:r>
+              <w:rPr>
+                <w:b/>
+                <w:sz w:val="17"/>
+              </w:rPr>
+              <w:t>Sau bản sửa 24/10</w:t>
+            </w:r>
+          </w:p>
+        </w:tc>
+      </w:tr>
+      <w:tr>
+        <w:tc>
+          <w:tcPr>
+            <w:tcW w:type="dxa" w:w="1100"/>
+          </w:tcPr>
+          <w:p>
+            <w:r>
+              <w:rPr>
+                <w:b/>
+                <w:sz w:val="17"/>
+              </w:rPr>
+              <w:t>B14 (mới)</w:t>
+            </w:r>
+          </w:p>
+        </w:tc>
+        <w:tc>
+          <w:tcPr>
+            <w:tcW w:type="dxa" w:w="3200"/>
+          </w:tcPr>
+          <w:p>
+            <w:r>
+              <w:rPr>
+                <w:sz w:val="17"/>
+              </w:rPr>
+              <w:t>Ở chunking_test 1c40712, chunking_rules.py lỗi cú pháp (tham số parent_clause_id lặp ở dòng 625, 678) và dùng 12 tên chưa định nghĩa (_register_cid, min_words, article_ref, cl_num…); run_experiment.py dùng extra_candidates chưa định nghĩa. Merge trộn bản 16e4495 (17/10, trước CTM: gộp mảnh qua ranh giới Khoản, chunk_id kiểu cũ) với bản testing; exporter, test_chunking.py, scripts/build_index.py, demo_pipeline.py không import được.</w:t>
+            </w:r>
+          </w:p>
+        </w:tc>
+        <w:tc>
+          <w:tcPr>
+            <w:tcW w:type="dxa" w:w="5566"/>
+          </w:tcPr>
+          <w:p>
+            <w:r>
+              <w:rPr>
+                <w:sz w:val="17"/>
+              </w:rPr>
+              <w:t>Đã sửa. Lấy lại chunking_rules.py, run_experiment.py từ f0a7007 rồi sửa; giữ ý tưởng câu dẫn danh sách Điểm và cắt intro dài của 16e4495, bỏ phần gộp qua Khoản.</w:t>
+            </w:r>
+          </w:p>
+        </w:tc>
+      </w:tr>
+      <w:tr>
+        <w:tc>
+          <w:tcPr>
+            <w:tcW w:type="dxa" w:w="1100"/>
+          </w:tcPr>
+          <w:p>
+            <w:r>
+              <w:rPr>
+                <w:b/>
+                <w:sz w:val="17"/>
+              </w:rPr>
+              <w:t>B1</w:t>
+            </w:r>
+          </w:p>
+        </w:tc>
+        <w:tc>
+          <w:tcPr>
+            <w:tcW w:type="dxa" w:w="3200"/>
+          </w:tcPr>
+          <w:p>
+            <w:r>
+              <w:rPr>
+                <w:sz w:val="17"/>
+              </w:rPr>
+              <w:t>130 chunk (228) ghi “Khoản 1” cho Điều không chia Khoản ở clause_ref, breadcrumb, embed_text, metadata.clause_number; exporter không kiểm clause_id với parser.</w:t>
+            </w:r>
+          </w:p>
+        </w:tc>
+        <w:tc>
+          <w:tcPr>
+            <w:tcW w:type="dxa" w:w="5566"/>
+          </w:tcPr>
+          <w:p>
+            <w:r>
+              <w:rPr>
+                <w:sz w:val="17"/>
+              </w:rPr>
+              <w:t>Đã sửa trong code; corpus trong repo chờ sinh lại. Điều chỉ có 1 clause và nội dung không mở đầu bằng “1.” (128 Điều; 238): clause_ref = null, metadata.clause_number = null, breadcrumb không có Khoản; clause_id và chunk_id giữ nguyên theo contract. Exporter dừng khi clause_id không có trong parser. 0 chunk còn “Khoản 1” giả.</w:t>
+            </w:r>
+          </w:p>
+        </w:tc>
+      </w:tr>
+      <w:tr>
+        <w:tc>
+          <w:tcPr>
+            <w:tcW w:type="dxa" w:w="1100"/>
+          </w:tcPr>
+          <w:p>
+            <w:r>
+              <w:rPr>
+                <w:b/>
+                <w:sz w:val="17"/>
+              </w:rPr>
+              <w:t>B10</w:t>
+            </w:r>
+          </w:p>
+        </w:tc>
+        <w:tc>
+          <w:tcPr>
+            <w:tcW w:type="dxa" w:w="3200"/>
+          </w:tcPr>
+          <w:p>
+            <w:r>
+              <w:rPr>
+                <w:sz w:val="17"/>
+              </w:rPr>
+              <w:t>132 breadcrumb dạng “Khoản 1-10 &gt; Khoản 2” (223); 102 chunk (190) không có Khoản của mình vì so chuỗi con (“Khoản 1” nằm trong “Khoản 1-10”); 34 nhãn “Khoản 3-3”; 8 Parent có clause_refs đếm theo phần của Khoản.</w:t>
+            </w:r>
+          </w:p>
+        </w:tc>
+        <w:tc>
+          <w:tcPr>
+            <w:tcW w:type="dxa" w:w="5566"/>
+          </w:tcPr>
+          <w:p>
+            <w:r>
+              <w:rPr>
+                <w:sz w:val="17"/>
+              </w:rPr>
+              <w:t>Đã sửa trong code; corpus trong repo chờ sinh lại. Breadcrumb của chunk = breadcrumb cấp Điều + “Khoản N” (+ dải Điểm); dải Khoản của Parent tính theo số Khoản thật. 0 breadcrumb sai; exporter dừng khi breadcrumb của chunk có Khoản khác clause_ref.</w:t>
+            </w:r>
+          </w:p>
+        </w:tc>
+      </w:tr>
+      <w:tr>
+        <w:tc>
+          <w:tcPr>
+            <w:tcW w:type="dxa" w:w="1100"/>
+          </w:tcPr>
+          <w:p>
+            <w:r>
+              <w:rPr>
+                <w:b/>
+                <w:sz w:val="17"/>
+              </w:rPr>
+              <w:t>B9</w:t>
+            </w:r>
+          </w:p>
+        </w:tc>
+        <w:tc>
+          <w:tcPr>
+            <w:tcW w:type="dxa" w:w="3200"/>
+          </w:tcPr>
+          <w:p>
+            <w:r>
+              <w:rPr>
+                <w:sz w:val="17"/>
+              </w:rPr>
+              <w:t>point_ref rỗng ở 100% chunk; 25 phần (44) bắt đầu giữa danh sách Điểm không có câu dẫn; Khoản dài cắt theo câu, kể cả giữa một Điểm.</w:t>
+            </w:r>
+          </w:p>
+        </w:tc>
+        <w:tc>
+          <w:tcPr>
+            <w:tcW w:type="dxa" w:w="5566"/>
+          </w:tcPr>
+          <w:p>
+            <w:r>
+              <w:rPr>
+                <w:sz w:val="17"/>
+              </w:rPr>
+              <w:t>Đã sửa theo đề xuất của register v2. Khoản dài có danh sách Điểm được cắt tại ranh giới Điểm (một Điểm chỉ bị tách khi tự nó vượt giới hạn Child); point_ref ghi dải Điểm ở 73 chunk (153); 35 phần bắt đầu bằng Điểm (76) có câu dẫn trong embed_text, text giữ nguyên văn; 4 câu dẫn dài bị cắt bớt cho vừa 256 token.</w:t>
+            </w:r>
+          </w:p>
+        </w:tc>
+      </w:tr>
+      <w:tr>
+        <w:tc>
+          <w:tcPr>
+            <w:tcW w:type="dxa" w:w="1100"/>
+          </w:tcPr>
+          <w:p>
+            <w:r>
+              <w:rPr>
+                <w:b/>
+                <w:sz w:val="17"/>
+              </w:rPr>
+              <w:t>B15 (mới)</w:t>
+            </w:r>
+          </w:p>
+        </w:tc>
+        <w:tc>
+          <w:tcPr>
+            <w:tcW w:type="dxa" w:w="3200"/>
+          </w:tcPr>
+          <w:p>
+            <w:r>
+              <w:rPr>
+                <w:sz w:val="17"/>
+              </w:rPr>
+              <w:t>Intro của Điều (vd “Việc kết hôn bị cấm trong những trường hợp sau đây:”) chỉ nằm trong Parent, không có trong text hay embed_text của chunk nào: 41/41 Điều có intro, 1.230 từ (58/70 Điều, 1.898 từ); 13 câu benchmark có candidate ở các Điều này. Exporter chỉ kiểm intro trong Parent.</w:t>
+            </w:r>
+          </w:p>
+        </w:tc>
+        <w:tc>
+          <w:tcPr>
+            <w:tcW w:type="dxa" w:w="5566"/>
+          </w:tcPr>
+          <w:p>
+            <w:r>
+              <w:rPr>
+                <w:sz w:val="17"/>
+              </w:rPr>
+              <w:t>Đã sửa. Intro vào embed_text, embed_text_raw của mọi chunk trong Điều, tối đa 60 từ và trong giới hạn 256 token; text giữ nguyên văn: 41/41 Điều (78/78). Exporter dừng nếu intro không có trong chunk nào, cảnh báo khi intro bị cắt bớt (0; 4 Điều).</w:t>
+            </w:r>
+          </w:p>
+        </w:tc>
+      </w:tr>
+      <w:tr>
+        <w:tc>
+          <w:tcPr>
+            <w:tcW w:type="dxa" w:w="1100"/>
+          </w:tcPr>
+          <w:p>
+            <w:r>
+              <w:rPr>
+                <w:b/>
+                <w:sz w:val="17"/>
+              </w:rPr>
+              <w:t>B16 (mới)</w:t>
+            </w:r>
+          </w:p>
+        </w:tc>
+        <w:tc>
+          <w:tcPr>
+            <w:tcW w:type="dxa" w:w="3200"/>
+          </w:tcPr>
+          <w:p>
+            <w:r>
+              <w:rPr>
+                <w:sz w:val="17"/>
+              </w:rPr>
+              <w:t>Chunker so intro với phần đầu của Khoản đầu sau khi Khoản đã bị tách, nên giữ intro trùng nguyên văn: NĐ 68/2002 Điều 39 sinh Parent vượt 1.500 ký tự và exporter dừng trên 21 văn bản (nguyên nhân phía chunker của A26); ND04 Điều 26 (data/parser_validated) sinh Parent 2.814 ký tự. Parent đầu không trừ chỗ cho intro dài.</w:t>
+            </w:r>
+          </w:p>
+        </w:tc>
+        <w:tc>
+          <w:tcPr>
+            <w:tcW w:type="dxa" w:w="5566"/>
+          </w:tcPr>
+          <w:p>
+            <w:r>
+              <w:rPr>
+                <w:sz w:val="17"/>
+              </w:rPr>
+              <w:t>Đã sửa. So intro với Khoản gốc; nếu header + intro + phần đầu Khoản đầu vượt 1.500 ký tự thì tách phần đó nhỏ hơn, intro quá dài thì báo lỗi. Exporter chạy hết 21 văn bản; 0 Parent vượt ngưỡng. Header của Parent giữ tiêu đề Điều đầy đủ (12 Điều có tiêu đề trên 120 ký tự; 36), breadcrumb vẫn rút gọn.</w:t>
+            </w:r>
+          </w:p>
+        </w:tc>
+      </w:tr>
+      <w:tr>
+        <w:tc>
+          <w:tcPr>
+            <w:tcW w:type="dxa" w:w="1100"/>
+          </w:tcPr>
+          <w:p>
+            <w:r>
+              <w:rPr>
+                <w:b/>
+                <w:sz w:val="17"/>
+              </w:rPr>
+              <w:t>B12</w:t>
+            </w:r>
+          </w:p>
+        </w:tc>
+        <w:tc>
+          <w:tcPr>
+            <w:tcW w:type="dxa" w:w="3200"/>
+          </w:tcPr>
+          <w:p>
+            <w:r>
+              <w:rPr>
+                <w:sz w:val="17"/>
+              </w:rPr>
+              <w:t>Nhánh sửa nhãn TT 02a (BAD_NAME) và 3 cảnh báo viết cứng còn trong exporter; report ghi “l_52_2014_qh13 chỉ có 131 điều”.</w:t>
+            </w:r>
+          </w:p>
+        </w:tc>
+        <w:tc>
+          <w:tcPr>
+            <w:tcW w:type="dxa" w:w="5566"/>
+          </w:tcPr>
+          <w:p>
+            <w:r>
+              <w:rPr>
+                <w:sz w:val="17"/>
+              </w:rPr>
+              <w:t>Đã sửa. Xóa BAD_NAME, create_corrected_source và trường corrected_document; cảnh báo trong report sinh từ kiểm tra thật (mảnh ngắn, intro bị cắt, validity_status “Không xác định”).</w:t>
+            </w:r>
+          </w:p>
+        </w:tc>
+      </w:tr>
+      <w:tr>
+        <w:tc>
+          <w:tcPr>
+            <w:tcW w:type="dxa" w:w="1100"/>
+          </w:tcPr>
+          <w:p>
+            <w:r>
+              <w:rPr>
+                <w:b/>
+                <w:sz w:val="17"/>
+              </w:rPr>
+              <w:t>B13</w:t>
+            </w:r>
+          </w:p>
+        </w:tc>
+        <w:tc>
+          <w:tcPr>
+            <w:tcW w:type="dxa" w:w="3200"/>
+          </w:tcPr>
+          <w:p>
+            <w:r>
+              <w:rPr>
+                <w:sz w:val="17"/>
+              </w:rPr>
+              <w:t>0 chunk dưới 10 ký tự từ khi A24 được sửa; exporter không chặn.</w:t>
+            </w:r>
+          </w:p>
+        </w:tc>
+        <w:tc>
+          <w:tcPr>
+            <w:tcW w:type="dxa" w:w="5566"/>
+          </w:tcPr>
+          <w:p>
+            <w:r>
+              <w:rPr>
+                <w:sz w:val="17"/>
+              </w:rPr>
+              <w:t>Đã sửa trong code; corpus trong repo chờ sinh lại. Đuôi dưới 10 ký tự gộp vào phần trước (đã có ở bản testing; mô tả trước ghi nhầm là chưa làm); exporter dừng khi còn chunk dưới 10 ký tự. 0 chunk ở cả hai corpus.</w:t>
+            </w:r>
+          </w:p>
+        </w:tc>
+      </w:tr>
+      <w:tr>
+        <w:tc>
+          <w:tcPr>
+            <w:tcW w:type="dxa" w:w="1100"/>
+          </w:tcPr>
+          <w:p>
+            <w:r>
+              <w:rPr>
+                <w:b/>
+                <w:sz w:val="17"/>
+              </w:rPr>
+              <w:t>B5</w:t>
+            </w:r>
+          </w:p>
+        </w:tc>
+        <w:tc>
+          <w:tcPr>
+            <w:tcW w:type="dxa" w:w="3200"/>
+          </w:tcPr>
+          <w:p>
+            <w:r>
+              <w:rPr>
+                <w:sz w:val="17"/>
+              </w:rPr>
+              <w:t>CHILD_MIN_WORDS không dùng ở nhánh có cấu trúc, nên Config A và D cho cùng kết quả; bảng của chunking_strategy.md lấy từ chunker cũ (13 tài liệu, có data/parser_validated).</w:t>
+            </w:r>
+          </w:p>
+        </w:tc>
+        <w:tc>
+          <w:tcPr>
+            <w:tcW w:type="dxa" w:w="5566"/>
+          </w:tcPr>
+          <w:p>
+            <w:r>
+              <w:rPr>
+                <w:sz w:val="17"/>
+              </w:rPr>
+              <w:t>Mảnh dưới 20 từ của cùng Khoản được gộp hoặc dời ranh giới: 0 mảnh (Config D không gộp: 3); 82 chunk dưới 20 từ (134) đều là Khoản trọn vẹn. child_min_words, child_max_units đọc từ config; chunking_strategy.md, chunking_evaluation.xlsx, chunking_examples.json sinh lại trên 21 văn bản. Còn câu benchmark cho cặp trùng (mục 3).</w:t>
+            </w:r>
+          </w:p>
+        </w:tc>
+      </w:tr>
+      <w:tr>
+        <w:tc>
+          <w:tcPr>
+            <w:tcW w:type="dxa" w:w="1100"/>
+          </w:tcPr>
+          <w:p>
+            <w:r>
+              <w:rPr>
+                <w:b/>
+                <w:sz w:val="17"/>
+              </w:rPr>
+              <w:t>B2</w:t>
+            </w:r>
+          </w:p>
+        </w:tc>
+        <w:tc>
+          <w:tcPr>
+            <w:tcW w:type="dxa" w:w="3200"/>
+          </w:tcPr>
+          <w:p>
+            <w:r>
+              <w:rPr>
+                <w:sz w:val="17"/>
+              </w:rPr>
+              <w:t>Corpus trong repo fallback_whitespace; word_segment trả text gốc khi thiếu underthesea; hai file requirements mâu thuẫn.</w:t>
+            </w:r>
+          </w:p>
+        </w:tc>
+        <w:tc>
+          <w:tcPr>
+            <w:tcW w:type="dxa" w:w="5566"/>
+          </w:tcPr>
+          <w:p>
+            <w:r>
+              <w:rPr>
+                <w:sz w:val="17"/>
+              </w:rPr>
+              <w:t>word_segment và exporter dừng khi thiếu underthesea; report ghi tokenization_version = 9.5.0; requirements.txt ghim underthesea==9.5.0. Corpus sinh lại: seg_text khác text ở 100% chunk. Còn requirements-bkai.txt và phía truy vấn (mục 3).</w:t>
+            </w:r>
+          </w:p>
+        </w:tc>
+      </w:tr>
+      <w:tr>
+        <w:tc>
+          <w:tcPr>
+            <w:tcW w:type="dxa" w:w="1100"/>
+          </w:tcPr>
+          <w:p>
+            <w:r>
+              <w:rPr>
+                <w:b/>
+                <w:sz w:val="17"/>
+              </w:rPr>
+              <w:t>B3, B4, B7</w:t>
+            </w:r>
+          </w:p>
+        </w:tc>
+        <w:tc>
+          <w:tcPr>
+            <w:tcW w:type="dxa" w:w="3200"/>
+          </w:tcPr>
+          <w:p>
+            <w:r>
+              <w:rPr>
+                <w:sz w:val="17"/>
+              </w:rPr>
+              <w:t>Như mục 3.</w:t>
+            </w:r>
+          </w:p>
+        </w:tc>
+        <w:tc>
+          <w:tcPr>
+            <w:tcW w:type="dxa" w:w="5566"/>
+          </w:tcPr>
+          <w:p>
+            <w:r>
+              <w:rPr>
+                <w:sz w:val="17"/>
+              </w:rPr>
+              <w:t>B3: 0 ID mất, 1 ID mới, 20 ID đổi nội dung (candidate của 4 câu). B4: chunking không còn đọc data/parser_validated/ (test_chunking.py, run_experiment.py chỉ đọc parser/parsed_jsons). B7: cấu trúc bản ghi không đổi; source_url có ở 100% chunk.</w:t>
+            </w:r>
+          </w:p>
+        </w:tc>
+      </w:tr>
+      <w:tr>
+        <w:tc>
+          <w:tcPr>
+            <w:tcW w:type="dxa" w:w="1100"/>
+          </w:tcPr>
+          <w:p>
+            <w:r>
+              <w:rPr>
+                <w:b/>
+                <w:sz w:val="17"/>
+              </w:rPr>
+              <w:t>Corpus</w:t>
+            </w:r>
+          </w:p>
+        </w:tc>
+        <w:tc>
+          <w:tcPr>
+            <w:tcW w:type="dxa" w:w="3200"/>
+          </w:tcPr>
+          <w:p>
+            <w:r>
+              <w:rPr>
+                <w:sz w:val="17"/>
+              </w:rPr>
+              <w:t>Repo: 1.156 chunk, 508 parent, fallback_whitespace. Chunker f0a7007 trên 21 văn bản: dừng ở NĐ 68/2002.</w:t>
+            </w:r>
+          </w:p>
+        </w:tc>
+        <w:tc>
+          <w:tcPr>
+            <w:tcW w:type="dxa" w:w="5566"/>
+          </w:tcPr>
+          <w:p>
+            <w:r>
+              <w:rPr>
+                <w:sz w:val="17"/>
+              </w:rPr>
+              <w:t>Repo không đổi. Chunker đã sửa: 11 văn bản 1.157 chunk, 508 parent; 21 văn bản 2.003 chunk, 923 parent; pass chunk_payload_schema.json và vector_store.normalize_chunk_record ở 100% chunk.</w:t>
+            </w:r>
+          </w:p>
+        </w:tc>
+      </w:tr>
+      <w:tr>
+        <w:tc>
+          <w:tcPr>
+            <w:tcW w:type="dxa" w:w="1100"/>
+          </w:tcPr>
+          <w:p>
+            <w:r>
+              <w:rPr>
+                <w:b/>
+                <w:sz w:val="17"/>
+              </w:rPr>
+              <w:t>Test</w:t>
+            </w:r>
+          </w:p>
+        </w:tc>
+        <w:tc>
+          <w:tcPr>
+            <w:tcW w:type="dxa" w:w="3200"/>
+          </w:tcPr>
+          <w:p>
+            <w:r>
+              <w:rPr>
+                <w:sz w:val="17"/>
+              </w:rPr>
+              <w:t>test_chunking.py lỗi collect (B14). Test mới chạy trên chunker f0a7007: 9 test và 1 subtest fail.</w:t>
+            </w:r>
+          </w:p>
+        </w:tc>
+        <w:tc>
+          <w:tcPr>
+            <w:tcW w:type="dxa" w:w="5566"/>
+          </w:tcPr>
+          <w:p>
+            <w:r>
+              <w:rPr>
+                <w:sz w:val="17"/>
+              </w:rPr>
+              <w:t>test_chunking.py 14 pass, 21 subtest pass; toàn bộ 218 pass, 2 fail (A25 và H9, như mục 4).</w:t>
             </w:r>
           </w:p>
         </w:tc>

</xml_diff>

<commit_message>
docs: add untitled-article fix and TT 04/2020 section parsing issue to recheck report
</commit_message>
<xml_diff>
--- a/docs/sprint6_issue_recheck_after_merge.docx
+++ b/docs/sprint6_issue_recheck_after_merge.docx
@@ -34,7 +34,7 @@
         <w:rPr>
           <w:sz w:val="19"/>
         </w:rPr>
-        <w:t>Cập nhật 23/10/2026: kiểm lại sau khi gộp origin/CTM ee755a5 vào testing (commit e64c49a). Mục 3 chỉ ghi phần còn lỗi tính tới e64c49a, gồm cả 7 lỗi mới. Cùng ngày, nhóm A được kiểm lại toàn bộ trên e64c49a (Phụ lục C); A24 và Phụ lục B (kết quả kiểm nhóm A trên e9ee31d ngày 22/10) bị mất trong lần cập nhật trước nên được ghi lại. Cũng ngày 23/10, nhóm C được kiểm lại toàn bộ trên bafe1e8, gồm phân tích lại C6 (Phụ lục D). Ngày 24/10/2026, sau khi kéo nhánh NMA mới nhất (testing fast-forward lên 72a7377), nhóm A được kiểm lại toàn bộ (Phụ lục E): A13, A23, A24 đã sửa và được bỏ khỏi bảng; thêm 2 lỗi mới A25, A26. Cũng ngày 24/10, nhóm B được kiểm lại và sửa trên nhánh chunking_test (Phụ lục F): B9, B12 đã sửa và được bỏ khỏi bảng; B1, B10, B13 đã sửa trong code nhưng còn trong bảng cho tới khi corpus trong repo được sinh lại; thêm 3 lỗi mới B14, B15, B16, đều đã sửa.</w:t>
+        <w:t>Cập nhật 23/10/2026: kiểm lại sau khi gộp origin/CTM ee755a5 vào testing (commit e64c49a). Mục 3 chỉ ghi phần còn lỗi tính tới e64c49a, gồm cả 7 lỗi mới. Cùng ngày, nhóm A được kiểm lại toàn bộ trên e64c49a (Phụ lục C); A24 và Phụ lục B (kết quả kiểm nhóm A trên e9ee31d ngày 22/10) bị mất trong lần cập nhật trước nên được ghi lại. Cũng ngày 23/10, nhóm C được kiểm lại toàn bộ trên bafe1e8, gồm phân tích lại C6 (Phụ lục D). Ngày 24/10/2026, sau khi kéo nhánh NMA mới nhất (testing fast-forward lên 72a7377), nhóm A được kiểm lại toàn bộ (Phụ lục E): A13, A23, A24 đã sửa và được bỏ khỏi bảng; thêm 2 lỗi mới A25, A26. Cũng ngày 24/10, nhóm B được kiểm lại và sửa trên nhánh chunking_test (Phụ lục F): B9, B12 đã sửa và được bỏ khỏi bảng; B1, B10, B13 đã sửa trong code nhưng còn trong bảng cho tới khi corpus trong repo được sinh lại; thêm 3 lỗi mới B14, B15, B16, đều đã sửa. Kiểm lại chunking sau commit: thêm B17 (chunker lấy câu đầu intro làm tiêu đề, đã sửa) và A27 (parser không nhận nhãn “Mục N.”, TT 04/2020 mất cấp Mục).</w:t>
       </w:r>
     </w:p>
     <w:p>
@@ -50,7 +50,7 @@
         <w:spacing w:after="80"/>
       </w:pPr>
       <w:r>
-        <w:t>Trong 67 lỗi của register v2, tính tới commit e64c49a (nhóm A tính tới 72a7377, nhóm B tính tới bản sửa chunking ngày 24/10, nhóm C tính tới bafe1e8): 21 đã sửa, 1 đóng, 17 còn một phần, 3 đổi tính chất, 2 nặng hơn, 23 còn nguyên. Phát hiện thêm 17 lỗi mới: A22, A23, A24, B11, B12 (22/10; A22, A23, A24, B11 và B12 nay đã sửa), B13 (nay sửa trong code, chờ sinh lại corpus), C6, C7, C8, C9, D5, H9 (23/10, sau khi gộp CTM; C7 nay sửa một phần ở af8ee9a), A25, A26 (24/10, sau khi kéo NMA 72a7377) và B14, B15, B16 (24/10, khi kiểm lại nhóm B; đã sửa). Trong 15 lỗi mức Cao, 6 đã sửa (A1, A12, A13, A14, E15, C1), 9 còn mở. Nhóm A, B, C đã được kiểm lại lần 2 trên commit 75dd586; các chỗ đính chính ghi ở Phụ lục A. Nhóm A được kiểm lại lần 3 trên e9ee31d (Phụ lục B), lần 4 trên e64c49a (Phụ lục C) và lần 5 trên 72a7377 (Phụ lục E). Ngày 23/10 kiểm lại các lỗi liên quan tới thay đổi của CTM và toàn bộ nhóm A; nhóm C được kiểm lại toàn bộ trên bafe1e8 (Phụ lục D); ngày 24/10 nhóm B được kiểm lại và sửa trên nhánh chunking_test (Phụ lục F); các lỗi còn lại giữ kết quả ngày 22/10.</w:t>
+        <w:t>Trong 67 lỗi của register v2, tính tới commit e64c49a (nhóm A tính tới 72a7377, nhóm B tính tới bản sửa chunking ngày 24/10, nhóm C tính tới bafe1e8): 21 đã sửa, 1 đóng, 17 còn một phần, 3 đổi tính chất, 2 nặng hơn, 23 còn nguyên. Phát hiện thêm 19 lỗi mới: A22, A23, A24, B11, B12 (22/10; A22, A23, A24, B11 và B12 nay đã sửa), B13 (nay sửa trong code, chờ sinh lại corpus), C6, C7, C8, C9, D5, H9 (23/10, sau khi gộp CTM; C7 nay sửa một phần ở af8ee9a), A25, A26 (24/10, sau khi kéo NMA 72a7377) B14, B15, B16, B17 (24/10, khi kiểm lại nhóm B; đã sửa) và A27 (24/10, khi kiểm lại corpus thử 21 văn bản). Trong 15 lỗi mức Cao, 6 đã sửa (A1, A12, A13, A14, E15, C1), 9 còn mở. Nhóm A, B, C đã được kiểm lại lần 2 trên commit 75dd586; các chỗ đính chính ghi ở Phụ lục A. Nhóm A được kiểm lại lần 3 trên e9ee31d (Phụ lục B), lần 4 trên e64c49a (Phụ lục C) và lần 5 trên 72a7377 (Phụ lục E). Ngày 23/10 kiểm lại các lỗi liên quan tới thay đổi của CTM và toàn bộ nhóm A; nhóm C được kiểm lại toàn bộ trên bafe1e8 (Phụ lục D); ngày 24/10 nhóm B được kiểm lại và sửa trên nhánh chunking_test (Phụ lục F); các lỗi còn lại giữ kết quả ngày 22/10.</w:t>
       </w:r>
     </w:p>
     <w:p>
@@ -2019,7 +2019,7 @@
         <w:spacing w:after="80"/>
       </w:pPr>
       <w:r>
-        <w:t>Lỗi mới (trạng thái “Mới”) là mười bảy lỗi chưa có trong register v2, mã nối tiếp register v2 theo nhóm. Năm lỗi tìm thấy ngày 22/10 khi kiểm lại sau lần gộp CTM và NMA (A22–A24 thuộc Parser; B11, B12 thuộc Chunking; A24 tìm thấy khi kiểm lại e9ee31d, do bản sửa A23 ở NMA 41802ab gây ra). Bảy lỗi tìm thấy ngày 23/10 sau khi gộp CTM ee755a5 (B13 thuộc Chunking; C6–C9, D5, H9 thuộc CTM). Hai lỗi tìm thấy ngày 24/10 sau khi kéo NMA 72a7377 (A25, A26 thuộc Parser; A25 do chính bản sửa A6 và A13 gây ra). Ba lỗi tìm thấy ngày 24/10 khi kiểm lại nhóm B trên nhánh chunking_test (B14, B15, B16 thuộc Chunking) đã sửa cùng đợt nên không có trong bảng (Phụ lục F).</w:t>
+        <w:t>Lỗi mới (trạng thái “Mới”) là mười chín lỗi chưa có trong register v2, mã nối tiếp register v2 theo nhóm. Năm lỗi tìm thấy ngày 22/10 khi kiểm lại sau lần gộp CTM và NMA (A22–A24 thuộc Parser; B11, B12 thuộc Chunking; A24 tìm thấy khi kiểm lại e9ee31d, do bản sửa A23 ở NMA 41802ab gây ra). Bảy lỗi tìm thấy ngày 23/10 sau khi gộp CTM ee755a5 (B13 thuộc Chunking; C6–C9, D5, H9 thuộc CTM). Hai lỗi tìm thấy ngày 24/10 sau khi kéo NMA 72a7377 (A25, A26 thuộc Parser; A25 do chính bản sửa A6 và A13 gây ra). Bốn lỗi tìm thấy ngày 24/10 khi kiểm lại nhóm B trên nhánh chunking_test (B14–B17 thuộc Chunking) đã sửa cùng đợt nên không có trong bảng (Phụ lục F); A27 (Parser) tìm thấy cùng ngày khi kiểm lại corpus thử 21 văn bản.</w:t>
       </w:r>
     </w:p>
     <w:p>
@@ -2027,7 +2027,7 @@
         <w:spacing w:after="80"/>
       </w:pPr>
       <w:r>
-        <w:t>Các lỗi đã sửa hoặc đã đóng mà không còn việc gì được bỏ khỏi bảng (vẫn tính trong thống kê ở mục 1; kết quả kiểm nhóm A ở Phụ lục C và Phụ lục E, nhóm B ở Phụ lục F): A1, A5, A10, A12, A13, A14, A15, A17, A18, A19, A20, A22, A23, A24, B8, B9, B11, B12, B14, B15, B16, C1, E5. Phần còn lại của A22 (thông báo lỗi in chữ \n) và việc thêm test cho A23, A24 nằm ở A7; đề xuất kiểm tra CI của B11 nằm ở bước 3 mục 5.</w:t>
+        <w:t>Các lỗi đã sửa hoặc đã đóng mà không còn việc gì được bỏ khỏi bảng (vẫn tính trong thống kê ở mục 1; kết quả kiểm nhóm A ở Phụ lục C và Phụ lục E, nhóm B ở Phụ lục F): A1, A5, A10, A12, A13, A14, A15, A17, A18, A19, A20, A22, A23, A24, B8, B9, B11, B12, B14, B15, B16, B17, C1, E5. Phần còn lại của A22 (thông báo lỗi in chữ \n) và việc thêm test cho A23, A24 nằm ở A7; đề xuất kiểm tra CI của B11 nằm ở bước 3 mục 5.</w:t>
       </w:r>
     </w:p>
     <w:p>
@@ -2472,6 +2472,148 @@
                 <w:b/>
                 <w:sz w:val="17"/>
               </w:rPr>
+              <w:t>A27</w:t>
+            </w:r>
+          </w:p>
+        </w:tc>
+        <w:tc>
+          <w:tcPr>
+            <w:tcW w:type="dxa" w:w="1020"/>
+            <w:vAlign w:val="top"/>
+            <w:shd w:val="clear" w:color="auto" w:fill="FCE8B2"/>
+          </w:tcPr>
+          <w:p>
+            <w:pPr>
+              <w:spacing w:after="20" w:line="252" w:lineRule="auto"/>
+            </w:pPr>
+            <w:r>
+              <w:rPr>
+                <w:sz w:val="17"/>
+              </w:rPr>
+              <w:t>Trung bình</w:t>
+            </w:r>
+          </w:p>
+        </w:tc>
+        <w:tc>
+          <w:tcPr>
+            <w:tcW w:type="dxa" w:w="4479"/>
+            <w:vAlign w:val="top"/>
+          </w:tcPr>
+          <w:p>
+            <w:pPr>
+              <w:spacing w:after="20" w:line="252" w:lineRule="auto"/>
+            </w:pPr>
+            <w:r>
+              <w:rPr>
+                <w:sz w:val="17"/>
+              </w:rPr>
+              <w:t>TT 04/2020/TT-BTP (văn bản bổ sung ở 72a7377, chưa vào corpus) mất toàn bộ cấp Mục: 39/39 Điều có section = null. Tên 6/8 Mục bị nuốt vào cuối Khoản cuối của Điều đứng trước, vd Điều 10 khoản 2 kết thúc bằng “Mục 2. ĐĂNG KÝ KẾT HÔN, CẤP GIẤY XÁC NHẬN TÌNH TRẠNG HÔN NHÂN” (thêm Điều 12 khoản 5, Điều 16 khoản 4, Điều 20 khoản 2, Điều 23 khoản 3, Điều 28 khoản 5); 2 tên “Mục 1” đứng sau tên Chương II, III không còn ở trường nào. Nguyên nhân: _HEADING_LABEL chỉ cho dấu hai chấm sau số (“Mục 2:”) và HEAD_LABEL_RE đòi khoảng trắng ngay sau nhãn, nên nhãn có dấu chấm (“Mục 2.”, “Chương II.”) không được nhận là heading. Trong 23 TXT, chỉ TT 04/2020 viết Mục kiểu này. Khi văn bản vào corpus, 6 chunk mang tên Mục như nội dung Khoản và breadcrumb của mọi chunk thiếu Mục. Chunker không sửa được vì tên Mục đã nằm trong clause_text.</w:t>
+            </w:r>
+          </w:p>
+          <w:p>
+            <w:pPr>
+              <w:spacing w:after="20" w:line="252" w:lineRule="auto"/>
+            </w:pPr>
+            <w:r>
+              <w:rPr>
+                <w:b/>
+                <w:sz w:val="17"/>
+              </w:rPr>
+              <w:t xml:space="preserve">Đề xuất: </w:t>
+            </w:r>
+            <w:r>
+              <w:rPr>
+                <w:sz w:val="17"/>
+              </w:rPr>
+              <w:t>Cho _HEADING_LABEL nhận cả dấu chấm sau số Chương/Mục (vd \s*[:.]?) và thêm test cho TT 04/2020: 8 Mục, section khác null, không Khoản nào chứa “Mục N.”.</w:t>
+            </w:r>
+          </w:p>
+          <w:p>
+            <w:pPr>
+              <w:spacing w:after="20" w:line="252" w:lineRule="auto"/>
+            </w:pPr>
+            <w:r>
+              <w:rPr>
+                <w:b/>
+                <w:sz w:val="17"/>
+              </w:rPr>
+              <w:t xml:space="preserve">Kiểm chứng: </w:t>
+            </w:r>
+            <w:r>
+              <w:rPr>
+                <w:sz w:val="17"/>
+              </w:rPr>
+              <w:t>HEAD_LABEL_RE.search("Mục 2. ĐĂNG KÝ KẾT HÔN") trả None; “Mục 2 ĐĂNG KÝ…” và “Mục 2: ĐĂNG KÝ” khớp. parser/cleaned_texts/TT_04_2020_BTP.txt có 8 dòng “Mục N.” (dòng 81–519); tt_04_2020_tt_btp.json: 0/39 Điều có section, 6 Khoản chứa tên Mục. Corpus thử 21 văn bản: tt_04_2020_tt_btp_art_10_clause_2_chunk_2 và …_art_23_clause_3_chunk_2 kết thúc bằng tên Mục.</w:t>
+            </w:r>
+          </w:p>
+        </w:tc>
+        <w:tc>
+          <w:tcPr>
+            <w:tcW w:type="dxa" w:w="1701"/>
+            <w:vAlign w:val="top"/>
+          </w:tcPr>
+          <w:p>
+            <w:pPr>
+              <w:spacing w:after="20" w:line="252" w:lineRule="auto"/>
+            </w:pPr>
+            <w:r>
+              <w:rPr>
+                <w:sz w:val="17"/>
+              </w:rPr>
+              <w:t>parser/parser.py: _HEADING_LABEL, HEAD_LABEL_RE (dòng 93–94), iter_headings (dòng 131), parse_text_to_articles (dòng 850–866); parser/parsed_jsons/tt_04_2020_tt_btp.json</w:t>
+            </w:r>
+          </w:p>
+        </w:tc>
+        <w:tc>
+          <w:tcPr>
+            <w:tcW w:type="dxa" w:w="1077"/>
+            <w:vAlign w:val="top"/>
+          </w:tcPr>
+          <w:p>
+            <w:pPr>
+              <w:spacing w:after="20" w:line="252" w:lineRule="auto"/>
+            </w:pPr>
+            <w:r>
+              <w:rPr>
+                <w:sz w:val="17"/>
+              </w:rPr>
+              <w:t>Parser</w:t>
+            </w:r>
+          </w:p>
+        </w:tc>
+        <w:tc>
+          <w:tcPr>
+            <w:tcW w:type="dxa" w:w="964"/>
+            <w:vAlign w:val="top"/>
+          </w:tcPr>
+          <w:p>
+            <w:pPr>
+              <w:spacing w:after="20" w:line="252" w:lineRule="auto"/>
+            </w:pPr>
+            <w:r>
+              <w:rPr>
+                <w:sz w:val="17"/>
+              </w:rPr>
+              <w:t>Mới</w:t>
+            </w:r>
+          </w:p>
+        </w:tc>
+      </w:tr>
+      <w:tr>
+        <w:tc>
+          <w:tcPr>
+            <w:tcW w:type="dxa" w:w="624"/>
+            <w:vAlign w:val="top"/>
+          </w:tcPr>
+          <w:p>
+            <w:pPr>
+              <w:spacing w:after="20" w:line="252" w:lineRule="auto"/>
+            </w:pPr>
+            <w:r>
+              <w:rPr>
+                <w:b/>
+                <w:sz w:val="17"/>
+              </w:rPr>
               <w:t>A16</w:t>
             </w:r>
           </w:p>
@@ -3214,7 +3356,7 @@
       </w:pPr>
       <w:r>
         <w:rPr/>
-        <w:t>Nhóm A đo trên 72a7377 (24/10). A13, A23, A24 đã sửa và được bỏ khỏi bảng; phần test còn thiếu của A23, A24 chuyển sang A7. Corpus trong repo được sinh từ bản parse mới cho 11 văn bản cũ, nên mang cả A25. Hai lỗi mới do chính các bản sửa (A25) và các văn bản bổ sung (A26) gây ra. Số liệu đo ở Phụ lục E.</w:t>
+        <w:t>Nhóm A đo trên 72a7377 (24/10). A13, A23, A24 đã sửa và được bỏ khỏi bảng; phần test còn thiếu của A23, A24 chuyển sang A7. Corpus trong repo được sinh từ bản parse mới cho 11 văn bản cũ, nên mang cả A25. Hai lỗi mới do chính các bản sửa (A25) và các văn bản bổ sung (A26) gây ra. Số liệu đo ở Phụ lục E. A27 (TT 04/2020 mất cấp Mục) tìm thấy ngày 24/10 khi kiểm lại corpus thử 21 văn bản sinh bằng chunker đã sửa.</w:t>
       </w:r>
     </w:p>
     <w:p>
@@ -3846,7 +3988,7 @@
               <w:rPr>
                 <w:sz w:val="17"/>
               </w:rPr>
-              <w:t>Gold, proposal và production_chunk_index chưa đổi sang chunk_id = {clause_id}_chunk_{n} (D4). Bản sửa chunking 24/10 giữ quy ước ID nhưng dời ranh giới phần ở 10 Khoản dài: 20 chunk giữ ID mà đổi nội dung, thêm nd_207_2025_nd_cp_art_9_clause_2_chunk_3; candidate của HN_244, HN_253, HN_255, HN_260 trỏ các Khoản này (đủ các phần của Khoản, nên Parent Match không đổi). data_contract.md tự mâu thuẫn ở dòng 14: câu chữ yêu cầu ID viết thường nhưng regex ở dòng 14, 30 và chunk_payload_schema.json cho [a-zA-Z0-9_]; khi đưa đủ 21 văn bản, 57 chunk_id có chữ hoa (l_21_LCT_HDND7_…, A26) vẫn qua exporter và schema.</w:t>
+              <w:t>Gold, proposal và production_chunk_index chưa đổi sang chunk_id = {clause_id}_chunk_{n} (D4). Bản sửa chunking 24/10 giữ quy ước ID nhưng dời ranh giới phần ở 10 Khoản dài: 20 chunk giữ ID mà đổi nội dung, thêm nd_207_2025_nd_cp_art_9_clause_2_chunk_3; candidate của HN_244, HN_253, HN_255, HN_260 trỏ các Khoản này (đủ các phần của Khoản, nên Parent Match không đổi). data_contract.md tự mâu thuẫn ở dòng 14: câu chữ yêu cầu ID viết thường nhưng regex ở dòng 14, 30 và chunk_payload_schema.json cho [a-zA-Z0-9_]; khi đưa đủ 21 văn bản, 57 chunk_id có chữ hoa (l_21_LCT_HDND7_…, A26) vẫn qua exporter và schema. Ngoài ra 8 candidate trỏ ID không có trong corpus, ở cả corpus trong repo lẫn corpus sinh lại (có từ trước bản sửa): 2 ID khoản 4, 5 Luật 52/2014 Điều 2 (HN_062, do A25) và 6 ID _chunk_2, _chunk_3 của Khoản nay chỉ còn một chunk (NĐ 207/2025 Điều 17, NQ 01/2024 Điều 2, 3, 4, 6; HN_263, HN_265, HN_266, HN_267, HN_269): số _chunk_n đổi khi độ dài Khoản đổi.</w:t>
             </w:r>
           </w:p>
           <w:p>
@@ -4464,7 +4606,7 @@
       </w:pPr>
       <w:r>
         <w:rPr/>
-        <w:t>Nhóm B đo ngày 24/10 trên nhánh chunking_test sau bản sửa chunking. B9, B12 đã sửa và được bỏ khỏi bảng. B1, B10, B13 đã sửa trong code nhưng giữ trong bảng vì corpus trong repo chưa sinh lại (parser A25, A26 và contract C3 chưa xong). Ba lỗi mới B14 (merge 1c40712 làm chunker lỗi cú pháp), B15 (intro của Điều không vào chunk con), B16 (Parent vượt ngưỡng khi intro trùng Khoản đầu dài) tìm thấy và sửa cùng đợt. Số liệu đo trên corpus sinh lại trong thư mục tạm ở Phụ lục F.</w:t>
+        <w:t>Nhóm B đo ngày 24/10 trên nhánh chunking_test sau bản sửa chunking. B9, B12 đã sửa và được bỏ khỏi bảng. B1, B10, B13 đã sửa trong code nhưng giữ trong bảng vì corpus trong repo chưa sinh lại (parser A25, A26 và contract C3 chưa xong). Ba lỗi mới B14 (merge 1c40712 làm chunker lỗi cú pháp), B15 (intro của Điều không vào chunk con), B16 (Parent vượt ngưỡng khi intro trùng Khoản đầu dài) tìm thấy và sửa cùng đợt; B17 (chunker lấy câu đầu intro làm tiêu đề cho Điều không có tiêu đề) tìm thấy khi kiểm lại sau commit và cũng đã sửa. Số liệu đo trên corpus sinh lại trong thư mục tạm ở Phụ lục F.</w:t>
       </w:r>
     </w:p>
     <w:p>
@@ -13002,7 +13144,7 @@
               <w:rPr>
                 <w:sz w:val="17"/>
               </w:rPr>
-              <w:t>Sửa mẫu cắt chú thích VBHN để không xóa Khoản nằm sau chú thích, bỏ IGNORECASE ở mẫu “Hướng dẫn”, xóa số chú thích dính chữ (A25, A6). clause_regex nhận Khoản viết thường; văn bản không có tiêu đề Điều (Luật 1986) để title null; quyết định cách xử lý 2 TT chia theo mục La Mã; sửa bản ghi registry của Luật 1986 (A26). Cắt tên người ký theo quy tắc chung (A21). Test giá trị và test bất biến cho mọi văn bản, test bảo toàn nội dung cho cleaner, test chạy exporter (A7). Không bỏ qua Điều khi dựng Khoản lỗi (H8). Sinh lại parsed_jsons, rồi chạy lại export ở bước 3.</w:t>
+              <w:t>Sửa mẫu cắt chú thích VBHN để không xóa Khoản nằm sau chú thích, bỏ IGNORECASE ở mẫu “Hướng dẫn”, xóa số chú thích dính chữ (A25, A6). clause_regex nhận Khoản viết thường; văn bản không có tiêu đề Điều (Luật 1986) để title null; quyết định cách xử lý 2 TT chia theo mục La Mã; sửa bản ghi registry của Luật 1986 (A26). Nhận nhãn Chương/Mục có dấu chấm (A27). Cắt tên người ký theo quy tắc chung (A21). Test giá trị và test bất biến cho mọi văn bản, test bảo toàn nội dung cho cleaner, test chạy exporter (A7). Không bỏ qua Điều khi dựng Khoản lỗi (H8). Sinh lại parsed_jsons, rồi chạy lại export ở bước 3.</w:t>
             </w:r>
           </w:p>
         </w:tc>
@@ -13018,7 +13160,7 @@
               <w:rPr>
                 <w:sz w:val="17"/>
               </w:rPr>
-              <w:t>A25, A26, A6, A21, A7, H8</w:t>
+              <w:t>A25, A26, A27, A6, A21, A7, H8</w:t>
             </w:r>
           </w:p>
         </w:tc>
@@ -16646,7 +16788,7 @@
                 <w:b/>
                 <w:sz w:val="17"/>
               </w:rPr>
-              <w:t>B12</w:t>
+              <w:t>B17 (mới)</w:t>
             </w:r>
           </w:p>
         </w:tc>
@@ -16659,7 +16801,7 @@
               <w:rPr>
                 <w:sz w:val="17"/>
               </w:rPr>
-              <w:t>Nhánh sửa nhãn TT 02a (BAD_NAME) và 3 cảnh báo viết cứng còn trong exporter; report ghi “l_52_2014_qh13 chỉ có 131 điều”.</w:t>
+              <w:t>Điều không có tiêu đề nhưng có intro: chunker lấy câu đầu của intro làm tiêu đề, nên breadcrumb và header của Parent mang câu nội dung như tên Điều (vd Luật HNGĐ 1986 Điều 2 “Vợ chồng có nghĩa vụ thực hiện sinh đẻ có kế hoạch”); 0 Điều ở 11 văn bản cũ (14 Điều: Luật 1986 12, NĐ 68/2002 2). Tìm thấy khi kiểm lại sau commit.</w:t>
             </w:r>
           </w:p>
         </w:tc>
@@ -16672,7 +16814,7 @@
               <w:rPr>
                 <w:sz w:val="17"/>
               </w:rPr>
-              <w:t>Đã sửa. Xóa BAD_NAME, create_corrected_source và trường corrected_document; cảnh báo trong report sinh từ kiểm tra thật (mảnh ngắn, intro bị cắt, validity_status “Không xác định”).</w:t>
+              <w:t>Đã sửa. Header và breadcrumb chỉ ghi “Điều N”, intro vẫn ở Parent và embed_text; 11 văn bản cũ không đổi, 15 chunk của 2 văn bản mới đổi breadcrumb. Thêm test_untitled_article_has_no_fabricated_title.</w:t>
             </w:r>
           </w:p>
         </w:tc>
@@ -16688,7 +16830,7 @@
                 <w:b/>
                 <w:sz w:val="17"/>
               </w:rPr>
-              <w:t>B13</w:t>
+              <w:t>Kiểm lại sau commit</w:t>
             </w:r>
           </w:p>
         </w:tc>
@@ -16701,7 +16843,7 @@
               <w:rPr>
                 <w:sz w:val="17"/>
               </w:rPr>
-              <w:t>0 chunk dưới 10 ký tự từ khi A24 được sửa; exporter không chặn.</w:t>
+              <w:t>—</w:t>
             </w:r>
           </w:p>
         </w:tc>
@@ -16714,7 +16856,7 @@
               <w:rPr>
                 <w:sz w:val="17"/>
               </w:rPr>
-              <w:t>Đã sửa trong code; corpus trong repo chờ sinh lại. Đuôi dưới 10 ký tự gộp vào phần trước (đã có ở bản testing; mô tả trước ghi nhầm là chưa làm); exporter dừng khi còn chunk dưới 10 ký tự. 0 chunk ở cả hai corpus.</w:t>
+              <w:t>Corpus trong repo: 130 chunk có Khoản giả (B1), 234 breadcrumb sai Khoản (B10), 0 chunk dưới 10 ký tự (B13); corpus sinh lại: 0 ở cả ba. Còn 2 chunk (2) không có intro trong embed_text vì câu dẫn danh sách Điểm dài hơn 60 từ, theo thiết kế. embed_text dài nhất 243 đơn vị khoảng trắng (247); chưa đo bằng tokenizer của bkai, BGE-M3 vì máy chưa tải model, nên chưa chắc dưới 256 token (E2, E4). Dấu vết parser lộ ra qua chunk: A27 (TT 04/2020), “khu vực2” (A6), Khoản viết thường của NĐ 68/2002 (A26). test_chunking.py 15 pass.</w:t>
             </w:r>
           </w:p>
         </w:tc>
@@ -16730,7 +16872,7 @@
                 <w:b/>
                 <w:sz w:val="17"/>
               </w:rPr>
-              <w:t>B5</w:t>
+              <w:t>B12</w:t>
             </w:r>
           </w:p>
         </w:tc>
@@ -16743,7 +16885,7 @@
               <w:rPr>
                 <w:sz w:val="17"/>
               </w:rPr>
-              <w:t>CHILD_MIN_WORDS không dùng ở nhánh có cấu trúc, nên Config A và D cho cùng kết quả; bảng của chunking_strategy.md lấy từ chunker cũ (13 tài liệu, có data/parser_validated).</w:t>
+              <w:t>Nhánh sửa nhãn TT 02a (BAD_NAME) và 3 cảnh báo viết cứng còn trong exporter; report ghi “l_52_2014_qh13 chỉ có 131 điều”.</w:t>
             </w:r>
           </w:p>
         </w:tc>
@@ -16756,7 +16898,7 @@
               <w:rPr>
                 <w:sz w:val="17"/>
               </w:rPr>
-              <w:t>Mảnh dưới 20 từ của cùng Khoản được gộp hoặc dời ranh giới: 0 mảnh (Config D không gộp: 3); 82 chunk dưới 20 từ (134) đều là Khoản trọn vẹn. child_min_words, child_max_units đọc từ config; chunking_strategy.md, chunking_evaluation.xlsx, chunking_examples.json sinh lại trên 21 văn bản. Còn câu benchmark cho cặp trùng (mục 3).</w:t>
+              <w:t>Đã sửa. Xóa BAD_NAME, create_corrected_source và trường corrected_document; cảnh báo trong report sinh từ kiểm tra thật (mảnh ngắn, intro bị cắt, validity_status “Không xác định”).</w:t>
             </w:r>
           </w:p>
         </w:tc>
@@ -16772,7 +16914,7 @@
                 <w:b/>
                 <w:sz w:val="17"/>
               </w:rPr>
-              <w:t>B2</w:t>
+              <w:t>B13</w:t>
             </w:r>
           </w:p>
         </w:tc>
@@ -16785,7 +16927,7 @@
               <w:rPr>
                 <w:sz w:val="17"/>
               </w:rPr>
-              <w:t>Corpus trong repo fallback_whitespace; word_segment trả text gốc khi thiếu underthesea; hai file requirements mâu thuẫn.</w:t>
+              <w:t>0 chunk dưới 10 ký tự từ khi A24 được sửa; exporter không chặn.</w:t>
             </w:r>
           </w:p>
         </w:tc>
@@ -16798,7 +16940,7 @@
               <w:rPr>
                 <w:sz w:val="17"/>
               </w:rPr>
-              <w:t>word_segment và exporter dừng khi thiếu underthesea; report ghi tokenization_version = 9.5.0; requirements.txt ghim underthesea==9.5.0. Corpus sinh lại: seg_text khác text ở 100% chunk. Còn requirements-bkai.txt và phía truy vấn (mục 3).</w:t>
+              <w:t>Đã sửa trong code; corpus trong repo chờ sinh lại. Đuôi dưới 10 ký tự gộp vào phần trước (đã có ở bản testing; mô tả trước ghi nhầm là chưa làm); exporter dừng khi còn chunk dưới 10 ký tự. 0 chunk ở cả hai corpus.</w:t>
             </w:r>
           </w:p>
         </w:tc>
@@ -16814,7 +16956,7 @@
                 <w:b/>
                 <w:sz w:val="17"/>
               </w:rPr>
-              <w:t>B3, B4, B7</w:t>
+              <w:t>B5</w:t>
             </w:r>
           </w:p>
         </w:tc>
@@ -16827,7 +16969,7 @@
               <w:rPr>
                 <w:sz w:val="17"/>
               </w:rPr>
-              <w:t>Như mục 3.</w:t>
+              <w:t>CHILD_MIN_WORDS không dùng ở nhánh có cấu trúc, nên Config A và D cho cùng kết quả; bảng của chunking_strategy.md lấy từ chunker cũ (13 tài liệu, có data/parser_validated).</w:t>
             </w:r>
           </w:p>
         </w:tc>
@@ -16840,7 +16982,7 @@
               <w:rPr>
                 <w:sz w:val="17"/>
               </w:rPr>
-              <w:t>B3: 0 ID mất, 1 ID mới, 20 ID đổi nội dung (candidate của 4 câu). B4: chunking không còn đọc data/parser_validated/ (test_chunking.py, run_experiment.py chỉ đọc parser/parsed_jsons). B7: cấu trúc bản ghi không đổi; source_url có ở 100% chunk.</w:t>
+              <w:t>Mảnh dưới 20 từ của cùng Khoản được gộp hoặc dời ranh giới: 0 mảnh (Config D không gộp: 3); 82 chunk dưới 20 từ (134) đều là Khoản trọn vẹn. child_min_words, child_max_units đọc từ config; chunking_strategy.md, chunking_evaluation.xlsx, chunking_examples.json sinh lại trên 21 văn bản. Còn câu benchmark cho cặp trùng (mục 3).</w:t>
             </w:r>
           </w:p>
         </w:tc>
@@ -16856,7 +16998,7 @@
                 <w:b/>
                 <w:sz w:val="17"/>
               </w:rPr>
-              <w:t>Corpus</w:t>
+              <w:t>B2</w:t>
             </w:r>
           </w:p>
         </w:tc>
@@ -16869,7 +17011,7 @@
               <w:rPr>
                 <w:sz w:val="17"/>
               </w:rPr>
-              <w:t>Repo: 1.156 chunk, 508 parent, fallback_whitespace. Chunker f0a7007 trên 21 văn bản: dừng ở NĐ 68/2002.</w:t>
+              <w:t>Corpus trong repo fallback_whitespace; word_segment trả text gốc khi thiếu underthesea; hai file requirements mâu thuẫn.</w:t>
             </w:r>
           </w:p>
         </w:tc>
@@ -16882,7 +17024,7 @@
               <w:rPr>
                 <w:sz w:val="17"/>
               </w:rPr>
-              <w:t>Repo không đổi. Chunker đã sửa: 11 văn bản 1.157 chunk, 508 parent; 21 văn bản 2.003 chunk, 923 parent; pass chunk_payload_schema.json và vector_store.normalize_chunk_record ở 100% chunk.</w:t>
+              <w:t>word_segment và exporter dừng khi thiếu underthesea; report ghi tokenization_version = 9.5.0; requirements.txt ghim underthesea==9.5.0. Corpus sinh lại: seg_text khác text ở 100% chunk. Còn requirements-bkai.txt và phía truy vấn (mục 3).</w:t>
             </w:r>
           </w:p>
         </w:tc>
@@ -16898,6 +17040,90 @@
                 <w:b/>
                 <w:sz w:val="17"/>
               </w:rPr>
+              <w:t>B3, B4, B7</w:t>
+            </w:r>
+          </w:p>
+        </w:tc>
+        <w:tc>
+          <w:tcPr>
+            <w:tcW w:type="dxa" w:w="3200"/>
+          </w:tcPr>
+          <w:p>
+            <w:r>
+              <w:rPr>
+                <w:sz w:val="17"/>
+              </w:rPr>
+              <w:t>Như mục 3.</w:t>
+            </w:r>
+          </w:p>
+        </w:tc>
+        <w:tc>
+          <w:tcPr>
+            <w:tcW w:type="dxa" w:w="5566"/>
+          </w:tcPr>
+          <w:p>
+            <w:r>
+              <w:rPr>
+                <w:sz w:val="17"/>
+              </w:rPr>
+              <w:t>B3: 0 ID mất, 1 ID mới, 20 ID đổi nội dung (candidate của 4 câu). B4: chunking không còn đọc data/parser_validated/ (test_chunking.py, run_experiment.py chỉ đọc parser/parsed_jsons). B7: cấu trúc bản ghi không đổi; source_url có ở 100% chunk.</w:t>
+            </w:r>
+          </w:p>
+        </w:tc>
+      </w:tr>
+      <w:tr>
+        <w:tc>
+          <w:tcPr>
+            <w:tcW w:type="dxa" w:w="1100"/>
+          </w:tcPr>
+          <w:p>
+            <w:r>
+              <w:rPr>
+                <w:b/>
+                <w:sz w:val="17"/>
+              </w:rPr>
+              <w:t>Corpus</w:t>
+            </w:r>
+          </w:p>
+        </w:tc>
+        <w:tc>
+          <w:tcPr>
+            <w:tcW w:type="dxa" w:w="3200"/>
+          </w:tcPr>
+          <w:p>
+            <w:r>
+              <w:rPr>
+                <w:sz w:val="17"/>
+              </w:rPr>
+              <w:t>Repo: 1.156 chunk, 508 parent, fallback_whitespace. Chunker f0a7007 trên 21 văn bản: dừng ở NĐ 68/2002.</w:t>
+            </w:r>
+          </w:p>
+        </w:tc>
+        <w:tc>
+          <w:tcPr>
+            <w:tcW w:type="dxa" w:w="5566"/>
+          </w:tcPr>
+          <w:p>
+            <w:r>
+              <w:rPr>
+                <w:sz w:val="17"/>
+              </w:rPr>
+              <w:t>Repo không đổi. Chunker đã sửa: 11 văn bản 1.157 chunk, 508 parent; 21 văn bản 2.003 chunk, 923 parent; pass chunk_payload_schema.json và vector_store.normalize_chunk_record ở 100% chunk.</w:t>
+            </w:r>
+          </w:p>
+        </w:tc>
+      </w:tr>
+      <w:tr>
+        <w:tc>
+          <w:tcPr>
+            <w:tcW w:type="dxa" w:w="1100"/>
+          </w:tcPr>
+          <w:p>
+            <w:r>
+              <w:rPr>
+                <w:b/>
+                <w:sz w:val="17"/>
+              </w:rPr>
               <w:t>Test</w:t>
             </w:r>
           </w:p>
@@ -16924,7 +17150,7 @@
               <w:rPr>
                 <w:sz w:val="17"/>
               </w:rPr>
-              <w:t>test_chunking.py 14 pass, 21 subtest pass; toàn bộ 218 pass, 2 fail (A25 và H9, như mục 4).</w:t>
+              <w:t>test_chunking.py 14 pass (sau B17: 15), 21 subtest pass; toàn bộ 218 pass, 2 fail (A25 và H9, như mục 4).</w:t>
             </w:r>
           </w:p>
         </w:tc>

</xml_diff>

<commit_message>
docs(report): recheck group A on 64b65f0, drop fixed A28, trim A7 and partly fixed rows to open parts
</commit_message>
<xml_diff>
--- a/docs/sprint6_issue_recheck_after_merge.docx
+++ b/docs/sprint6_issue_recheck_after_merge.docx
@@ -25,7 +25,7 @@
         <w:rPr>
           <w:sz w:val="19"/>
         </w:rPr>
-        <w:t>Người lập: Dev 5 (Reranker &amp; Packaging Lead)   ·   Ngày: 22/10/2026   ·   Phạm vi: nhánh testing, commit 75dd586 (gộp CTM 5b62b35 và NMA f8e8311); nhóm A kiểm lại trên e9ee31d, e64c49a, 72a7377 và 840c8a3; nhóm C kiểm lại trên bafe1e8 và 840c8a3, C3 sửa ở 75e06c8; nhóm B kiểm lại và sửa trên nhánh chunking_test (1c40712)</w:t>
+        <w:t>Người lập: Dev 5 (Reranker &amp; Packaging Lead)   ·   Ngày: 22/10/2026   ·   Phạm vi: nhánh testing, commit 75dd586 (gộp CTM 5b62b35 và NMA f8e8311); nhóm A kiểm lại trên e9ee31d, e64c49a, 72a7377, 840c8a3 và 64b65f0; nhóm C kiểm lại trên bafe1e8 và 840c8a3, C3 sửa ở 75e06c8; nhóm B kiểm lại và sửa trên nhánh chunking_test (1c40712)</w:t>
       </w:r>
     </w:p>
     <w:p>
@@ -34,7 +34,7 @@
         <w:rPr>
           <w:sz w:val="19"/>
         </w:rPr>
-        <w:t>Cập nhật 23/10/2026: kiểm lại sau khi gộp origin/CTM ee755a5 vào testing (commit e64c49a). Mục 3 chỉ ghi phần còn lỗi tính tới e64c49a, gồm cả 7 lỗi mới. Cùng ngày, nhóm A được kiểm lại toàn bộ trên e64c49a (Phụ lục C); A24 và Phụ lục B (kết quả kiểm nhóm A trên e9ee31d ngày 22/10) bị mất trong lần cập nhật trước nên được ghi lại. Cũng ngày 23/10, nhóm C được kiểm lại toàn bộ trên bafe1e8, gồm phân tích lại C6 (Phụ lục D). Ngày 24/10/2026, sau khi kéo nhánh NMA mới nhất (testing fast-forward lên 72a7377), nhóm A được kiểm lại toàn bộ (Phụ lục E): A13, A23, A24 đã sửa và được bỏ khỏi bảng; thêm 2 lỗi mới A25, A26. Cũng ngày 24/10, nhóm B được kiểm lại và sửa trên nhánh chunking_test (Phụ lục F): B9, B12 đã sửa và được bỏ khỏi bảng; B1, B10, B13 đã sửa trong code nhưng còn trong bảng cho tới khi corpus trong repo được sinh lại; thêm 3 lỗi mới B14, B15, B16, đều đã sửa. Kiểm lại chunking sau commit: thêm B17 (chunker lấy câu đầu intro làm tiêu đề, đã sửa) và A27 (parser không nhận nhãn “Mục N.”, TT 04/2020 mất cấp Mục). Cuối ngày 24/10, sau khi gộp NMA (b031620–fc997a6) vào testing ở 840c8a3, nhóm C được kiểm lại toàn bộ (Phụ lục G): không lỗi nào sửa xong; C6 sửa thêm một phần (ID của Luật 1986 viết thường, test định danh cho parsed_jsons, run_experiment.py không còn ghi cứng file TTLT); các lỗi C khác không đổi vì contract, schema, code retrieval, reranker và benchmark không đổi từ bafe1e8. Cũng ở 840c8a3, nhóm A được kiểm lại toàn bộ (Phụ lục H): A21 đã sửa và được bỏ khỏi bảng; A25, A26 sửa phần lớn, nhưng mẫu cắt chú thích VBHN mới không khớp chỗ nào (chú thích nay nằm trong Luật 52/2014 Điều 2 khoản 3) và mẫu nhãn “Hướng dẫn” mới để lọt lại 3 nhãn ở NĐ 10/2015. Sau đó C3 được sửa ở 75e06c8 (bảng ánh xạ status → validity_status ở mục 3.1 của data_contract.md và test_registry_validity_status_mapping) và được bỏ khỏi bảng.</w:t>
+        <w:t>Cập nhật 23/10/2026: kiểm lại sau khi gộp origin/CTM ee755a5 vào testing (commit e64c49a). Mục 3 chỉ ghi phần còn lỗi tính tới e64c49a, gồm cả 7 lỗi mới. Cùng ngày, nhóm A được kiểm lại toàn bộ trên e64c49a (Phụ lục C); A24 và Phụ lục B (kết quả kiểm nhóm A trên e9ee31d ngày 22/10) bị mất trong lần cập nhật trước nên được ghi lại. Cũng ngày 23/10, nhóm C được kiểm lại toàn bộ trên bafe1e8, gồm phân tích lại C6 (Phụ lục D). Ngày 24/10/2026, sau khi kéo nhánh NMA mới nhất (testing fast-forward lên 72a7377), nhóm A được kiểm lại toàn bộ (Phụ lục E): A13, A23, A24 đã sửa và được bỏ khỏi bảng; thêm 2 lỗi mới A25, A26. Cũng ngày 24/10, nhóm B được kiểm lại và sửa trên nhánh chunking_test (Phụ lục F): B9, B12 đã sửa và được bỏ khỏi bảng; B1, B10, B13 đã sửa trong code nhưng còn trong bảng cho tới khi corpus trong repo được sinh lại; thêm 3 lỗi mới B14, B15, B16, đều đã sửa. Kiểm lại chunking sau commit: thêm B17 (chunker lấy câu đầu intro làm tiêu đề, đã sửa) và A27 (parser không nhận nhãn “Mục N.”, TT 04/2020 mất cấp Mục). Cuối ngày 24/10, sau khi gộp NMA (b031620–fc997a6) vào testing ở 840c8a3, nhóm C được kiểm lại toàn bộ (Phụ lục G): không lỗi nào sửa xong; C6 sửa thêm một phần (ID của Luật 1986 viết thường, test định danh cho parsed_jsons, run_experiment.py không còn ghi cứng file TTLT); các lỗi C khác không đổi vì contract, schema, code retrieval, reranker và benchmark không đổi từ bafe1e8. Cũng ở 840c8a3, nhóm A được kiểm lại toàn bộ (Phụ lục H): A21 đã sửa và được bỏ khỏi bảng; A25, A26 sửa phần lớn, nhưng mẫu cắt chú thích VBHN mới không khớp chỗ nào (chú thích nay nằm trong Luật 52/2014 Điều 2 khoản 3) và mẫu nhãn “Hướng dẫn” mới để lọt lại 3 nhãn ở NĐ 10/2015. Sau đó C3 được sửa ở 75e06c8 (bảng ánh xạ status → validity_status ở mục 3.1 của data_contract.md và test_registry_validity_status_mapping) và được bỏ khỏi bảng. Cuối ngày 24/10, sau khi gộp NMA 1260ed8 vào testing ở 64b65f0, nhóm A được kiểm lại (Phụ lục I): 11 PDF gốc được thay bằng bản có lớp text; A27 đã sửa và được bỏ khỏi bảng; A25 chỉ còn phần corpus và các mẫu cleaner thừa; L01 quay về bản gốc 2014 (A6); thêm lỗi mới A28 (ghép dòng làm mất dấu câu, làm 1 test fail). Ngày 25/10, A28 và phần test của A7 được sửa ở commit 77b5886 trên testing (Phụ lục K): A28 được bỏ khỏi bảng, A7 chỉ còn CI và test cho cleaner.</w:t>
       </w:r>
     </w:p>
     <w:p>
@@ -50,7 +50,7 @@
         <w:spacing w:after="80"/>
       </w:pPr>
       <w:r>
-        <w:t>Trong 67 lỗi của register v2, tính tới commit e64c49a (nhóm A tính tới 840c8a3, nhóm B tính tới bản sửa chunking ngày 24/10, nhóm C tính tới 840c8a3, C3 tới 75e06c8): 23 đã sửa, 1 đóng, 15 còn một phần, 3 đổi tính chất, 2 nặng hơn, 23 còn nguyên. Phát hiện thêm 19 lỗi mới: A22, A23, A24, B11, B12 (22/10; A22, A23, A24, B11 và B12 nay đã sửa), B13 (nay sửa trong code, chờ sinh lại corpus), C6, C7, C8, C9, D5, H9 (23/10, sau khi gộp CTM; C6 nay sửa một phần ở 840c8a3, C7 ở af8ee9a), A25, A26 (24/10, sau khi kéo NMA 72a7377; nay sửa một phần ở 840c8a3), B14, B15, B16, B17 (24/10, khi kiểm lại nhóm B; đã sửa) và A27 (24/10, khi kiểm lại corpus thử 21 văn bản). Trong 15 lỗi mức Cao, 7 đã sửa (A1, A12, A13, A14, E15, C1, C3), 8 còn mở. Nhóm A, B, C đã được kiểm lại lần 2 trên commit 75dd586; các chỗ đính chính ghi ở Phụ lục A. Nhóm A được kiểm lại lần 3 trên e9ee31d (Phụ lục B), lần 4 trên e64c49a (Phụ lục C) và lần 5 trên 72a7377 (Phụ lục E) và lần 6 trên 840c8a3 (Phụ lục H). Ngày 23/10 kiểm lại các lỗi liên quan tới thay đổi của CTM và toàn bộ nhóm A; nhóm C được kiểm lại toàn bộ trên bafe1e8 (Phụ lục D) và trên 840c8a3 sau khi gộp NMA (Phụ lục G); ngày 24/10 nhóm B được kiểm lại và sửa trên nhánh chunking_test (Phụ lục F); các lỗi còn lại giữ kết quả ngày 22/10.</w:t>
+        <w:t>Trong 67 lỗi của register v2, tính tới commit e64c49a (nhóm A tính tới 64b65f0, nhóm B tính tới bản sửa chunking ngày 24/10, nhóm C tính tới 840c8a3, C3 tới 75e06c8): 23 đã sửa, 1 đóng, 15 còn một phần, 3 đổi tính chất, 2 nặng hơn, 23 còn nguyên. Phát hiện thêm 20 lỗi mới: A22, A23, A24, B11, B12 (22/10; A22, A23, A24, B11 và B12 nay đã sửa), B13 (nay sửa trong code, chờ sinh lại corpus), C6, C7, C8, C9, D5, H9 (23/10, sau khi gộp CTM; C6 nay sửa một phần ở 840c8a3, C7 ở af8ee9a), A25, A26 (24/10, sau khi kéo NMA 72a7377; nay sửa một phần ở 840c8a3 và 64b65f0), B14, B15, B16, B17 (24/10, khi kiểm lại nhóm B; đã sửa) A27 (24/10, khi kiểm lại corpus thử 21 văn bản; nay đã sửa) và A28 (24/10, sau khi gộp NMA 1260ed8; nay đã sửa ở 77b5886). Trong 15 lỗi mức Cao, 7 đã sửa (A1, A12, A13, A14, E15, C1, C3), 8 còn mở. Nhóm A, B, C đã được kiểm lại lần 2 trên commit 75dd586; các chỗ đính chính ghi ở Phụ lục A. Nhóm A được kiểm lại lần 3 trên e9ee31d (Phụ lục B), lần 4 trên e64c49a (Phụ lục C) và lần 5 trên 72a7377 (Phụ lục E), lần 6 trên 840c8a3 (Phụ lục H) và lần 7 trên 64b65f0 (Phụ lục I); A28 sửa ngày 25/10 (Phụ lục K). Ngày 23/10 kiểm lại các lỗi liên quan tới thay đổi của CTM và toàn bộ nhóm A; nhóm C được kiểm lại toàn bộ trên bafe1e8 (Phụ lục D) và trên 840c8a3 sau khi gộp NMA (Phụ lục G); ngày 24/10 nhóm B được kiểm lại và sửa trên nhánh chunking_test (Phụ lục F); các lỗi còn lại giữ kết quả ngày 22/10.</w:t>
       </w:r>
     </w:p>
     <w:p>
@@ -68,7 +68,7 @@
       </w:pPr>
       <w:r>
         <w:rPr/>
-        <w:t>Parser đã trả lại nội dung bị xóa nhầm, nhưng chú thích và nhãn lại lọt vào (A25, A26). NMA gộp ở 840c8a3 trả lại khoản 4, 5 của Luật 52/2014 Điều 2 và 5 chữ “hướng dẫn” thật, tách đủ Khoản của NĐ 68/2002, bỏ 25 tiêu đề giả của Luật 1986, cắt tên người ký theo quy tắc chung (A21 đã sửa); pytest parser/ 209 pass. Nhưng mẫu cắt chú thích VBHN mới viết “\\s” trong chuỗi raw nên không khớp chỗ nào: chú thích 1 nay nằm cuối khoản 3 Điều 2. Mẫu nhãn “Hướng dẫn” mới chỉ xóa dòng đứng riêng, nên 3 nhãn luatvietnam trở lại NĐ 10/2015, một nhãn nằm trong tiêu đề Điều 12. Không test nào bắt được hai lỗi này. Corpus trong repo vẫn là bản 72a7377 (thiếu khoản 4, 5 của Điều 2; chưa có 10 văn bản bổ sung). Phải sửa hai mẫu của cleaner, rồi sinh lại corpus trước khi map gold (D1, D4) và dựng lại index.</w:t>
+        <w:t>Parser hết chú thích và nhãn nhờ đổi PDF, nhưng Luật 52/2014 quay về bản gốc và corpus chưa sinh lại (A6, A25). NMA 1260ed8 (gộp ở 64b65f0) thay 11 PDF gốc bằng bản có lớp text: parsed_jsons hết chú thích VBHN và nhãn luatvietnam, sửa cả chữ sai của bản cũ (vd TT 34/2017 Điều 2 “dị tật bào thai”); A27 đã sửa và ID của Luật 1986 đúng mã. Nhưng L01.pdf mới là bản gốc 2014, không còn là VBHN 121: Điều 123 khoản 3 ghi “cấp huyện” thay cho “khu vực”, lệch đáp án HN_183 và luật hiện hành (A6). Commit được đẩy lên khi 1 test parser fail vì ghép dòng làm mất dấu câu ở tiêu đề; lỗi này (A28) đã sửa ngày 25/10 ở 77b5886. Corpus trong repo vẫn là bản 72a7377. Cần chốt phiên bản Luật 52/2014 rồi sinh lại corpus trước khi map gold (D1, D4) và dựng lại index.</w:t>
       </w:r>
     </w:p>
     <w:p>
@@ -1663,7 +1663,7 @@
         <w:spacing w:after="80"/>
       </w:pPr>
       <w:r>
-        <w:t>Mốc so sánh là commit ae1ce0d (register v2) và commit 75dd586 (nhánh testing); lần kiểm lại ngày 23/10 đo trên commit e64c49a; nhóm A kiểm lại ngày 24/10 trên 72a7377 và 840c8a3; nhóm B kiểm lại và sửa ngày 24/10 trên nhánh chunking_test (1c40712); nhóm C kiểm lại ngày 24/10 trên 840c8a3. Thay đổi giữa các mốc:</w:t>
+        <w:t>Mốc so sánh là commit ae1ce0d (register v2) và commit 75dd586 (nhánh testing); lần kiểm lại ngày 23/10 đo trên commit e64c49a; nhóm A kiểm lại ngày 24/10 trên 72a7377, 840c8a3 và 64b65f0; nhóm B kiểm lại và sửa ngày 24/10 trên nhánh chunking_test (1c40712); nhóm C kiểm lại ngày 24/10 trên 840c8a3. Thay đổi giữa các mốc:</w:t>
       </w:r>
     </w:p>
     <w:p>
@@ -1759,6 +1759,16 @@
       <w:r>
         <w:rPr/>
         <w:t>NMA b031620, 5a310c2, de0de7f, 9dda96c, fc997a6 (gộp vào testing ở 840c8a3 ngày 24/10; testing trước đó đã lên chunking_test a24e404, gồm bản sửa nhóm B): cleaner.py viết mẫu cắt chú thích VBHN đầu tiên theo nguyên văn chú thích, chỉ xóa nhãn “Hướng dẫn” khi đứng riêng một dòng và thêm mẫu xóa số chú thích “khu vực2”; thay PDF và TXT trích xuất của NĐ 68/2002 (Khoản nay viết hoa) và Luật 1986; parser.py ghép tiêu đề Chương/Mục bị xuống dòng, để title null cho Điều không có tiêu đề, cắt tên người ký theo quy tắc chung thay cho 3 tên viết cứng; registry bỏ dấu cách ở số hiệu Luật 1986 và đổi document_id thành l_21_lct_hdnd7; sinh lại parsed_jsons (21 file); test_parser_unit.py thêm test cho mọi TXT và test định danh của parsed_jsons. data_contract.md, schemas/, code retrieval, reranker, benchmark và data/chunking_output không đổi.</w:t>
+      </w:r>
+    </w:p>
+    <w:p>
+      <w:pPr>
+        <w:pStyle w:val="ListBullet"/>
+        <w:spacing w:after="80"/>
+      </w:pPr>
+      <w:r>
+        <w:rPr/>
+        <w:t>NMA 1260ed8 (gộp vào testing ở 64b65f0 ngày 24/10): thay 11 PDF gốc trong data/raw_data/circulars/ và laws_and_decrees/ bằng bản có lớp text, trích xuất lại extracted_texts_qwen và cleaned_texts của 11 văn bản; cleaner.py sửa “\\s” thành “\s” trong mẫu chú thích VBHN; parser.py nhận nhãn Chương/Mục có dấu chấm (A27) và thêm dấu hiệu ký “TM. HỘI ĐỒNG THẨM PHÁN”; registry đổi document_id của Luật 1986 thành l_21_lct_hdnn7; sinh lại parsed_jsons. data/chunking_output không đổi.</w:t>
       </w:r>
     </w:p>
     <w:p>
@@ -2055,6 +2065,45 @@
     </w:p>
     <w:p>
       <w:pPr>
+        <w:spacing w:after="80"/>
+      </w:pPr>
+      <w:r>
+        <w:rPr/>
+        <w:t>Ngày 24/10, kiểm lại nhóm A trên 64b65f0 (NMA 1260ed8):</w:t>
+      </w:r>
+    </w:p>
+    <w:p>
+      <w:pPr>
+        <w:pStyle w:val="ListBullet"/>
+        <w:spacing w:after="80"/>
+      </w:pPr>
+      <w:r>
+        <w:rPr/>
+        <w:t>chép parser/, chunking/, data/reference/, schemas/, tests/, test/ của 64b65f0 sang thư mục tạm; chạy clean_extracted_text trên 23 file extracted_texts_qwen: 23/23 giống hệt cleaned_texts; chạy test_parser.py --skip-clean: 21/21 file giống hệt parsed_jsons, 2 TT lỗi như cũ;</w:t>
+      </w:r>
+    </w:p>
+    <w:p>
+      <w:pPr>
+        <w:pStyle w:val="ListBullet"/>
+        <w:spacing w:after="80"/>
+      </w:pPr>
+      <w:r>
+        <w:rPr/>
+        <w:t>so từng Điều, Khoản của parsed_jsons với bản 840c8a3 theo từ; đối chiếu các chỗ đổi chữ với lớp text của PDF mới (PyMuPDF); quét chú thích, nhãn, header web, dấu thanh kiểu cũ, số hiệu bị tách “- ”; so metadata 21 văn bản với registry; đối chiếu HN_183 với Điều 123;</w:t>
+      </w:r>
+    </w:p>
+    <w:p>
+      <w:pPr>
+        <w:pStyle w:val="ListBullet"/>
+        <w:spacing w:after="80"/>
+      </w:pPr>
+      <w:r>
+        <w:rPr/>
+        <w:t>chạy pytest parser/, tests/schema_test.py, test/test_chunking.py (.venv, Python 3.14).</w:t>
+      </w:r>
+    </w:p>
+    <w:p>
+      <w:pPr>
         <w:pStyle w:val="Heading1"/>
       </w:pPr>
       <w:r>
@@ -2066,7 +2115,7 @@
         <w:spacing w:after="80"/>
       </w:pPr>
       <w:r>
-        <w:t>Mỗi nhóm có một bảng gồm các lỗi của register v2 còn việc phải làm và các lỗi mới, chỉ ghi phần còn lỗi tính tới e64c49a (nhóm A tính tới 840c8a3, nhóm B tính tới bản sửa chunking ngày 24/10, nhóm C tính tới 840c8a3). Trong mỗi bảng, lỗi xếp theo mức độ; cùng mức thì lỗi mới đứng trước. Cột Vấn đề và đề xuất gồm phần còn lỗi, “Đề xuất” và, khi có, “Kiểm chứng”. Lỗi của register v2 giữ mức độ như register; Vị trí và Owner của chúng lấy từ register v2 (commit ae1ce0d), nên số dòng có thể đã lệch. Lỗi có trạng thái “Còn” giữ nguyên mô tả, đề xuất và kiểm chứng của register v2 vì file liên quan chưa đổi; số đo trong đó được đo trên corpus cũ.</w:t>
+        <w:t>Mỗi nhóm có một bảng gồm các lỗi của register v2 còn việc phải làm và các lỗi mới, chỉ ghi phần còn lỗi tính tới e64c49a (nhóm A tính tới 64b65f0, nhóm B tính tới bản sửa chunking ngày 24/10, nhóm C tính tới 840c8a3). Trong mỗi bảng, lỗi xếp theo mức độ; cùng mức thì lỗi mới đứng trước. Cột Vấn đề và đề xuất gồm phần còn lỗi, “Đề xuất” và, khi có, “Kiểm chứng”. Lỗi của register v2 giữ mức độ như register; Vị trí và Owner của chúng lấy từ register v2 (commit ae1ce0d), nên số dòng có thể đã lệch. Lỗi có trạng thái “Còn” giữ nguyên mô tả, đề xuất và kiểm chứng của register v2 vì file liên quan chưa đổi; số đo trong đó được đo trên corpus cũ.</w:t>
       </w:r>
     </w:p>
     <w:p>
@@ -2074,7 +2123,7 @@
         <w:spacing w:after="80"/>
       </w:pPr>
       <w:r>
-        <w:t>Lỗi mới (trạng thái “Mới”) là mười chín lỗi chưa có trong register v2, mã nối tiếp register v2 theo nhóm. Năm lỗi tìm thấy ngày 22/10 khi kiểm lại sau lần gộp CTM và NMA (A22–A24 thuộc Parser; B11, B12 thuộc Chunking; A24 tìm thấy khi kiểm lại e9ee31d, do bản sửa A23 ở NMA 41802ab gây ra). Bảy lỗi tìm thấy ngày 23/10 sau khi gộp CTM ee755a5 (B13 thuộc Chunking; C6–C9, D5, H9 thuộc CTM). Hai lỗi tìm thấy ngày 24/10 sau khi kéo NMA 72a7377 (A25, A26 thuộc Parser; A25 do chính bản sửa A6 và A13 gây ra). Bốn lỗi tìm thấy ngày 24/10 khi kiểm lại nhóm B trên nhánh chunking_test (B14–B17 thuộc Chunking) đã sửa cùng đợt nên không có trong bảng (Phụ lục F); A27 (Parser) tìm thấy cùng ngày khi kiểm lại corpus thử 21 văn bản.</w:t>
+        <w:t>Lỗi mới (trạng thái “Mới”) là hai mươi lỗi chưa có trong register v2, mã nối tiếp register v2 theo nhóm. Năm lỗi tìm thấy ngày 22/10 khi kiểm lại sau lần gộp CTM và NMA (A22–A24 thuộc Parser; B11, B12 thuộc Chunking; A24 tìm thấy khi kiểm lại e9ee31d, do bản sửa A23 ở NMA 41802ab gây ra). Bảy lỗi tìm thấy ngày 23/10 sau khi gộp CTM ee755a5 (B13 thuộc Chunking; C6–C9, D5, H9 thuộc CTM). Hai lỗi tìm thấy ngày 24/10 sau khi kéo NMA 72a7377 (A25, A26 thuộc Parser; A25 do chính bản sửa A6 và A13 gây ra). Bốn lỗi tìm thấy ngày 24/10 khi kiểm lại nhóm B trên nhánh chunking_test (B14–B17 thuộc Chunking) đã sửa cùng đợt nên không có trong bảng (Phụ lục F); A27 (Parser) tìm thấy cùng ngày khi kiểm lại corpus thử 21 văn bản. A28 (Parser) tìm thấy ngày 24/10 sau khi gộp NMA 1260ed8; lỗi có từ trước nhưng chỉ lộ ra khi PDF mới đổi chỗ xuống dòng.</w:t>
       </w:r>
     </w:p>
     <w:p>
@@ -2082,7 +2131,7 @@
         <w:spacing w:after="80"/>
       </w:pPr>
       <w:r>
-        <w:t>Các lỗi đã sửa hoặc đã đóng mà không còn việc gì được bỏ khỏi bảng (vẫn tính trong thống kê ở mục 1; kết quả kiểm nhóm A ở Phụ lục C, Phụ lục E và Phụ lục H, nhóm B ở Phụ lục F, nhóm C ở Phụ lục D và Phụ lục G): A1, A5, A10, A12, A13, A14, A15, A17, A18, A19, A20, A21, A22, A23, A24, B8, B9, B11, B12, B14, B15, B16, B17, C1, C3, E5. Phần còn lại của A22 (thông báo lỗi in chữ \n) và việc thêm test cho A23, A24 nằm ở A7; đề xuất kiểm tra CI của B11 nằm ở bước 3 mục 5.</w:t>
+        <w:t>Các lỗi đã sửa hoặc đã đóng mà không còn việc gì được bỏ khỏi bảng (vẫn tính trong thống kê ở mục 1; kết quả kiểm nhóm A ở Phụ lục C, E, H, I và K, nhóm B ở Phụ lục F, nhóm C ở Phụ lục D và Phụ lục G): A1, A5, A10, A12, A13, A14, A15, A17, A18, A19, A20, A21, A22, A23, A24, A27, A28, B8, B9, B11, B12, B14, B15, B16, B17, C1, C3, E5. Test cho cleaner nằm ở A7; đề xuất kiểm tra CI của B11 nằm ở bước 3 mục 5.</w:t>
       </w:r>
     </w:p>
     <w:p>
@@ -2278,7 +2327,7 @@
               <w:rPr>
                 <w:sz w:val="17"/>
               </w:rPr>
-              <w:t>Bản sửa ở NMA 5a310c2 (gộp ở 840c8a3) trả lại phần bị xóa nhầm: Luật 52/2014 Điều 2 có đủ 5 Khoản, 5 chữ “hướng dẫn” thật trở lại, test_known_article_clause_counts[2-5] pass. Còn lại: (1) Mẫu đầu tiên của AMENDMENT_FOOTNOTE_PATTERNS viết “\\s” trong chuỗi raw (r'…\\s…'), nên regex tìm dấu gạch ngược thật và không khớp TXT nào. Khoản 4, 5 trở lại chỉ vì mẫu này không còn chạy; chú thích 1 của VBHN (6 dòng, “1 Luật số 81/2025/QH15 sửa đổi, bổ sung một số điều của Luật Tổ chức Tòa án nhân dân có căn cứ ban hành như sau: … số 34/2024/QH15.”.”) nay nằm cuối khoản 3 Điều 2. Mẫu còn chép nguyên văn một chú thích, nên không dùng được cho chú thích khác. (2) Mẫu nhãn “Hướng dẫn” nay chỉ khớp dòng chỉ gồm nhãn (^Hướng dẫn$), nên chỉ xóa được 1/4 nhãn luatvietnam của ND04. 3 nhãn dính cuối dòng trở lại NĐ 10/2015: cuối khoản 5 Điều 3 (“…do Bộ trưởng Bộ Y tế ban hành. Hướng dẫn”), cuối khoản 1 Điều 23 và tiêu đề Điều 12 (“Quy trình thực hiện kỹ thuật thụ tinh trong ống nghiệm Hướng dẫn”), nên breadcrumb của chunk thuộc Điều 12 cũng mang nhãn. Ở 72a7377 số nhãn này là 0. (3) Mẫu (?&lt;=khu vực)2\b xóa đúng số chú thích ở Điều 123 khoản 3 nhưng viết cứng cho một chỗ và áp cho mọi văn bản. (4) Chưa có test cho cleaner: 209 test của parser/ đều pass dù còn lỗi (1) và (2). (5) Corpus trong repo vẫn là bản 72a7377: chưa có l_52_2014_qh13_art_2_clause_4_chunk_1 và …_clause_5_chunk_1 (2/5 candidate của HN_062); nd_207_2025_nd_cp_art_17_clause_1_chunk_1, tt_34_2017_tt_byt_art_4_clause_2_chunk_1 và tt_34_2017_tt_byt_art_5_clause_2_chunk_1 vẫn mất chữ “hướng dẫn”.</w:t>
+              <w:t>(1) Corpus trong repo vẫn là bản 72a7377, sinh từ bản parse còn lỗi: thiếu l_52_2014_qh13_art_2_clause_4_chunk_1 và …_clause_5_chunk_1 (2/5 candidate của HN_062); nd_207_2025_nd_cp_art_17_clause_1_chunk_1, tt_34_2017_tt_byt_art_4_clause_2_chunk_1 và tt_34_2017_tt_byt_art_5_clause_2_chunk_1 mất chữ “hướng dẫn”. (2) Các mẫu viết riêng cho nguồn PDF cũ khớp 0 lần trên 23 TXT nhưng vẫn chạy trên mọi văn bản: 4 mẫu chú thích VBHN của Luật 81/2025/QH15 (AMENDMENT_FOOTNOTE_PATTERNS), mẫu “khu vực2”, mẫu nhãn “Hướng dẫn” và hai mẫu header bản in của NĐ 70/2001, NĐ 10/2015. Văn bản thêm sau có thể khớp nhầm các mẫu này.</w:t>
             </w:r>
           </w:p>
           <w:p>
@@ -2296,7 +2345,7 @@
               <w:rPr>
                 <w:sz w:val="17"/>
               </w:rPr>
-              <w:t>(1) Sửa “\\s” thành “\s” và cắt chú thích theo cấu trúc thay vì nguyên văn: khối bắt đầu bằng “N Luật số 81/2025/QH15”, “N Cụm từ”, “N Điều N của Luật số 81/2025/QH15” và dừng ở dòng trống hoặc ở dòng đầu tiên khớp Khoản (“N. ”), Điểm, Điều, Chương. Tốt hơn là bỏ chú thích theo vùng chân trang của PDF (cỡ chữ nhỏ). Gộp mẫu “khu vực2” vào bước xóa số chú thích dính chữ. (2) Gắn mẫu nhãn “Hướng dẫn” với file ND04 và xóa nhãn đứng cuối dòng (“Hướng dẫn$”, không IGNORECASE); không áp cho văn bản khác. (3) Thêm test cho cleaner: không Khoản, intro hay tiêu đề nào chứa “81/2025/QH15” hoặc “Cụm từ “” (mẫu sus_footnote của quality_report đã bắt được nhưng chỉ in ra); ND04 không còn “Hướng dẫn” cuối dòng; mọi từ bị xóa so với extracted_texts_qwen thuộc khối được phép (header, URL, số trang, chú thích). (4) Chạy lại cleaner, parser và exporter, commit corpus trong cùng PR (bước 3).</w:t>
+              <w:t>(1) Sinh lại corpus ở bước 3. (2) Bỏ các mẫu không còn khớp, hoặc gắn từng mẫu với file nguồn của nó để không chạy trên văn bản khác. Test cho cleaner ở A7.</w:t>
             </w:r>
           </w:p>
           <w:p>
@@ -2314,7 +2363,7 @@
               <w:rPr>
                 <w:sz w:val="17"/>
               </w:rPr>
-              <w:t>Chạy clean_extracted_text trên 23 file extracted_texts_qwen của bản sao 840c8a3 (thay ollama bằng module rỗng): 23/23 giống hệt cleaned_texts; mẫu chú thích đầu khớp 0 lần, hai mẫu “Cụm từ” và “Điều N của Luật số 81/2025/QH15” khớp 1 lần mỗi mẫu. extracted_texts_qwen/ND04.txt có 4 nhãn (dòng 90, 193, 303, 628), chỉ dòng 193 đứng riêng. parsed_jsons: l_52_2014_qh13_art_2_clause_3 kết thúc bằng “…số 34/2024/QH15.”.”. Corpus thử 21 văn bản (Phụ lục G): có đủ 5 chunk của Điều 2; l_52_2014_qh13_art_2_clause_3_chunk_1 mang chú thích; nd_10_2015_nd_cp_art_3_clause_5_chunk_1 và …_art_23_clause_1_chunk_1 kết thúc bằng “Hướng dẫn”. pytest parser/: 209 pass, 14 skip.</w:t>
+              <w:t>Chạy 4 mẫu của REPEATED_DOCUMENT_MARKING_PATTERNS và 4 mẫu của AMENDMENT_FOOTNOTE_PATTERNS trên 23 file extracted_texts_qwen của 64b65f0: 0 lần khớp. chunks.jsonl trong repo không đổi từ 72a7377 (1.156 chunk): không có hai chunk khoản 4, khoản 5 Điều 2 của Luật 52/2014; ba chunk NĐ 207/2025, TT 34/2017 nêu trên không chứa “hướng dẫn”.</w:t>
             </w:r>
           </w:p>
         </w:tc>
@@ -2331,7 +2380,7 @@
               <w:rPr>
                 <w:sz w:val="17"/>
               </w:rPr>
-              <w:t>parser/cleaner.py: REPEATED_DOCUMENT_MARKING_PATTERNS (dòng 85–101, mẫu “Hướng dẫn” và “khu vực2”), AMENDMENT_FOOTNOTE_PATTERNS (dòng 107–142, mẫu đầu), clean_extracted_text (dòng 268); parser/cleaned_texts/L01.txt, ND04.txt; data/chunking_output/chunks.jsonl</w:t>
+              <w:t>data/chunking_output/chunks.jsonl; parser/cleaner.py: REPEATED_DOCUMENT_MARKING_PATTERNS (dòng 85–101), AMENDMENT_FOOTNOTE_PATTERNS (dòng 107–142)</w:t>
             </w:r>
           </w:p>
         </w:tc>
@@ -2365,7 +2414,7 @@
               <w:rPr>
                 <w:sz w:val="17"/>
               </w:rPr>
-              <w:t>Còn một phần (840c8a3)</w:t>
+              <w:t>Còn một phần (64b65f0)</w:t>
             </w:r>
           </w:p>
         </w:tc>
@@ -2420,7 +2469,7 @@
               <w:rPr>
                 <w:sz w:val="17"/>
               </w:rPr>
-              <w:t>NMA 5a310c2–fc997a6 (gộp ở 840c8a3) đã sửa phần lớn: NĐ 68/2002 tách đủ Khoản ở Điều 2, 3, 39; Luật 1986 có title null ở 57/57 Điều và hết tên người ký; registry bỏ dấu cách ở số hiệu; exporter chạy được trên 21 văn bản (Phụ lục G). Còn lại: (1) Corpus trong repo vẫn là bản 72a7377 với 11 văn bản: 10 văn bản bổ sung chưa vào, 11 câu benchmark trích 8 văn bản trong số này vẫn not_mapped (vd HN_039 NĐ 68/2002, HN_044 TT 38/2025, HN_060 NĐ 123/2015). (2) TT 07/2001/TT-BTP và TT 07/2002/TT-BTP chia theo mục La Mã (I., II., 1.1-), không có Điều, nên vẫn không parse được. test_parser_unit.py nay ghi hai file vào KNOWN_UNPARSEABLE_TXT và bỏ qua 7 test cho mỗi file, nhưng chưa quyết định cách xử lý; HN_048 hỏi về TT 07/2002. (3) document_id của Luật 1986 đã viết thường (l_21_lct_hdnd7, tên file parsed_jsons theo ID này) nhưng vẫn ghi HDND (Hội đồng nhân dân) thay cho HĐNN (Hội đồng Nhà nước); build_document_id cho l_21_lct_hdnn7 (xem C6).</w:t>
+              <w:t>(1) Corpus trong repo vẫn là bản 72a7377 với 11 văn bản: 10 văn bản bổ sung chưa vào, 11 câu benchmark trích 8 văn bản trong số này vẫn not_mapped (vd HN_039 NĐ 68/2002, HN_044 TT 38/2025, HN_060 NĐ 123/2015). (2) TT 07/2001/TT-BTP và TT 07/2002/TT-BTP chia theo mục La Mã (I., II., 1.1-), không có Điều, nên vẫn không parse được; test_parser_unit.py ghi hai file vào KNOWN_UNPARSEABLE_TXT nhưng chưa quyết định cách xử lý; HN_048 hỏi về TT 07/2002.</w:t>
             </w:r>
           </w:p>
           <w:p>
@@ -2438,7 +2487,7 @@
               <w:rPr>
                 <w:sz w:val="17"/>
               </w:rPr>
-              <w:t>(1) Sinh lại corpus trên đủ parsed_jsons ở bước 3 và thêm văn bản mới vào article_index.json (C5). (2) Với 2 TT chia theo mục La Mã: hoặc parser hỗ trợ cấp mục La Mã thay cho Điều, hoặc ghi trong registry là chưa đưa vào corpus và đánh dấu HN_048 là câu hỏi về văn bản ngoài corpus (D2). (3) Dev 1 đổi document_id thành l_21_lct_hdnn7 (hoặc chốt ngoại lệ ở C6), đổi tên file parsed_jsons theo, cập nhật bảng ở mục 6 của data_contract.md (Bảng Ánh xạ Định danh Văn bản) và README.</w:t>
+              <w:t>(1) Sinh lại corpus trên đủ parsed_jsons ở bước 3 và thêm văn bản mới vào article_index.json (C5). (2) Hoặc parser hỗ trợ cấp mục La Mã thay cho Điều, hoặc ghi trong registry là chưa đưa vào corpus và đánh dấu HN_048 là câu hỏi về văn bản ngoài corpus (D2).</w:t>
             </w:r>
           </w:p>
           <w:p>
@@ -2456,7 +2505,7 @@
               <w:rPr>
                 <w:sz w:val="17"/>
               </w:rPr>
-              <w:t>Chạy lại parser trên bản sao 840c8a3 (test_parser.py --skip-clean, không đặt biến môi trường): 21/21 file giống hệt parsed_jsons; 2 TT lỗi “Không tìm thấy Điều nào”. NĐ 68/2002 Điều 2, 3, 39 có 2, 3, 2 Khoản (trước mỗi Điều chỉ một khối). Luật 1986: 0/57 Điều có tiêu đề; Điều 57 kết thúc bằng “…thông qua ngày 29 tháng 12 năm 1986.”. chunks.jsonl trong repo: 1.156 chunk, 11 văn bản.</w:t>
+              <w:t>Chạy lại parser trên bản sao 64b65f0: 2 TT lỗi “Không tìm thấy Điều nào”. chunks.jsonl trong repo: 1.156 chunk, 11 văn bản.</w:t>
             </w:r>
           </w:p>
         </w:tc>
@@ -2473,7 +2522,7 @@
               <w:rPr>
                 <w:sz w:val="17"/>
               </w:rPr>
-              <w:t>data/chunking_output/chunks.jsonl; data/reference/document_versions.json (bản ghi L03); parser/parsed_jsons/l_21_lct_hdnd7.json; parser/cleaned_texts/07_2001_TT-BTP_48707.txt, 07_2002_TT-BTP_50377.txt; parser/test_parser_unit.py: KNOWN_UNPARSEABLE_TXT (dòng 308)</w:t>
+              <w:t>data/chunking_output/chunks.jsonl; parser/cleaned_texts/07_2001_TT-BTP_48707.txt, 07_2002_TT-BTP_50377.txt; parser/test_parser_unit.py: KNOWN_UNPARSEABLE_TXT (dòng 308)</w:t>
             </w:r>
           </w:p>
         </w:tc>
@@ -2507,7 +2556,7 @@
               <w:rPr>
                 <w:sz w:val="17"/>
               </w:rPr>
-              <w:t>Còn một phần (840c8a3)</w:t>
+              <w:t>Còn một phần (64b65f0)</w:t>
             </w:r>
           </w:p>
         </w:tc>
@@ -2527,7 +2576,7 @@
                 <w:b/>
                 <w:sz w:val="17"/>
               </w:rPr>
-              <w:t>A27</w:t>
+              <w:t>A16</w:t>
             </w:r>
           </w:p>
         </w:tc>
@@ -2562,7 +2611,7 @@
               <w:rPr>
                 <w:sz w:val="17"/>
               </w:rPr>
-              <w:t>TT 04/2020/TT-BTP (văn bản bổ sung ở 72a7377, chưa vào corpus) mất toàn bộ cấp Mục: 39/39 Điều có section = null. Tên 6/8 Mục bị nuốt vào cuối Khoản cuối của Điều đứng trước, vd Điều 10 khoản 2 kết thúc bằng “Mục 2. ĐĂNG KÝ KẾT HÔN, CẤP GIẤY XÁC NHẬN TÌNH TRẠNG HÔN NHÂN” (thêm Điều 12 khoản 5, Điều 16 khoản 4, Điều 20 khoản 2, Điều 23 khoản 3, Điều 28 khoản 5); 2 tên “Mục 1” đứng sau tên Chương II, III không còn ở trường nào. Nguyên nhân: _HEADING_LABEL chỉ cho dấu hai chấm sau số (“Mục 2:”) và HEAD_LABEL_RE đòi khoảng trắng ngay sau nhãn, nên nhãn có dấu chấm (“Mục 2.”, “Chương II.”) không được nhận là heading. Trong 23 TXT, chỉ TT 04/2020 viết Mục kiểu này. Khi văn bản vào corpus, 6 chunk mang tên Mục như nội dung Khoản và breadcrumb của mọi chunk thiếu Mục. Chunker không sửa được vì tên Mục đã nằm trong clause_text.</w:t>
+              <w:t>Title là dạng tóm tắt của registry, không phải tên chính thức (vd TT 32/2016 “Quy định liên quan đến hỗ trợ sinh sản”, NĐ 77/2001 “Đăng ký kết hôn theo Nghị quyết 35/2000/QH10”); ba Luật HNGĐ ghi năm không thống nhất (“Luật Hôn nhân và gia đình năm 1986”, “Luật Hôn nhân và gia đình 2000”, Luật 52/2014 không ghi năm). Luật 22/2000 phải mang hậu tố năm để không trùng title với Luật 52/2014.</w:t>
             </w:r>
           </w:p>
           <w:p>
@@ -2580,25 +2629,7 @@
               <w:rPr>
                 <w:sz w:val="17"/>
               </w:rPr>
-              <w:t>Cho _HEADING_LABEL nhận cả dấu chấm sau số Chương/Mục (vd \s*[:.]?) và thêm test cho TT 04/2020: 8 Mục, section khác null, không Khoản nào chứa “Mục N.”.</w:t>
-            </w:r>
-          </w:p>
-          <w:p>
-            <w:pPr>
-              <w:spacing w:after="20" w:line="252" w:lineRule="auto"/>
-            </w:pPr>
-            <w:r>
-              <w:rPr>
-                <w:b/>
-                <w:sz w:val="17"/>
-              </w:rPr>
-              <w:t xml:space="preserve">Kiểm chứng: </w:t>
-            </w:r>
-            <w:r>
-              <w:rPr>
-                <w:sz w:val="17"/>
-              </w:rPr>
-              <w:t>HEAD_LABEL_RE.search("Mục 2. ĐĂNG KÝ KẾT HÔN") trả None; “Mục 2 ĐĂNG KÝ…” và “Mục 2: ĐĂNG KÝ” khớp. parser/cleaned_texts/TT_04_2020_BTP.txt có 8 dòng “Mục N.” (dòng 81–519); tt_04_2020_tt_btp.json: 0/39 Điều có section, 6 Khoản chứa tên Mục. Corpus thử 21 văn bản: tt_04_2020_tt_btp_art_10_clause_2_chunk_2 và …_art_23_clause_3_chunk_2 kết thúc bằng tên Mục.</w:t>
+              <w:t>Dev 1 chốt registry là nguồn title chính thức và một cách ghi năm cho các văn bản cùng tên.</w:t>
             </w:r>
           </w:p>
         </w:tc>
@@ -2615,7 +2646,7 @@
               <w:rPr>
                 <w:sz w:val="17"/>
               </w:rPr>
-              <w:t>parser/parser.py: _HEADING_LABEL, HEAD_LABEL_RE (dòng 93–94), iter_headings (dòng 131), parse_text_to_articles (dòng 850–866); parser/parsed_jsons/tt_04_2020_tt_btp.json</w:t>
+              <w:t>parser/parser.py: TITLE_TYPE_RE, TITLE_SELF_REF_RE, locate_document_title, clean_document_title_candidate, extract_issuing_body (dòng 877–1014)</w:t>
             </w:r>
           </w:p>
         </w:tc>
@@ -2632,7 +2663,7 @@
               <w:rPr>
                 <w:sz w:val="17"/>
               </w:rPr>
-              <w:t>Parser</w:t>
+              <w:t>Parser + Dev 1</w:t>
             </w:r>
           </w:p>
         </w:tc>
@@ -2640,16 +2671,17 @@
           <w:tcPr>
             <w:tcW w:type="dxa" w:w="964"/>
             <w:vAlign w:val="top"/>
-          </w:tcPr>
-          <w:p>
-            <w:pPr>
-              <w:spacing w:after="20" w:line="252" w:lineRule="auto"/>
-            </w:pPr>
-            <w:r>
-              <w:rPr>
-                <w:sz w:val="17"/>
-              </w:rPr>
-              <w:t>Mới</w:t>
+            <w:shd w:val="clear" w:color="auto" w:fill="E2EFDA"/>
+          </w:tcPr>
+          <w:p>
+            <w:pPr>
+              <w:spacing w:after="20" w:line="252" w:lineRule="auto"/>
+            </w:pPr>
+            <w:r>
+              <w:rPr>
+                <w:sz w:val="17"/>
+              </w:rPr>
+              <w:t>Đã sửa</w:t>
             </w:r>
           </w:p>
         </w:tc>
@@ -2669,7 +2701,7 @@
                 <w:b/>
                 <w:sz w:val="17"/>
               </w:rPr>
-              <w:t>A16</w:t>
+              <w:t>A11</w:t>
             </w:r>
           </w:p>
         </w:tc>
@@ -2704,7 +2736,7 @@
               <w:rPr>
                 <w:sz w:val="17"/>
               </w:rPr>
-              <w:t>Metadata của 21/21 văn bản lấy từ registry và khớp registry ở 8 trường. Còn chưa chốt: title là dạng tóm tắt của registry, không phải tên chính thức (vd TT 32/2016 “Quy định liên quan đến hỗ trợ sinh sản”, NĐ 77/2001 “Đăng ký kết hôn theo Nghị quyết 35/2000/QH10”); ba Luật HNGĐ ghi năm không thống nhất (“Luật Hôn nhân và gia đình năm 1986”, “Luật Hôn nhân và gia đình 2000”, Luật 52/2014 không ghi năm). Luật 22/2000 phải mang hậu tố năm để không trùng title với Luật 52/2014.</w:t>
+              <w:t>(1) document_id là ttlt_01_2016_ttlt_tandtc, rút gọn theo registry và bảng ở mục 6 của data_contract.md (parser lấy qua resolve_document_id), trái quy tắc [loại]_[số hiệu đầy đủ] ở mục 2 (Quy ước Định danh); xem C6. (2) Từ 72a7377, DOCUMENT_NUMBER_RE viết “\\s”, “\\w” trong chuỗi rf, nên regex tìm dấu gạch ngược thật và không bao giờ khớp nhãn “Số:”. Số hiệu của 23/23 TXT vẫn đúng nhờ nhánh dự phòng, vốn lấy số hiệu đầu tiên trong 5.000 ký tự đầu; văn bản có số hiệu khác đứng trước dòng “Số:” (vd trích văn bản được hướng dẫn ở phần tiêu đề) sẽ bị nhận sai.</w:t>
             </w:r>
           </w:p>
           <w:p>
@@ -2722,7 +2754,7 @@
               <w:rPr>
                 <w:sz w:val="17"/>
               </w:rPr>
-              <w:t>Dev 1 chốt registry là nguồn title chính thức và một cách ghi năm cho các văn bản cùng tên.</w:t>
+              <w:t>Chốt quy tắc document_id theo C6. Sửa DOCUMENT_NUMBER_RE thành (?&lt;!\w)Số\s*:\s*(…) và thêm test: TXT có nhãn “Số:” phải lấy số hiệu từ nhãn, không từ nhánh dự phòng.</w:t>
             </w:r>
           </w:p>
         </w:tc>
@@ -2739,7 +2771,7 @@
               <w:rPr>
                 <w:sz w:val="17"/>
               </w:rPr>
-              <w:t>parser/parser.py: TITLE_TYPE_RE, TITLE_SELF_REF_RE, locate_document_title, clean_document_title_candidate, extract_issuing_body (dòng 877–1014)</w:t>
+              <w:t>parser/parser.py: DOCUMENT_NUMBER_RE (dòng 909–912), extract_document_number (dòng 977–1003), resolve_document_id; parser/cleaner.py</w:t>
             </w:r>
           </w:p>
         </w:tc>
@@ -2756,7 +2788,7 @@
               <w:rPr>
                 <w:sz w:val="17"/>
               </w:rPr>
-              <w:t>Parser + Dev 1</w:t>
+              <w:t>Parser</w:t>
             </w:r>
           </w:p>
         </w:tc>
@@ -2794,7 +2826,7 @@
                 <w:b/>
                 <w:sz w:val="17"/>
               </w:rPr>
-              <w:t>A11</w:t>
+              <w:t>A7</w:t>
             </w:r>
           </w:p>
         </w:tc>
@@ -2829,7 +2861,7 @@
               <w:rPr>
                 <w:sz w:val="17"/>
               </w:rPr>
-              <w:t>Số hiệu TTLT 01/2016 đã đủ (“01/2016/TTLT-TANDTC-VKSNDTC-BTP” ở parsed_jsons và 45/45 chunk). Còn lại: (1) document_id là ttlt_01_2016_ttlt_tandtc, rút gọn theo registry và bảng ở mục 6 của data_contract.md (parser lấy qua resolve_document_id), trái quy tắc [loại]_[số hiệu đầy đủ] ở mục 2 (Quy ước Định danh); xem C6. (2) Từ 72a7377, DOCUMENT_NUMBER_RE viết “\\s”, “\\w” trong chuỗi rf, nên regex tìm dấu gạch ngược thật và không bao giờ khớp nhãn “Số:”. Số hiệu của 23/23 TXT vẫn đúng nhờ nhánh dự phòng, vốn lấy số hiệu đầu tiên trong 5.000 ký tự đầu; văn bản có số hiệu khác đứng trước dòng “Số:” (vd trích văn bản được hướng dẫn ở phần tiêu đề) sẽ bị nhận sai.</w:t>
+              <w:t>(1) Chưa có CI chạy pytest parser/ (H2); 72a7377 và 1260ed8 đều được commit khi pytest parser/ đang fail. (2) Không có test cho cleaner: các mẫu thừa của A25 và việc đổi cả 11 PDF không làm test nào đỏ; mẫu sus_footnote của quality_report chỉ in ra. cleaner.py import ollama ở đầu file nên test không import được cleaner trên máy thiếu ollama (A8).</w:t>
             </w:r>
           </w:p>
           <w:p>
@@ -2847,7 +2879,25 @@
               <w:rPr>
                 <w:sz w:val="17"/>
               </w:rPr>
-              <w:t>Chốt quy tắc document_id theo C6. Sửa DOCUMENT_NUMBER_RE thành (?&lt;!\w)Số\s*:\s*(…) và thêm test: TXT có nhãn “Số:” phải lấy số hiệu từ nhãn, không từ nhánh dự phòng.</w:t>
+              <w:t>Chạy pytest parser/ trong CI và chặn merge khi fail (H2). Thêm test cho cleaner (mọi từ bị xóa so với extracted_texts_qwen thuộc khối được phép; không Khoản, intro hay tiêu đề nào khớp mẫu sus_footnote), sau khi cleaner chỉ import ollama khi cần OCR (A8).</w:t>
+            </w:r>
+          </w:p>
+          <w:p>
+            <w:pPr>
+              <w:spacing w:after="20" w:line="252" w:lineRule="auto"/>
+            </w:pPr>
+            <w:r>
+              <w:rPr>
+                <w:b/>
+                <w:sz w:val="17"/>
+              </w:rPr>
+              <w:t xml:space="preserve">Kiểm chứng: </w:t>
+            </w:r>
+            <w:r>
+              <w:rPr>
+                <w:sz w:val="17"/>
+              </w:rPr>
+              <w:t>Không file test nào trong parser/, tests/, test/ gọi hàm của cleaner.py (parser/test_parser.py chỉ gọi cleaner khi chạy không có --skip-clean); repo không có thư mục .github/.</w:t>
             </w:r>
           </w:p>
         </w:tc>
@@ -2864,7 +2914,7 @@
               <w:rPr>
                 <w:sz w:val="17"/>
               </w:rPr>
-              <w:t>parser/parser.py: DOCUMENT_NUMBER_RE (dòng 909–912), extract_document_number (dòng 977–1003), resolve_document_id; parser/cleaner.py</w:t>
+              <w:t>parser/cleaner.py; parser/parser.py: quality_report; parser/test_parser_unit.py</w:t>
             </w:r>
           </w:p>
         </w:tc>
@@ -2889,17 +2939,17 @@
           <w:tcPr>
             <w:tcW w:type="dxa" w:w="964"/>
             <w:vAlign w:val="top"/>
-            <w:shd w:val="clear" w:color="auto" w:fill="E2EFDA"/>
-          </w:tcPr>
-          <w:p>
-            <w:pPr>
-              <w:spacing w:after="20" w:line="252" w:lineRule="auto"/>
-            </w:pPr>
-            <w:r>
-              <w:rPr>
-                <w:sz w:val="17"/>
-              </w:rPr>
-              <w:t>Đã sửa</w:t>
+            <w:shd w:val="clear" w:color="auto" w:fill="FFF2CC"/>
+          </w:tcPr>
+          <w:p>
+            <w:pPr>
+              <w:spacing w:after="20" w:line="252" w:lineRule="auto"/>
+            </w:pPr>
+            <w:r>
+              <w:rPr>
+                <w:sz w:val="17"/>
+              </w:rPr>
+              <w:t>Còn một phần</w:t>
             </w:r>
           </w:p>
         </w:tc>
@@ -2919,7 +2969,7 @@
                 <w:b/>
                 <w:sz w:val="17"/>
               </w:rPr>
-              <w:t>A7</w:t>
+              <w:t>A6</w:t>
             </w:r>
           </w:p>
         </w:tc>
@@ -2954,7 +3004,7 @@
               <w:rPr>
                 <w:sz w:val="17"/>
               </w:rPr>
-              <w:t>840c8a3 thêm test bất biến chạy parser trên mọi TXT (Điều liên tục, không sót mốc Điều, không Điều bắt đầu giữa câu, title null cho văn bản không có tiêu đề Điều, số Khoản khớp số dòng “N.” của TXT, Điều cuối không còn chữ ký), test định danh cho parsed_jsons và test tiêu đề, Chương cho TT 02a/2015 Điều 9, 14; test/test_chunking.py chạy chunker trên mọi parsed_jsons. pytest parser/: 209 pass, 14 skip. Còn thiếu: (1) Không có test cho cleaner, nên chú thích VBHN trong Luật 52/2014 Điều 2 khoản 3 và 3 nhãn “Hướng dẫn” ở NĐ 10/2015 (A25) lọt qua cả 209 test; mẫu sus_footnote của quality_report bắt được chú thích nhưng chỉ in ra. (2) Test giá trị vẫn chỉ có cho Luật 52/2014 và TT 02a/2015; TTLT 01/2016 Điều 9 (A23) chưa có test tiêu đề. (3) Ngưỡng tiêu đề là 80 từ, gấp đôi mức 40 từ đề xuất, trong khi tiêu đề thật dài nhất là 44 từ (NĐ 126/2014 Điều 8), nên tiêu đề nuốt thêm 40–80 từ nội dung vẫn pass. (4) Chưa có CI chạy pytest parser/ (H2). (5) Thông báo FileNotFoundError của find_document_versions_file vẫn in chữ \n thay vì xuống dòng (phần còn lại của A22).</w:t>
+              <w:t>NMA 1260ed8 thay L01.pdf bằng bản gốc Luật 52/2014 (có lớp text, 40 trang), không còn là VBHN 121/VBHN-VPQH. parsed_jsons nay khớp registry (effective_date 2015-01-01, không có phiên bản hợp nhất) nhưng lệch benchmark và luật hiện hành: Điều 123 khoản 3 ghi “Tòa án nhân dân cấp huyện”, trong khi Luật 81/2025/QH15 đã đổi thành “Tòa án nhân dân khu vực” (bản VBHN); đáp án HN_183 lấy từ bản VBHN. Câu hỏi về thời điểm sau khi Luật 81/2025 có hiệu lực sẽ nhận quy định cũ. Nguồn tải của PDF mới không ghi ở đâu; registry vẫn trỏ vbpl.vn ItemID 36870.</w:t>
             </w:r>
           </w:p>
           <w:p>
@@ -2972,7 +3022,25 @@
               <w:rPr>
                 <w:sz w:val="17"/>
               </w:rPr>
-              <w:t>Thêm test cho cleaner như đề xuất ở A25, và một test bất biến: không Khoản, intro hay tiêu đề nào khớp mẫu sus_footnote. Thêm TTLT 01/2016 Điều 9 vào test tiêu đề. Đặt MAX_TITLE_WORDS_IN_CORPUS = 40 và đưa 2 tiêu đề thật dài hơn (NĐ 126/2014 Điều 8, TT 02a/2015 Điều 4) vào TITLE_LENGTH_ALLOWLIST. Chạy pytest parser/ trong CI và chặn commit khi fail (H2). Sửa chuỗi “\\n” thành “\n” ở parser.py dòng 1158, 1162.</w:t>
+              <w:t>Dev 1 chốt phiên bản dùng trong corpus trước khi sinh lại corpus: (a) dùng VBHN 121 (khớp benchmark và luật hiện hành), ghi version/consolidated_date vào registry; hoặc (b) giữ bản gốc, thêm Luật 81/2025 làm văn bản sửa đổi có effective_from riêng, rồi sửa đáp án HN_183. Ghi nguồn tải của từng PDF (URL, ngày tải, checksum) vào registry.</w:t>
+            </w:r>
+          </w:p>
+          <w:p>
+            <w:pPr>
+              <w:spacing w:after="20" w:line="252" w:lineRule="auto"/>
+            </w:pPr>
+            <w:r>
+              <w:rPr>
+                <w:b/>
+                <w:sz w:val="17"/>
+              </w:rPr>
+              <w:t xml:space="preserve">Kiểm chứng: </w:t>
+            </w:r>
+            <w:r>
+              <w:rPr>
+                <w:sz w:val="17"/>
+              </w:rPr>
+              <w:t>parser/cleaned_texts/L01.txt dòng 1150: “3. Tòa án nhân dân cấp huyện nơi cư trú…”. ground_truth.json HN_183: answer chứa “Tòa án nhân dân khu vực2”. So với 840c8a3: 26 Khoản của Luật 52/2014 đổi chữ, chủ yếu chữ hoa thành chữ thường (“Dân” → “dân”, “Nuôi” → “nuôi”), Điều 123 khoản 3 đổi “khu vực” → “cấp huyện”.</w:t>
             </w:r>
           </w:p>
         </w:tc>
@@ -2989,132 +3057,7 @@
               <w:rPr>
                 <w:sz w:val="17"/>
               </w:rPr>
-              <w:t>parser/test_parser_unit.py: MAX_TITLE_WORDS_IN_CORPUS, TITLE_LENGTH_ALLOWLIST (dòng 314–316); parser/parser.py: find_document_versions_file (dòng 1158, 1162), quality_report (dòng 1332)</w:t>
-            </w:r>
-          </w:p>
-        </w:tc>
-        <w:tc>
-          <w:tcPr>
-            <w:tcW w:type="dxa" w:w="1077"/>
-            <w:vAlign w:val="top"/>
-          </w:tcPr>
-          <w:p>
-            <w:pPr>
-              <w:spacing w:after="20" w:line="252" w:lineRule="auto"/>
-            </w:pPr>
-            <w:r>
-              <w:rPr>
-                <w:sz w:val="17"/>
-              </w:rPr>
-              <w:t>Parser</w:t>
-            </w:r>
-          </w:p>
-        </w:tc>
-        <w:tc>
-          <w:tcPr>
-            <w:tcW w:type="dxa" w:w="964"/>
-            <w:vAlign w:val="top"/>
-            <w:shd w:val="clear" w:color="auto" w:fill="FFF2CC"/>
-          </w:tcPr>
-          <w:p>
-            <w:pPr>
-              <w:spacing w:after="20" w:line="252" w:lineRule="auto"/>
-            </w:pPr>
-            <w:r>
-              <w:rPr>
-                <w:sz w:val="17"/>
-              </w:rPr>
-              <w:t>Còn một phần</w:t>
-            </w:r>
-          </w:p>
-        </w:tc>
-      </w:tr>
-      <w:tr>
-        <w:tc>
-          <w:tcPr>
-            <w:tcW w:type="dxa" w:w="624"/>
-            <w:vAlign w:val="top"/>
-          </w:tcPr>
-          <w:p>
-            <w:pPr>
-              <w:spacing w:after="20" w:line="252" w:lineRule="auto"/>
-            </w:pPr>
-            <w:r>
-              <w:rPr>
-                <w:b/>
-                <w:sz w:val="17"/>
-              </w:rPr>
-              <w:t>A6</w:t>
-            </w:r>
-          </w:p>
-        </w:tc>
-        <w:tc>
-          <w:tcPr>
-            <w:tcW w:type="dxa" w:w="1020"/>
-            <w:vAlign w:val="top"/>
-            <w:shd w:val="clear" w:color="auto" w:fill="FCE8B2"/>
-          </w:tcPr>
-          <w:p>
-            <w:pPr>
-              <w:spacing w:after="20" w:line="252" w:lineRule="auto"/>
-            </w:pPr>
-            <w:r>
-              <w:rPr>
-                <w:sz w:val="17"/>
-              </w:rPr>
-              <w:t>Trung bình</w:t>
-            </w:r>
-          </w:p>
-        </w:tc>
-        <w:tc>
-          <w:tcPr>
-            <w:tcW w:type="dxa" w:w="4479"/>
-            <w:vAlign w:val="top"/>
-          </w:tcPr>
-          <w:p>
-            <w:pPr>
-              <w:spacing w:after="20" w:line="252" w:lineRule="auto"/>
-            </w:pPr>
-            <w:r>
-              <w:rPr>
-                <w:sz w:val="17"/>
-              </w:rPr>
-              <w:t>L01.pdf là VBHN 121/VBHN-VPQH (Luật 52/2014 hợp nhất với Luật 81/2025), khớp benchmark. Còn lại: registry vẫn mô tả bản gốc (effective_date 2015-01-01), không có trường phiên bản hay ngày hợp nhất. Chú thích 1 của VBHN nay nằm trong khoản 3 Điều 2 vì mẫu cắt không khớp (A25).</w:t>
-            </w:r>
-          </w:p>
-          <w:p>
-            <w:pPr>
-              <w:spacing w:after="20" w:line="252" w:lineRule="auto"/>
-            </w:pPr>
-            <w:r>
-              <w:rPr>
-                <w:b/>
-                <w:sz w:val="17"/>
-              </w:rPr>
-              <w:t xml:space="preserve">Đề xuất: </w:t>
-            </w:r>
-            <w:r>
-              <w:rPr>
-                <w:sz w:val="17"/>
-              </w:rPr>
-              <w:t>Dev 1 thêm version/consolidated_date vào registry. Cắt chú thích theo A25.</w:t>
-            </w:r>
-          </w:p>
-        </w:tc>
-        <w:tc>
-          <w:tcPr>
-            <w:tcW w:type="dxa" w:w="1701"/>
-            <w:vAlign w:val="top"/>
-          </w:tcPr>
-          <w:p>
-            <w:pPr>
-              <w:spacing w:after="20" w:line="252" w:lineRule="auto"/>
-            </w:pPr>
-            <w:r>
-              <w:rPr>
-                <w:sz w:val="17"/>
-              </w:rPr>
-              <w:t>data/raw_data/laws_and_decrees/L01.pdf; data/reference/document_versions.json; docs/expansion_300_report.md</w:t>
+              <w:t>data/raw_data/laws_and_decrees/L01.pdf; data/reference/document_versions.json (bản ghi L01); data/benchmark/ground_truth.json (HN_183)</w:t>
             </w:r>
           </w:p>
         </w:tc>
@@ -3286,7 +3229,7 @@
       </w:pPr>
       <w:r>
         <w:rPr/>
-        <w:t>Nhóm A đo trên 840c8a3 (24/10). A21 đã sửa (cắt tên người ký theo quy tắc chung, có test) và được bỏ khỏi bảng. A25, A26, A6, A7 sửa thêm một phần, bảng chỉ ghi phần còn lại. A27, A16, A11, A8 không đổi: _HEADING_LABEL, DOCUMENT_NUMBER_RE không đổi, registry chỉ đổi bản ghi Luật 1986, requirements.txt chỉ ghim underthesea. Corpus trong repo chưa sinh lại từ 72a7377 nên vẫn mang A25. Số liệu đo ở Phụ lục H.</w:t>
+        <w:t>Nhóm A đo trên 64b65f0 (24/10), sau khi gộp NMA 1260ed8. A27 đã sửa (8/8 Mục của TT 04/2020 được nhận, không Khoản nào chứa tên Mục) và được bỏ khỏi bảng; test còn thiếu chuyển sang A7. 11 PDF gốc được thay bằng bản có lớp text nên A25 chỉ còn phần corpus và các mẫu cleaner thừa; A6 đổi lại vì L01 là bản gốc 2014; A26 chỉ còn 2 TT chia theo mục La Mã và corpus. A16, A11, A8 không đổi. Số liệu đo ở Phụ lục I. Ngày 25/10, A28 được sửa (tiêu đề Điều, Chương, Mục giữ dấu câu và không cụt; số hiệu không còn bị tách sau “-”) và được bỏ khỏi bảng; A7 có thêm test cho A23, A27, A28, ngưỡng tiêu đề 40 từ và thông báo lỗi xuống dòng thật, nên chỉ còn CI và test cho cleaner (Phụ lục K). Bản sửa ở commit 77b5886; corpus chưa sinh lại.</w:t>
       </w:r>
     </w:p>
     <w:p>
@@ -11476,7 +11419,7 @@
               <w:rPr>
                 <w:sz w:val="17"/>
               </w:rPr>
-              <w:t>32 pass, 1 fail; 840c8a3: 209 pass, 14 skip</w:t>
+              <w:t>32 pass, 1 fail; 840c8a3: 209 pass, 14 skip; 64b65f0: 1 fail; 25/10: 0 fail</w:t>
             </w:r>
           </w:p>
         </w:tc>
@@ -11493,7 +11436,7 @@
               <w:rPr>
                 <w:sz w:val="17"/>
               </w:rPr>
-              <w:t>Ở 840c8a3 hết fail (Luật 52/2014 Điều 2 đủ 5 Khoản); thêm test bất biến cho mọi TXT; 14 skip là 7 test cho mỗi TT chia theo mục La Mã. Chưa có test cho cleaner: chú thích VBHN và 3 nhãn “Hướng dẫn” (A25) không làm test nào fail.</w:t>
+              <w:t>Ở 64b65f0: test_tt02a_wrapped_chapter_title_is_complete[9-…] fail vì tiêu đề Chương III của TT 02a/2015 mất dấu phẩy khi ghép dòng (A28). Sau bản sửa A28 (77b5886): hết fail. Chưa có test cho cleaner.</w:t>
             </w:r>
           </w:p>
         </w:tc>
@@ -11510,7 +11453,7 @@
               <w:rPr>
                 <w:sz w:val="17"/>
               </w:rPr>
-              <w:t>A25, A7</w:t>
+              <w:t>A28, A7</w:t>
             </w:r>
           </w:p>
         </w:tc>
@@ -12532,7 +12475,7 @@
               <w:rPr>
                 <w:sz w:val="17"/>
               </w:rPr>
-              <w:t>Chạy riêng từng file; chạy chung tests/ và test/ vẫn lỗi collect. Chạy test làm bẩn git trở lại vì 72a7377 commit lại parser/__pycache__/*.pyc (H5). Sau bản sửa chunking 24/10 (chunking_test): 218 pass, 2 fail (thêm 14 test của test_chunking.py; 2 fail như trên). Ở 840c8a3, parser/: 209 pass, 14 skip (hết fail của A25).</w:t>
+              <w:t>Chạy riêng từng file; chạy chung tests/ và test/ vẫn lỗi collect. Chạy test làm bẩn git trở lại vì 72a7377 commit lại parser/__pycache__/*.pyc (H5). Sau bản sửa chunking 24/10 (chunking_test): 218 pass, 2 fail (thêm 14 test của test_chunking.py; 2 fail như trên). Ở 840c8a3, parser/: 209 pass, 14 skip (hết fail của A25). Ở 64b65f0, parser/, tests/schema_test.py và test/test_chunking.py: 235 pass, 14 skip, 1 fail (A28). Sau bản sửa A28 (77b5886): 302 pass, 20 skip, 0 fail (thêm 72 test; 6 skip mới là 3 test chạy trên mọi TXT gặp 2 TT chia theo mục La Mã).</w:t>
             </w:r>
           </w:p>
         </w:tc>
@@ -12571,7 +12514,7 @@
     <w:p>
       <w:pPr/>
       <w:r>
-        <w:t>Bảng dưới đây là thứ tự làm cho các lỗi còn mở sau khi gộp CTM và NMA, tính cả các lỗi mới A25, A26. Mỗi bước ghi việc cụ thể, owner, điều kiện để bắt đầu và tiêu chí để coi là xong. Màu ở cột Bước: đỏ là đang chặn các bước sau, vàng là làm ngay khi có điều kiện, xanh là làm sau. Những lỗi đã sửa (mục 3) không có trong bảng.</w:t>
+        <w:t>Bảng dưới đây là thứ tự làm cho các lỗi còn mở sau khi gộp CTM và NMA, tính cả các lỗi mới A25, A26, A28. Mỗi bước ghi việc cụ thể, owner, điều kiện để bắt đầu và tiêu chí để coi là xong. Màu ở cột Bước: đỏ là đang chặn các bước sau, vàng là làm ngay khi có điều kiện, xanh là làm sau. Những lỗi đã sửa (mục 3) không có trong bảng. Nguyên tắc: chỉ sửa trước những lỗi đang chặn việc sinh corpus (A6, A28), sinh corpus rồi chuyển sang map gold, dựng index và đo số; các lỗi parser còn lại làm song song, không chờ sửa hết. Mỗi lần sửa parser từ 22/10 tới nay đều sinh thêm lỗi mới (A24 từ bản sửa A23, A25 từ bản sửa A6 và A13, A28 lộ ra khi đổi PDF), và hai lần commit được đẩy lên khi test đang fail, nên việc chặn commit khi test fail làm trước tiên.</w:t>
       </w:r>
     </w:p>
     <w:tbl>
@@ -12734,7 +12677,7 @@
               <w:rPr>
                 <w:sz w:val="17"/>
               </w:rPr>
-              <w:t>requirements: thêm pymupdf, bỏ pdfplumber; cleaner chỉ import ollama khi cần OCR (A8). git rm --cached 4 file .pyc (H5). Đổi tên một trong hai test_benchmark.py (H2).</w:t>
+              <w:t>requirements: thêm pymupdf, bỏ pdfplumber; cleaner chỉ import ollama khi cần OCR (A8). git rm --cached 4 file .pyc (H5). Đổi tên một trong hai test_benchmark.py (H2). Thêm pre-commit hook hoặc CI chạy pytest parser/ và chặn commit khi fail (A7, H2).</w:t>
             </w:r>
           </w:p>
         </w:tc>
@@ -12750,7 +12693,7 @@
               <w:rPr>
                 <w:sz w:val="17"/>
               </w:rPr>
-              <w:t>A8, H5, H2</w:t>
+              <w:t>A8, H5, H2, A7</w:t>
             </w:r>
           </w:p>
         </w:tc>
@@ -12800,7 +12743,7 @@
               <w:rPr>
                 <w:sz w:val="17"/>
               </w:rPr>
-              <w:t>Clone mới cài đủ thư viện và chạy được cleaner, parser; pytest test/ tests/ hết lỗi collect; chạy test không làm bẩn git.</w:t>
+              <w:t>Clone mới cài đủ thư viện và chạy được cleaner, parser; pytest test/ tests/ hết lỗi collect; chạy test không làm bẩn git. Không commit được khi pytest parser/ fail.</w:t>
             </w:r>
           </w:p>
         </w:tc>
@@ -12837,7 +12780,7 @@
                 <w:b w:val="0"/>
                 <w:sz w:val="17"/>
               </w:rPr>
-              <w:t>Registry thêm trường phiên bản/ngày hợp nhất cho Luật 52/2014 bản VBHN (A6). Bảng ánh xạ 4 kiểu ID: slug, mã file, số hiệu, l01_ (C5). retrieval_schema theo Sprint 6 §4.3 (C2). Sửa câu quy tắc document_id ở mục 2 của data_contract.md theo registry và thêm test đối chiếu registry với bảng mục 6, README và chunks.jsonl (C6). Khai báo query, config, stats trong RetrievalEnvelope (C7). Sửa enum document_type ở mục 3.1 của contract theo schema (C8). Đổi tên status của registry (C9).</w:t>
+              <w:t>Chốt phiên bản Luật 52/2014 dùng trong corpus (bản gốc 2014 đang dùng từ 1260ed8, hay VBHN 121) và ghi phiên bản, nguồn tải của mọi PDF vào registry (A6). Bảng ánh xạ 4 kiểu ID: slug, mã file, số hiệu, l01_ (C5). retrieval_schema theo Sprint 6 §4.3 (C2). Sửa câu quy tắc document_id ở mục 2 của data_contract.md theo registry và thêm test đối chiếu registry với bảng mục 6, README và chunks.jsonl (C6). Khai báo query, config, stats trong RetrievalEnvelope (C7). Sửa enum document_type ở mục 3.1 của contract theo schema (C8). Đổi tên status của registry (C9).</w:t>
             </w:r>
           </w:p>
         </w:tc>
@@ -12886,7 +12829,7 @@
               <w:rPr>
                 <w:sz w:val="17"/>
               </w:rPr>
-              <w:t>Ngay, song song bước 0 và 2. Sửa document_id của Luật 1986 (A26, C6) trước khi sinh corpus, vì đổi ID sẽ đổi chunk_id.</w:t>
+              <w:t>Ngay, song song bước 0 và 2. Chốt phiên bản Luật 52/2014 (A6) trước khi sinh corpus.</w:t>
             </w:r>
           </w:p>
         </w:tc>
@@ -12923,7 +12866,7 @@
                 <w:b/>
                 <w:sz w:val="17"/>
               </w:rPr>
-              <w:t>2. Sửa nốt parser</w:t>
+              <w:t>2. Sửa parser: phần chặn corpus trước, phần còn lại song song</w:t>
             </w:r>
           </w:p>
         </w:tc>
@@ -12937,9 +12880,34 @@
             </w:pPr>
             <w:r>
               <w:rPr>
-                <w:sz w:val="17"/>
-              </w:rPr>
-              <w:t>Sửa mẫu cắt chú thích VBHN (đang viết “\\s” nên không khớp; chú thích 1 nằm trong Luật 52/2014 Điều 2 khoản 3) và mẫu nhãn “Hướng dẫn” (3 nhãn ở NĐ 10/2015), gắn từng mẫu header bản in với file nguồn (A25, A6). Quyết định cách xử lý 2 TT chia theo mục La Mã; sửa document_id của Luật 1986 (A26). Nhận nhãn Chương/Mục có dấu chấm (A27). Test cho cleaner, test tiêu đề TTLT 01/2016 Điều 9, ngưỡng tiêu đề 40 từ (A7). Không bỏ qua Điều khi dựng Khoản lỗi (H8). Sinh lại parsed_jsons, rồi chạy lại export ở bước 3.</w:t>
+                <w:b/>
+                <w:sz w:val="17"/>
+              </w:rPr>
+              <w:t xml:space="preserve">Trước bước 3: </w:t>
+            </w:r>
+            <w:r>
+              <w:rPr>
+                <w:sz w:val="17"/>
+              </w:rPr>
+              <w:t>chỉ khi Dev 1 chọn bản VBHN cho Luật 52/2014 (A6): chạy lại cleaner và parser cho L01, sinh lại parsed_jsons.</w:t>
+            </w:r>
+          </w:p>
+          <w:p>
+            <w:pPr>
+              <w:spacing w:after="0"/>
+            </w:pPr>
+            <w:r>
+              <w:rPr>
+                <w:b/>
+                <w:sz w:val="17"/>
+              </w:rPr>
+              <w:t xml:space="preserve">Song song với bước 3–5, không chặn: </w:t>
+            </w:r>
+            <w:r>
+              <w:rPr>
+                <w:sz w:val="17"/>
+              </w:rPr>
+              <w:t>bỏ hoặc gắn theo file nguồn các mẫu cleaner viết cho nguồn cũ (A25); sửa “\\s” trong DOCUMENT_NUMBER_RE (A11); thêm pymupdf vào requirements (A8, bước 0); test cho cleaner (A7); 2 TT chia theo mục La Mã chọn cách rẻ: ghi trong registry là chưa đưa vào corpus và đánh dấu HN_048 là câu hỏi về văn bản ngoài corpus (A26, D2), không viết parser cho cấu trúc mục La Mã; không bỏ qua Điều khi dựng Khoản lỗi (H8). Mỗi việc dưới nửa ngày. Sửa xong thì sinh lại parsed_jsons; chỉ chạy lại export khi nội dung Điều đổi.</w:t>
             </w:r>
           </w:p>
         </w:tc>
@@ -12955,7 +12923,7 @@
               <w:rPr>
                 <w:sz w:val="17"/>
               </w:rPr>
-              <w:t>A25, A26, A27, A6, A7, H8</w:t>
+              <w:t>A25, A26, A11, A7, H8</w:t>
             </w:r>
           </w:p>
         </w:tc>
@@ -12987,7 +12955,7 @@
               <w:rPr>
                 <w:sz w:val="17"/>
               </w:rPr>
-              <w:t>Ngay; A25 trước tiên vì chú thích và nhãn sẽ vào corpus khi sinh lại.</w:t>
+              <w:t>L01: ngay sau khi Dev 1 chốt A6 (bước 1). Phần còn lại: song song với bước 3–5.</w:t>
             </w:r>
           </w:p>
         </w:tc>
@@ -13003,7 +12971,7 @@
               <w:rPr>
                 <w:sz w:val="17"/>
               </w:rPr>
-              <w:t>pytest parser/ pass, có test cho cleaner; số Khoản của mọi Điều khớp TXT; 0 chú thích, chữ ký, số chú thích dính chữ, nhãn “Hướng dẫn” trong parsed_jsons; cleaner không xóa từ nào ngoài khối được phép; exporter chạy hết parsed_jsons (21 văn bản hoặc danh sách đã chốt).</w:t>
+              <w:t>Trước bước 3: pytest parser/ pass (đã đạt ở 77b5886). Phần còn lại: cleaner không xóa từ nào ngoài khối được phép; không còn mẫu cleaner nào khớp 0 lần trên cả 23 TXT; số hiệu lấy từ nhãn “Số:”.</w:t>
             </w:r>
           </w:p>
         </w:tc>
@@ -13087,7 +13055,7 @@
               <w:rPr>
                 <w:sz w:val="17"/>
               </w:rPr>
-              <w:t>Chạy export và commit: sau bước 1 và 2.</w:t>
+              <w:t>Chạy export và commit: sau khi chốt A6 (bước 1).</w:t>
             </w:r>
           </w:p>
         </w:tc>
@@ -13537,7 +13505,7 @@
     <w:p>
       <w:pPr/>
       <w:r>
-        <w:t>Đường găng là 1 → 2 → 3 → 4 → 5 → 6 → 7, trong đó C3 đã xong; trước khi sinh corpus còn cần A25 (bước 2) và ID của Luật 1986 (A26, C6). Bước 0 nên xong trong ngày đầu để mọi người chạy được parser và test. Phần viết code của bước 5 và 6 làm song song trên fixture theo nguyên tắc mock-first, chỉ chạy số thật khi đã có data-v1 và gold mới. Lưu ý: corpus mới mang tiêu đề văn bản theo registry (A16), nên Dense có thể giảm nếu chưa có bộ lọc as_of_date (register v2 đo Hit@10 từ 0,570 xuống 0,479). Vì vậy chỉ so số đo sau khi xong E1 ở bước 5.</w:t>
+        <w:t>Đường găng là 1 → 2 → 3 → 4 → 5 → 6 → 7, trong đó C3 và ID của Luật 1986 đã xong; trước khi sinh corpus còn cần chốt phiên bản Luật 52/2014 (A6); A28 đã sửa ngày 25/10 (77b5886). Thí nghiệm lấy text từ HTML của vbpl.vn (Phụ lục J) không nằm trên đường găng; chỉ làm khi cần thêm nhiều văn bản. Bước 0 nên xong trong ngày đầu để mọi người chạy được parser và test. Phần viết code của bước 5 và 6 làm song song trên fixture theo nguyên tắc mock-first, chỉ chạy số thật khi đã có data-v1 và gold mới. Lưu ý: corpus mới mang tiêu đề văn bản theo registry (A16), nên Dense có thể giảm nếu chưa có bộ lọc as_of_date (register v2 đo Hit@10 từ 0,570 xuống 0,479). Vì vậy chỉ so số đo sau khi xong E1 ở bước 5.</w:t>
       </w:r>
     </w:p>
     <w:p>
@@ -13650,7 +13618,7 @@
               <w:rPr>
                 <w:sz w:val="17"/>
               </w:rPr>
-              <w:t>ID của Luật 1986 (A26, C6) trước khi sinh corpus, vì đổi ID sẽ đổi chunk_id; rồi C5 (article_index cho văn bản mới).</w:t>
+              <w:t>Chốt phiên bản Luật 52/2014 (A6) trước khi sinh corpus; rồi C5 (article_index cho văn bản mới).</w:t>
             </w:r>
           </w:p>
         </w:tc>
@@ -13702,7 +13670,7 @@
               <w:rPr>
                 <w:sz w:val="17"/>
               </w:rPr>
-              <w:t>A25 (chú thích VBHN trong Luật 52/2014 Điều 2 khoản 3, 3 nhãn “Hướng dẫn” ở NĐ 10/2015), rồi A26 (2 TT chia theo mục La Mã, ID của Luật 1986), A8, A6, A7, A27.</w:t>
+              <w:t>A28 đã sửa (77b5886). Song song với việc sinh corpus: A25 (bỏ mẫu cleaner thừa), A11, A8, A7 (test cho cleaner), A26 (ghi 2 TT là ngoài corpus).</w:t>
             </w:r>
           </w:p>
         </w:tc>
@@ -14042,7 +14010,7 @@
     <w:p>
       <w:pPr/>
       <w:r>
-        <w:t>Trước khi commit, kiểm 4 điều: report ghi tokenization_backend = “underthesea” và tokenization_version khớp phiên bản ghim; số chunk và parent hợp lý (chunker đã sửa trên parser 72a7377 cho 1.157 / 508 với 11 văn bản cũ và 2.003 / 923 với đủ 21 văn bản; trên parser 840c8a3 cho 2.011 / 923); Luật 52/2014 Điều 2 có đủ 5 Khoản và không chứa chú thích VBHN, NĐ 10/2015 không còn nhãn “Hướng dẫn” (A25); tests/schema_test.py và test/test_chunking.py pass; git status không có file .pyc bị đổi (nếu có thì git checkout -- các thư mục __pycache__). Sau khi commit corpus phải làm tiếp bước 4 (map gold) và dựng lại index ở bước 5. Trước đó mọi số đo retrieval đều không chấm được.</w:t>
+        <w:t>Trước khi commit, kiểm 4 điều: report ghi tokenization_backend = “underthesea” và tokenization_version khớp phiên bản ghim; số chunk và parent hợp lý (chunker đã sửa trên parser 72a7377 cho 1.157 / 508 với 11 văn bản cũ và 2.003 / 923 với đủ 21 văn bản; trên parser 840c8a3 cho 2.011 / 923); Luật 52/2014 Điều 2 có đủ 5 Khoản và không chứa chú thích VBHN, NĐ 10/2015 không còn nhãn “Hướng dẫn” (A25), Điều 123 khoản 3 đúng phiên bản đã chốt (A6); tests/schema_test.py và test/test_chunking.py pass; git status không có file .pyc bị đổi (nếu có thì git checkout -- các thư mục __pycache__). Sau khi commit corpus phải làm tiếp bước 4 (map gold) và dựng lại index ở bước 5. Trước đó mọi số đo retrieval đều không chấm được.</w:t>
       </w:r>
     </w:p>
     <w:p>
@@ -17825,6 +17793,1267 @@
                 <w:sz w:val="17"/>
               </w:rPr>
               <w:t>parser/ 209 pass, 14 skip. Chạy test vẫn làm bẩn git (parser/__pycache__/parser.cpython-314.pyc, H5).</w:t>
+            </w:r>
+          </w:p>
+        </w:tc>
+      </w:tr>
+    </w:tbl>
+    <w:p>
+      <w:pPr>
+        <w:spacing w:after="40"/>
+      </w:pPr>
+    </w:p>
+    <w:p>
+      <w:pPr>
+        <w:pStyle w:val="Heading1"/>
+      </w:pPr>
+      <w:r>
+        <w:rPr/>
+        <w:t>Phụ lục I. Kiểm lại nhóm A sau khi gộp NMA 1260ed8 (64b65f0)</w:t>
+      </w:r>
+    </w:p>
+    <w:p>
+      <w:r>
+        <w:rPr/>
+        <w:t>Kiểm lại ngày 24/10/2026 trên commit 64b65f0 (gộp NMA 1260ed8 “fix parser” vào testing). Commit thay 11 PDF gốc, trích xuất lại text của 11 văn bản, sửa cleaner.py, parser.py, registry và sinh lại parsed_jsons; test_parser_unit.py, requirements.txt và data/chunking_output không đổi. Cách kiểm ghi ở mục 2 (Phạm vi và cách kiểm tra).</w:t>
+      </w:r>
+    </w:p>
+    <w:tbl>
+      <w:tblPr>
+        <w:tblStyle w:val="TableGrid"/>
+        <w:tblW w:type="auto" w:w="0"/>
+        <w:jc w:val="center"/>
+        <w:tblLayout w:type="fixed"/>
+        <w:tblLook w:firstColumn="1" w:firstRow="1" w:lastColumn="0" w:lastRow="0" w:noHBand="0" w:noVBand="1" w:val="04A0"/>
+      </w:tblPr>
+      <w:tblGrid>
+        <w:gridCol w:w="3289"/>
+        <w:gridCol w:w="3289"/>
+        <w:gridCol w:w="3289"/>
+      </w:tblGrid>
+      <w:tr>
+        <w:trPr>
+          <w:tblHeader w:val="true"/>
+        </w:trPr>
+        <w:tc>
+          <w:tcPr>
+            <w:tcW w:type="dxa" w:w="1100"/>
+            <w:shd w:val="clear" w:color="auto" w:fill="DCE6F1"/>
+          </w:tcPr>
+          <w:p>
+            <w:r>
+              <w:rPr>
+                <w:b/>
+                <w:sz w:val="17"/>
+              </w:rPr>
+              <w:t>#</w:t>
+            </w:r>
+          </w:p>
+        </w:tc>
+        <w:tc>
+          <w:tcPr>
+            <w:tcW w:type="dxa" w:w="3200"/>
+            <w:shd w:val="clear" w:color="auto" w:fill="DCE6F1"/>
+          </w:tcPr>
+          <w:p>
+            <w:r>
+              <w:rPr>
+                <w:sz w:val="17"/>
+              </w:rPr>
+              <w:t>Ở 840c8a3 (Phụ lục H)</w:t>
+            </w:r>
+          </w:p>
+        </w:tc>
+        <w:tc>
+          <w:tcPr>
+            <w:tcW w:type="dxa" w:w="5566"/>
+            <w:shd w:val="clear" w:color="auto" w:fill="DCE6F1"/>
+          </w:tcPr>
+          <w:p>
+            <w:r>
+              <w:rPr>
+                <w:sz w:val="17"/>
+              </w:rPr>
+              <w:t>Ở 64b65f0</w:t>
+            </w:r>
+          </w:p>
+        </w:tc>
+      </w:tr>
+      <w:tr>
+        <w:tc>
+          <w:tcPr>
+            <w:tcW w:type="dxa" w:w="1100"/>
+          </w:tcPr>
+          <w:p>
+            <w:r>
+              <w:rPr>
+                <w:b/>
+                <w:sz w:val="17"/>
+              </w:rPr>
+              <w:t>PDF gốc</w:t>
+            </w:r>
+          </w:p>
+        </w:tc>
+        <w:tc>
+          <w:tcPr>
+            <w:tcW w:type="dxa" w:w="3200"/>
+          </w:tcPr>
+          <w:p>
+            <w:r>
+              <w:rPr>
+                <w:sz w:val="17"/>
+              </w:rPr>
+              <w:t>L01 là VBHN 121; ND04, ND05 là bản in luatvietnam; có chú thích, nhãn, header bản in.</w:t>
+            </w:r>
+          </w:p>
+        </w:tc>
+        <w:tc>
+          <w:tcPr>
+            <w:tcW w:type="dxa" w:w="5566"/>
+          </w:tcPr>
+          <w:p>
+            <w:r>
+              <w:rPr>
+                <w:sz w:val="17"/>
+              </w:rPr>
+              <w:t>11 PDF mới có lớp text ở mọi trang; cleaner không còn xóa chú thích, nhãn hay header nào (0 ở 23 TXT). 26 Khoản của Luật 52/2014, 11 của NĐ 126/2014 và một số Khoản ở 7 văn bản khác đổi chữ; đối chiếu với lớp text của PDF thì bản mới đúng ở các chỗ đã kiểm (TT 34/2017 Điều 2 “dị tật bào thai”, NĐ 207/2025 Điều 10 “nối”). Số Điều, số Khoản của 21 văn bản không đổi. Nguồn tải của PDF mới không ghi trong registry.</w:t>
+            </w:r>
+          </w:p>
+        </w:tc>
+      </w:tr>
+      <w:tr>
+        <w:tc>
+          <w:tcPr>
+            <w:tcW w:type="dxa" w:w="1100"/>
+          </w:tcPr>
+          <w:p>
+            <w:r>
+              <w:rPr>
+                <w:b/>
+                <w:sz w:val="17"/>
+              </w:rPr>
+              <w:t>A25</w:t>
+            </w:r>
+          </w:p>
+        </w:tc>
+        <w:tc>
+          <w:tcPr>
+            <w:tcW w:type="dxa" w:w="3200"/>
+          </w:tcPr>
+          <w:p>
+            <w:r>
+              <w:rPr>
+                <w:sz w:val="17"/>
+              </w:rPr>
+              <w:t>Còn một phần. Mẫu chú thích viết “\\s” nên khớp 0 lần: chú thích 1 nằm trong khoản 3 Điều 2; 3 nhãn ở NĐ 10/2015.</w:t>
+            </w:r>
+          </w:p>
+        </w:tc>
+        <w:tc>
+          <w:tcPr>
+            <w:tcW w:type="dxa" w:w="5566"/>
+          </w:tcPr>
+          <w:p>
+            <w:r>
+              <w:rPr>
+                <w:sz w:val="17"/>
+              </w:rPr>
+              <w:t>Còn một phần. “\\s” đã sửa nhưng PDF mới không có chú thích nên mẫu vẫn khớp 0 lần; parsed_jsons 0 chú thích, 0 nhãn. Còn corpus trong repo (bản 72a7377) và các mẫu thừa của nguồn cũ.</w:t>
+            </w:r>
+          </w:p>
+        </w:tc>
+      </w:tr>
+      <w:tr>
+        <w:tc>
+          <w:tcPr>
+            <w:tcW w:type="dxa" w:w="1100"/>
+          </w:tcPr>
+          <w:p>
+            <w:r>
+              <w:rPr>
+                <w:b/>
+                <w:sz w:val="17"/>
+              </w:rPr>
+              <w:t>A26</w:t>
+            </w:r>
+          </w:p>
+        </w:tc>
+        <w:tc>
+          <w:tcPr>
+            <w:tcW w:type="dxa" w:w="3200"/>
+          </w:tcPr>
+          <w:p>
+            <w:r>
+              <w:rPr>
+                <w:sz w:val="17"/>
+              </w:rPr>
+              <w:t>Còn một phần. 2 TT không parse được; ID l_21_lct_hdnd7 sai mã; corpus chưa sinh lại.</w:t>
+            </w:r>
+          </w:p>
+        </w:tc>
+        <w:tc>
+          <w:tcPr>
+            <w:tcW w:type="dxa" w:w="5566"/>
+          </w:tcPr>
+          <w:p>
+            <w:r>
+              <w:rPr>
+                <w:sz w:val="17"/>
+              </w:rPr>
+              <w:t>Còn một phần. ID đổi thành l_21_lct_hdnn7, khớp build_document_id. Còn 2 TT và corpus.</w:t>
+            </w:r>
+          </w:p>
+        </w:tc>
+      </w:tr>
+      <w:tr>
+        <w:tc>
+          <w:tcPr>
+            <w:tcW w:type="dxa" w:w="1100"/>
+          </w:tcPr>
+          <w:p>
+            <w:r>
+              <w:rPr>
+                <w:b/>
+                <w:sz w:val="17"/>
+              </w:rPr>
+              <w:t>A27</w:t>
+            </w:r>
+          </w:p>
+        </w:tc>
+        <w:tc>
+          <w:tcPr>
+            <w:tcW w:type="dxa" w:w="3200"/>
+          </w:tcPr>
+          <w:p>
+            <w:r>
+              <w:rPr>
+                <w:sz w:val="17"/>
+              </w:rPr>
+              <w:t>Mới. TT 04/2020 có 0/39 Điều có section, 6 Khoản chứa tên Mục.</w:t>
+            </w:r>
+          </w:p>
+        </w:tc>
+        <w:tc>
+          <w:tcPr>
+            <w:tcW w:type="dxa" w:w="5566"/>
+          </w:tcPr>
+          <w:p>
+            <w:r>
+              <w:rPr>
+                <w:sz w:val="17"/>
+              </w:rPr>
+              <w:t>Đã sửa. _HEADING_LABEL nhận “Mục 2.”: 8/8 Mục, 32/39 Điều có section (Chương I, IV không có Mục), 0 Khoản chứa tên Mục. Chưa có test (chuyển sang A7). Tên Mục 5 dài 4 dòng vẫn cụt (A28).</w:t>
+            </w:r>
+          </w:p>
+        </w:tc>
+      </w:tr>
+      <w:tr>
+        <w:tc>
+          <w:tcPr>
+            <w:tcW w:type="dxa" w:w="1100"/>
+          </w:tcPr>
+          <w:p>
+            <w:r>
+              <w:rPr>
+                <w:b/>
+                <w:sz w:val="17"/>
+              </w:rPr>
+              <w:t>A6</w:t>
+            </w:r>
+          </w:p>
+        </w:tc>
+        <w:tc>
+          <w:tcPr>
+            <w:tcW w:type="dxa" w:w="3200"/>
+          </w:tcPr>
+          <w:p>
+            <w:r>
+              <w:rPr>
+                <w:sz w:val="17"/>
+              </w:rPr>
+              <w:t>Chú thích 1 trở lại Điều 2 (A25); registry không đổi.</w:t>
+            </w:r>
+          </w:p>
+        </w:tc>
+        <w:tc>
+          <w:tcPr>
+            <w:tcW w:type="dxa" w:w="5566"/>
+          </w:tcPr>
+          <w:p>
+            <w:r>
+              <w:rPr>
+                <w:sz w:val="17"/>
+              </w:rPr>
+              <w:t>Đổi lại: L01 là bản gốc 2014. Điều 123 khoản 3 ghi “cấp huyện” thay cho “khu vực”; HN_183 lấy đáp án từ bản VBHN. Hết chú thích.</w:t>
+            </w:r>
+          </w:p>
+        </w:tc>
+      </w:tr>
+      <w:tr>
+        <w:tc>
+          <w:tcPr>
+            <w:tcW w:type="dxa" w:w="1100"/>
+          </w:tcPr>
+          <w:p>
+            <w:r>
+              <w:rPr>
+                <w:b/>
+                <w:sz w:val="17"/>
+              </w:rPr>
+              <w:t>A7</w:t>
+            </w:r>
+          </w:p>
+        </w:tc>
+        <w:tc>
+          <w:tcPr>
+            <w:tcW w:type="dxa" w:w="3200"/>
+          </w:tcPr>
+          <w:p>
+            <w:r>
+              <w:rPr>
+                <w:sz w:val="17"/>
+              </w:rPr>
+              <w:t>parser/ 209 pass, 14 skip; chưa có test cho cleaner; ngưỡng tiêu đề 80 từ.</w:t>
+            </w:r>
+          </w:p>
+        </w:tc>
+        <w:tc>
+          <w:tcPr>
+            <w:tcW w:type="dxa" w:w="5566"/>
+          </w:tcPr>
+          <w:p>
+            <w:r>
+              <w:rPr>
+                <w:sz w:val="17"/>
+              </w:rPr>
+              <w:t>parser/ 1 fail (Chương III của TT 02a/2015, A28): commit được đẩy lên khi test fail. test_parser_unit.py không đổi so với 840c8a3.</w:t>
+            </w:r>
+          </w:p>
+        </w:tc>
+      </w:tr>
+      <w:tr>
+        <w:tc>
+          <w:tcPr>
+            <w:tcW w:type="dxa" w:w="1100"/>
+          </w:tcPr>
+          <w:p>
+            <w:r>
+              <w:rPr>
+                <w:b/>
+                <w:sz w:val="17"/>
+              </w:rPr>
+              <w:t>A28 (mới)</w:t>
+            </w:r>
+          </w:p>
+        </w:tc>
+        <w:tc>
+          <w:tcPr>
+            <w:tcW w:type="dxa" w:w="3200"/>
+          </w:tcPr>
+          <w:p>
+            <w:r>
+              <w:rPr>
+                <w:sz w:val="17"/>
+              </w:rPr>
+              <w:t>—</w:t>
+            </w:r>
+          </w:p>
+        </w:tc>
+        <w:tc>
+          <w:tcPr>
+            <w:tcW w:type="dxa" w:w="5566"/>
+          </w:tcPr>
+          <w:p>
+            <w:r>
+              <w:rPr>
+                <w:sz w:val="17"/>
+              </w:rPr>
+              <w:t>Thấp. Ghép dòng bỏ “;”, “,” cuối dòng tiêu đề (TT 02a/2015 Điều 4, Chương III), ghép tối đa 3 dòng tiêu đề Chương/Mục (TT 04/2020 Mục 5, TT 38/2025 và TT 57/2015 Chương II cụt), chèn dấu cách sau “-” ở 8 số hiệu, ngày, mã mẫu.</w:t>
+            </w:r>
+          </w:p>
+        </w:tc>
+      </w:tr>
+      <w:tr>
+        <w:tc>
+          <w:tcPr>
+            <w:tcW w:type="dxa" w:w="1100"/>
+          </w:tcPr>
+          <w:p>
+            <w:r>
+              <w:rPr>
+                <w:b/>
+                <w:sz w:val="17"/>
+              </w:rPr>
+              <w:t>A11, A16, A8, A21, A13, A20</w:t>
+            </w:r>
+          </w:p>
+        </w:tc>
+        <w:tc>
+          <w:tcPr>
+            <w:tcW w:type="dxa" w:w="3200"/>
+          </w:tcPr>
+          <w:p>
+            <w:r>
+              <w:rPr>
+                <w:sz w:val="17"/>
+              </w:rPr>
+              <w:t>Như mục 3.</w:t>
+            </w:r>
+          </w:p>
+        </w:tc>
+        <w:tc>
+          <w:tcPr>
+            <w:tcW w:type="dxa" w:w="5566"/>
+          </w:tcPr>
+          <w:p>
+            <w:r>
+              <w:rPr>
+                <w:sz w:val="17"/>
+              </w:rPr>
+              <w:t>A11: DOCUMENT_NUMBER_RE vẫn không khớp; số hiệu TTLT đúng nhờ nhánh dự phòng dù header hai cột của PDF mới bị trộn chữ. A16: metadata 21/21 khớp registry. A8: không đổi. A21: Điều cuối của 21 văn bản sạch; thêm dấu hiệu “TM. HỘI ĐỒNG THẨM PHÁN” cho NQ 01/2024. A13, A20: 0 header, 0 dấu thanh kiểu cũ.</w:t>
+            </w:r>
+          </w:p>
+        </w:tc>
+      </w:tr>
+      <w:tr>
+        <w:tc>
+          <w:tcPr>
+            <w:tcW w:type="dxa" w:w="1100"/>
+          </w:tcPr>
+          <w:p>
+            <w:r>
+              <w:rPr>
+                <w:b/>
+                <w:sz w:val="17"/>
+              </w:rPr>
+              <w:t>Corpus</w:t>
+            </w:r>
+          </w:p>
+        </w:tc>
+        <w:tc>
+          <w:tcPr>
+            <w:tcW w:type="dxa" w:w="3200"/>
+          </w:tcPr>
+          <w:p>
+            <w:r>
+              <w:rPr>
+                <w:sz w:val="17"/>
+              </w:rPr>
+              <w:t>Không đổi (bản 72a7377).</w:t>
+            </w:r>
+          </w:p>
+        </w:tc>
+        <w:tc>
+          <w:tcPr>
+            <w:tcW w:type="dxa" w:w="5566"/>
+          </w:tcPr>
+          <w:p>
+            <w:r>
+              <w:rPr>
+                <w:sz w:val="17"/>
+              </w:rPr>
+              <w:t>Không đổi (bản 72a7377).</w:t>
+            </w:r>
+          </w:p>
+        </w:tc>
+      </w:tr>
+      <w:tr>
+        <w:tc>
+          <w:tcPr>
+            <w:tcW w:type="dxa" w:w="1100"/>
+          </w:tcPr>
+          <w:p>
+            <w:r>
+              <w:rPr>
+                <w:b/>
+                <w:sz w:val="17"/>
+              </w:rPr>
+              <w:t>Test</w:t>
+            </w:r>
+          </w:p>
+        </w:tc>
+        <w:tc>
+          <w:tcPr>
+            <w:tcW w:type="dxa" w:w="3200"/>
+          </w:tcPr>
+          <w:p>
+            <w:r>
+              <w:rPr>
+                <w:sz w:val="17"/>
+              </w:rPr>
+              <w:t>parser/ 209 pass, 14 skip.</w:t>
+            </w:r>
+          </w:p>
+        </w:tc>
+        <w:tc>
+          <w:tcPr>
+            <w:tcW w:type="dxa" w:w="5566"/>
+          </w:tcPr>
+          <w:p>
+            <w:r>
+              <w:rPr>
+                <w:sz w:val="17"/>
+              </w:rPr>
+              <w:t>parser/, tests/schema_test.py, test/test_chunking.py: 235 pass, 14 skip, 1 fail. Chạy test vẫn làm bẩn git (parser/__pycache__/*.pyc, H5).</w:t>
+            </w:r>
+          </w:p>
+        </w:tc>
+      </w:tr>
+    </w:tbl>
+    <w:p>
+      <w:pPr>
+        <w:spacing w:after="40"/>
+      </w:pPr>
+    </w:p>
+    <w:p>
+      <w:pPr>
+        <w:pStyle w:val="Heading1"/>
+      </w:pPr>
+      <w:r>
+        <w:rPr/>
+        <w:t>Phụ lục J. Khảo sát parser của các dự án tham khảo (thư mục RAG)</w:t>
+      </w:r>
+    </w:p>
+    <w:p>
+      <w:r>
+        <w:rPr/>
+        <w:t>Khảo sát ngày 24/10/2026 để trả lời câu hỏi: parser của nhóm phức tạp vì bài toán khó hay vì làm phức tạp hóa. Đọc phần lấy văn bản và tách cấu trúc của 6 dự án trong thư mục RAG, rồi chạy parser của dự án gần nhất trên cleaned_texts của nhóm (bản 840c8a3). Thời điểm khảo sát, parser.py có 1.354 dòng và cleaner.py 656 dòng.</w:t>
+      </w:r>
+    </w:p>
+    <w:tbl>
+      <w:tblPr>
+        <w:tblStyle w:val="TableGrid"/>
+        <w:tblW w:type="auto" w:w="0"/>
+        <w:jc w:val="center"/>
+        <w:tblLayout w:type="fixed"/>
+        <w:tblLook w:firstColumn="1" w:firstRow="1" w:lastColumn="0" w:lastRow="0" w:noHBand="0" w:noVBand="1" w:val="04A0"/>
+      </w:tblPr>
+      <w:tblGrid>
+        <w:gridCol w:w="3289"/>
+        <w:gridCol w:w="3289"/>
+        <w:gridCol w:w="3289"/>
+      </w:tblGrid>
+      <w:tr>
+        <w:trPr>
+          <w:tblHeader w:val="true"/>
+        </w:trPr>
+        <w:tc>
+          <w:tcPr>
+            <w:tcW w:type="dxa" w:w="1100"/>
+            <w:shd w:val="clear" w:color="auto" w:fill="DCE6F1"/>
+          </w:tcPr>
+          <w:p>
+            <w:r>
+              <w:rPr>
+                <w:b/>
+                <w:sz w:val="17"/>
+              </w:rPr>
+              <w:t>Dự án</w:t>
+            </w:r>
+          </w:p>
+        </w:tc>
+        <w:tc>
+          <w:tcPr>
+            <w:tcW w:type="dxa" w:w="3200"/>
+            <w:shd w:val="clear" w:color="auto" w:fill="DCE6F1"/>
+          </w:tcPr>
+          <w:p>
+            <w:r>
+              <w:rPr>
+                <w:sz w:val="17"/>
+              </w:rPr>
+              <w:t>Nguồn văn bản</w:t>
+            </w:r>
+          </w:p>
+        </w:tc>
+        <w:tc>
+          <w:tcPr>
+            <w:tcW w:type="dxa" w:w="5566"/>
+            <w:shd w:val="clear" w:color="auto" w:fill="DCE6F1"/>
+          </w:tcPr>
+          <w:p>
+            <w:r>
+              <w:rPr>
+                <w:sz w:val="17"/>
+              </w:rPr>
+              <w:t>Cách tách cấu trúc</w:t>
+            </w:r>
+          </w:p>
+        </w:tc>
+      </w:tr>
+      <w:tr>
+        <w:tc>
+          <w:tcPr>
+            <w:tcW w:type="dxa" w:w="1100"/>
+          </w:tcPr>
+          <w:p>
+            <w:r>
+              <w:rPr>
+                <w:b/>
+                <w:sz w:val="17"/>
+              </w:rPr>
+              <w:t>Legal-RAG</w:t>
+            </w:r>
+          </w:p>
+        </w:tc>
+        <w:tc>
+          <w:tcPr>
+            <w:tcW w:type="dxa" w:w="3200"/>
+          </w:tcPr>
+          <w:p>
+            <w:r>
+              <w:rPr>
+                <w:sz w:val="17"/>
+              </w:rPr>
+              <w:t>Dataset HuggingFace nhn309261/vietnamese-legal-docs (text đã sạch, có metadata); file tải lên đọc thẳng bằng PyMuPDF, không làm sạch.</w:t>
+            </w:r>
+          </w:p>
+        </w:tc>
+        <w:tc>
+          <w:tcPr>
+            <w:tcW w:type="dxa" w:w="5566"/>
+          </w:tcPr>
+          <w:p>
+            <w:r>
+              <w:rPr>
+                <w:sz w:val="17"/>
+              </w:rPr>
+              <w:t>Máy trạng thái đọc từng dòng bằng regex (Chương, Điều, Khoản, Điểm, phụ lục), khoảng 470 dòng cùng 290 dòng metadata.</w:t>
+            </w:r>
+          </w:p>
+        </w:tc>
+      </w:tr>
+      <w:tr>
+        <w:tc>
+          <w:tcPr>
+            <w:tcW w:type="dxa" w:w="1100"/>
+          </w:tcPr>
+          <w:p>
+            <w:r>
+              <w:rPr>
+                <w:b/>
+                <w:sz w:val="17"/>
+              </w:rPr>
+              <w:t>Vietnamese-Legal-RAG-Assistant</w:t>
+            </w:r>
+          </w:p>
+        </w:tc>
+        <w:tc>
+          <w:tcPr>
+            <w:tcW w:type="dxa" w:w="3200"/>
+          </w:tcPr>
+          <w:p>
+            <w:r>
+              <w:rPr>
+                <w:sz w:val="17"/>
+              </w:rPr>
+              <w:t>DOCX đọc bằng python-docx theo đúng thứ tự đoạn và bảng; PDF chỉ là phương án phụ (PyMuPDF, Tesseract cho trang ít chữ). Có registry nguồn kèm checksum.</w:t>
+            </w:r>
+          </w:p>
+        </w:tc>
+        <w:tc>
+          <w:tcPr>
+            <w:tcW w:type="dxa" w:w="5566"/>
+          </w:tcPr>
+          <w:p>
+            <w:r>
+              <w:rPr>
+                <w:sz w:val="17"/>
+              </w:rPr>
+              <w:t>Regex theo dòng, 455 dòng; cleaner khoảng 100 dòng chỉ xóa nhiễu chung (số trang, tên trang web).</w:t>
+            </w:r>
+          </w:p>
+        </w:tc>
+      </w:tr>
+      <w:tr>
+        <w:tc>
+          <w:tcPr>
+            <w:tcW w:type="dxa" w:w="1100"/>
+          </w:tcPr>
+          <w:p>
+            <w:r>
+              <w:rPr>
+                <w:b/>
+                <w:sz w:val="17"/>
+              </w:rPr>
+              <w:t>vietnamese-legal-rag-portfolio</w:t>
+            </w:r>
+          </w:p>
+        </w:tc>
+        <w:tc>
+          <w:tcPr>
+            <w:tcW w:type="dxa" w:w="3200"/>
+          </w:tcPr>
+          <w:p>
+            <w:r>
+              <w:rPr>
+                <w:sz w:val="17"/>
+              </w:rPr>
+              <w:t>Dataset HuggingFace th1nhng0/vietnamese-legal-documents, lấy từ vbpl.vn.</w:t>
+            </w:r>
+          </w:p>
+        </w:tc>
+        <w:tc>
+          <w:tcPr>
+            <w:tcW w:type="dxa" w:w="5566"/>
+          </w:tcPr>
+          <w:p>
+            <w:r>
+              <w:rPr>
+                <w:sz w:val="17"/>
+              </w:rPr>
+              <w:t>Tách theo mốc “Điều N.” rồi cắt cửa sổ 260 từ; không có cấp Khoản.</w:t>
+            </w:r>
+          </w:p>
+        </w:tc>
+      </w:tr>
+      <w:tr>
+        <w:tc>
+          <w:tcPr>
+            <w:tcW w:type="dxa" w:w="1100"/>
+          </w:tcPr>
+          <w:p>
+            <w:r>
+              <w:rPr>
+                <w:b/>
+                <w:sz w:val="17"/>
+              </w:rPr>
+              <w:t>Vietnamese-Legal-Document-Retrieval (VLSP 2025)</w:t>
+            </w:r>
+          </w:p>
+        </w:tc>
+        <w:tc>
+          <w:tcPr>
+            <w:tcW w:type="dxa" w:w="3200"/>
+          </w:tcPr>
+          <w:p>
+            <w:r>
+              <w:rPr>
+                <w:sz w:val="17"/>
+              </w:rPr>
+              <w:t>Corpus do ban tổ chức cấp, đã tách sẵn theo Điều.</w:t>
+            </w:r>
+          </w:p>
+        </w:tc>
+        <w:tc>
+          <w:tcPr>
+            <w:tcW w:type="dxa" w:w="5566"/>
+          </w:tcPr>
+          <w:p>
+            <w:r>
+              <w:rPr>
+                <w:sz w:val="17"/>
+              </w:rPr>
+              <w:t>Cắt 400 từ bằng RecursiveCharacterTextSplitter; không có parser.</w:t>
+            </w:r>
+          </w:p>
+        </w:tc>
+      </w:tr>
+      <w:tr>
+        <w:tc>
+          <w:tcPr>
+            <w:tcW w:type="dxa" w:w="1100"/>
+          </w:tcPr>
+          <w:p>
+            <w:r>
+              <w:rPr>
+                <w:b/>
+                <w:sz w:val="17"/>
+              </w:rPr>
+              <w:t>Vietnamese-Law-Question-Answering-system</w:t>
+            </w:r>
+          </w:p>
+        </w:tc>
+        <w:tc>
+          <w:tcPr>
+            <w:tcW w:type="dxa" w:w="3200"/>
+          </w:tcPr>
+          <w:p>
+            <w:r>
+              <w:rPr>
+                <w:sz w:val="17"/>
+              </w:rPr>
+              <w:t>Dataset tải từ Drive, đã tách sẵn.</w:t>
+            </w:r>
+          </w:p>
+        </w:tc>
+        <w:tc>
+          <w:tcPr>
+            <w:tcW w:type="dxa" w:w="5566"/>
+          </w:tcPr>
+          <w:p>
+            <w:r>
+              <w:rPr>
+                <w:sz w:val="17"/>
+              </w:rPr>
+              <w:t>Không có parser.</w:t>
+            </w:r>
+          </w:p>
+        </w:tc>
+      </w:tr>
+      <w:tr>
+        <w:tc>
+          <w:tcPr>
+            <w:tcW w:type="dxa" w:w="1100"/>
+          </w:tcPr>
+          <w:p>
+            <w:r>
+              <w:rPr>
+                <w:b/>
+                <w:sz w:val="17"/>
+              </w:rPr>
+              <w:t>traffic-law-assistant</w:t>
+            </w:r>
+          </w:p>
+        </w:tc>
+        <w:tc>
+          <w:tcPr>
+            <w:tcW w:type="dxa" w:w="3200"/>
+          </w:tcPr>
+          <w:p>
+            <w:r>
+              <w:rPr>
+                <w:sz w:val="17"/>
+              </w:rPr>
+              <w:t>Qwen-VL đọc ảnh 5 trang đầu của PDF.</w:t>
+            </w:r>
+          </w:p>
+        </w:tc>
+        <w:tc>
+          <w:tcPr>
+            <w:tcW w:type="dxa" w:w="5566"/>
+          </w:tcPr>
+          <w:p>
+            <w:r>
+              <w:rPr>
+                <w:sz w:val="17"/>
+              </w:rPr>
+              <w:t>LightRAG cắt chunk theo token, không có cấu trúc.</w:t>
+            </w:r>
+          </w:p>
+        </w:tc>
+      </w:tr>
+      <w:tr>
+        <w:tc>
+          <w:tcPr>
+            <w:tcW w:type="dxa" w:w="1100"/>
+          </w:tcPr>
+          <w:p>
+            <w:r>
+              <w:rPr>
+                <w:b/>
+                <w:sz w:val="17"/>
+              </w:rPr>
+              <w:t>Thí nghiệm</w:t>
+            </w:r>
+          </w:p>
+        </w:tc>
+        <w:tc>
+          <w:tcPr>
+            <w:tcW w:type="dxa" w:w="3200"/>
+          </w:tcPr>
+          <w:p>
+            <w:r>
+              <w:rPr>
+                <w:sz w:val="17"/>
+              </w:rPr>
+              <w:t>Parser 455 dòng của Vietnamese-Legal-RAG-Assistant chạy trên 21 file cleaned_texts của nhóm.</w:t>
+            </w:r>
+          </w:p>
+        </w:tc>
+        <w:tc>
+          <w:tcPr>
+            <w:tcW w:type="dxa" w:w="5566"/>
+          </w:tcPr>
+          <w:p>
+            <w:r>
+              <w:rPr>
+                <w:sz w:val="17"/>
+              </w:rPr>
+              <w:t>Tiêu đề Điều giống của nhóm ở 670/776 Điều, số Khoản giống ở 719/747. Trong 48 chỗ khác nhau, parser của nhóm đúng ở cả 48: parser kia cắt cụt tiêu đề bị xuống dòng, nhận dòng bắt đầu bằng “Điều 18 của Luật…” thành Điều mới (25 Điều trùng số), chỉ tìm được 2/28 Điều ở NĐ 32/2002 và 0/3 ở TT 30/2019, tạo 57 tiêu đề giả cho Luật 1986.</w:t>
+            </w:r>
+          </w:p>
+        </w:tc>
+      </w:tr>
+      <w:tr>
+        <w:tc>
+          <w:tcPr>
+            <w:tcW w:type="dxa" w:w="1100"/>
+          </w:tcPr>
+          <w:p>
+            <w:r>
+              <w:rPr>
+                <w:b/>
+                <w:sz w:val="17"/>
+              </w:rPr>
+              <w:t>Nguồn HTML vbpl.vn</w:t>
+            </w:r>
+          </w:p>
+        </w:tc>
+        <w:tc>
+          <w:tcPr>
+            <w:tcW w:type="dxa" w:w="3200"/>
+          </w:tcPr>
+          <w:p>
+            <w:r>
+              <w:rPr>
+                <w:sz w:val="17"/>
+              </w:rPr>
+              <w:t>Dataset th1nhng0 có 170.824 văn bản; id là ItemID của vbpl.vn, trùng ItemID trong source_url của registry. Tra theo số hiệu thấy 16/23 văn bản; 7 truy vấn còn lại lỗi phía máy chủ HuggingFace, chưa khẳng định là không có.</w:t>
+            </w:r>
+          </w:p>
+        </w:tc>
+        <w:tc>
+          <w:tcPr>
+            <w:tcW w:type="dxa" w:w="5566"/>
+          </w:tcPr>
+          <w:p>
+            <w:r>
+              <w:rPr>
+                <w:sz w:val="17"/>
+              </w:rPr>
+              <w:t>Nội dung là HTML của vbpl.vn: mỗi đoạn một thẻ &lt;p&gt;, gắn nhãn prov-article, prov-clause, prov-content; không có xuống dòng giữa câu, header trang hay chú thích. Mới thấy nhãn trên vài văn bản mẫu, chưa kiểm trên văn bản của nhóm; dataset chỉ có Luật 52/2014 bản gốc, không có VBHN 121.</w:t>
+            </w:r>
+          </w:p>
+        </w:tc>
+      </w:tr>
+    </w:tbl>
+    <w:p>
+      <w:r>
+        <w:rPr/>
+        <w:t>Kết luận: cả hai nguyên nhân đều có. Phần tách Chương/Mục/Điều/Khoản/Điểm ở dự án nào cũng chỉ cần 300–500 dòng; phần còn lại của parser và cleaner của nhóm dùng để xử lý đặc thù của text trích từ PDF nhiều nguồn: câu và tiêu đề bị xuống dòng (A23, A24, A28), header và nhãn bản in (A13), chú thích VBHN (A6, A25), phần đầu hai cột (A11), lỗi OCR (A20, A26), khối chữ ký (A21). Không dự án tham khảo nào tách PDF nhiều nguồn tới cấp Khoản có kiểm tra; các dự án có cấu trúc đều dùng DOCX hoặc text đã sạch. Phần phức tạp hóa nằm ở cách sửa theo từng ca: mẫu regex chép nguyên văn một chú thích, “khu vực2”, ba tên người ký viết cứng, header riêng của từng văn bản, nhiều hàm tách tiêu đề chồng lên nhau sau các lần vá; mỗi bản vá chỉ kiểm trên đúng ca lỗi nên sinh lỗi ở chỗ khác.</w:t>
+      </w:r>
+    </w:p>
+    <w:p>
+      <w:r>
+        <w:rPr/>
+        <w:t>Đề xuất: không viết thêm luật cho parser PDF. Từ 1260ed8, 11 PDF gốc đã có lớp text nên lỗi OCR, header và chú thích không còn; phần còn lại (A28) sửa trực tiếp rẻ hơn đổi nguồn. Thí nghiệm lấy text từ HTML của vbpl.vn (tải parquet của dataset th1nhng0, viết parser HTML nhỏ, chạy bộ test bất biến hiện có và so từng Điều với parsed_jsons) để dành cho lúc cần thêm nhiều văn bản; khi đó PDF chỉ là phương án phụ cho văn bản không có HTML.</w:t>
+      </w:r>
+    </w:p>
+    <w:p>
+      <w:pPr>
+        <w:pStyle w:val="Heading1"/>
+      </w:pPr>
+      <w:r>
+        <w:rPr/>
+        <w:t>Phụ lục K. Sửa A28 và phần test của A7 (25/10)</w:t>
+      </w:r>
+    </w:p>
+    <w:p>
+      <w:r>
+        <w:rPr/>
+        <w:t>Sửa ngày 25/10/2026 trên testing, commit 77b5886 (cha là 64b65f0). parser/parser.py: tiêu đề Điều ghép từ các dòng còn giữ dấu câu cuối dòng (split_title_from_line_structure vẫn dùng bản đã bỏ “ :;” để quyết định có ghép hay không, nên chỗ tách tiêu đề và nội dung không đổi); tiêu đề Chương/Mục giữ dấu câu cuối dòng và ghép tối đa 8 dòng (MAX_HEADING_CONTINUATION_LINES, trước là 2), vẫn dừng ở mốc cấu trúc kế tiếp hoặc dòng không viết hoa; HYPHEN_LINE_BREAK_RE ghép “NĐ-” + xuống dòng + “CP” trước khi tách Điều, trừ khi dòng sau mở đầu Khoản hoặc mốc cấu trúc; thông báo FileNotFoundError của find_document_versions_file xuống dòng thật. Sinh lại parsed_jsons bằng test_parser.py --skip-clean: 21 thành công, 2 TT chia theo mục La Mã vẫn lỗi như trước; 8 file đổi, không Điều hay Khoản nào thêm, bớt hay đổi số, mọi chỗ đổi là dấu câu, phần tiêu đề bị cụt hoặc dấu cách thừa. parser/test_parser_unit.py thêm test: tiêu đề Chương/Mục khớp nguyên văn TXT và kéo tới mốc kế tiếp, tiêu đề Điều khớp nguyên văn TXT, không số hiệu nào bị tách sau “-” (ba test chạy trên mọi TXT), dấu “;” của TT 02a/2015 Điều 4, 8 Mục của TT 04/2020 (A27), tiêu đề TTLT 01/2016 Điều 9 (A23); ngưỡng tiêu đề hạ từ 80 xuống 40 từ, ngoại lệ NĐ 126/2014 Điều 8 (44 từ) và TT 02a/2015 Điều 4 (41 từ). Chạy các test mới với parser.py của 64b65f0: 13 test fail, đúng ở các chỗ lỗi A28. Corpus trong repo chưa sinh lại (chờ A6).</w:t>
+      </w:r>
+    </w:p>
+    <w:tbl>
+      <w:tblPr>
+        <w:tblStyle w:val="TableGrid"/>
+        <w:tblW w:type="auto" w:w="0"/>
+        <w:jc w:val="center"/>
+        <w:tblLayout w:type="fixed"/>
+        <w:tblLook w:firstColumn="1" w:firstRow="1" w:lastColumn="0" w:lastRow="0" w:noHBand="0" w:noVBand="1" w:val="04A0"/>
+      </w:tblPr>
+      <w:tblGrid>
+        <w:gridCol w:w="3289"/>
+        <w:gridCol w:w="3289"/>
+        <w:gridCol w:w="3289"/>
+      </w:tblGrid>
+      <w:tr>
+        <w:trPr>
+          <w:tblHeader w:val="true"/>
+        </w:trPr>
+        <w:tc>
+          <w:tcPr>
+            <w:tcW w:type="dxa" w:w="1100"/>
+            <w:shd w:val="clear" w:color="auto" w:fill="DCE6F1"/>
+          </w:tcPr>
+          <w:p>
+            <w:r>
+              <w:rPr>
+                <w:b/>
+                <w:sz w:val="17"/>
+              </w:rPr>
+              <w:t>#</w:t>
+            </w:r>
+          </w:p>
+        </w:tc>
+        <w:tc>
+          <w:tcPr>
+            <w:tcW w:type="dxa" w:w="3200"/>
+            <w:shd w:val="clear" w:color="auto" w:fill="DCE6F1"/>
+          </w:tcPr>
+          <w:p>
+            <w:r>
+              <w:rPr>
+                <w:sz w:val="17"/>
+              </w:rPr>
+              <w:t>Ở 64b65f0 (Phụ lục I)</w:t>
+            </w:r>
+          </w:p>
+        </w:tc>
+        <w:tc>
+          <w:tcPr>
+            <w:tcW w:type="dxa" w:w="5566"/>
+            <w:shd w:val="clear" w:color="auto" w:fill="DCE6F1"/>
+          </w:tcPr>
+          <w:p>
+            <w:r>
+              <w:rPr>
+                <w:sz w:val="17"/>
+              </w:rPr>
+              <w:t>Ở 77b5886 (25/10)</w:t>
+            </w:r>
+          </w:p>
+        </w:tc>
+      </w:tr>
+      <w:tr>
+        <w:tc>
+          <w:tcPr>
+            <w:tcW w:type="dxa" w:w="1100"/>
+          </w:tcPr>
+          <w:p>
+            <w:r>
+              <w:rPr>
+                <w:b/>
+                <w:sz w:val="17"/>
+              </w:rPr>
+              <w:t>Tiêu đề Điều</w:t>
+            </w:r>
+          </w:p>
+        </w:tc>
+        <w:tc>
+          <w:tcPr>
+            <w:tcW w:type="dxa" w:w="3200"/>
+          </w:tcPr>
+          <w:p>
+            <w:r>
+              <w:rPr>
+                <w:sz w:val="17"/>
+              </w:rPr>
+              <w:t>TT 02a/2015 Điều 4 mất “;” sau “có yếu tố nước ngoài”.</w:t>
+            </w:r>
+          </w:p>
+        </w:tc>
+        <w:tc>
+          <w:tcPr>
+            <w:tcW w:type="dxa" w:w="5566"/>
+          </w:tcPr>
+          <w:p>
+            <w:r>
+              <w:rPr>
+                <w:sz w:val="17"/>
+              </w:rPr>
+              <w:t>Giữ “;”. Tiêu đề Điều của 21 văn bản khớp nguyên văn TXT.</w:t>
+            </w:r>
+          </w:p>
+        </w:tc>
+      </w:tr>
+      <w:tr>
+        <w:tc>
+          <w:tcPr>
+            <w:tcW w:type="dxa" w:w="1100"/>
+          </w:tcPr>
+          <w:p>
+            <w:r>
+              <w:rPr>
+                <w:b/>
+                <w:sz w:val="17"/>
+              </w:rPr>
+              <w:t>Tiêu đề Chương/Mục</w:t>
+            </w:r>
+          </w:p>
+        </w:tc>
+        <w:tc>
+          <w:tcPr>
+            <w:tcW w:type="dxa" w:w="3200"/>
+          </w:tcPr>
+          <w:p>
+            <w:r>
+              <w:rPr>
+                <w:sz w:val="17"/>
+              </w:rPr>
+              <w:t>9 tiêu đề ở 7 văn bản mất dấu câu hoặc cụt: TT 02a/2015 Chương III, TT 15/2015 Chương III và Mục 3, TT 04/2020 Mục 2 của Chương III mất “,”; NĐ 207/2025 Chương II mất “;”; NĐ 126/2014 Mục 4 thành “CHA MẸ”; TT 57/2015 Chương II mất “;” và cụt; TT 38/2025 Chương II, TT 04/2020 Mục 5 cụt.</w:t>
+            </w:r>
+          </w:p>
+        </w:tc>
+        <w:tc>
+          <w:tcPr>
+            <w:tcW w:type="dxa" w:w="5566"/>
+          </w:tcPr>
+          <w:p>
+            <w:r>
+              <w:rPr>
+                <w:sz w:val="17"/>
+              </w:rPr>
+              <w:t>Đủ dấu câu và đủ dòng; mọi tiêu đề Chương/Mục của 21 văn bản khớp TXT và kéo tới mốc kế tiếp.</w:t>
+            </w:r>
+          </w:p>
+        </w:tc>
+      </w:tr>
+      <w:tr>
+        <w:tc>
+          <w:tcPr>
+            <w:tcW w:type="dxa" w:w="1100"/>
+          </w:tcPr>
+          <w:p>
+            <w:r>
+              <w:rPr>
+                <w:b/>
+                <w:sz w:val="17"/>
+              </w:rPr>
+              <w:t>Số hiệu, ngày</w:t>
+            </w:r>
+          </w:p>
+        </w:tc>
+        <w:tc>
+          <w:tcPr>
+            <w:tcW w:type="dxa" w:w="3200"/>
+          </w:tcPr>
+          <w:p>
+            <w:r>
+              <w:rPr>
+                <w:sz w:val="17"/>
+              </w:rPr>
+              <w:t>8 chỗ bị tách “- ” ở TT 02a/2015 (Điều 6, 16, 17), TT 04/2020 Điều 8, TTLT 01/2016 Điều 4.</w:t>
+            </w:r>
+          </w:p>
+        </w:tc>
+        <w:tc>
+          <w:tcPr>
+            <w:tcW w:type="dxa" w:w="5566"/>
+          </w:tcPr>
+          <w:p>
+            <w:r>
+              <w:rPr>
+                <w:sz w:val="17"/>
+              </w:rPr>
+              <w:t>0 chỗ.</w:t>
+            </w:r>
+          </w:p>
+        </w:tc>
+      </w:tr>
+      <w:tr>
+        <w:tc>
+          <w:tcPr>
+            <w:tcW w:type="dxa" w:w="1100"/>
+          </w:tcPr>
+          <w:p>
+            <w:r>
+              <w:rPr>
+                <w:b/>
+                <w:sz w:val="17"/>
+              </w:rPr>
+              <w:t>A7</w:t>
+            </w:r>
+          </w:p>
+        </w:tc>
+        <w:tc>
+          <w:tcPr>
+            <w:tcW w:type="dxa" w:w="3200"/>
+          </w:tcPr>
+          <w:p>
+            <w:r>
+              <w:rPr>
+                <w:sz w:val="17"/>
+              </w:rPr>
+              <w:t>Thiếu test cho A23, A27; ngưỡng tiêu đề 80 từ; thông báo lỗi in chữ \n.</w:t>
+            </w:r>
+          </w:p>
+        </w:tc>
+        <w:tc>
+          <w:tcPr>
+            <w:tcW w:type="dxa" w:w="5566"/>
+          </w:tcPr>
+          <w:p>
+            <w:r>
+              <w:rPr>
+                <w:sz w:val="17"/>
+              </w:rPr>
+              <w:t>Đã có test; ngưỡng 40 từ; thông báo xuống dòng thật. Còn CI và test cho cleaner.</w:t>
+            </w:r>
+          </w:p>
+        </w:tc>
+      </w:tr>
+      <w:tr>
+        <w:tc>
+          <w:tcPr>
+            <w:tcW w:type="dxa" w:w="1100"/>
+          </w:tcPr>
+          <w:p>
+            <w:r>
+              <w:rPr>
+                <w:b/>
+                <w:sz w:val="17"/>
+              </w:rPr>
+              <w:t>Test</w:t>
+            </w:r>
+          </w:p>
+        </w:tc>
+        <w:tc>
+          <w:tcPr>
+            <w:tcW w:type="dxa" w:w="3200"/>
+          </w:tcPr>
+          <w:p>
+            <w:r>
+              <w:rPr>
+                <w:sz w:val="17"/>
+              </w:rPr>
+              <w:t>parser/, tests/schema_test.py, test/test_chunking.py: 235 pass, 14 skip, 1 fail.</w:t>
+            </w:r>
+          </w:p>
+        </w:tc>
+        <w:tc>
+          <w:tcPr>
+            <w:tcW w:type="dxa" w:w="5566"/>
+          </w:tcPr>
+          <w:p>
+            <w:r>
+              <w:rPr>
+                <w:sz w:val="17"/>
+              </w:rPr>
+              <w:t>302 pass, 20 skip, 0 fail.</w:t>
+            </w:r>
+          </w:p>
+        </w:tc>
+      </w:tr>
+      <w:tr>
+        <w:tc>
+          <w:tcPr>
+            <w:tcW w:type="dxa" w:w="1100"/>
+          </w:tcPr>
+          <w:p>
+            <w:r>
+              <w:rPr>
+                <w:b/>
+                <w:sz w:val="17"/>
+              </w:rPr>
+              <w:t>Corpus</w:t>
+            </w:r>
+          </w:p>
+        </w:tc>
+        <w:tc>
+          <w:tcPr>
+            <w:tcW w:type="dxa" w:w="3200"/>
+          </w:tcPr>
+          <w:p>
+            <w:r>
+              <w:rPr>
+                <w:sz w:val="17"/>
+              </w:rPr>
+              <w:t>Bản 72a7377.</w:t>
+            </w:r>
+          </w:p>
+        </w:tc>
+        <w:tc>
+          <w:tcPr>
+            <w:tcW w:type="dxa" w:w="5566"/>
+          </w:tcPr>
+          <w:p>
+            <w:r>
+              <w:rPr>
+                <w:sz w:val="17"/>
+              </w:rPr>
+              <w:t>Không đổi. 4 trong 11 văn bản của corpus có chữ đổi khi sinh lại (NĐ 126/2014, NĐ 207/2025, TT 02a/2015, TTLT 01/2016).</w:t>
             </w:r>
           </w:p>
         </w:tc>

</xml_diff>

<commit_message>
docs(report): record corpus regeneration; drop fixed B1, B10, B13; trim A25, A26, B2 to open parts
</commit_message>
<xml_diff>
--- a/docs/sprint6_issue_recheck_after_merge.docx
+++ b/docs/sprint6_issue_recheck_after_merge.docx
@@ -34,7 +34,7 @@
         <w:rPr>
           <w:sz w:val="19"/>
         </w:rPr>
-        <w:t>Cập nhật 23/10/2026: kiểm lại sau khi gộp origin/CTM ee755a5 vào testing (commit e64c49a). Mục 3 chỉ ghi phần còn lỗi tính tới e64c49a, gồm cả 7 lỗi mới. Cùng ngày, nhóm A được kiểm lại toàn bộ trên e64c49a (Phụ lục C); A24 và Phụ lục B (kết quả kiểm nhóm A trên e9ee31d ngày 22/10) bị mất trong lần cập nhật trước nên được ghi lại. Cũng ngày 23/10, nhóm C được kiểm lại toàn bộ trên bafe1e8, gồm phân tích lại C6 (Phụ lục D). Ngày 24/10/2026, sau khi kéo nhánh NMA mới nhất (testing fast-forward lên 72a7377), nhóm A được kiểm lại toàn bộ (Phụ lục E): A13, A23, A24 đã sửa và được bỏ khỏi bảng; thêm 2 lỗi mới A25, A26. Cũng ngày 24/10, nhóm B được kiểm lại và sửa trên nhánh chunking_test (Phụ lục F): B9, B12 đã sửa và được bỏ khỏi bảng; B1, B10, B13 đã sửa trong code nhưng còn trong bảng cho tới khi corpus trong repo được sinh lại; thêm 3 lỗi mới B14, B15, B16, đều đã sửa. Kiểm lại chunking sau commit: thêm B17 (chunker lấy câu đầu intro làm tiêu đề, đã sửa) và A27 (parser không nhận nhãn “Mục N.”, TT 04/2020 mất cấp Mục). Cuối ngày 24/10, sau khi gộp NMA (b031620–fc997a6) vào testing ở 840c8a3, nhóm C được kiểm lại toàn bộ (Phụ lục G): không lỗi nào sửa xong; C6 sửa thêm một phần (ID của Luật 1986 viết thường, test định danh cho parsed_jsons, run_experiment.py không còn ghi cứng file TTLT); các lỗi C khác không đổi vì contract, schema, code retrieval, reranker và benchmark không đổi từ bafe1e8. Cũng ở 840c8a3, nhóm A được kiểm lại toàn bộ (Phụ lục H): A21 đã sửa và được bỏ khỏi bảng; A25, A26 sửa phần lớn, nhưng mẫu cắt chú thích VBHN mới không khớp chỗ nào (chú thích nay nằm trong Luật 52/2014 Điều 2 khoản 3) và mẫu nhãn “Hướng dẫn” mới để lọt lại 3 nhãn ở NĐ 10/2015. Sau đó C3 được sửa ở 75e06c8 (bảng ánh xạ status → validity_status ở mục 3.1 của data_contract.md và test_registry_validity_status_mapping) và được bỏ khỏi bảng. Cuối ngày 24/10, sau khi gộp NMA 1260ed8 vào testing ở 64b65f0, nhóm A được kiểm lại (Phụ lục I): 11 PDF gốc được thay bằng bản có lớp text; A27 đã sửa và được bỏ khỏi bảng; A25 chỉ còn phần corpus và các mẫu cleaner thừa; L01 quay về bản gốc 2014 (A6); thêm lỗi mới A28 (ghép dòng làm mất dấu câu, làm 1 test fail). Ngày 25/10, A28 và phần test của A7 được sửa ở commit 77b5886 trên testing (Phụ lục K): A28 được bỏ khỏi bảng, A7 chỉ còn CI và test cho cleaner.</w:t>
+        <w:t>Cập nhật 23/10/2026: kiểm lại sau khi gộp origin/CTM ee755a5 vào testing (commit e64c49a). Mục 3 chỉ ghi phần còn lỗi tính tới e64c49a, gồm cả 7 lỗi mới. Cùng ngày, nhóm A được kiểm lại toàn bộ trên e64c49a (Phụ lục C); A24 và Phụ lục B (kết quả kiểm nhóm A trên e9ee31d ngày 22/10) bị mất trong lần cập nhật trước nên được ghi lại. Cũng ngày 23/10, nhóm C được kiểm lại toàn bộ trên bafe1e8, gồm phân tích lại C6 (Phụ lục D). Ngày 24/10/2026, sau khi kéo nhánh NMA mới nhất (testing fast-forward lên 72a7377), nhóm A được kiểm lại toàn bộ (Phụ lục E): A13, A23, A24 đã sửa và được bỏ khỏi bảng; thêm 2 lỗi mới A25, A26. Cũng ngày 24/10, nhóm B được kiểm lại và sửa trên nhánh chunking_test (Phụ lục F): B9, B12 đã sửa và được bỏ khỏi bảng; B1, B10, B13 đã sửa trong code nhưng còn trong bảng cho tới khi corpus trong repo được sinh lại; thêm 3 lỗi mới B14, B15, B16, đều đã sửa. Kiểm lại chunking sau commit: thêm B17 (chunker lấy câu đầu intro làm tiêu đề, đã sửa) và A27 (parser không nhận nhãn “Mục N.”, TT 04/2020 mất cấp Mục). Cuối ngày 24/10, sau khi gộp NMA (b031620–fc997a6) vào testing ở 840c8a3, nhóm C được kiểm lại toàn bộ (Phụ lục G): không lỗi nào sửa xong; C6 sửa thêm một phần (ID của Luật 1986 viết thường, test định danh cho parsed_jsons, run_experiment.py không còn ghi cứng file TTLT); các lỗi C khác không đổi vì contract, schema, code retrieval, reranker và benchmark không đổi từ bafe1e8. Cũng ở 840c8a3, nhóm A được kiểm lại toàn bộ (Phụ lục H): A21 đã sửa và được bỏ khỏi bảng; A25, A26 sửa phần lớn, nhưng mẫu cắt chú thích VBHN mới không khớp chỗ nào (chú thích nay nằm trong Luật 52/2014 Điều 2 khoản 3) và mẫu nhãn “Hướng dẫn” mới để lọt lại 3 nhãn ở NĐ 10/2015. Sau đó C3 được sửa ở 75e06c8 (bảng ánh xạ status → validity_status ở mục 3.1 của data_contract.md và test_registry_validity_status_mapping) và được bỏ khỏi bảng. Cuối ngày 24/10, sau khi gộp NMA 1260ed8 vào testing ở 64b65f0, nhóm A được kiểm lại (Phụ lục I): 11 PDF gốc được thay bằng bản có lớp text; A27 đã sửa và được bỏ khỏi bảng; A25 chỉ còn phần corpus và các mẫu cleaner thừa; L01 quay về bản gốc 2014 (A6); thêm lỗi mới A28 (ghép dòng làm mất dấu câu, làm 1 test fail). Ngày 25/10, A28 và phần test của A7 được sửa ở commit 77b5886 trên testing (Phụ lục K): A28 được bỏ khỏi bảng, A7 chỉ còn CI và test cho cleaner. Cũng ngày 25/10, corpus được sinh lại ở 664634e (21 văn bản, 2.011 chunk, tách từ underthesea): A25, A26 hết phần corpus; B1, B10, B13 đã sửa và được bỏ khỏi bảng; B2 chỉ còn phía truy vấn và requirements-bkai.txt.</w:t>
       </w:r>
     </w:p>
     <w:p>
@@ -50,7 +50,7 @@
         <w:spacing w:after="80"/>
       </w:pPr>
       <w:r>
-        <w:t>Trong 67 lỗi của register v2, tính tới commit e64c49a (nhóm A tính tới 64b65f0, nhóm B tính tới bản sửa chunking ngày 24/10, nhóm C tính tới 840c8a3, C3 tới 75e06c8): 23 đã sửa, 1 đóng, 15 còn một phần, 3 đổi tính chất, 2 nặng hơn, 23 còn nguyên. Phát hiện thêm 20 lỗi mới: A22, A23, A24, B11, B12 (22/10; A22, A23, A24, B11 và B12 nay đã sửa), B13 (nay sửa trong code, chờ sinh lại corpus), C6, C7, C8, C9, D5, H9 (23/10, sau khi gộp CTM; C6 nay sửa một phần ở 840c8a3, C7 ở af8ee9a), A25, A26 (24/10, sau khi kéo NMA 72a7377; nay sửa một phần ở 840c8a3 và 64b65f0), B14, B15, B16, B17 (24/10, khi kiểm lại nhóm B; đã sửa) A27 (24/10, khi kiểm lại corpus thử 21 văn bản; nay đã sửa) và A28 (24/10, sau khi gộp NMA 1260ed8; nay đã sửa ở 77b5886). Trong 15 lỗi mức Cao, 7 đã sửa (A1, A12, A13, A14, E15, C1, C3), 8 còn mở. Nhóm A, B, C đã được kiểm lại lần 2 trên commit 75dd586; các chỗ đính chính ghi ở Phụ lục A. Nhóm A được kiểm lại lần 3 trên e9ee31d (Phụ lục B), lần 4 trên e64c49a (Phụ lục C) và lần 5 trên 72a7377 (Phụ lục E), lần 6 trên 840c8a3 (Phụ lục H) và lần 7 trên 64b65f0 (Phụ lục I); A28 sửa ngày 25/10 (Phụ lục K). Ngày 23/10 kiểm lại các lỗi liên quan tới thay đổi của CTM và toàn bộ nhóm A; nhóm C được kiểm lại toàn bộ trên bafe1e8 (Phụ lục D) và trên 840c8a3 sau khi gộp NMA (Phụ lục G); ngày 24/10 nhóm B được kiểm lại và sửa trên nhánh chunking_test (Phụ lục F); các lỗi còn lại giữ kết quả ngày 22/10.</w:t>
+        <w:t>Trong 67 lỗi của register v2, tính tới commit e64c49a (nhóm A tính tới 64b65f0, nhóm B tính tới bản sửa chunking ngày 24/10 và corpus sinh lại ở 664634e, nhóm C tính tới 840c8a3, C3 tới 75e06c8): 25 đã sửa, 1 đóng, 13 còn một phần, 3 đổi tính chất, 2 nặng hơn, 23 còn nguyên. Phát hiện thêm 20 lỗi mới: A22, A23, A24, B11, B12 (22/10; A22, A23, A24, B11 và B12 nay đã sửa), B13 (nay đã sửa), C6, C7, C8, C9, D5, H9 (23/10, sau khi gộp CTM; C6 nay sửa một phần ở 840c8a3, C7 ở af8ee9a), A25, A26 (24/10, sau khi kéo NMA 72a7377; nay sửa một phần ở 840c8a3 và 64b65f0), B14, B15, B16, B17 (24/10, khi kiểm lại nhóm B; đã sửa) A27 (24/10, khi kiểm lại corpus thử 21 văn bản; nay đã sửa) và A28 (24/10, sau khi gộp NMA 1260ed8; nay đã sửa ở 77b5886). Trong 15 lỗi mức Cao, 8 đã sửa (A1, A12, A13, A14, B1, E15, C1, C3), 7 còn mở. Nhóm A, B, C đã được kiểm lại lần 2 trên commit 75dd586; các chỗ đính chính ghi ở Phụ lục A. Nhóm A được kiểm lại lần 3 trên e9ee31d (Phụ lục B), lần 4 trên e64c49a (Phụ lục C) và lần 5 trên 72a7377 (Phụ lục E), lần 6 trên 840c8a3 (Phụ lục H) và lần 7 trên 64b65f0 (Phụ lục I); A28 sửa ngày 25/10 (Phụ lục K). Ngày 23/10 kiểm lại các lỗi liên quan tới thay đổi của CTM và toàn bộ nhóm A; nhóm C được kiểm lại toàn bộ trên bafe1e8 (Phụ lục D) và trên 840c8a3 sau khi gộp NMA (Phụ lục G); ngày 24/10 nhóm B được kiểm lại và sửa trên nhánh chunking_test (Phụ lục F); các lỗi còn lại giữ kết quả ngày 22/10.</w:t>
       </w:r>
     </w:p>
     <w:p>
@@ -68,7 +68,7 @@
       </w:pPr>
       <w:r>
         <w:rPr/>
-        <w:t>Parser hết chú thích và nhãn nhờ đổi PDF, nhưng Luật 52/2014 quay về bản gốc và corpus chưa sinh lại (A6, A25). NMA 1260ed8 (gộp ở 64b65f0) thay 11 PDF gốc bằng bản có lớp text: parsed_jsons hết chú thích VBHN và nhãn luatvietnam, sửa cả chữ sai của bản cũ (vd TT 34/2017 Điều 2 “dị tật bào thai”); A27 đã sửa và ID của Luật 1986 đúng mã. Nhưng L01.pdf mới là bản gốc 2014, không còn là VBHN 121: Điều 123 khoản 3 ghi “cấp huyện” thay cho “khu vực”, lệch đáp án HN_183 và luật hiện hành (A6). Commit được đẩy lên khi 1 test parser fail vì ghép dòng làm mất dấu câu ở tiêu đề; lỗi này (A28) đã sửa ngày 25/10 ở 77b5886. Corpus trong repo vẫn là bản 72a7377. Cần chốt phiên bản Luật 52/2014 rồi sinh lại corpus trước khi map gold (D1, D4) và dựng lại index.</w:t>
+        <w:t>Parser hết chú thích và nhãn nhờ đổi PDF, nhưng Luật 52/2014 quay về bản gốc (A6). NMA 1260ed8 (gộp ở 64b65f0) thay 11 PDF gốc bằng bản có lớp text: parsed_jsons hết chú thích VBHN và nhãn luatvietnam, sửa cả chữ sai của bản cũ (vd TT 34/2017 Điều 2 “dị tật bào thai”); A27 đã sửa và ID của Luật 1986 đúng mã. Nhưng L01.pdf mới là bản gốc 2014, không còn là VBHN 121: Điều 123 khoản 3 ghi “cấp huyện” thay cho “khu vực”, lệch đáp án HN_183 và luật hiện hành (A6). Commit được đẩy lên khi 1 test parser fail vì ghép dòng làm mất dấu câu ở tiêu đề; lỗi này (A28) đã sửa ngày 25/10 ở 77b5886. Corpus được sinh lại ở 664634e (21 văn bản, 2.011 chunk); map gold (D1, D4) và dựng lại index làm trên corpus này. Nếu Dev 1 chọn bản VBHN cho Luật 52/2014 thì chỉ chạy lại parser và export cho văn bản này; chunk_id không đổi.</w:t>
       </w:r>
     </w:p>
     <w:p>
@@ -78,7 +78,7 @@
       </w:pPr>
       <w:r>
         <w:rPr/>
-        <w:t>Chunker đã sửa nhóm B nhưng corpus chưa sinh lại. Merge 1c40712 trên chunking_test làm chunking_rules.py lỗi cú pháp (B14), nên exporter, test và các script import chunker đều không chạy. Chunker được lấy lại từ testing rồi sửa: 0 “Khoản 1” giả (trước 130 chunk), 0 breadcrumb sai Khoản (trước 234), intro của 41/41 Điều nay có trong embed_text (trước 0, B15), Khoản dài có danh sách Điểm được cắt tại ranh giới Điểm (B9), exporter không còn dừng vì Parent vượt ngưỡng (B16) và dừng khi thiếu underthesea (B2). Quy ước chunk_id không đổi; 20 chunk của 10 Khoản dài đổi ranh giới (B3). Corpus trong repo vẫn là bản 72a7377 (fallback_whitespace) cho tới khi sinh lại ở bước 3 (Phụ lục F).</w:t>
+        <w:t>Chunker đã sửa nhóm B và corpus đã sinh lại ở 664634e. Merge 1c40712 trên chunking_test làm chunking_rules.py lỗi cú pháp (B14), nên exporter, test và các script import chunker đều không chạy. Chunker được lấy lại từ testing rồi sửa: 0 “Khoản 1” giả (trước 130 chunk), 0 breadcrumb sai Khoản (trước 234), intro của 41/41 Điều nay có trong embed_text (trước 0, B15), Khoản dài có danh sách Điểm được cắt tại ranh giới Điểm (B9), exporter không còn dừng vì Parent vượt ngưỡng (B16) và dừng khi thiếu underthesea (B2). Quy ước chunk_id không đổi; 20 chunk của 10 Khoản dài đổi ranh giới (B3). Corpus trong repo sinh lại ở 664634e bằng chunker này: 0 “Khoản 1” giả, 0 breadcrumb sai Khoản, 0 chunk dưới 10 ký tự, tách từ underthesea 9.5.0 (Phụ lục F, K).</w:t>
       </w:r>
     </w:p>
     <w:p>
@@ -486,7 +486,7 @@
               <w:rPr>
                 <w:sz w:val="17"/>
               </w:rPr>
-              <w:t>3</w:t>
+              <w:t>5</w:t>
             </w:r>
           </w:p>
         </w:tc>
@@ -520,7 +520,7 @@
               <w:rPr>
                 <w:sz w:val="17"/>
               </w:rPr>
-              <w:t>6</w:t>
+              <w:t>4</w:t>
             </w:r>
           </w:p>
         </w:tc>
@@ -1523,7 +1523,7 @@
                 <w:b/>
                 <w:sz w:val="17"/>
               </w:rPr>
-              <w:t>23</w:t>
+              <w:t>25</w:t>
             </w:r>
           </w:p>
         </w:tc>
@@ -1559,7 +1559,7 @@
                 <w:b/>
                 <w:sz w:val="17"/>
               </w:rPr>
-              <w:t>15</w:t>
+              <w:t>13</w:t>
             </w:r>
           </w:p>
         </w:tc>
@@ -1647,7 +1647,7 @@
         <w:spacing w:after="80"/>
       </w:pPr>
       <w:r>
-        <w:t>“Đã sửa” ở nhóm A và B nghĩa là đã sửa trong code và trong parser/parsed_jsons; từ e64c49a corpus trong repo cũng được sinh lại từ parsed_jsons hiện tại (B11). Riêng B9, B12 (sửa ngày 24/10) mới sửa trong code chunking và được kiểm trên corpus sinh lại trong thư mục tạm; B1, B10, B13 cũng đã sửa trong code nhưng giữ trong bảng cho tới khi corpus trong repo được sinh lại ở bước 3. Các lỗi “Còn” ở nhóm E–H phần lớn là do file liên quan không đổi kể từ commit ae1ce0d mà register v2 đã rà soát; số đo trong register cho các lỗi này được đo trên corpus cũ và cần đo lại.</w:t>
+        <w:t>“Đã sửa” ở nhóm A và B nghĩa là đã sửa trong code và trong parser/parsed_jsons; từ e64c49a corpus trong repo cũng được sinh lại từ parsed_jsons hiện tại (B11). Riêng B9, B12 (sửa ngày 24/10) mới sửa trong code chunking và được kiểm trên corpus sinh lại trong thư mục tạm; B1, B10, B13 sửa trong code ngày 24/10 và được bỏ khỏi bảng sau khi corpus trong repo được sinh lại ở 664634e (25/10). Các lỗi “Còn” ở nhóm E–H phần lớn là do file liên quan không đổi kể từ commit ae1ce0d mà register v2 đã rà soát; số đo trong register cho các lỗi này được đo trên corpus cũ và cần đo lại.</w:t>
       </w:r>
     </w:p>
     <w:p>
@@ -2131,7 +2131,7 @@
         <w:spacing w:after="80"/>
       </w:pPr>
       <w:r>
-        <w:t>Các lỗi đã sửa hoặc đã đóng mà không còn việc gì được bỏ khỏi bảng (vẫn tính trong thống kê ở mục 1; kết quả kiểm nhóm A ở Phụ lục C, E, H, I và K, nhóm B ở Phụ lục F, nhóm C ở Phụ lục D và Phụ lục G): A1, A5, A10, A12, A13, A14, A15, A17, A18, A19, A20, A21, A22, A23, A24, A27, A28, B8, B9, B11, B12, B14, B15, B16, B17, C1, C3, E5. Test cho cleaner nằm ở A7; đề xuất kiểm tra CI của B11 nằm ở bước 3 mục 5.</w:t>
+        <w:t>Các lỗi đã sửa hoặc đã đóng mà không còn việc gì được bỏ khỏi bảng (vẫn tính trong thống kê ở mục 1; kết quả kiểm nhóm A ở Phụ lục C, E, H, I và K, nhóm B ở Phụ lục F, nhóm C ở Phụ lục D và Phụ lục G): A1, A5, A10, A12, A13, A14, A15, A17, A18, A19, A20, A21, A22, A23, A24, A27, A28, B1, B8, B9, B10, B11, B12, B13, B14, B15, B16, B17, C1, C3, E5. Test cho cleaner nằm ở A7; đề xuất kiểm tra CI của B11 nằm ở bước 3 mục 5.</w:t>
       </w:r>
     </w:p>
     <w:p>
@@ -2327,7 +2327,7 @@
               <w:rPr>
                 <w:sz w:val="17"/>
               </w:rPr>
-              <w:t>(1) Corpus trong repo vẫn là bản 72a7377, sinh từ bản parse còn lỗi: thiếu l_52_2014_qh13_art_2_clause_4_chunk_1 và …_clause_5_chunk_1 (2/5 candidate của HN_062); nd_207_2025_nd_cp_art_17_clause_1_chunk_1, tt_34_2017_tt_byt_art_4_clause_2_chunk_1 và tt_34_2017_tt_byt_art_5_clause_2_chunk_1 mất chữ “hướng dẫn”. (2) Các mẫu viết riêng cho nguồn PDF cũ khớp 0 lần trên 23 TXT nhưng vẫn chạy trên mọi văn bản: 4 mẫu chú thích VBHN của Luật 81/2025/QH15 (AMENDMENT_FOOTNOTE_PATTERNS), mẫu “khu vực2”, mẫu nhãn “Hướng dẫn” và hai mẫu header bản in của NĐ 70/2001, NĐ 10/2015. Văn bản thêm sau có thể khớp nhầm các mẫu này.</w:t>
+              <w:t>Các mẫu viết riêng cho nguồn PDF cũ khớp 0 lần trên 23 TXT nhưng vẫn chạy trên mọi văn bản: 4 mẫu chú thích VBHN của Luật 81/2025/QH15 (AMENDMENT_FOOTNOTE_PATTERNS), mẫu “khu vực2”, mẫu nhãn “Hướng dẫn” và hai mẫu header bản in của NĐ 70/2001, NĐ 10/2015. Văn bản thêm sau có thể khớp nhầm các mẫu này.</w:t>
             </w:r>
           </w:p>
           <w:p>
@@ -2345,7 +2345,7 @@
               <w:rPr>
                 <w:sz w:val="17"/>
               </w:rPr>
-              <w:t>(1) Sinh lại corpus ở bước 3. (2) Bỏ các mẫu không còn khớp, hoặc gắn từng mẫu với file nguồn của nó để không chạy trên văn bản khác. Test cho cleaner ở A7.</w:t>
+              <w:t>Bỏ các mẫu không còn khớp, hoặc gắn từng mẫu với file nguồn của nó để không chạy trên văn bản khác. Test cho cleaner ở A7.</w:t>
             </w:r>
           </w:p>
           <w:p>
@@ -2363,7 +2363,7 @@
               <w:rPr>
                 <w:sz w:val="17"/>
               </w:rPr>
-              <w:t>Chạy 4 mẫu của REPEATED_DOCUMENT_MARKING_PATTERNS và 4 mẫu của AMENDMENT_FOOTNOTE_PATTERNS trên 23 file extracted_texts_qwen của 64b65f0: 0 lần khớp. chunks.jsonl trong repo không đổi từ 72a7377 (1.156 chunk): không có hai chunk khoản 4, khoản 5 Điều 2 của Luật 52/2014; ba chunk NĐ 207/2025, TT 34/2017 nêu trên không chứa “hướng dẫn”.</w:t>
+              <w:t>Chạy 4 mẫu của REPEATED_DOCUMENT_MARKING_PATTERNS và 4 mẫu của AMENDMENT_FOOTNOTE_PATTERNS trên 23 file extracted_texts_qwen của 64b65f0: 0 lần khớp.</w:t>
             </w:r>
           </w:p>
         </w:tc>
@@ -2380,7 +2380,7 @@
               <w:rPr>
                 <w:sz w:val="17"/>
               </w:rPr>
-              <w:t>data/chunking_output/chunks.jsonl; parser/cleaner.py: REPEATED_DOCUMENT_MARKING_PATTERNS (dòng 85–101), AMENDMENT_FOOTNOTE_PATTERNS (dòng 107–142)</w:t>
+              <w:t>parser/cleaner.py: REPEATED_DOCUMENT_MARKING_PATTERNS (dòng 85–101), AMENDMENT_FOOTNOTE_PATTERNS (dòng 107–142)</w:t>
             </w:r>
           </w:p>
         </w:tc>
@@ -2469,7 +2469,7 @@
               <w:rPr>
                 <w:sz w:val="17"/>
               </w:rPr>
-              <w:t>(1) Corpus trong repo vẫn là bản 72a7377 với 11 văn bản: 10 văn bản bổ sung chưa vào, 11 câu benchmark trích 8 văn bản trong số này vẫn not_mapped (vd HN_039 NĐ 68/2002, HN_044 TT 38/2025, HN_060 NĐ 123/2015). (2) TT 07/2001/TT-BTP và TT 07/2002/TT-BTP chia theo mục La Mã (I., II., 1.1-), không có Điều, nên vẫn không parse được; test_parser_unit.py ghi hai file vào KNOWN_UNPARSEABLE_TXT nhưng chưa quyết định cách xử lý; HN_048 hỏi về TT 07/2002.</w:t>
+              <w:t>TT 07/2001/TT-BTP và TT 07/2002/TT-BTP chia theo mục La Mã (I., II., 1.1-), không có Điều, nên vẫn không parse được; test_parser_unit.py ghi hai file vào KNOWN_UNPARSEABLE_TXT nhưng chưa quyết định cách xử lý; HN_048 hỏi về TT 07/2002.</w:t>
             </w:r>
           </w:p>
           <w:p>
@@ -2487,7 +2487,7 @@
               <w:rPr>
                 <w:sz w:val="17"/>
               </w:rPr>
-              <w:t>(1) Sinh lại corpus trên đủ parsed_jsons ở bước 3 và thêm văn bản mới vào article_index.json (C5). (2) Hoặc parser hỗ trợ cấp mục La Mã thay cho Điều, hoặc ghi trong registry là chưa đưa vào corpus và đánh dấu HN_048 là câu hỏi về văn bản ngoài corpus (D2).</w:t>
+              <w:t>Hoặc parser hỗ trợ cấp mục La Mã thay cho Điều, hoặc ghi trong registry là chưa đưa vào corpus và đánh dấu HN_048 là câu hỏi về văn bản ngoài corpus (D2).</w:t>
             </w:r>
           </w:p>
           <w:p>
@@ -2505,7 +2505,7 @@
               <w:rPr>
                 <w:sz w:val="17"/>
               </w:rPr>
-              <w:t>Chạy lại parser trên bản sao 64b65f0: 2 TT lỗi “Không tìm thấy Điều nào”. chunks.jsonl trong repo: 1.156 chunk, 11 văn bản.</w:t>
+              <w:t>Chạy lại parser trên bản sao 64b65f0: 2 TT lỗi “Không tìm thấy Điều nào”.</w:t>
             </w:r>
           </w:p>
         </w:tc>
@@ -2522,7 +2522,7 @@
               <w:rPr>
                 <w:sz w:val="17"/>
               </w:rPr>
-              <w:t>data/chunking_output/chunks.jsonl; parser/cleaned_texts/07_2001_TT-BTP_48707.txt, 07_2002_TT-BTP_50377.txt; parser/test_parser_unit.py: KNOWN_UNPARSEABLE_TXT (dòng 308)</w:t>
+              <w:t>parser/cleaned_texts/07_2001_TT-BTP_48707.txt, 07_2002_TT-BTP_50377.txt; parser/test_parser_unit.py: KNOWN_UNPARSEABLE_TXT (dòng 308)</w:t>
             </w:r>
           </w:p>
         </w:tc>
@@ -3022,7 +3022,7 @@
               <w:rPr>
                 <w:sz w:val="17"/>
               </w:rPr>
-              <w:t>Dev 1 chốt phiên bản dùng trong corpus trước khi sinh lại corpus: (a) dùng VBHN 121 (khớp benchmark và luật hiện hành), ghi version/consolidated_date vào registry; hoặc (b) giữ bản gốc, thêm Luật 81/2025 làm văn bản sửa đổi có effective_from riêng, rồi sửa đáp án HN_183. Ghi nguồn tải của từng PDF (URL, ngày tải, checksum) vào registry.</w:t>
+              <w:t>Dev 1 chốt phiên bản dùng trong corpus rồi sinh lại corpus cho văn bản này (chunk_id không đổi): (a) dùng VBHN 121 (khớp benchmark và luật hiện hành), ghi version/consolidated_date vào registry; hoặc (b) giữ bản gốc, thêm Luật 81/2025 làm văn bản sửa đổi có effective_from riêng, rồi sửa đáp án HN_183. Ghi nguồn tải của từng PDF (URL, ngày tải, checksum) vào registry.</w:t>
             </w:r>
           </w:p>
           <w:p>
@@ -3229,7 +3229,7 @@
       </w:pPr>
       <w:r>
         <w:rPr/>
-        <w:t>Nhóm A đo trên 64b65f0 (24/10), sau khi gộp NMA 1260ed8. A27 đã sửa (8/8 Mục của TT 04/2020 được nhận, không Khoản nào chứa tên Mục) và được bỏ khỏi bảng; test còn thiếu chuyển sang A7. 11 PDF gốc được thay bằng bản có lớp text nên A25 chỉ còn phần corpus và các mẫu cleaner thừa; A6 đổi lại vì L01 là bản gốc 2014; A26 chỉ còn 2 TT chia theo mục La Mã và corpus. A16, A11, A8 không đổi. Số liệu đo ở Phụ lục I. Ngày 25/10, A28 được sửa (tiêu đề Điều, Chương, Mục giữ dấu câu và không cụt; số hiệu không còn bị tách sau “-”) và được bỏ khỏi bảng; A7 có thêm test cho A23, A27, A28, ngưỡng tiêu đề 40 từ và thông báo lỗi xuống dòng thật, nên chỉ còn CI và test cho cleaner (Phụ lục K). Bản sửa ở commit 77b5886; corpus chưa sinh lại.</w:t>
+        <w:t>Nhóm A đo trên 64b65f0 (24/10), sau khi gộp NMA 1260ed8. A27 đã sửa (8/8 Mục của TT 04/2020 được nhận, không Khoản nào chứa tên Mục) và được bỏ khỏi bảng; test còn thiếu chuyển sang A7. 11 PDF gốc được thay bằng bản có lớp text nên A25 chỉ còn phần corpus và các mẫu cleaner thừa; A6 đổi lại vì L01 là bản gốc 2014; A26 chỉ còn 2 TT chia theo mục La Mã và corpus. A16, A11, A8 không đổi. Số liệu đo ở Phụ lục I. Ngày 25/10, A28 được sửa (tiêu đề Điều, Chương, Mục giữ dấu câu và không cụt; số hiệu không còn bị tách sau “-”) và được bỏ khỏi bảng; A7 có thêm test cho A23, A27, A28, ngưỡng tiêu đề 40 từ và thông báo lỗi xuống dòng thật, nên chỉ còn CI và test cho cleaner (Phụ lục K). Bản sửa ở commit 77b5886. Corpus sinh lại ở 664634e nên A25 chỉ còn các mẫu cleaner thừa, A26 chỉ còn 2 TT chia theo mục La Mã (Phụ lục K).</w:t>
       </w:r>
     </w:p>
     <w:p>
@@ -3398,7 +3398,7 @@
                 <w:b/>
                 <w:sz w:val="17"/>
               </w:rPr>
-              <w:t>B1</w:t>
+              <w:t>B2</w:t>
             </w:r>
           </w:p>
         </w:tc>
@@ -3433,7 +3433,7 @@
               <w:rPr>
                 <w:sz w:val="17"/>
               </w:rPr>
-              <w:t>Code chunking đã sửa ngày 24/10 (Phụ lục F), nhưng corpus trong repo (bản 72a7377) chưa sinh lại: 130/1.156 chunk của Điều không chia Khoản vẫn ghi “Khoản 1” vào clause_ref, breadcrumb, embed_text và metadata.clause_number.</w:t>
+              <w:t>embedding/requirements-bkai.txt vẫn ghi underthesea&gt;=8.3,&lt;9, mâu thuẫn với requirements.txt (ghim underthesea==9.5.0). Phía truy vấn chưa tách từ cùng phiên bản với corpus: ElasticsearchBM25Retriever tìm trên content_segmented bằng câu hỏi thô; dense_retriever tự tắt tách từ câu hỏi khi thiếu underthesea (E4).</w:t>
             </w:r>
           </w:p>
           <w:p>
@@ -3451,7 +3451,7 @@
               <w:rPr>
                 <w:sz w:val="17"/>
               </w:rPr>
-              <w:t>Sinh lại corpus ở bước 3 (sau khi parser sửa A25, A26) bằng chunker đã sửa; exporter nay dừng nếu lỗi này còn.</w:t>
+              <w:t>Dev 3 ghim underthesea==9.5.0 trong requirements-bkai.txt. Dev 4 tách từ câu hỏi bằng cùng phiên bản, truy vấn cả content (câu hỏi thô) lẫn content_segmented (câu hỏi tách từ); Dense chọn embed_text hoặc embed_text_raw theo cờ của model (E4).</w:t>
             </w:r>
           </w:p>
           <w:p>
@@ -3469,7 +3469,7 @@
               <w:rPr>
                 <w:sz w:val="17"/>
               </w:rPr>
-              <w:t>Corpus export lại trong thư mục tạm bằng chunker đã sửa: 0/1.157 chunk (21 văn bản: 0/2.003) còn “Khoản 1” giả; test_implicit_clause_has_no_khoan pass.</w:t>
+              <w:t>embedding/requirements-bkai.txt dòng 2: underthesea&gt;=8.3,&lt;9. ElasticsearchBM25Retriever mặc định text_field = “content_segmented” (hybrid_retriever.py dòng 33) và không tách từ câu hỏi.</w:t>
             </w:r>
           </w:p>
         </w:tc>
@@ -3486,7 +3486,7 @@
               <w:rPr>
                 <w:sz w:val="17"/>
               </w:rPr>
-              <w:t>data/chunking_output/chunks.jsonl; chunking/export_legal_chunks.py: _assert_breadcrumb</w:t>
+              <w:t>embedding/requirements-bkai.txt; retrieval/hybrid_retriever.py: ElasticsearchBM25Retriever.search; embedding/dense_retriever.py (dòng 80–102)</w:t>
             </w:r>
           </w:p>
         </w:tc>
@@ -3503,7 +3503,7 @@
               <w:rPr>
                 <w:sz w:val="17"/>
               </w:rPr>
-              <w:t>Chunking</w:t>
+              <w:t>Dev 3 + Dev 4</w:t>
             </w:r>
           </w:p>
         </w:tc>
@@ -3541,7 +3541,7 @@
                 <w:b/>
                 <w:sz w:val="17"/>
               </w:rPr>
-              <w:t>B2</w:t>
+              <w:t>B3</w:t>
             </w:r>
           </w:p>
         </w:tc>
@@ -3549,17 +3549,17 @@
           <w:tcPr>
             <w:tcW w:type="dxa" w:w="1020"/>
             <w:vAlign w:val="top"/>
-            <w:shd w:val="clear" w:color="auto" w:fill="F4C7C3"/>
-          </w:tcPr>
-          <w:p>
-            <w:pPr>
-              <w:spacing w:after="20" w:line="252" w:lineRule="auto"/>
-            </w:pPr>
-            <w:r>
-              <w:rPr>
-                <w:sz w:val="17"/>
-              </w:rPr>
-              <w:t>Cao</w:t>
+            <w:shd w:val="clear" w:color="auto" w:fill="FCE8B2"/>
+          </w:tcPr>
+          <w:p>
+            <w:pPr>
+              <w:spacing w:after="20" w:line="252" w:lineRule="auto"/>
+            </w:pPr>
+            <w:r>
+              <w:rPr>
+                <w:sz w:val="17"/>
+              </w:rPr>
+              <w:t>Trung bình</w:t>
             </w:r>
           </w:p>
         </w:tc>
@@ -3576,7 +3576,7 @@
               <w:rPr>
                 <w:sz w:val="17"/>
               </w:rPr>
-              <w:t>Corpus trong repo vẫn là bản 72a7377: chunking_report ghi tokenization_backend = fallback_whitespace, seg_text giống text ở 1.156/1.156 chunk, cho tới khi sinh lại ở bước 3. embedding/requirements-bkai.txt vẫn ghi underthesea&gt;=8.3,&lt;9, mâu thuẫn với requirements.txt (ghim underthesea==9.5.0). Phía truy vấn chưa tách từ cùng phiên bản với corpus: ElasticsearchBM25Retriever tìm trên content_segmented bằng câu hỏi thô; dense_retriever tự tắt tách từ câu hỏi khi thiếu underthesea (E4).</w:t>
+              <w:t>Gold, proposal và production_chunk_index chưa đổi sang chunk_id = {clause_id}_chunk_{n} (D4). Bản sửa chunking 24/10 giữ quy ước ID nhưng dời ranh giới phần ở 10 Khoản dài: 20 chunk giữ ID mà đổi nội dung, thêm nd_207_2025_nd_cp_art_9_clause_2_chunk_3; candidate của HN_244, HN_253, HN_255, HN_260 trỏ các Khoản này (đủ các phần của Khoản, nên Parent Match không đổi). data_contract.md tự mâu thuẫn ở dòng 14: câu chữ yêu cầu ID viết thường nhưng regex ở dòng 14, 30 và chunk_payload_schema.json cho [a-zA-Z0-9_]; khi đưa đủ 21 văn bản, 57 chunk_id có chữ hoa (l_21_LCT_HDND7_…, A26) vẫn qua exporter và schema. Ngoài ra 8 candidate trỏ ID không có trong corpus, ở cả corpus trong repo lẫn corpus sinh lại (có từ trước bản sửa): 2 ID khoản 4, 5 Luật 52/2014 Điều 2 (HN_062, do A25) và 6 ID _chunk_2, _chunk_3 của Khoản nay chỉ còn một chunk (NĐ 207/2025 Điều 17, NQ 01/2024 Điều 2, 3, 4, 6; HN_263, HN_265, HN_266, HN_267, HN_269): số _chunk_n đổi khi độ dài Khoản đổi.</w:t>
             </w:r>
           </w:p>
           <w:p>
@@ -3594,7 +3594,7 @@
               <w:rPr>
                 <w:sz w:val="17"/>
               </w:rPr>
-              <w:t>Dev 3 ghim underthesea==9.5.0 trong requirements-bkai.txt. Dev 4 tách từ câu hỏi bằng cùng phiên bản, truy vấn cả content (câu hỏi thô) lẫn content_segmented (câu hỏi tách từ); Dense chọn embed_text hoặc embed_text_raw theo cờ của model (E4). Sinh lại corpus ở bước 3 và kiểm tokenization_version trong report.</w:t>
+              <w:t>Map lại dữ liệu benchmark theo nội dung chunk, không theo ID cũ (D4). CTM sửa regex ID trong data_contract.md và chunk_payload_schema.json thành ^[a-z0-9_]+$ cùng lúc Dev 1 sửa ID registry của Luật 1986 (A26, C6); exporter dùng cùng regex.</w:t>
             </w:r>
           </w:p>
           <w:p>
@@ -3612,7 +3612,7 @@
               <w:rPr>
                 <w:sz w:val="17"/>
               </w:rPr>
-              <w:t>Corpus export lại bằng chunker đã sửa (thư mục tạm, 11 và 21 văn bản): seg_text khác text ở 100% chunk, report ghi tokenization_version = 9.5.0. Khi không import được underthesea, word_segment báo RuntimeError (test_word_segment_requires_underthesea).</w:t>
+              <w:t>So corpus 11 văn bản sinh bằng chunker f0a7007 và chunker đã sửa: 0 ID mất, 1 ID mới, 20 ID đổi nội dung.</w:t>
             </w:r>
           </w:p>
         </w:tc>
@@ -3629,7 +3629,7 @@
               <w:rPr>
                 <w:sz w:val="17"/>
               </w:rPr>
-              <w:t>embedding/requirements-bkai.txt; retrieval/hybrid_retriever.py: ElasticsearchBM25Retriever.search; embedding/dense_retriever.py (dòng 80–102); data/chunking_output/chunks.jsonl</w:t>
+              <w:t>docs/data_contract.md (dòng 14, 30); schemas/chunk_payload_schema.json (dòng 38–62); chunking/export_legal_chunks.py: main (kiểm chunk_id); data/benchmark/ground_truth.json</w:t>
             </w:r>
           </w:p>
         </w:tc>
@@ -3646,7 +3646,132 @@
               <w:rPr>
                 <w:sz w:val="17"/>
               </w:rPr>
-              <w:t>Dev 3 + Dev 4</w:t>
+              <w:t>Dev 1 + CTM</w:t>
+            </w:r>
+          </w:p>
+        </w:tc>
+        <w:tc>
+          <w:tcPr>
+            <w:tcW w:type="dxa" w:w="964"/>
+            <w:vAlign w:val="top"/>
+            <w:shd w:val="clear" w:color="auto" w:fill="E2EFDA"/>
+          </w:tcPr>
+          <w:p>
+            <w:pPr>
+              <w:spacing w:after="20" w:line="252" w:lineRule="auto"/>
+            </w:pPr>
+            <w:r>
+              <w:rPr>
+                <w:sz w:val="17"/>
+              </w:rPr>
+              <w:t>Đã sửa</w:t>
+            </w:r>
+          </w:p>
+        </w:tc>
+      </w:tr>
+      <w:tr>
+        <w:tc>
+          <w:tcPr>
+            <w:tcW w:type="dxa" w:w="624"/>
+            <w:vAlign w:val="top"/>
+          </w:tcPr>
+          <w:p>
+            <w:pPr>
+              <w:spacing w:after="20" w:line="252" w:lineRule="auto"/>
+            </w:pPr>
+            <w:r>
+              <w:rPr>
+                <w:b/>
+                <w:sz w:val="17"/>
+              </w:rPr>
+              <w:t>B4</w:t>
+            </w:r>
+          </w:p>
+        </w:tc>
+        <w:tc>
+          <w:tcPr>
+            <w:tcW w:type="dxa" w:w="1020"/>
+            <w:vAlign w:val="top"/>
+            <w:shd w:val="clear" w:color="auto" w:fill="FCE8B2"/>
+          </w:tcPr>
+          <w:p>
+            <w:pPr>
+              <w:spacing w:after="20" w:line="252" w:lineRule="auto"/>
+            </w:pPr>
+            <w:r>
+              <w:rPr>
+                <w:sz w:val="17"/>
+              </w:rPr>
+              <w:t>Trung bình</w:t>
+            </w:r>
+          </w:p>
+        </w:tc>
+        <w:tc>
+          <w:tcPr>
+            <w:tcW w:type="dxa" w:w="4479"/>
+            <w:vAlign w:val="top"/>
+          </w:tcPr>
+          <w:p>
+            <w:pPr>
+              <w:spacing w:after="20" w:line="252" w:lineRule="auto"/>
+            </w:pPr>
+            <w:r>
+              <w:rPr>
+                <w:sz w:val="17"/>
+              </w:rPr>
+              <w:t>build_bm25_index.py và scripts/build_index.py mặc định đọc data/chunking_output/chunks.jsonl. Vẫn dùng file smoke: retrieval/run_dev_retrieval.py, retrieval/retrieval_evaluation.py, embedding/retrieval_smoke_test.py, test/test_bm25_retrieval.py. chunks_benchmark.jsonl và all_legal_chunks.json vẫn trong git. Thêm: data/parser_validated/ có 4 JSON cũ (L02, ND04, ND05 với ID dạng mã file như L02_art_1_clause_1, và bản tt_02a_2015_tt_btp.json sửa nhãn cũ ghi “Hết hiệu lực”); tests/schema_test.py gộp clause_id của chúng vào tập hợp lệ, embedding/prepare_all_chunk_dataset.py vẫn đọc bản TT 02a.</w:t>
+            </w:r>
+          </w:p>
+          <w:p>
+            <w:pPr>
+              <w:spacing w:after="20" w:line="252" w:lineRule="auto"/>
+            </w:pPr>
+            <w:r>
+              <w:rPr>
+                <w:b/>
+                <w:sz w:val="17"/>
+              </w:rPr>
+              <w:t xml:space="preserve">Đề xuất: </w:t>
+            </w:r>
+            <w:r>
+              <w:rPr>
+                <w:sz w:val="17"/>
+              </w:rPr>
+              <w:t>Đổi các mặc định còn lại; xóa corpus cũ và data/parser_validated/.</w:t>
+            </w:r>
+          </w:p>
+        </w:tc>
+        <w:tc>
+          <w:tcPr>
+            <w:tcW w:type="dxa" w:w="1701"/>
+            <w:vAlign w:val="top"/>
+          </w:tcPr>
+          <w:p>
+            <w:pPr>
+              <w:spacing w:after="20" w:line="252" w:lineRule="auto"/>
+            </w:pPr>
+            <w:r>
+              <w:rPr>
+                <w:sz w:val="17"/>
+              </w:rPr>
+              <w:t>retrieval/build_bm25_index.py:12; retrieval/run_dev_retrieval.py:74; retrieval/retrieval_evaluation.py:16; embedding/retrieval_smoke_test.py:13; embedding/prepare_all_chunk_dataset.py:14; data/chunking_output/chunks_benchmark.jsonl; scripts/build_index.py:64; demo_pipeline.py:41</w:t>
+            </w:r>
+          </w:p>
+        </w:tc>
+        <w:tc>
+          <w:tcPr>
+            <w:tcW w:type="dxa" w:w="1077"/>
+            <w:vAlign w:val="top"/>
+          </w:tcPr>
+          <w:p>
+            <w:pPr>
+              <w:spacing w:after="20" w:line="252" w:lineRule="auto"/>
+            </w:pPr>
+            <w:r>
+              <w:rPr>
+                <w:sz w:val="17"/>
+              </w:rPr>
+              <w:t>Chunking + Dev 4</w:t>
             </w:r>
           </w:p>
         </w:tc>
@@ -3684,7 +3809,7 @@
                 <w:b/>
                 <w:sz w:val="17"/>
               </w:rPr>
-              <w:t>B13</w:t>
+              <w:t>B7</w:t>
             </w:r>
           </w:p>
         </w:tc>
@@ -3719,7 +3844,7 @@
               <w:rPr>
                 <w:sz w:val="17"/>
               </w:rPr>
-              <w:t>chunks.jsonl trong repo hiện có 0 chunk dưới 10 ký tự (schema_test pass) nhờ A24 đã sửa, nhưng chưa được sinh bằng exporter mới, vốn dừng khi còn chunk dưới 10 ký tự (data_contract.md mục 5.2). Chưa có gì chặn lỗi quay lại trong corpus đang commit.</w:t>
+              <w:t>Bản ghi chunk có 29 trường cấp gốc và metadata 16 trường, lưu cùng thông tin nhiều lần: 3 cặp alias (id/chunk_id, doc_id/document_id, text/chunk_text), thông tin văn bản và Điều lặp ở cấp gốc và trong metadata, nội dung luật có 5 bản (text, chunk_text, seg_text, embed_text, embed_text_raw). effective_from, effective_to, source_url chỉ nằm trong metadata (effective_to có giá trị ở 445/1.157 chunk, 21 văn bản: 907/2.003); mỗi consumer tự viết bộ chuyển đổi (build_bm25_index.load_chunks, vector_store.normalize_chunk_record, build_index._adapt_chunk_for_vector_store).</w:t>
             </w:r>
           </w:p>
           <w:p>
@@ -3737,25 +3862,7 @@
               <w:rPr>
                 <w:sz w:val="17"/>
               </w:rPr>
-              <w:t>Sinh lại corpus ở bước 3 bằng exporter mới.</w:t>
-            </w:r>
-          </w:p>
-          <w:p>
-            <w:pPr>
-              <w:spacing w:after="20" w:line="252" w:lineRule="auto"/>
-            </w:pPr>
-            <w:r>
-              <w:rPr>
-                <w:b/>
-                <w:sz w:val="17"/>
-              </w:rPr>
-              <w:t xml:space="preserve">Kiểm chứng: </w:t>
-            </w:r>
-            <w:r>
-              <w:rPr>
-                <w:sz w:val="17"/>
-              </w:rPr>
-              <w:t>Corpus export lại trong thư mục tạm: 0 chunk dưới 10 ký tự ở 11 và 21 văn bản.</w:t>
+              <w:t>Rút gọn khi chốt C1; dùng một hàm đọc corpus chung.</w:t>
             </w:r>
           </w:p>
         </w:tc>
@@ -3772,7 +3879,7 @@
               <w:rPr>
                 <w:sz w:val="17"/>
               </w:rPr>
-              <w:t>data/chunking_output/chunks.jsonl; chunking/export_legal_chunks.py: main (kiểm CHILD_MIN_CHARS)</w:t>
+              <w:t>schemas/chunk_payload_schema.json; chunking/export_legal_chunks.py (dòng 146–153); retrieval/build_bm25_index.py: load_chunks (dòng 39–106); embedding/vector_store.py: normalize_chunk_record (dòng 30–110); scripts/build_index.py: _adapt_chunk_for_vector_store (dòng 107–146)</w:t>
             </w:r>
           </w:p>
         </w:tc>
@@ -3789,542 +3896,7 @@
               <w:rPr>
                 <w:sz w:val="17"/>
               </w:rPr>
-              <w:t>Chunking</w:t>
-            </w:r>
-          </w:p>
-        </w:tc>
-        <w:tc>
-          <w:tcPr>
-            <w:tcW w:type="dxa" w:w="964"/>
-            <w:vAlign w:val="top"/>
-          </w:tcPr>
-          <w:p>
-            <w:pPr>
-              <w:spacing w:after="20" w:line="252" w:lineRule="auto"/>
-            </w:pPr>
-            <w:r>
-              <w:rPr>
-                <w:sz w:val="17"/>
-              </w:rPr>
-              <w:t>Mới</w:t>
-            </w:r>
-          </w:p>
-        </w:tc>
-      </w:tr>
-      <w:tr>
-        <w:tc>
-          <w:tcPr>
-            <w:tcW w:type="dxa" w:w="624"/>
-            <w:vAlign w:val="top"/>
-          </w:tcPr>
-          <w:p>
-            <w:pPr>
-              <w:spacing w:after="20" w:line="252" w:lineRule="auto"/>
-            </w:pPr>
-            <w:r>
-              <w:rPr>
-                <w:b/>
-                <w:sz w:val="17"/>
-              </w:rPr>
-              <w:t>B3</w:t>
-            </w:r>
-          </w:p>
-        </w:tc>
-        <w:tc>
-          <w:tcPr>
-            <w:tcW w:type="dxa" w:w="1020"/>
-            <w:vAlign w:val="top"/>
-            <w:shd w:val="clear" w:color="auto" w:fill="FCE8B2"/>
-          </w:tcPr>
-          <w:p>
-            <w:pPr>
-              <w:spacing w:after="20" w:line="252" w:lineRule="auto"/>
-            </w:pPr>
-            <w:r>
-              <w:rPr>
-                <w:sz w:val="17"/>
-              </w:rPr>
-              <w:t>Trung bình</w:t>
-            </w:r>
-          </w:p>
-        </w:tc>
-        <w:tc>
-          <w:tcPr>
-            <w:tcW w:type="dxa" w:w="4479"/>
-            <w:vAlign w:val="top"/>
-          </w:tcPr>
-          <w:p>
-            <w:pPr>
-              <w:spacing w:after="20" w:line="252" w:lineRule="auto"/>
-            </w:pPr>
-            <w:r>
-              <w:rPr>
-                <w:sz w:val="17"/>
-              </w:rPr>
-              <w:t>Gold, proposal và production_chunk_index chưa đổi sang chunk_id = {clause_id}_chunk_{n} (D4). Bản sửa chunking 24/10 giữ quy ước ID nhưng dời ranh giới phần ở 10 Khoản dài: 20 chunk giữ ID mà đổi nội dung, thêm nd_207_2025_nd_cp_art_9_clause_2_chunk_3; candidate của HN_244, HN_253, HN_255, HN_260 trỏ các Khoản này (đủ các phần của Khoản, nên Parent Match không đổi). data_contract.md tự mâu thuẫn ở dòng 14: câu chữ yêu cầu ID viết thường nhưng regex ở dòng 14, 30 và chunk_payload_schema.json cho [a-zA-Z0-9_]; khi đưa đủ 21 văn bản, 57 chunk_id có chữ hoa (l_21_LCT_HDND7_…, A26) vẫn qua exporter và schema. Ngoài ra 8 candidate trỏ ID không có trong corpus, ở cả corpus trong repo lẫn corpus sinh lại (có từ trước bản sửa): 2 ID khoản 4, 5 Luật 52/2014 Điều 2 (HN_062, do A25) và 6 ID _chunk_2, _chunk_3 của Khoản nay chỉ còn một chunk (NĐ 207/2025 Điều 17, NQ 01/2024 Điều 2, 3, 4, 6; HN_263, HN_265, HN_266, HN_267, HN_269): số _chunk_n đổi khi độ dài Khoản đổi.</w:t>
-            </w:r>
-          </w:p>
-          <w:p>
-            <w:pPr>
-              <w:spacing w:after="20" w:line="252" w:lineRule="auto"/>
-            </w:pPr>
-            <w:r>
-              <w:rPr>
-                <w:b/>
-                <w:sz w:val="17"/>
-              </w:rPr>
-              <w:t xml:space="preserve">Đề xuất: </w:t>
-            </w:r>
-            <w:r>
-              <w:rPr>
-                <w:sz w:val="17"/>
-              </w:rPr>
-              <w:t>Map lại dữ liệu benchmark theo nội dung chunk, không theo ID cũ (D4). CTM sửa regex ID trong data_contract.md và chunk_payload_schema.json thành ^[a-z0-9_]+$ cùng lúc Dev 1 sửa ID registry của Luật 1986 (A26, C6); exporter dùng cùng regex.</w:t>
-            </w:r>
-          </w:p>
-          <w:p>
-            <w:pPr>
-              <w:spacing w:after="20" w:line="252" w:lineRule="auto"/>
-            </w:pPr>
-            <w:r>
-              <w:rPr>
-                <w:b/>
-                <w:sz w:val="17"/>
-              </w:rPr>
-              <w:t xml:space="preserve">Kiểm chứng: </w:t>
-            </w:r>
-            <w:r>
-              <w:rPr>
-                <w:sz w:val="17"/>
-              </w:rPr>
-              <w:t>So corpus 11 văn bản sinh bằng chunker f0a7007 và chunker đã sửa: 0 ID mất, 1 ID mới, 20 ID đổi nội dung.</w:t>
-            </w:r>
-          </w:p>
-        </w:tc>
-        <w:tc>
-          <w:tcPr>
-            <w:tcW w:type="dxa" w:w="1701"/>
-            <w:vAlign w:val="top"/>
-          </w:tcPr>
-          <w:p>
-            <w:pPr>
-              <w:spacing w:after="20" w:line="252" w:lineRule="auto"/>
-            </w:pPr>
-            <w:r>
-              <w:rPr>
-                <w:sz w:val="17"/>
-              </w:rPr>
-              <w:t>docs/data_contract.md (dòng 14, 30); schemas/chunk_payload_schema.json (dòng 38–62); chunking/export_legal_chunks.py: main (kiểm chunk_id); data/benchmark/ground_truth.json</w:t>
-            </w:r>
-          </w:p>
-        </w:tc>
-        <w:tc>
-          <w:tcPr>
-            <w:tcW w:type="dxa" w:w="1077"/>
-            <w:vAlign w:val="top"/>
-          </w:tcPr>
-          <w:p>
-            <w:pPr>
-              <w:spacing w:after="20" w:line="252" w:lineRule="auto"/>
-            </w:pPr>
-            <w:r>
-              <w:rPr>
-                <w:sz w:val="17"/>
-              </w:rPr>
-              <w:t>Dev 1 + CTM</w:t>
-            </w:r>
-          </w:p>
-        </w:tc>
-        <w:tc>
-          <w:tcPr>
-            <w:tcW w:type="dxa" w:w="964"/>
-            <w:vAlign w:val="top"/>
-            <w:shd w:val="clear" w:color="auto" w:fill="E2EFDA"/>
-          </w:tcPr>
-          <w:p>
-            <w:pPr>
-              <w:spacing w:after="20" w:line="252" w:lineRule="auto"/>
-            </w:pPr>
-            <w:r>
-              <w:rPr>
-                <w:sz w:val="17"/>
-              </w:rPr>
-              <w:t>Đã sửa</w:t>
-            </w:r>
-          </w:p>
-        </w:tc>
-      </w:tr>
-      <w:tr>
-        <w:tc>
-          <w:tcPr>
-            <w:tcW w:type="dxa" w:w="624"/>
-            <w:vAlign w:val="top"/>
-          </w:tcPr>
-          <w:p>
-            <w:pPr>
-              <w:spacing w:after="20" w:line="252" w:lineRule="auto"/>
-            </w:pPr>
-            <w:r>
-              <w:rPr>
-                <w:b/>
-                <w:sz w:val="17"/>
-              </w:rPr>
-              <w:t>B4</w:t>
-            </w:r>
-          </w:p>
-        </w:tc>
-        <w:tc>
-          <w:tcPr>
-            <w:tcW w:type="dxa" w:w="1020"/>
-            <w:vAlign w:val="top"/>
-            <w:shd w:val="clear" w:color="auto" w:fill="FCE8B2"/>
-          </w:tcPr>
-          <w:p>
-            <w:pPr>
-              <w:spacing w:after="20" w:line="252" w:lineRule="auto"/>
-            </w:pPr>
-            <w:r>
-              <w:rPr>
-                <w:sz w:val="17"/>
-              </w:rPr>
-              <w:t>Trung bình</w:t>
-            </w:r>
-          </w:p>
-        </w:tc>
-        <w:tc>
-          <w:tcPr>
-            <w:tcW w:type="dxa" w:w="4479"/>
-            <w:vAlign w:val="top"/>
-          </w:tcPr>
-          <w:p>
-            <w:pPr>
-              <w:spacing w:after="20" w:line="252" w:lineRule="auto"/>
-            </w:pPr>
-            <w:r>
-              <w:rPr>
-                <w:sz w:val="17"/>
-              </w:rPr>
-              <w:t>build_bm25_index.py và scripts/build_index.py mặc định đọc data/chunking_output/chunks.jsonl. Vẫn dùng file smoke: retrieval/run_dev_retrieval.py, retrieval/retrieval_evaluation.py, embedding/retrieval_smoke_test.py, test/test_bm25_retrieval.py. chunks_benchmark.jsonl và all_legal_chunks.json vẫn trong git. Thêm: data/parser_validated/ có 4 JSON cũ (L02, ND04, ND05 với ID dạng mã file như L02_art_1_clause_1, và bản tt_02a_2015_tt_btp.json sửa nhãn cũ ghi “Hết hiệu lực”); tests/schema_test.py gộp clause_id của chúng vào tập hợp lệ, embedding/prepare_all_chunk_dataset.py vẫn đọc bản TT 02a.</w:t>
-            </w:r>
-          </w:p>
-          <w:p>
-            <w:pPr>
-              <w:spacing w:after="20" w:line="252" w:lineRule="auto"/>
-            </w:pPr>
-            <w:r>
-              <w:rPr>
-                <w:b/>
-                <w:sz w:val="17"/>
-              </w:rPr>
-              <w:t xml:space="preserve">Đề xuất: </w:t>
-            </w:r>
-            <w:r>
-              <w:rPr>
-                <w:sz w:val="17"/>
-              </w:rPr>
-              <w:t>Đổi các mặc định còn lại; xóa corpus cũ và data/parser_validated/.</w:t>
-            </w:r>
-          </w:p>
-        </w:tc>
-        <w:tc>
-          <w:tcPr>
-            <w:tcW w:type="dxa" w:w="1701"/>
-            <w:vAlign w:val="top"/>
-          </w:tcPr>
-          <w:p>
-            <w:pPr>
-              <w:spacing w:after="20" w:line="252" w:lineRule="auto"/>
-            </w:pPr>
-            <w:r>
-              <w:rPr>
-                <w:sz w:val="17"/>
-              </w:rPr>
-              <w:t>retrieval/build_bm25_index.py:12; retrieval/run_dev_retrieval.py:74; retrieval/retrieval_evaluation.py:16; embedding/retrieval_smoke_test.py:13; embedding/prepare_all_chunk_dataset.py:14; data/chunking_output/chunks_benchmark.jsonl; scripts/build_index.py:64; demo_pipeline.py:41</w:t>
-            </w:r>
-          </w:p>
-        </w:tc>
-        <w:tc>
-          <w:tcPr>
-            <w:tcW w:type="dxa" w:w="1077"/>
-            <w:vAlign w:val="top"/>
-          </w:tcPr>
-          <w:p>
-            <w:pPr>
-              <w:spacing w:after="20" w:line="252" w:lineRule="auto"/>
-            </w:pPr>
-            <w:r>
-              <w:rPr>
-                <w:sz w:val="17"/>
-              </w:rPr>
-              <w:t>Chunking + Dev 4</w:t>
-            </w:r>
-          </w:p>
-        </w:tc>
-        <w:tc>
-          <w:tcPr>
-            <w:tcW w:type="dxa" w:w="964"/>
-            <w:vAlign w:val="top"/>
-            <w:shd w:val="clear" w:color="auto" w:fill="FFF2CC"/>
-          </w:tcPr>
-          <w:p>
-            <w:pPr>
-              <w:spacing w:after="20" w:line="252" w:lineRule="auto"/>
-            </w:pPr>
-            <w:r>
-              <w:rPr>
-                <w:sz w:val="17"/>
-              </w:rPr>
-              <w:t>Còn một phần</w:t>
-            </w:r>
-          </w:p>
-        </w:tc>
-      </w:tr>
-      <w:tr>
-        <w:tc>
-          <w:tcPr>
-            <w:tcW w:type="dxa" w:w="624"/>
-            <w:vAlign w:val="top"/>
-          </w:tcPr>
-          <w:p>
-            <w:pPr>
-              <w:spacing w:after="20" w:line="252" w:lineRule="auto"/>
-            </w:pPr>
-            <w:r>
-              <w:rPr>
-                <w:b/>
-                <w:sz w:val="17"/>
-              </w:rPr>
-              <w:t>B7</w:t>
-            </w:r>
-          </w:p>
-        </w:tc>
-        <w:tc>
-          <w:tcPr>
-            <w:tcW w:type="dxa" w:w="1020"/>
-            <w:vAlign w:val="top"/>
-            <w:shd w:val="clear" w:color="auto" w:fill="FCE8B2"/>
-          </w:tcPr>
-          <w:p>
-            <w:pPr>
-              <w:spacing w:after="20" w:line="252" w:lineRule="auto"/>
-            </w:pPr>
-            <w:r>
-              <w:rPr>
-                <w:sz w:val="17"/>
-              </w:rPr>
-              <w:t>Trung bình</w:t>
-            </w:r>
-          </w:p>
-        </w:tc>
-        <w:tc>
-          <w:tcPr>
-            <w:tcW w:type="dxa" w:w="4479"/>
-            <w:vAlign w:val="top"/>
-          </w:tcPr>
-          <w:p>
-            <w:pPr>
-              <w:spacing w:after="20" w:line="252" w:lineRule="auto"/>
-            </w:pPr>
-            <w:r>
-              <w:rPr>
-                <w:sz w:val="17"/>
-              </w:rPr>
-              <w:t>Bản ghi chunk có 29 trường cấp gốc và metadata 16 trường, lưu cùng thông tin nhiều lần: 3 cặp alias (id/chunk_id, doc_id/document_id, text/chunk_text), thông tin văn bản và Điều lặp ở cấp gốc và trong metadata, nội dung luật có 5 bản (text, chunk_text, seg_text, embed_text, embed_text_raw). effective_from, effective_to, source_url chỉ nằm trong metadata (effective_to có giá trị ở 445/1.157 chunk, 21 văn bản: 907/2.003); mỗi consumer tự viết bộ chuyển đổi (build_bm25_index.load_chunks, vector_store.normalize_chunk_record, build_index._adapt_chunk_for_vector_store).</w:t>
-            </w:r>
-          </w:p>
-          <w:p>
-            <w:pPr>
-              <w:spacing w:after="20" w:line="252" w:lineRule="auto"/>
-            </w:pPr>
-            <w:r>
-              <w:rPr>
-                <w:b/>
-                <w:sz w:val="17"/>
-              </w:rPr>
-              <w:t xml:space="preserve">Đề xuất: </w:t>
-            </w:r>
-            <w:r>
-              <w:rPr>
-                <w:sz w:val="17"/>
-              </w:rPr>
-              <w:t>Rút gọn khi chốt C1; dùng một hàm đọc corpus chung.</w:t>
-            </w:r>
-          </w:p>
-        </w:tc>
-        <w:tc>
-          <w:tcPr>
-            <w:tcW w:type="dxa" w:w="1701"/>
-            <w:vAlign w:val="top"/>
-          </w:tcPr>
-          <w:p>
-            <w:pPr>
-              <w:spacing w:after="20" w:line="252" w:lineRule="auto"/>
-            </w:pPr>
-            <w:r>
-              <w:rPr>
-                <w:sz w:val="17"/>
-              </w:rPr>
-              <w:t>schemas/chunk_payload_schema.json; chunking/export_legal_chunks.py (dòng 146–153); retrieval/build_bm25_index.py: load_chunks (dòng 39–106); embedding/vector_store.py: normalize_chunk_record (dòng 30–110); scripts/build_index.py: _adapt_chunk_for_vector_store (dòng 107–146)</w:t>
-            </w:r>
-          </w:p>
-        </w:tc>
-        <w:tc>
-          <w:tcPr>
-            <w:tcW w:type="dxa" w:w="1077"/>
-            <w:vAlign w:val="top"/>
-          </w:tcPr>
-          <w:p>
-            <w:pPr>
-              <w:spacing w:after="20" w:line="252" w:lineRule="auto"/>
-            </w:pPr>
-            <w:r>
-              <w:rPr>
-                <w:sz w:val="17"/>
-              </w:rPr>
               <w:t>Chunking + Dev 1</w:t>
-            </w:r>
-          </w:p>
-        </w:tc>
-        <w:tc>
-          <w:tcPr>
-            <w:tcW w:type="dxa" w:w="964"/>
-            <w:vAlign w:val="top"/>
-            <w:shd w:val="clear" w:color="auto" w:fill="FFF2CC"/>
-          </w:tcPr>
-          <w:p>
-            <w:pPr>
-              <w:spacing w:after="20" w:line="252" w:lineRule="auto"/>
-            </w:pPr>
-            <w:r>
-              <w:rPr>
-                <w:sz w:val="17"/>
-              </w:rPr>
-              <w:t>Còn một phần</w:t>
-            </w:r>
-          </w:p>
-        </w:tc>
-      </w:tr>
-      <w:tr>
-        <w:tc>
-          <w:tcPr>
-            <w:tcW w:type="dxa" w:w="624"/>
-            <w:vAlign w:val="top"/>
-          </w:tcPr>
-          <w:p>
-            <w:pPr>
-              <w:spacing w:after="20" w:line="252" w:lineRule="auto"/>
-            </w:pPr>
-            <w:r>
-              <w:rPr>
-                <w:b/>
-                <w:sz w:val="17"/>
-              </w:rPr>
-              <w:t>B10</w:t>
-            </w:r>
-          </w:p>
-        </w:tc>
-        <w:tc>
-          <w:tcPr>
-            <w:tcW w:type="dxa" w:w="1020"/>
-            <w:vAlign w:val="top"/>
-            <w:shd w:val="clear" w:color="auto" w:fill="FCE8B2"/>
-          </w:tcPr>
-          <w:p>
-            <w:pPr>
-              <w:spacing w:after="20" w:line="252" w:lineRule="auto"/>
-            </w:pPr>
-            <w:r>
-              <w:rPr>
-                <w:sz w:val="17"/>
-              </w:rPr>
-              <w:t>Trung bình</w:t>
-            </w:r>
-          </w:p>
-        </w:tc>
-        <w:tc>
-          <w:tcPr>
-            <w:tcW w:type="dxa" w:w="4479"/>
-            <w:vAlign w:val="top"/>
-          </w:tcPr>
-          <w:p>
-            <w:pPr>
-              <w:spacing w:after="20" w:line="252" w:lineRule="auto"/>
-            </w:pPr>
-            <w:r>
-              <w:rPr>
-                <w:sz w:val="17"/>
-              </w:rPr>
-              <w:t>Code chunking đã sửa ngày 24/10 (Phụ lục F), nhưng corpus trong repo chưa sinh lại: 132 breadcrumb lặp dải Khoản (“Khoản 1-10 &gt; Khoản 2”) và 102 chunk không có Khoản của chính nó (breadcrumb dừng ở “Khoản 1-10”, “Khoản 11-14”). Breadcrumb này đi vào embed_text của Dense.</w:t>
-            </w:r>
-          </w:p>
-          <w:p>
-            <w:pPr>
-              <w:spacing w:after="20" w:line="252" w:lineRule="auto"/>
-            </w:pPr>
-            <w:r>
-              <w:rPr>
-                <w:b/>
-                <w:sz w:val="17"/>
-              </w:rPr>
-              <w:t xml:space="preserve">Đề xuất: </w:t>
-            </w:r>
-            <w:r>
-              <w:rPr>
-                <w:sz w:val="17"/>
-              </w:rPr>
-              <w:t>Sinh lại corpus ở bước 3 (sau khi parser sửa A25, A26) bằng chunker đã sửa; exporter nay dừng nếu lỗi này còn.</w:t>
-            </w:r>
-          </w:p>
-          <w:p>
-            <w:pPr>
-              <w:spacing w:after="20" w:line="252" w:lineRule="auto"/>
-            </w:pPr>
-            <w:r>
-              <w:rPr>
-                <w:b/>
-                <w:sz w:val="17"/>
-              </w:rPr>
-              <w:t xml:space="preserve">Kiểm chứng: </w:t>
-            </w:r>
-            <w:r>
-              <w:rPr>
-                <w:sz w:val="17"/>
-              </w:rPr>
-              <w:t>Corpus export lại trong thư mục tạm: 0 breadcrumb sai Khoản ở 11 và 21 văn bản; test_child_breadcrumb_has_only_own_clause pass.</w:t>
-            </w:r>
-          </w:p>
-        </w:tc>
-        <w:tc>
-          <w:tcPr>
-            <w:tcW w:type="dxa" w:w="1701"/>
-            <w:vAlign w:val="top"/>
-          </w:tcPr>
-          <w:p>
-            <w:pPr>
-              <w:spacing w:after="20" w:line="252" w:lineRule="auto"/>
-            </w:pPr>
-            <w:r>
-              <w:rPr>
-                <w:sz w:val="17"/>
-              </w:rPr>
-              <w:t>data/chunking_output/chunks.jsonl; chunking/export_legal_chunks.py: _assert_breadcrumb</w:t>
-            </w:r>
-          </w:p>
-        </w:tc>
-        <w:tc>
-          <w:tcPr>
-            <w:tcW w:type="dxa" w:w="1077"/>
-            <w:vAlign w:val="top"/>
-          </w:tcPr>
-          <w:p>
-            <w:pPr>
-              <w:spacing w:after="20" w:line="252" w:lineRule="auto"/>
-            </w:pPr>
-            <w:r>
-              <w:rPr>
-                <w:sz w:val="17"/>
-              </w:rPr>
-              <w:t>Chunking</w:t>
             </w:r>
           </w:p>
         </w:tc>
@@ -4479,7 +4051,7 @@
       </w:pPr>
       <w:r>
         <w:rPr/>
-        <w:t>Nhóm B đo ngày 24/10 trên nhánh chunking_test sau bản sửa chunking. B9, B12 đã sửa và được bỏ khỏi bảng. B1, B10, B13 đã sửa trong code nhưng giữ trong bảng vì corpus trong repo chưa sinh lại (parser A25, A26 chưa xong). Ba lỗi mới B14 (merge 1c40712 làm chunker lỗi cú pháp), B15 (intro của Điều không vào chunk con), B16 (Parent vượt ngưỡng khi intro trùng Khoản đầu dài) tìm thấy và sửa cùng đợt; B17 (chunker lấy câu đầu intro làm tiêu đề cho Điều không có tiêu đề) tìm thấy khi kiểm lại sau commit và cũng đã sửa. Số liệu đo trên corpus sinh lại trong thư mục tạm ở Phụ lục F.</w:t>
+        <w:t>Nhóm B đo ngày 24/10 trên nhánh chunking_test sau bản sửa chunking. B9, B12 đã sửa và được bỏ khỏi bảng. B1, B10, B13 đã sửa trong code và được bỏ khỏi bảng sau khi corpus trong repo được sinh lại ở 664634e ngày 25/10 (0 “Khoản 1” giả, 0 breadcrumb sai Khoản, 0 chunk dưới 10 ký tự); B2 chỉ còn phía truy vấn và requirements-bkai.txt. Ba lỗi mới B14 (merge 1c40712 làm chunker lỗi cú pháp), B15 (intro của Điều không vào chunk con), B16 (Parent vượt ngưỡng khi intro trùng Khoản đầu dài) tìm thấy và sửa cùng đợt; B17 (chunker lấy câu đầu intro làm tiêu đề cho Điều không có tiêu đề) tìm thấy khi kiểm lại sau commit và cũng đã sửa. Số liệu đo trên corpus sinh lại trong thư mục tạm ở Phụ lục F.</w:t>
       </w:r>
     </w:p>
     <w:p>
@@ -13007,7 +12579,7 @@
               <w:rPr>
                 <w:sz w:val="17"/>
               </w:rPr>
-              <w:t>Code chunker đã sửa ngày 24/10 (Phụ lục F). Còn: chạy export_legal_chunks.py và commit cùng PR với parser, để corpus hết “Khoản 1” giả (B1), breadcrumb sai Khoản (B10) và được exporter mới kiểm chunk dưới 10 ký tự (B13); CI kiểm chunks.jsonl khớp parsed_jsons (B11). Xóa corpus cũ, data/parser_validated/ và các mặc định trỏ file smoke (B4). Ghim underthesea ở requirements-bkai.txt, tách từ câu hỏi cùng phiên bản (B2).</w:t>
+              <w:t>Corpus đã sinh lại ở 664634e (25/10): 0 “Khoản 1” giả (B1), 0 breadcrumb sai Khoản (B10), exporter mới kiểm chunk dưới 10 ký tự (B13). Còn: CI kiểm chunks.jsonl khớp parsed_jsons (B11). Xóa corpus cũ, data/parser_validated/ và các mặc định trỏ file smoke (B4). Ghim underthesea ở requirements-bkai.txt, tách từ câu hỏi cùng phiên bản (B2). Khi Dev 1 chốt A6 theo bản VBHN, chạy lại parser và export cho Luật 52/2014.</w:t>
             </w:r>
           </w:p>
         </w:tc>
@@ -13023,7 +12595,7 @@
               <w:rPr>
                 <w:sz w:val="17"/>
               </w:rPr>
-              <w:t>B11, B1, B10, B13, B2, B4</w:t>
+              <w:t>B11, B2, B4</w:t>
             </w:r>
           </w:p>
         </w:tc>
@@ -13055,7 +12627,7 @@
               <w:rPr>
                 <w:sz w:val="17"/>
               </w:rPr>
-              <w:t>Chạy export và commit: sau khi chốt A6 (bước 1).</w:t>
+              <w:t>Phần còn lại: ngay. Chạy lại export: khi Dev 1 chốt A6 (bước 1).</w:t>
             </w:r>
           </w:p>
         </w:tc>
@@ -13505,7 +13077,7 @@
     <w:p>
       <w:pPr/>
       <w:r>
-        <w:t>Đường găng là 1 → 2 → 3 → 4 → 5 → 6 → 7, trong đó C3 và ID của Luật 1986 đã xong; trước khi sinh corpus còn cần chốt phiên bản Luật 52/2014 (A6); A28 đã sửa ngày 25/10 (77b5886). Thí nghiệm lấy text từ HTML của vbpl.vn (Phụ lục J) không nằm trên đường găng; chỉ làm khi cần thêm nhiều văn bản. Bước 0 nên xong trong ngày đầu để mọi người chạy được parser và test. Phần viết code của bước 5 và 6 làm song song trên fixture theo nguyên tắc mock-first, chỉ chạy số thật khi đã có data-v1 và gold mới. Lưu ý: corpus mới mang tiêu đề văn bản theo registry (A16), nên Dense có thể giảm nếu chưa có bộ lọc as_of_date (register v2 đo Hit@10 từ 0,570 xuống 0,479). Vì vậy chỉ so số đo sau khi xong E1 ở bước 5.</w:t>
+        <w:t>Đường găng là 1 → 2 → 3 → 4 → 5 → 6 → 7, trong đó C3 và ID của Luật 1986 đã xong; A28 đã sửa (77b5886) và corpus đã sinh lại ở 664634e (bước 3); khi Dev 1 chốt phiên bản Luật 52/2014 (A6) chỉ cần chạy lại parser và export, chunk_id không đổi. Thí nghiệm lấy text từ HTML của vbpl.vn (Phụ lục J) không nằm trên đường găng; chỉ làm khi cần thêm nhiều văn bản. Bước 0 nên xong trong ngày đầu để mọi người chạy được parser và test. Phần viết code của bước 5 và 6 làm song song trên fixture theo nguyên tắc mock-first, chỉ chạy số thật khi đã có data-v1 và gold mới. Lưu ý: corpus mới mang tiêu đề văn bản theo registry (A16), nên Dense có thể giảm nếu chưa có bộ lọc as_of_date (register v2 đo Hit@10 từ 0,570 xuống 0,479). Vì vậy chỉ so số đo sau khi xong E1 ở bước 5.</w:t>
       </w:r>
     </w:p>
     <w:p>
@@ -13618,7 +13190,7 @@
               <w:rPr>
                 <w:sz w:val="17"/>
               </w:rPr>
-              <w:t>Chốt phiên bản Luật 52/2014 (A6) trước khi sinh corpus; rồi C5 (article_index cho văn bản mới).</w:t>
+              <w:t>Chốt phiên bản Luật 52/2014 (A6); rồi C5 (article_index cho văn bản mới).</w:t>
             </w:r>
           </w:p>
         </w:tc>
@@ -13722,7 +13294,7 @@
               <w:rPr>
                 <w:sz w:val="17"/>
               </w:rPr>
-              <w:t>Code chunker đã sửa (24/10); chạy export và commit corpus khi bước 1 và 2 xong; xóa corpus cũ cùng Dev 4 (B4).</w:t>
+              <w:t>Corpus đã sinh lại (664634e); chạy lại export khi Dev 1 chốt A6; xóa corpus cũ cùng Dev 4 (B4).</w:t>
             </w:r>
           </w:p>
         </w:tc>
@@ -18736,13 +18308,13 @@
       </w:pPr>
       <w:r>
         <w:rPr/>
-        <w:t>Phụ lục K. Sửa A28 và phần test của A7 (25/10)</w:t>
+        <w:t>Phụ lục K. Sửa A28, phần test của A7 và sinh lại corpus (25/10)</w:t>
       </w:r>
     </w:p>
     <w:p>
       <w:r>
         <w:rPr/>
-        <w:t>Sửa ngày 25/10/2026 trên testing, commit 77b5886 (cha là 64b65f0). parser/parser.py: tiêu đề Điều ghép từ các dòng còn giữ dấu câu cuối dòng (split_title_from_line_structure vẫn dùng bản đã bỏ “ :;” để quyết định có ghép hay không, nên chỗ tách tiêu đề và nội dung không đổi); tiêu đề Chương/Mục giữ dấu câu cuối dòng và ghép tối đa 8 dòng (MAX_HEADING_CONTINUATION_LINES, trước là 2), vẫn dừng ở mốc cấu trúc kế tiếp hoặc dòng không viết hoa; HYPHEN_LINE_BREAK_RE ghép “NĐ-” + xuống dòng + “CP” trước khi tách Điều, trừ khi dòng sau mở đầu Khoản hoặc mốc cấu trúc; thông báo FileNotFoundError của find_document_versions_file xuống dòng thật. Sinh lại parsed_jsons bằng test_parser.py --skip-clean: 21 thành công, 2 TT chia theo mục La Mã vẫn lỗi như trước; 8 file đổi, không Điều hay Khoản nào thêm, bớt hay đổi số, mọi chỗ đổi là dấu câu, phần tiêu đề bị cụt hoặc dấu cách thừa. parser/test_parser_unit.py thêm test: tiêu đề Chương/Mục khớp nguyên văn TXT và kéo tới mốc kế tiếp, tiêu đề Điều khớp nguyên văn TXT, không số hiệu nào bị tách sau “-” (ba test chạy trên mọi TXT), dấu “;” của TT 02a/2015 Điều 4, 8 Mục của TT 04/2020 (A27), tiêu đề TTLT 01/2016 Điều 9 (A23); ngưỡng tiêu đề hạ từ 80 xuống 40 từ, ngoại lệ NĐ 126/2014 Điều 8 (44 từ) và TT 02a/2015 Điều 4 (41 từ). Chạy các test mới với parser.py của 64b65f0: 13 test fail, đúng ở các chỗ lỗi A28. Corpus trong repo chưa sinh lại (chờ A6).</w:t>
+        <w:t>Sửa ngày 25/10/2026 trên testing, commit 77b5886 (cha là 64b65f0). parser/parser.py: tiêu đề Điều ghép từ các dòng còn giữ dấu câu cuối dòng (split_title_from_line_structure vẫn dùng bản đã bỏ “ :;” để quyết định có ghép hay không, nên chỗ tách tiêu đề và nội dung không đổi); tiêu đề Chương/Mục giữ dấu câu cuối dòng và ghép tối đa 8 dòng (MAX_HEADING_CONTINUATION_LINES, trước là 2), vẫn dừng ở mốc cấu trúc kế tiếp hoặc dòng không viết hoa; HYPHEN_LINE_BREAK_RE ghép “NĐ-” + xuống dòng + “CP” trước khi tách Điều, trừ khi dòng sau mở đầu Khoản hoặc mốc cấu trúc; thông báo FileNotFoundError của find_document_versions_file xuống dòng thật. Sinh lại parsed_jsons bằng test_parser.py --skip-clean: 21 thành công, 2 TT chia theo mục La Mã vẫn lỗi như trước; 8 file đổi, không Điều hay Khoản nào thêm, bớt hay đổi số, mọi chỗ đổi là dấu câu, phần tiêu đề bị cụt hoặc dấu cách thừa. parser/test_parser_unit.py thêm test: tiêu đề Chương/Mục khớp nguyên văn TXT và kéo tới mốc kế tiếp, tiêu đề Điều khớp nguyên văn TXT, không số hiệu nào bị tách sau “-” (ba test chạy trên mọi TXT), dấu “;” của TT 02a/2015 Điều 4, 8 Mục của TT 04/2020 (A27), tiêu đề TTLT 01/2016 Điều 9 (A23); ngưỡng tiêu đề hạ từ 80 xuống 40 từ, ngoại lệ NĐ 126/2014 Điều 8 (44 từ) và TT 02a/2015 Điều 4 (41 từ). Chạy các test mới với parser.py của 64b65f0: 13 test fail, đúng ở các chỗ lỗi A28. Sau đó corpus được sinh lại ở commit 664634e bằng chunking/export_legal_chunks.py (export trong thư mục tạm cho kết quả giống hệt). Mọi chunk_id cũ còn nguyên nên chọn phiên bản Luật 52/2014 sau (A6) chỉ đổi chữ của văn bản này. pytest từng file ở parser/, tests/, test/ pass, trừ test_build_function_loads_chunks_creates_index_and_returns_stats của test/test_bm25_retrieval.py: test đọc fixture smoke embedding/data/han_gia_dinh_smoke_chunks.json (336 chunk) nhưng ghi cứng 321, không liên quan tới corpus.</w:t>
       </w:r>
     </w:p>
     <w:tbl>
@@ -19053,7 +18625,7 @@
               <w:rPr>
                 <w:sz w:val="17"/>
               </w:rPr>
-              <w:t>Không đổi. 4 trong 11 văn bản của corpus có chữ đổi khi sinh lại (NĐ 126/2014, NĐ 207/2025, TT 02a/2015, TTLT 01/2016).</w:t>
+              <w:t>Sinh lại ở 664634e: 21 văn bản, 2.011 chunk, 923 parent; giữ 1.156/1.156 chunk_id cũ, 103 chunk cũ đổi chữ, 11 văn bản cũ có thêm 4 chunk (có khoản 4, 5 Điều 2 Luật 52/2014); tokenization underthesea 9.5.0, seg_text khác text ở 100% chunk; 0 “Khoản 1” giả, 0 breadcrumb sai Khoản, 0 chunk dưới 10 ký tự, 1.888/1.888 Khoản có trong parsed_jsons; ID trong ground_truth.json có trong corpus: 541/546 (trước 538/546).</w:t>
             </w:r>
           </w:p>
         </w:tc>

</xml_diff>

<commit_message>
docs(report): record the CTM 9348764 and NMA 86b55f5 rechecks and the 26/10 A16, A7, H2 fixes in Appendix P, Q and R
</commit_message>
<xml_diff>
--- a/docs/sprint6_issue_recheck_after_merge.docx
+++ b/docs/sprint6_issue_recheck_after_merge.docx
@@ -25,7 +25,7 @@
         <w:rPr>
           <w:sz w:val="19"/>
         </w:rPr>
-        <w:t>Người lập: Dev 5 (Reranker &amp; Packaging Lead)   ·   Ngày: 22/10/2026   ·   Phạm vi: nhánh testing, commit 75dd586 (gộp CTM 5b62b35 và NMA f8e8311); nhóm A kiểm lại trên e9ee31d, e64c49a, 72a7377, 840c8a3, 64b65f0; nhóm C kiểm lại trên bafe1e8, 840c8a3, 3d646da, C3 sửa ở 75e06c8; nhóm B kiểm lại và sửa trên nhánh chunking_test (1c40712); trạng thái đối chiếu lại trên be28659 (25/10); sửa trên testing be28659..96d0086 (Phụ lục N)</w:t>
+        <w:t>Người lập: Dev 5 (Reranker &amp; Packaging Lead)   ·   Ngày: 22/10/2026   ·   Phạm vi: nhánh testing, commit 75dd586 (gộp CTM 5b62b35 và NMA f8e8311); nhóm A kiểm lại trên e9ee31d, e64c49a, 72a7377, 840c8a3, 64b65f0, 5ef41dc; nhóm C kiểm lại trên bafe1e8, 840c8a3, 3d646da, C3 sửa ở 75e06c8; nhóm B kiểm lại và sửa trên nhánh chunking_test (1c40712); trạng thái đối chiếu lại trên be28659 (25/10); sửa trên testing be28659..96d0086 (Phụ lục N); các dòng còn mở kiểm lại trên 948fc94 (Phụ lục O); gộp CTM 9348764 kiểm trên 01c639e (Phụ lục P); gộp NMA 86b55f5 kiểm trên 5ef41dc (Phụ lục Q); sửa A16, A7, H2 ngày 26/10 (Phụ lục R)</w:t>
       </w:r>
     </w:p>
     <w:p>
@@ -34,7 +34,7 @@
         <w:rPr>
           <w:sz w:val="19"/>
         </w:rPr>
-        <w:t>Cập nhật 23/10/2026: kiểm lại sau khi gộp origin/CTM ee755a5 vào testing (commit e64c49a). Mục 3 chỉ ghi phần còn lỗi tính tới e64c49a, gồm cả 7 lỗi mới. Cùng ngày, nhóm A được kiểm lại toàn bộ trên e64c49a (Phụ lục C); A24 và Phụ lục B (kết quả kiểm nhóm A trên e9ee31d ngày 22/10) bị mất trong lần cập nhật trước nên được ghi lại. Cũng ngày 23/10, nhóm C được kiểm lại toàn bộ trên bafe1e8, gồm phân tích lại C6 (Phụ lục D). Ngày 24/10/2026, sau khi kéo nhánh NMA mới nhất (testing fast-forward lên 72a7377), nhóm A được kiểm lại toàn bộ (Phụ lục E): A13, A23, A24 đã sửa và được bỏ khỏi bảng; thêm 2 lỗi mới A25, A26. Cũng ngày 24/10, nhóm B được kiểm lại và sửa trên nhánh chunking_test (Phụ lục F): B9, B12 đã sửa và được bỏ khỏi bảng; B1, B10, B13 đã sửa trong code nhưng còn trong bảng cho tới khi corpus trong repo được sinh lại; thêm 3 lỗi mới B14, B15, B16, đều đã sửa. Kiểm lại chunking sau commit: thêm B17 (chunker lấy câu đầu intro làm tiêu đề, đã sửa) và A27 (parser không nhận nhãn “Mục N.”, TT 04/2020 mất cấp Mục). Cuối ngày 24/10, sau khi gộp NMA (b031620–fc997a6) vào testing ở 840c8a3, nhóm C được kiểm lại toàn bộ (Phụ lục G): không lỗi nào sửa xong; C6 sửa thêm một phần (ID của Luật 1986 viết thường, test định danh cho parsed_jsons, run_experiment.py không còn ghi cứng file TTLT); các lỗi C khác không đổi vì contract, schema, code retrieval, reranker và benchmark không đổi từ bafe1e8. Cũng ở 840c8a3, nhóm A được kiểm lại toàn bộ (Phụ lục H): A21 đã sửa và được bỏ khỏi bảng; A25, A26 sửa phần lớn, nhưng mẫu cắt chú thích VBHN mới không khớp chỗ nào (chú thích nay nằm trong Luật 52/2014 Điều 2 khoản 3) và mẫu nhãn “Hướng dẫn” mới để lọt lại 3 nhãn ở NĐ 10/2015. Sau đó C3 được sửa ở 75e06c8 (bảng ánh xạ status → validity_status ở mục 3.1 của data_contract.md và test_registry_validity_status_mapping) và được bỏ khỏi bảng. Cuối ngày 24/10, sau khi gộp NMA 1260ed8 vào testing ở 64b65f0, nhóm A được kiểm lại (Phụ lục I): 11 PDF gốc được thay bằng bản có lớp text; A27 đã sửa và được bỏ khỏi bảng; A25 chỉ còn phần corpus và các mẫu cleaner thừa; L01 quay về bản gốc 2014 (A6); thêm lỗi mới A28 (ghép dòng làm mất dấu câu, làm 1 test fail). Ngày 25/10, A28 và phần test của A7 được sửa ở commit 77b5886 trên testing (Phụ lục K): A28 được bỏ khỏi bảng, A7 chỉ còn CI và test cho cleaner. Cũng ngày 25/10, corpus được sinh lại ở 664634e (21 văn bản, 2.011 chunk, tách từ underthesea): A25, A26 hết phần corpus; B1, B10, B13 đã sửa và được bỏ khỏi bảng; B2 chỉ còn phía truy vấn và requirements-bkai.txt. Cũng ngày 25/10, sau khi kéo nhánh CTM (f87a327, 4afa41e, 3d646da) vào testing, nhóm C được kiểm lại toàn bộ trên 3d646da (Phụ lục L): C6, C8, C9 đã sửa và được bỏ khỏi bảng; C2, C4, C5, C7 sửa thêm một phần và chỉ còn phần chưa sửa; thêm lỗi mới C10 (3d646da làm scripts/build_gold_300_provisional.py lỗi cú pháp; phần lỗi cú pháp sửa ở d1eaa3a). Sau đó article_index.json được bổ sung 9 văn bản còn thiếu ở d24ff2a; C5 chỉ còn context_registry.json và kiểu ID của gold_article_ids. C7 sửa xong ở 33bc4ff (xóa reranking/results cũ, bỏ ENVELOPE_FIELDS) và được bỏ khỏi bảng. Cuối ngày 25/10, trạng thái các dòng của mục 3 được đối chiếu lại với code trên be28659 (Phụ lục M): H5 chưa sửa (testing vẫn theo dõi 2 file .pyc) nên chuyển về Còn; A11, A16, B3, E3, E12, E15 đã sửa phần của register v2 nhưng còn việc nên chuyển sang Còn một phần; B3 bỏ phần đã hết (ID chữ hoa, candidate của Luật 52/2014 và NĐ 207/2025); G3 bỏ phần reranking/results đã xóa ở 33bc4ff. Mục 5 được viết lại vì parser và corpus không còn nằm trên đường găng, và có thêm bảng phân loại lỗi theo mức cần phối hợp. Cũng ngày 25/10, các lỗi sửa được mà không cần bàn với dev khác được sửa trên testing, 9 commit từ 5e0b9c2 tới 96d0086, chưa push (Phụ lục N): A8, A11, A25, B3, C10, D3, D4, D5, E3, E7, E9, E10, E15, G1, G2, G6, H9 đã sửa và được bỏ khỏi bảng; A7, B2, B4, C2, C4, C5, E11, E14, F1, G5, H2, H4, H5 chỉ còn phần chưa sửa; D1 ghi thêm 11 câu đã duyệt còn trong gold_id_proposals_300.json. Toàn bộ test chạy chung (parser/, tests/, test/): 531 pass, 20 skip, 0 fail. Mục 5 viết lại theo các lỗi còn mở.</w:t>
+        <w:t>Cập nhật 23/10/2026: kiểm lại sau khi gộp origin/CTM ee755a5 vào testing (commit e64c49a). Mục 3 chỉ ghi phần còn lỗi tính tới e64c49a, gồm cả 7 lỗi mới. Cùng ngày, nhóm A được kiểm lại toàn bộ trên e64c49a (Phụ lục C); A24 và Phụ lục B (kết quả kiểm nhóm A trên e9ee31d ngày 22/10) bị mất trong lần cập nhật trước nên được ghi lại. Cũng ngày 23/10, nhóm C được kiểm lại toàn bộ trên bafe1e8, gồm phân tích lại C6 (Phụ lục D). Ngày 24/10/2026, sau khi kéo nhánh NMA mới nhất (testing fast-forward lên 72a7377), nhóm A được kiểm lại toàn bộ (Phụ lục E): A13, A23, A24 đã sửa và được bỏ khỏi bảng; thêm 2 lỗi mới A25, A26. Cũng ngày 24/10, nhóm B được kiểm lại và sửa trên nhánh chunking_test (Phụ lục F): B9, B12 đã sửa và được bỏ khỏi bảng; B1, B10, B13 đã sửa trong code nhưng còn trong bảng cho tới khi corpus trong repo được sinh lại; thêm 3 lỗi mới B14, B15, B16, đều đã sửa. Kiểm lại chunking sau commit: thêm B17 (chunker lấy câu đầu intro làm tiêu đề, đã sửa) và A27 (parser không nhận nhãn “Mục N.”, TT 04/2020 mất cấp Mục). Cuối ngày 24/10, sau khi gộp NMA (b031620–fc997a6) vào testing ở 840c8a3, nhóm C được kiểm lại toàn bộ (Phụ lục G): không lỗi nào sửa xong; C6 sửa thêm một phần (ID của Luật 1986 viết thường, test định danh cho parsed_jsons, run_experiment.py không còn ghi cứng file TTLT); các lỗi C khác không đổi vì contract, schema, code retrieval, reranker và benchmark không đổi từ bafe1e8. Cũng ở 840c8a3, nhóm A được kiểm lại toàn bộ (Phụ lục H): A21 đã sửa và được bỏ khỏi bảng; A25, A26 sửa phần lớn, nhưng mẫu cắt chú thích VBHN mới không khớp chỗ nào (chú thích nay nằm trong Luật 52/2014 Điều 2 khoản 3) và mẫu nhãn “Hướng dẫn” mới để lọt lại 3 nhãn ở NĐ 10/2015. Sau đó C3 được sửa ở 75e06c8 (bảng ánh xạ status → validity_status ở mục 3.1 của data_contract.md và test_registry_validity_status_mapping) và được bỏ khỏi bảng. Cuối ngày 24/10, sau khi gộp NMA 1260ed8 vào testing ở 64b65f0, nhóm A được kiểm lại (Phụ lục I): 11 PDF gốc được thay bằng bản có lớp text; A27 đã sửa và được bỏ khỏi bảng; A25 chỉ còn phần corpus và các mẫu cleaner thừa; L01 quay về bản gốc 2014 (A6); thêm lỗi mới A28 (ghép dòng làm mất dấu câu, làm 1 test fail). Ngày 25/10, A28 và phần test của A7 được sửa ở commit 77b5886 trên testing (Phụ lục K): A28 được bỏ khỏi bảng, A7 chỉ còn CI và test cho cleaner. Cũng ngày 25/10, corpus được sinh lại ở 664634e (21 văn bản, 2.011 chunk, tách từ underthesea): A25, A26 hết phần corpus; B1, B10, B13 đã sửa và được bỏ khỏi bảng; B2 chỉ còn phía truy vấn và requirements-bkai.txt. Cũng ngày 25/10, sau khi kéo nhánh CTM (f87a327, 4afa41e, 3d646da) vào testing, nhóm C được kiểm lại toàn bộ trên 3d646da (Phụ lục L): C6, C8, C9 đã sửa và được bỏ khỏi bảng; C2, C4, C5, C7 sửa thêm một phần và chỉ còn phần chưa sửa; thêm lỗi mới C10 (3d646da làm scripts/build_gold_300_provisional.py lỗi cú pháp; phần lỗi cú pháp sửa ở d1eaa3a). Sau đó article_index.json được bổ sung 9 văn bản còn thiếu ở d24ff2a; C5 chỉ còn context_registry.json và kiểu ID của gold_article_ids. C7 sửa xong ở 33bc4ff (xóa reranking/results cũ, bỏ ENVELOPE_FIELDS) và được bỏ khỏi bảng. Cuối ngày 25/10, trạng thái các dòng của mục 3 được đối chiếu lại với code trên be28659 (Phụ lục M): H5 chưa sửa (testing vẫn theo dõi 2 file .pyc) nên chuyển về Còn; A11, A16, B3, E3, E12, E15 đã sửa phần của register v2 nhưng còn việc nên chuyển sang Còn một phần; B3 bỏ phần đã hết (ID chữ hoa, candidate của Luật 52/2014 và NĐ 207/2025); G3 bỏ phần reranking/results đã xóa ở 33bc4ff. Mục 5 được viết lại vì parser và corpus không còn nằm trên đường găng, và có thêm bảng phân loại lỗi theo mức cần phối hợp. Cũng ngày 25/10, các lỗi sửa được mà không cần bàn với dev khác được sửa trên testing, 9 commit từ 5e0b9c2 tới 96d0086, chưa push (Phụ lục N): A8, A11, A25, B3, C10, D3, D4, D5, E3, E7, E9, E10, E15, G1, G2, G6, H9 đã sửa và được bỏ khỏi bảng; A7, B2, B4, C2, C4, C5, E11, E14, F1, G5, H2, H4, H5 chỉ còn phần chưa sửa; D1 ghi thêm 11 câu đã duyệt còn trong gold_id_proposals_300.json. Toàn bộ test chạy chung (parser/, tests/, test/): 531 pass, 20 skip, 0 fail. Mục 5 viết lại theo các lỗi còn mở. Cuối ngày 25/10, các dòng còn mở của mục 3 được kiểm lại trên 948fc94 (đã push lên origin/testing; các nhánh remote khác không có commit mới) (Phụ lục O): E4, F3, F5 đã sửa một phần ở 664634e, f32754e, 146a6c9 mà bản trước chưa ghi, nên chuyển từ Còn sang Còn một phần; H8 bỏ phần tách từ đã sửa; B5, B7, E1, F1, H1 cập nhật số đo trên corpus 664634e; các dòng khác không đổi. Bước 2 của mục 5 thêm phần E4 (Dense dừng khi thiếu underthesea). Test chạy chung: 531 pass, 20 skip, 0 fail. Ngày 26/10, sau khi gộp CTM 9348764 vào testing ở 411075a, sửa thêm ở 01c639e, chưa push (Phụ lục P): CTM gộp tests/ vào test/ và bỏ bản test benchmark trùng, nên H2 chỉ còn retrieval/test/ nằm ngoài testpaths của pytest.ini; B4 cập nhật đường dẫn test/schema_test.py; lệnh chạy test ở A7 và mục 5 đổi thành python -m pytest. Phát hiện và sửa ở 01c639e: 9348764 chuyển schema_test.py mà không sửa demo_pipeline.py, nên demo lỗi ngay khi chạy. Các dòng khác không đổi. Test chạy chung: 490 pass, 20 skip, 0 fail (bớt 41 test của bản trùng). Cuối ngày 26/10, sau khi gộp NMA 86b55f5 (“update document title”) vào testing ở 5ef41dc, chưa push, nhóm A được kiểm lại (Phụ lục Q): title của 21/23 bản ghi registry (19 văn bản có parsed_jsons) đổi sang trích yếu của văn bản, ba Luật HNGĐ cùng ghi năm, nên A16 chỉ còn phần corpus, test, hai bảng ID và cách ghi title; A7 thêm một commit được đẩy lên khi test parser fail; A6, A26 không đổi. Test chạy chung: 489 pass, 20 skip, 1 fail (A16). Cũng tối 26/10 (Phụ lục R; 856e6be, 4ec0706, dfc025b): sửa các phần không cần bàn của A16 (test, hai bảng ID, NĐ 207/2025, dấu cách TT 34/2017, sinh lại corpus) và A7 (thêm workflow CI), nên A16 chỉ còn cách ghi title của 5 văn bản cũ, A7 chỉ còn push workflow và bật branch protection. Test chạy chung: 490 pass, 20 skip, 0 fail. Sau đó H2 được sửa ở 21a2385: pytest.ini thêm retrieval/test vào testpaths, nên python -m pytest chạy cả 7 test của Dev 4 (497 pass, 20 skip, 0 fail); dòng H2 được bỏ khỏi bảng.</w:t>
       </w:r>
     </w:p>
     <w:p>
@@ -50,7 +50,7 @@
         <w:spacing w:after="80"/>
       </w:pPr>
       <w:r>
-        <w:t>Trong 67 lỗi của register v2, tính tới commit e64c49a (nhóm A tính tới 64b65f0, nhóm B tính tới bản sửa chunking ngày 24/10 và corpus sinh lại ở 664634e, nhóm C tính tới 3d646da; trạng thái đối chiếu lại trên be28659, Phụ lục M; các lỗi sửa ngày 25/10 tính tới 3b1b6dc, Phụ lục N): 31 đã sửa, 1 đóng, 20 còn một phần, 1 đổi tính chất, 2 nặng hơn, 12 còn nguyên. Phát hiện thêm 21 lỗi mới: A22, A23, A24, B11, B12 (22/10; A22, A23, A24, B11 và B12 nay đã sửa), B13 (nay đã sửa), C6, C7, C8, C9, D5, H9 (23/10, sau khi gộp CTM; C6, C8, C9 nay đã sửa ở 3d646da, C7 ở 33bc4ff), A25, A26 (24/10, sau khi kéo NMA 72a7377; nay sửa một phần ở 840c8a3 và 64b65f0), B14, B15, B16, B17 (24/10, khi kiểm lại nhóm B; đã sửa) A27 (24/10, khi kiểm lại corpus thử 21 văn bản; nay đã sửa), A28 (24/10, sau khi gộp NMA 1260ed8; nay đã sửa ở 77b5886) và C10 (25/10, sau khi kéo CTM 3d646da; đã sửa ở d1eaa3a và b7f5e30; D5, H9 và A25 cũng đã sửa ngày 25/10). Trong 15 lỗi mức Cao, 8 đã sửa (A1, A12, A13, A14, B1, E15, C1, C3), 7 còn mở (B2, D1, D2, E1, E2, F1, F5). Nhóm A, B, C đã được kiểm lại lần 2 trên commit 75dd586; các chỗ đính chính ghi ở Phụ lục A. Nhóm A được kiểm lại lần 3 trên e9ee31d (Phụ lục B), lần 4 trên e64c49a (Phụ lục C) và lần 5 trên 72a7377 (Phụ lục E), lần 6 trên 840c8a3 (Phụ lục H) và lần 7 trên 64b65f0 (Phụ lục I); A28 sửa ngày 25/10 (Phụ lục K). Ngày 23/10 kiểm lại các lỗi liên quan tới thay đổi của CTM và toàn bộ nhóm A; nhóm C được kiểm lại toàn bộ trên bafe1e8 (Phụ lục D) trên 840c8a3 sau khi gộp NMA (Phụ lục G) và trên 3d646da sau khi kéo CTM (Phụ lục L); ngày 24/10 nhóm B được kiểm lại và sửa trên nhánh chunking_test (Phụ lục F); các lỗi còn lại giữ kết quả ngày 22/10.</w:t>
+        <w:t>Trong 67 lỗi của register v2, tính tới commit e64c49a (nhóm A tính tới 5ef41dc, nhóm B tính tới bản sửa chunking ngày 24/10 và corpus sinh lại ở 664634e, nhóm C tính tới 3d646da; trạng thái đối chiếu lại trên be28659, Phụ lục M; các lỗi sửa ngày 25/10 tính tới 3b1b6dc, Phụ lục N; các dòng còn mở kiểm lại trên 948fc94, Phụ lục O; thay đổi của CTM 9348764 tính tới 01c639e, Phụ lục P; title của NMA 86b55f5 tính tới 5ef41dc, Phụ lục Q; bản sửa A16, A7 ngày 26/10, Phụ lục R): 32 đã sửa, 1 đóng, 22 còn một phần, 1 đổi tính chất, 2 nặng hơn, 9 còn nguyên. Phát hiện thêm 21 lỗi mới: A22, A23, A24, B11, B12 (22/10; A22, A23, A24, B11 và B12 nay đã sửa), B13 (nay đã sửa), C6, C7, C8, C9, D5, H9 (23/10, sau khi gộp CTM; C6, C8, C9 nay đã sửa ở 3d646da, C7 ở 33bc4ff), A25, A26 (24/10, sau khi kéo NMA 72a7377; nay sửa một phần ở 840c8a3 và 64b65f0), B14, B15, B16, B17 (24/10, khi kiểm lại nhóm B; đã sửa) A27 (24/10, khi kiểm lại corpus thử 21 văn bản; nay đã sửa), A28 (24/10, sau khi gộp NMA 1260ed8; nay đã sửa ở 77b5886) và C10 (25/10, sau khi kéo CTM 3d646da; đã sửa ở d1eaa3a và b7f5e30; D5, H9 và A25 cũng đã sửa ngày 25/10). Trong 15 lỗi mức Cao, 8 đã sửa (A1, A12, A13, A14, B1, E15, C1, C3), 7 còn mở (B2, D1, D2, E1, E2, F1, F5). Nhóm A, B, C đã được kiểm lại lần 2 trên commit 75dd586; các chỗ đính chính ghi ở Phụ lục A. Nhóm A được kiểm lại lần 3 trên e9ee31d (Phụ lục B), lần 4 trên e64c49a (Phụ lục C) và lần 5 trên 72a7377 (Phụ lục E), lần 6 trên 840c8a3 (Phụ lục H) và lần 7 trên 64b65f0 (Phụ lục I); A28 sửa ngày 25/10 (Phụ lục K). Ngày 23/10 kiểm lại các lỗi liên quan tới thay đổi của CTM và toàn bộ nhóm A; nhóm C được kiểm lại toàn bộ trên bafe1e8 (Phụ lục D) trên 840c8a3 sau khi gộp NMA (Phụ lục G) và trên 3d646da sau khi kéo CTM (Phụ lục L); ngày 24/10 nhóm B được kiểm lại và sửa trên nhánh chunking_test (Phụ lục F); các lỗi còn lại giữ kết quả ngày 22/10.</w:t>
       </w:r>
     </w:p>
     <w:p>
@@ -945,7 +945,7 @@
               <w:spacing w:after="0"/>
             </w:pPr>
             <w:r>
-              <w:t>4</w:t>
+              <w:t>5</w:t>
             </w:r>
             <w:r>
               <w:rPr>
@@ -1005,7 +1005,7 @@
               <w:spacing w:after="0"/>
             </w:pPr>
             <w:r>
-              <w:t>3</w:t>
+              <w:t>2</w:t>
             </w:r>
             <w:r>
               <w:rPr>
@@ -1106,7 +1106,7 @@
               <w:spacing w:after="0"/>
             </w:pPr>
             <w:r>
-              <w:t>1</w:t>
+              <w:t>3</w:t>
             </w:r>
             <w:r>
               <w:rPr>
@@ -1166,7 +1166,7 @@
               <w:spacing w:after="0"/>
             </w:pPr>
             <w:r>
-              <w:t>5</w:t>
+              <w:t>3</w:t>
             </w:r>
             <w:r>
               <w:rPr>
@@ -1388,7 +1388,7 @@
               <w:spacing w:after="0"/>
             </w:pPr>
             <w:r>
-              <w:t>0</w:t>
+              <w:t>1</w:t>
             </w:r>
             <w:r>
               <w:rPr>
@@ -1428,7 +1428,7 @@
               <w:spacing w:after="0"/>
             </w:pPr>
             <w:r>
-              <w:t>4</w:t>
+              <w:t>3</w:t>
             </w:r>
             <w:r>
               <w:rPr>
@@ -1553,7 +1553,7 @@
                 <w:b/>
                 <w:sz w:val="17"/>
               </w:rPr>
-              <w:t>31</w:t>
+              <w:t>32</w:t>
             </w:r>
           </w:p>
         </w:tc>
@@ -1589,7 +1589,7 @@
                 <w:b/>
                 <w:sz w:val="17"/>
               </w:rPr>
-              <w:t>20</w:t>
+              <w:t>22</w:t>
             </w:r>
           </w:p>
         </w:tc>
@@ -1643,7 +1643,7 @@
                 <w:b/>
                 <w:sz w:val="17"/>
               </w:rPr>
-              <w:t>12</w:t>
+              <w:t>9</w:t>
             </w:r>
           </w:p>
         </w:tc>
@@ -2145,7 +2145,7 @@
         <w:spacing w:after="80"/>
       </w:pPr>
       <w:r>
-        <w:t>Mỗi nhóm có một bảng gồm các lỗi của register v2 còn việc phải làm và các lỗi mới, chỉ ghi phần còn lỗi tính tới e64c49a (nhóm A tính tới 64b65f0, nhóm B tính tới bản sửa chunking ngày 24/10, nhóm C tính tới 3d646da). Trong mỗi bảng, lỗi xếp theo mức độ; cùng mức thì lỗi mới đứng trước. Cột Vấn đề và đề xuất gồm phần còn lỗi, “Đề xuất” và, khi có, “Kiểm chứng”. Lỗi của register v2 giữ mức độ như register; Vị trí và Owner của chúng lấy từ register v2 (commit ae1ce0d), nên số dòng có thể đã lệch. Lỗi có trạng thái “Còn” giữ nguyên mô tả, đề xuất và kiểm chứng của register v2 vì file liên quan chưa đổi; số đo trong đó được đo trên corpus cũ.</w:t>
+        <w:t>Mỗi nhóm có một bảng gồm các lỗi của register v2 còn việc phải làm và các lỗi mới, chỉ ghi phần còn lỗi tính tới e64c49a (nhóm A tính tới 5ef41dc, nhóm B tính tới bản sửa chunking ngày 24/10, nhóm C tính tới 3d646da). Trong mỗi bảng, lỗi xếp theo mức độ; cùng mức thì lỗi mới đứng trước. Cột Vấn đề và đề xuất gồm phần còn lỗi, “Đề xuất” và, khi có, “Kiểm chứng”. Lỗi của register v2 giữ mức độ như register; Vị trí và Owner của chúng lấy từ register v2 (commit ae1ce0d), nên số dòng có thể đã lệch. Lỗi có trạng thái “Còn” giữ nguyên mô tả, đề xuất và kiểm chứng của register v2 vì file liên quan chưa đổi; số đo trong đó được đo trên corpus cũ.</w:t>
       </w:r>
     </w:p>
     <w:p>
@@ -2161,7 +2161,7 @@
         <w:spacing w:after="80"/>
       </w:pPr>
       <w:r>
-        <w:t>Các lỗi đã sửa hoặc đã đóng mà không còn việc gì được bỏ khỏi bảng (vẫn tính trong thống kê ở mục 1; kết quả kiểm nhóm A ở Phụ lục C, E, H, I và K, nhóm B ở Phụ lục F, nhóm C ở Phụ lục D, G và L; các lỗi sửa ngày 25/10 ở Phụ lục N): A1, A5, A8, A10, A11, A12, A13, A14, A15, A17, A18, A19, A20, A21, A22, A23, A24, A25, A27, A28, B1, B3, B8, B9, B10, B11, B12, B13, B14, B15, B16, B17, C1, C3, C6, C7, C8, C9, C10, D3, D4, D5, E3, E5, E7, E9, E10, E15, G1, G2, G6, H9. Đề xuất CI (gồm kiểm tra chunks.jsonl khớp parsed_jsons của B11) nằm ở A7 và bước 0 của mục 5.</w:t>
+        <w:t>Các lỗi đã sửa hoặc đã đóng mà không còn việc gì được bỏ khỏi bảng (vẫn tính trong thống kê ở mục 1; kết quả kiểm nhóm A ở Phụ lục C, E, H, I và K, nhóm B ở Phụ lục F, nhóm C ở Phụ lục D, G và L; các lỗi sửa ngày 25/10 ở Phụ lục N): A1, A5, A8, A10, A11, A12, A13, A14, A15, A17, A18, A19, A20, A21, A22, A23, A24, A25, A27, A28, B1, B3, B8, B9, B10, B11, B12, B13, B14, B15, B16, B17, C1, C3, C6, C7, C8, C9, C10, D3, D4, D5, E3, E5, E7, E9, E10, E15, G1, G2, G6, H2, H9. Đề xuất CI (gồm kiểm tra chunks.jsonl khớp parsed_jsons của B11) nằm ở A7 và bước 0 của mục 5.</w:t>
       </w:r>
     </w:p>
     <w:p>
@@ -2435,6 +2435,7 @@
           <w:tcPr>
             <w:tcW w:type="dxa" w:w="964"/>
             <w:vAlign w:val="top"/>
+            <w:shd w:val="clear" w:color="auto" w:fill="FFF2CC"/>
           </w:tcPr>
           <w:p>
             <w:pPr>
@@ -2499,7 +2500,7 @@
               <w:rPr>
                 <w:sz w:val="17"/>
               </w:rPr>
-              <w:t>Title là dạng tóm tắt của registry, không phải tên chính thức (vd TT 32/2016 “Quy định liên quan đến hỗ trợ sinh sản”, NĐ 77/2001 “Đăng ký kết hôn theo Nghị quyết 35/2000/QH10”); ba Luật HNGĐ ghi năm không thống nhất (“Luật Hôn nhân và gia đình năm 1986”, “Luật Hôn nhân và gia đình 2000”, Luật 52/2014 không ghi năm). Luật 22/2000 phải mang hậu tố năm để không trùng title với Luật 52/2014.</w:t>
+              <w:t>Title chưa theo một cách ghi: 5 bản ghi (NĐ 70/2001, NĐ 32/2002, NĐ 77/2001, TT 07/2001, TT 07/2002) chép cả dòng đầu văn bản “Nghị định của Chính phủ số … ngày …”, “Thông tư của Bộ Tư pháp số … ngày …”, lặp lại document_type, document_number, issue_date; các bản ghi khác chỉ ghi trích yếu. Title đứng đầu embed_text nên phần lặp này vào cả embed_text của 3 Nghị định (title của NĐ 77/2001 dài 40 từ). TT 04/2020 và TT 15/2015 có title chính thức trùng nhau nên phần đầu embed_text của hai văn bản giống hệt.</w:t>
             </w:r>
           </w:p>
           <w:p>
@@ -2517,7 +2518,25 @@
               <w:rPr>
                 <w:sz w:val="17"/>
               </w:rPr>
-              <w:t>Dev 1 chốt registry là nguồn title chính thức và một cách ghi năm cho các văn bản cùng tên.</w:t>
+              <w:t>Dev 1 chốt title chỉ ghi trích yếu (bỏ loại, số hiệu, ngày ở 5 bản ghi trên), rồi chạy lại parser và export (chunk_id không đổi; test_registry_and_mapping_tables_integrity báo nếu quên sửa hai bảng ID hoặc sinh lại corpus). TT 04/2020 và TT 15/2015 được tách nhờ lọc theo thời điểm (E1); nếu cần, Chunking thêm số hiệu vào đầu embed_text.</w:t>
+            </w:r>
+          </w:p>
+          <w:p>
+            <w:pPr>
+              <w:spacing w:after="20" w:line="252" w:lineRule="auto"/>
+            </w:pPr>
+            <w:r>
+              <w:rPr>
+                <w:b/>
+                <w:sz w:val="17"/>
+              </w:rPr>
+              <w:t xml:space="preserve">Kiểm chứng: </w:t>
+            </w:r>
+            <w:r>
+              <w:rPr>
+                <w:sz w:val="17"/>
+              </w:rPr>
+              <w:t>parser/cleaned_texts/ND05.txt dòng 5–7: “NGHỊ ĐỊNH / CỦA CHÍNH PHỦ SỐ 70/2001/NĐ-CP NGÀY 03 THÁNG 10 NĂM 2001 QUY ĐỊNH CHI TIẾT THI HÀNH LUẬT HÔN NHÂN VÀ GIA ĐÌNH”: registry chép nguyên dòng này, còn trích yếu là “Quy định chi tiết thi hành Luật Hôn nhân và gia đình”. embed_text_raw của TT 04/2020 và TT 15/2015 cùng mở đầu bằng 42 từ giống nhau.</w:t>
             </w:r>
           </w:p>
         </w:tc>
@@ -2534,7 +2553,7 @@
               <w:rPr>
                 <w:sz w:val="17"/>
               </w:rPr>
-              <w:t>parser/parser.py: TITLE_TYPE_RE, TITLE_SELF_REF_RE, locate_document_title, clean_document_title_candidate, extract_issuing_body (dòng 877–1014)</w:t>
+              <w:t>data/reference/document_versions.json (title của 5 bản ghi trên)</w:t>
             </w:r>
           </w:p>
         </w:tc>
@@ -2551,7 +2570,7 @@
               <w:rPr>
                 <w:sz w:val="17"/>
               </w:rPr>
-              <w:t>Parser + Dev 1</w:t>
+              <w:t>Dev 1</w:t>
             </w:r>
           </w:p>
         </w:tc>
@@ -2559,6 +2578,7 @@
           <w:tcPr>
             <w:tcW w:type="dxa" w:w="964"/>
             <w:vAlign w:val="top"/>
+            <w:shd w:val="clear" w:color="auto" w:fill="FFF2CC"/>
           </w:tcPr>
           <w:p>
             <w:pPr>
@@ -2568,7 +2588,7 @@
               <w:rPr>
                 <w:sz w:val="17"/>
               </w:rPr>
-              <w:t>Còn một phần</w:t>
+              <w:t>Còn một phần (856e6be, 4ec0706)</w:t>
             </w:r>
           </w:p>
         </w:tc>
@@ -2623,7 +2643,7 @@
               <w:rPr>
                 <w:sz w:val="17"/>
               </w:rPr>
-              <w:t>Chưa có CI chạy pytest (H2): 72a7377 và 1260ed8 được commit khi pytest parser/ đang fail, 3d646da làm một script lỗi cú pháp; không có gì chặn việc này lặp lại.</w:t>
+              <w:t>CI đã có (.github/workflows/tests.yml, dfc025b) nhưng chưa chặn được merge: testing và main chưa bật branch protection, nên commit có check đỏ vẫn gộp được; workflow chưa chạy lần nào trên GitHub (máy Linux) vì chưa push.</w:t>
             </w:r>
           </w:p>
           <w:p>
@@ -2641,7 +2661,7 @@
               <w:rPr>
                 <w:sz w:val="17"/>
               </w:rPr>
-              <w:t>Chạy python -m pytest parser tests test và python -m compileall scripts evaluation retrieval reranking trong CI (hoặc pre-commit hook), chặn merge khi fail; branch protection cần quyền admin repo.</w:t>
+              <w:t>Push workflow lên testing và xem lần chạy đầu trên GitHub; admin repo bật branch protection cho testing và main, bắt buộc check “tests / pytest” trước khi merge.</w:t>
             </w:r>
           </w:p>
           <w:p>
@@ -2659,7 +2679,7 @@
               <w:rPr>
                 <w:sz w:val="17"/>
               </w:rPr>
-              <w:t>Trên 3b1b6dc, repo không có thư mục .github/; test cho cleaner đã có ở e7a0ff3 (parser/test_cleaner.py, 47 test).</w:t>
+              <w:t>GitHub API (26/10): branches/testing và branches/main đều trả “protected”: false.</w:t>
             </w:r>
           </w:p>
         </w:tc>
@@ -2676,7 +2696,7 @@
               <w:rPr>
                 <w:sz w:val="17"/>
               </w:rPr>
-              <w:t>CI; .github/ (chưa có)</w:t>
+              <w:t>.github/workflows/tests.yml; cài đặt Branches của repo trên GitHub</w:t>
             </w:r>
           </w:p>
         </w:tc>
@@ -2693,7 +2713,7 @@
               <w:rPr>
                 <w:sz w:val="17"/>
               </w:rPr>
-              <w:t>Cả nhóm</w:t>
+              <w:t>Admin repo; cả nhóm</w:t>
             </w:r>
           </w:p>
         </w:tc>
@@ -2711,7 +2731,7 @@
               <w:rPr>
                 <w:sz w:val="17"/>
               </w:rPr>
-              <w:t>Còn một phần</w:t>
+              <w:t>Còn một phần (dfc025b)</w:t>
             </w:r>
           </w:p>
         </w:tc>
@@ -2866,7 +2886,7 @@
       </w:pPr>
       <w:r>
         <w:rPr/>
-        <w:t>Nhóm A đo trên 64b65f0 (24/10), sau khi gộp NMA 1260ed8. A27 đã sửa (8/8 Mục của TT 04/2020 được nhận, không Khoản nào chứa tên Mục) và được bỏ khỏi bảng; test còn thiếu chuyển sang A7. 11 PDF gốc được thay bằng bản có lớp text nên A25 chỉ còn phần corpus và các mẫu cleaner thừa; A6 đổi lại vì L01 là bản gốc 2014; A26 chỉ còn 2 TT chia theo mục La Mã và corpus. A16, A11, A8 không đổi. Số liệu đo ở Phụ lục I. Ngày 25/10, A28 được sửa (tiêu đề Điều, Chương, Mục giữ dấu câu và không cụt; số hiệu không còn bị tách sau “-”) và được bỏ khỏi bảng; A7 có thêm test cho A23, A27, A28, ngưỡng tiêu đề 40 từ và thông báo lỗi xuống dòng thật, nên chỉ còn CI và test cho cleaner (Phụ lục K). Bản sửa ở commit 77b5886. Corpus sinh lại ở 664634e nên A25 chỉ còn các mẫu cleaner thừa, A26 chỉ còn 2 TT chia theo mục La Mã (Phụ lục K). Ngày 25/10 (Phụ lục N): A8, A11, A25 đã sửa và được bỏ khỏi bảng; A7 chỉ còn CI.</w:t>
+        <w:t>Nhóm A đo trên 64b65f0 (24/10), sau khi gộp NMA 1260ed8. A27 đã sửa (8/8 Mục của TT 04/2020 được nhận, không Khoản nào chứa tên Mục) và được bỏ khỏi bảng; test còn thiếu chuyển sang A7. 11 PDF gốc được thay bằng bản có lớp text nên A25 chỉ còn phần corpus và các mẫu cleaner thừa; A6 đổi lại vì L01 là bản gốc 2014; A26 chỉ còn 2 TT chia theo mục La Mã và corpus. A16, A11, A8 không đổi. Số liệu đo ở Phụ lục I. Ngày 25/10, A28 được sửa (tiêu đề Điều, Chương, Mục giữ dấu câu và không cụt; số hiệu không còn bị tách sau “-”) và được bỏ khỏi bảng; A7 có thêm test cho A23, A27, A28, ngưỡng tiêu đề 40 từ và thông báo lỗi xuống dòng thật, nên chỉ còn CI và test cho cleaner (Phụ lục K). Bản sửa ở commit 77b5886. Corpus sinh lại ở 664634e nên A25 chỉ còn các mẫu cleaner thừa, A26 chỉ còn 2 TT chia theo mục La Mã (Phụ lục K). Ngày 25/10 (Phụ lục N): A8, A11, A25 đã sửa và được bỏ khỏi bảng; A7 chỉ còn CI. Ngày 26/10 (Phụ lục Q), sau khi gộp NMA 86b55f5 ở 5ef41dc: title trong registry và parsed_jsons là trích yếu của văn bản và ba Luật HNGĐ cùng ghi năm, nên A16 chỉ còn corpus chưa sinh lại, test và hai bảng ID chưa theo, cách ghi title chưa thống nhất; A7 thêm bằng chứng; A6, A26 không đổi. Cũng ngày 26/10 (Phụ lục R): sửa phần không cần bàn của A16 và thêm workflow CI cho A7, nên A16 chỉ còn cách ghi title, A7 chỉ còn push workflow và branch protection.</w:t>
       </w:r>
     </w:p>
     <w:p>
@@ -3106,7 +3126,7 @@
               <w:rPr>
                 <w:sz w:val="17"/>
               </w:rPr>
-              <w:t>ElasticsearchBM25Retriever mặc định text_field = “content_segmented” và không tách từ câu hỏi (hybrid_retriever.py dòng 33–49). requirements-bkai.txt đã ghim underthesea==9.5.0 ở 7c9211e.</w:t>
+              <w:t>ElasticsearchBM25Retriever mặc định text_field = “content_segmented” và không tách từ câu hỏi (hybrid_retriever.py dòng 33–49).</w:t>
             </w:r>
           </w:p>
         </w:tc>
@@ -3213,7 +3233,7 @@
               <w:rPr>
                 <w:sz w:val="17"/>
               </w:rPr>
-              <w:t>Vẫn dùng file smoke embedding/data/han_gia_dinh_smoke_chunks.json làm mặc định: retrieval/run_dev_retrieval.py (--chunks), retrieval/retrieval_evaluation.py, embedding/retrieval_smoke_test.py; embedding/data/all_legal_chunks.json vẫn trong git. data/parser_validated/ còn 4 JSON cũ (L02, ND04, ND05 với ID dạng mã file, bản tt_02a_2015_tt_btp.json sửa nhãn cũ); tests/schema_test.py gộp clause_id của chúng vào tập hợp lệ, embedding/prepare_all_chunk_dataset.py vẫn đọc bản TT 02a (H7).</w:t>
+              <w:t>Vẫn dùng file smoke embedding/data/han_gia_dinh_smoke_chunks.json làm mặc định: retrieval/run_dev_retrieval.py (--chunks), retrieval/retrieval_evaluation.py, embedding/retrieval_smoke_test.py; embedding/data/all_legal_chunks.json vẫn trong git. data/parser_validated/ còn 4 JSON cũ (L02, ND04, ND05 với ID dạng mã file, bản tt_02a_2015_tt_btp.json sửa nhãn cũ); test/schema_test.py gộp clause_id của chúng vào tập hợp lệ, embedding/prepare_all_chunk_dataset.py vẫn đọc bản TT 02a (H7).</w:t>
             </w:r>
           </w:p>
           <w:p>
@@ -3231,7 +3251,7 @@
               <w:rPr>
                 <w:sz w:val="17"/>
               </w:rPr>
-              <w:t>Đổi các mặc định còn lại sang data/chunking_output/chunks.jsonl (giữ fixture smoke cho unit test); xóa all_legal_chunks.json và data/parser_validated/ cùng lúc sửa tests/schema_test.py và prepare_all_chunk_dataset.py.</w:t>
+              <w:t>Đổi các mặc định còn lại sang data/chunking_output/chunks.jsonl (giữ fixture smoke cho unit test); xóa all_legal_chunks.json và data/parser_validated/ cùng lúc sửa test/schema_test.py và prepare_all_chunk_dataset.py.</w:t>
             </w:r>
           </w:p>
           <w:p>
@@ -3249,7 +3269,7 @@
               <w:rPr>
                 <w:sz w:val="17"/>
               </w:rPr>
-              <w:t>chunks_benchmark.jsonl đã xóa ở 5e0b9c2; grep han_gia_dinh_smoke_chunks và parser_validated trong *.py.</w:t>
+              <w:t>Grep han_gia_dinh_smoke_chunks và parser_validated trong *.py.</w:t>
             </w:r>
           </w:p>
         </w:tc>
@@ -3266,7 +3286,7 @@
               <w:rPr>
                 <w:sz w:val="17"/>
               </w:rPr>
-              <w:t>retrieval/run_dev_retrieval.py (--chunks); retrieval/retrieval_evaluation.py:16; embedding/retrieval_smoke_test.py:13; embedding/prepare_all_chunk_dataset.py:12; tests/schema_test.py:261; data/parser_validated/</w:t>
+              <w:t>retrieval/run_dev_retrieval.py (--chunks); retrieval/retrieval_evaluation.py:16; embedding/retrieval_smoke_test.py:13; embedding/prepare_all_chunk_dataset.py:12; test/schema_test.py:261; data/parser_validated/</w:t>
             </w:r>
           </w:p>
         </w:tc>
@@ -3356,7 +3376,7 @@
               <w:rPr>
                 <w:sz w:val="17"/>
               </w:rPr>
-              <w:t>Bản ghi chunk có 29 trường cấp gốc và metadata 16 trường, lưu cùng thông tin nhiều lần: 3 cặp alias (id/chunk_id, doc_id/document_id, text/chunk_text), thông tin văn bản và Điều lặp ở cấp gốc và trong metadata, nội dung luật có 5 bản (text, chunk_text, seg_text, embed_text, embed_text_raw). effective_from, effective_to, source_url chỉ nằm trong metadata (effective_to có giá trị ở 445/1.157 chunk, 21 văn bản: 907/2.003); mỗi consumer tự viết bộ chuyển đổi (build_bm25_index.load_chunks, vector_store.normalize_chunk_record, build_index._adapt_chunk_for_vector_store).</w:t>
+              <w:t>Bản ghi chunk có 31 trường cấp gốc và metadata 18 trường (source_status, provision_status thêm ở 3d646da nằm ở cả hai cấp), lưu cùng thông tin nhiều lần: 3 cặp alias (id/chunk_id, doc_id/document_id, text/chunk_text), thông tin văn bản và Điều lặp ở cấp gốc và trong metadata, nội dung luật có 5 bản (text, chunk_text, seg_text, embed_text, embed_text_raw). effective_from, effective_to, source_url chỉ nằm trong metadata (effective_to có giá trị ở 912/2.011 chunk của corpus 664634e); mỗi consumer tự viết bộ chuyển đổi (build_bm25_index.load_chunks, vector_store.normalize_chunk_record, build_index._adapt_chunk_for_vector_store).</w:t>
             </w:r>
           </w:p>
           <w:p>
@@ -3481,7 +3501,7 @@
               <w:rPr>
                 <w:sz w:val="17"/>
               </w:rPr>
-              <w:t>Nhóm chunk trùng nội dung: 12 nhóm (24 chunk) ở 11 văn bản, 31 nhóm khi đủ 21 văn bản; đều là văn bản mới chép quy định của văn bản cũ (vd Luật 22/2000 Điều 53 và Luật 52/2014 Điều 116 “Mức cấp dưỡng”) nên phải giữ, nhưng benchmark chưa có câu hỏi phân biệt văn bản cũ và mới để kiểm bộ lọc hiệu lực. 82 chunk dưới 20 từ (21 văn bản: 134) đều là Khoản ngắn trọn vẹn. Khối chữ ký và “Nơi nhận” lọt vào Điều cuối xử lý ở A21.</w:t>
+              <w:t>Nhóm chunk trùng nội dung: 31 nhóm (62 chunk) ở corpus 664634e (21 văn bản); đều là văn bản mới chép quy định của văn bản cũ (vd Luật 22/2000 Điều 53 và Luật 52/2014 Điều 116 “Mức cấp dưỡng”) nên phải giữ, nhưng benchmark chưa có câu hỏi phân biệt văn bản cũ và mới để kiểm bộ lọc hiệu lực. 128 chunk dưới 20 từ đều là Khoản ngắn trọn vẹn.</w:t>
             </w:r>
           </w:p>
           <w:p>
@@ -3787,24 +3807,6 @@
               <w:t>Dev 4 sinh lại 6 file bằng run_dev_retrieval.py sau khi chốt model dense (E2) và có gold đã duyệt (D1), rồi bỏ nhánh đọc dạng phẳng trong hai script đánh giá.</w:t>
             </w:r>
           </w:p>
-          <w:p>
-            <w:pPr>
-              <w:spacing w:after="20" w:line="252" w:lineRule="auto"/>
-            </w:pPr>
-            <w:r>
-              <w:rPr>
-                <w:b/>
-                <w:sz w:val="17"/>
-              </w:rPr>
-              <w:t xml:space="preserve">Kiểm chứng: </w:t>
-            </w:r>
-            <w:r>
-              <w:rPr>
-                <w:sz w:val="17"/>
-              </w:rPr>
-              <w:t>Từ 26e41f9, run_dev_retrieval.py ghi mảng RetrievalEnvelope, mỗi câu một envelope, query_id lấy từ id của benchmark; test/test_run_dev_retrieval.py validate output theo retrieval_schema.json.</w:t>
-            </w:r>
-          </w:p>
         </w:tc>
         <w:tc>
           <w:tcPr>
@@ -3881,7 +3883,7 @@
           <w:tcPr>
             <w:tcW w:type="dxa" w:w="1020"/>
             <w:vAlign w:val="top"/>
-            <w:shd w:val="clear" w:color="auto" w:fill="FCE8B2"/>
+            <w:shd w:val="clear" w:color="auto" w:fill="E2EFDA"/>
           </w:tcPr>
           <w:p>
             <w:pPr>
@@ -3927,24 +3929,6 @@
                 <w:sz w:val="17"/>
               </w:rPr>
               <w:t>Dev 1 chọn bỏ context_registry.json khỏi validate_benchmark.py (production_chunk_index.json nay khớp 2.011/2.011 chunk của corpus), hoặc giữ làm bảng truy nguyên nhưng không cho ID smoke qua bước kiểm candidate; duyệt 334 dòng mới của article_index.</w:t>
-            </w:r>
-          </w:p>
-          <w:p>
-            <w:pPr>
-              <w:spacing w:after="20" w:line="252" w:lineRule="auto"/>
-            </w:pPr>
-            <w:r>
-              <w:rPr>
-                <w:b/>
-                <w:sz w:val="17"/>
-              </w:rPr>
-              <w:t xml:space="preserve">Kiểm chứng: </w:t>
-            </w:r>
-            <w:r>
-              <w:rPr>
-                <w:sz w:val="17"/>
-              </w:rPr>
-              <w:t>Từ 7c9211e, pattern gold_article_ids chỉ nhận mã file (776/776 article_id, 304/304 gold_article_ids khớp); validate_benchmark.py PASS.</w:t>
             </w:r>
           </w:p>
         </w:tc>
@@ -4069,24 +4053,6 @@
                 <w:sz w:val="17"/>
               </w:rPr>
               <w:t>Chạy lại 4 file bằng code hiện tại khi chạy lại số đo (F1, F5, F6); làm gold_clause_ids cùng D1.</w:t>
-            </w:r>
-          </w:p>
-          <w:p>
-            <w:pPr>
-              <w:spacing w:after="20" w:line="252" w:lineRule="auto"/>
-            </w:pPr>
-            <w:r>
-              <w:rPr>
-                <w:b/>
-                <w:sz w:val="17"/>
-              </w:rPr>
-              <w:t xml:space="preserve">Kiểm chứng: </w:t>
-            </w:r>
-            <w:r>
-              <w:rPr>
-                <w:sz w:val="17"/>
-              </w:rPr>
-              <w:t>Từ f32754e, metrics.evaluate và evaluate_zero_shot.py chỉ ghi query_id, báo lỗi khi đầu vào dùng question_id, lấy category từ file câu hỏi được truyền vào và báo lỗi khi đọc không được; zero_shot.py ghi query_id (trước đó evaluate_zero_shot.py không đọc được output của zero_shot.py); test/test_evaluation_ids.py 3 pass.</w:t>
             </w:r>
           </w:p>
         </w:tc>
@@ -4774,7 +4740,7 @@
               <w:rPr>
                 <w:sz w:val="17"/>
               </w:rPr>
-              <w:t>Chưa có lọc theo thời điểm. must_not tĩnh của BM25 (hybrid_retriever.py dòng 50) và build_active_legal_filter của Qdrant (vector_store.py dòng 247–265; exclude_expired mặc định True, as_of_date không được dùng) loại mọi chunk “Hết hiệu lực”. Từ khi validity_status có giá trị thật (C3), hai bộ lọc loại hẳn 445/1.160 chunk ở mọi câu hỏi, kể cả câu historical_law và outdated_law_trap.</w:t>
+              <w:t>Chưa có lọc theo thời điểm. must_not tĩnh của BM25 (hybrid_retriever.py dòng 50) và build_active_legal_filter của Qdrant (vector_store.py dòng 247–265; exclude_expired mặc định True, as_of_date không được dùng) loại mọi chunk “Hết hiệu lực”. Từ khi validity_status có giá trị thật (C3), hai bộ lọc loại hẳn 912/2.011 chunk của corpus 664634e ở mọi câu hỏi, kể cả câu historical_law và outdated_law_trap.</w:t>
             </w:r>
           </w:p>
           <w:p>
@@ -5120,6 +5086,7 @@
           <w:tcPr>
             <w:tcW w:type="dxa" w:w="964"/>
             <w:vAlign w:val="top"/>
+            <w:shd w:val="clear" w:color="auto" w:fill="FFF2CC"/>
           </w:tcPr>
           <w:p>
             <w:pPr>
@@ -5184,7 +5151,7 @@
               <w:rPr>
                 <w:sz w:val="17"/>
               </w:rPr>
-              <w:t>Với bkai, câu hỏi được tách từ (underthesea) còn embed_text của corpus thì không (B2: 1/1.164 embed_text có dấu “_”). Hai phía vì vậy không cùng không gian token. Đo Dense trên corpus hiện tại (265 câu Dev, gold đề xuất, không lọc): cấu hình đang chạy cho R@10 = 0,570, kém hơn cả khi không tách từ ở phía nào (0,725, −0,155), còn tách từ cả hai phía cho 0,864. Kết quả còn phụ thuộc máy chạy: dense_retriever.py bắt ImportError của underthesea và im lặng đặt HAS_UNDERTHESEA = False, nên máy không cài underthesea không tách từ câu hỏi và cho 0,725, máy có cài cho 0,570. Việc có tách từ hay không được quyết định bằng tên model (chuỗi “vietnamese-bi-encoder”) và chỉ áp dụng cho câu hỏi; encode_texts không tiền xử lý phía corpus, nên phía corpus phụ thuộc hoàn toàn vào embed_text đã được tách từ hay chưa. Câu “tự hết khi sửa B2” trong bản trước là không an toàn. B2 đưa tách từ vào embed_text cho mọi model, mà tách từ chỉ có lợi cho bkai. Nếu chọn BGE-M3 (E2), corpus đã tách từ trong khi câu hỏi không tách (hành vi hiện tại với model khác bkai) làm R@10 giảm từ 0,830 xuống 0,687 (khi lọc as_of_date: từ 0,943 xuống 0,872). Tách từ cả hai phía cũng vẫn kém hơn văn bản thô: 0,743 với BGE-M3, 0,834 với AITeamVN (so với 0,857).</w:t>
+              <w:t>(1) dense_retriever.py bắt ImportError của underthesea và im lặng đặt HAS_UNDERTHESEA = False; máy không cài underthesea đưa câu hỏi thô vào corpus đã tách từ (2.011/2.011 embed_text có dấu “_”) mà không báo lỗi. (2) Việc tách từ câu hỏi được quyết định bằng tên model (chuỗi “vietnamese-bi-encoder”); encode_texts không tiền xử lý phía corpus và index_chunks luôn đọc embed_text. Với model khác bkai, corpus đã tách từ còn câu hỏi thô: đo ở bản trước, BGE-M3 chỉ corpus tách từ làm R@10 giảm từ 0,830 xuống 0,687 (khi lọc as_of_date: từ 0,943 xuống 0,872); tách từ cả hai phía vẫn kém văn bản thô (BGE-M3 0,743, AITeamVN 0,834 so với 0,857). (3) Index không ghi model, phiên bản underthesea và cờ tách từ.</w:t>
             </w:r>
           </w:p>
           <w:p>
@@ -5193,9 +5160,16 @@
             </w:pPr>
             <w:r>
               <w:rPr>
-                <w:sz w:val="17"/>
-              </w:rPr>
-              <w:t>Kết quả tách từ vẫn phụ thuộc máy (B2).</w:t>
+                <w:b/>
+                <w:sz w:val="17"/>
+              </w:rPr>
+              <w:t xml:space="preserve">Đề xuất: </w:t>
+            </w:r>
+            <w:r>
+              <w:rPr>
+                <w:sz w:val="17"/>
+              </w:rPr>
+              <w:t>Model cần tách từ mà thiếu underthesea thì Dense dừng với lỗi rõ. Khai báo cờ tách từ trong config của model (E2); DenseRetriever chọn embed_text (đã tách từ) hoặc embed_text_raw (thô) theo cờ này và dùng cùng một hàm tiền xử lý cho corpus lẫn câu hỏi. Ghi model, phiên bản underthesea và cờ tách từ vào metadata của index, kiểm khi mở index (E2). Thêm test: với cùng một câu, văn bản đưa vào encode ở phía corpus và phía câu hỏi phải qua cùng một bước tiền xử lý.</w:t>
             </w:r>
           </w:p>
           <w:p>
@@ -5207,31 +5181,13 @@
                 <w:b/>
                 <w:sz w:val="17"/>
               </w:rPr>
-              <w:t xml:space="preserve">Đề xuất: </w:t>
-            </w:r>
-            <w:r>
-              <w:rPr>
-                <w:sz w:val="17"/>
-              </w:rPr>
-              <w:t>Coi tách từ là thuộc tính của model embedding, không phải của corpus. Corpus lưu cả hai dạng văn bản: bản đã tách từ và bản thô. Theo contract Sprint 5 và Sprint 6 §14, embed_text là bản đã tách từ, nên B2 đề xuất giữ embed_text đã tách từ và thêm embed_text_raw. Dev 1 chốt tên trường ở C1. DenseRetriever dùng cùng một hàm tiền xử lý cho cả corpus lẫn câu hỏi, theo cờ khai báo trong config của model (E2), không dựa vào tên model. Model cần tách từ mà thiếu underthesea thì dừng với lỗi rõ, không âm thầm bỏ qua. Ghi model, phiên bản underthesea và cờ tách từ vào metadata của index, và kiểm tra khi mở index (E2). Thêm test: với cùng một câu, văn bản đưa vào encode ở phía corpus và phía câu hỏi phải qua cùng một bước tiền xử lý. Không bao giờ trộn hai dạng: corpus tách từ thì câu hỏi cũng tách từ, và ngược lại. B2 đã cập nhật theo hướng này.</w:t>
-            </w:r>
-          </w:p>
-          <w:p>
-            <w:pPr>
-              <w:spacing w:after="20" w:line="252" w:lineRule="auto"/>
-            </w:pPr>
-            <w:r>
-              <w:rPr>
-                <w:b/>
-                <w:sz w:val="17"/>
-              </w:rPr>
               <w:t xml:space="preserve">Kiểm chứng: </w:t>
             </w:r>
             <w:r>
               <w:rPr>
                 <w:sz w:val="17"/>
               </w:rPr>
-              <w:t>Đọc dense_retriever.py (import underthesea, use_word_segmentation, _preprocess_query, encode_texts). Đếm dấu “_” trong embed_text của chunks.jsonl. Đo Dense trên corpus hiện tại bằng sentence-transformers trên GPU, cosine trong bộ nhớ, 265 câu Dev có gold đề xuất (chưa xác minh), có và không lọc as_of_date, cùng quy trình với E2. Thêm 4 cấu hình vào 4 cấu hình của E2: bkai không tách từ ở phía nào; BGE-M3 chỉ corpus tách từ; BGE-M3 tách từ cả hai phía; AITeamVN tách từ cả hai phía. Tách từ bằng underthesea 9.5.0 word_tokenize(format="text"). Kiểm định ghép cặp (bootstrap 10.000 lần, McNemar chính xác). bkai hiện tại so với không tách từ: R@10 +0,155 (CI95 +0,102 đến +0,211; 51 câu thắng, 10 câu thua). Không tách từ so với tách từ cả hai phía: +0,140 (CI95 +0,087 đến +0,192). BGE-M3 thô so với chỉ corpus tách từ: −0,143 (CI95 −0,189 đến −0,102; 1 câu thắng, 39 câu thua). BGE-M3 thô so với tách từ cả hai phía: −0,087 (CI95 −0,128 đến −0,045). AITeamVN: −0,023, không có ý nghĩa thống kê.</w:t>
+              <w:t>Đọc dense_retriever.py: import underthesea (dòng 14–20), use_word_segmentation (dòng 80–83), _preprocess_query và encode_texts (dòng 98–128), index_chunks (dòng 130–148).</w:t>
             </w:r>
           </w:p>
         </w:tc>
@@ -5248,7 +5204,7 @@
               <w:rPr>
                 <w:sz w:val="17"/>
               </w:rPr>
-              <w:t>embedding/dense_retriever.py: import underthesea (dòng 14–20), use_word_segmentation (dòng 80–82), _preprocess_query và encode_texts (dòng 97–125); chunking/export_legal_chunks.py: embed_text (B2)</w:t>
+              <w:t>embedding/dense_retriever.py: import underthesea (dòng 14–20), use_word_segmentation (dòng 80–83), _preprocess_query, encode_texts, index_chunks (dòng 98–148)</w:t>
             </w:r>
           </w:p>
         </w:tc>
@@ -5266,6 +5222,274 @@
                 <w:sz w:val="17"/>
               </w:rPr>
               <w:t>Dev 3</w:t>
+            </w:r>
+          </w:p>
+        </w:tc>
+        <w:tc>
+          <w:tcPr>
+            <w:tcW w:type="dxa" w:w="964"/>
+            <w:vAlign w:val="top"/>
+            <w:shd w:val="clear" w:color="auto" w:fill="FFF2CC"/>
+          </w:tcPr>
+          <w:p>
+            <w:pPr>
+              <w:spacing w:after="20" w:line="252" w:lineRule="auto"/>
+            </w:pPr>
+            <w:r>
+              <w:rPr>
+                <w:sz w:val="17"/>
+              </w:rPr>
+              <w:t>Còn một phần (664634e)</w:t>
+            </w:r>
+          </w:p>
+        </w:tc>
+      </w:tr>
+      <w:tr>
+        <w:tc>
+          <w:tcPr>
+            <w:tcW w:type="dxa" w:w="624"/>
+            <w:vAlign w:val="top"/>
+          </w:tcPr>
+          <w:p>
+            <w:pPr>
+              <w:spacing w:after="20" w:line="252" w:lineRule="auto"/>
+            </w:pPr>
+            <w:r>
+              <w:rPr>
+                <w:b/>
+                <w:sz w:val="17"/>
+              </w:rPr>
+              <w:t>E6</w:t>
+            </w:r>
+          </w:p>
+        </w:tc>
+        <w:tc>
+          <w:tcPr>
+            <w:tcW w:type="dxa" w:w="1020"/>
+            <w:vAlign w:val="top"/>
+            <w:shd w:val="clear" w:color="auto" w:fill="FCE8B2"/>
+          </w:tcPr>
+          <w:p>
+            <w:pPr>
+              <w:spacing w:after="20" w:line="252" w:lineRule="auto"/>
+            </w:pPr>
+            <w:r>
+              <w:rPr>
+                <w:sz w:val="17"/>
+              </w:rPr>
+              <w:t>Trung bình</w:t>
+            </w:r>
+          </w:p>
+        </w:tc>
+        <w:tc>
+          <w:tcPr>
+            <w:tcW w:type="dxa" w:w="4479"/>
+            <w:vAlign w:val="top"/>
+          </w:tcPr>
+          <w:p>
+            <w:pPr>
+              <w:spacing w:after="20" w:line="252" w:lineRule="auto"/>
+            </w:pPr>
+            <w:r>
+              <w:rPr>
+                <w:sz w:val="17"/>
+              </w:rPr>
+              <w:t>Index BM25 không lưu document_id, article_id, clause_id riêng; search() suy một phần bằng cách tách chuỗi ID. Index lưu parent_id = parent_clause_id (build_bm25_index.py dòng 112, 123), nên parent_id trả về là clause_id, sai ở 1.160/1.160 so với contract §5.1 (parent_id trỏ tới ParentChunk). Kết quả còn có trường text; HybridRetriever và pipeline không đưa trường này ra output.</w:t>
+            </w:r>
+          </w:p>
+          <w:p>
+            <w:pPr>
+              <w:spacing w:after="20" w:line="252" w:lineRule="auto"/>
+            </w:pPr>
+            <w:r>
+              <w:rPr>
+                <w:b/>
+                <w:sz w:val="17"/>
+              </w:rPr>
+              <w:t xml:space="preserve">Đề xuất: </w:t>
+            </w:r>
+            <w:r>
+              <w:rPr>
+                <w:sz w:val="17"/>
+              </w:rPr>
+              <w:t>Lưu đủ trường contract và parent_id thật vào index; bỏ text.</w:t>
+            </w:r>
+          </w:p>
+        </w:tc>
+        <w:tc>
+          <w:tcPr>
+            <w:tcW w:type="dxa" w:w="1701"/>
+            <w:vAlign w:val="top"/>
+          </w:tcPr>
+          <w:p>
+            <w:pPr>
+              <w:spacing w:after="20" w:line="252" w:lineRule="auto"/>
+            </w:pPr>
+            <w:r>
+              <w:rPr>
+                <w:sz w:val="17"/>
+              </w:rPr>
+              <w:t>retrieval/hybrid_retriever.py: ElasticsearchBM25Retriever.search (dòng 36–61); retrieval/build_bm25_index.py: load_chunks (dòng 90–101); embedding/vector_store.py: normalize_chunk_record (dòng 86–107); retrieval/rrf.py:26–39</w:t>
+            </w:r>
+          </w:p>
+        </w:tc>
+        <w:tc>
+          <w:tcPr>
+            <w:tcW w:type="dxa" w:w="1077"/>
+            <w:vAlign w:val="top"/>
+          </w:tcPr>
+          <w:p>
+            <w:pPr>
+              <w:spacing w:after="20" w:line="252" w:lineRule="auto"/>
+            </w:pPr>
+            <w:r>
+              <w:rPr>
+                <w:sz w:val="17"/>
+              </w:rPr>
+              <w:t>Dev 4 + Dev 3</w:t>
+            </w:r>
+          </w:p>
+        </w:tc>
+        <w:tc>
+          <w:tcPr>
+            <w:tcW w:type="dxa" w:w="964"/>
+            <w:vAlign w:val="top"/>
+            <w:shd w:val="clear" w:color="auto" w:fill="FFF2CC"/>
+          </w:tcPr>
+          <w:p>
+            <w:pPr>
+              <w:spacing w:after="20" w:line="252" w:lineRule="auto"/>
+            </w:pPr>
+            <w:r>
+              <w:rPr>
+                <w:sz w:val="17"/>
+              </w:rPr>
+              <w:t>Còn một phần</w:t>
+            </w:r>
+          </w:p>
+        </w:tc>
+      </w:tr>
+      <w:tr>
+        <w:tc>
+          <w:tcPr>
+            <w:tcW w:type="dxa" w:w="624"/>
+            <w:vAlign w:val="top"/>
+          </w:tcPr>
+          <w:p>
+            <w:pPr>
+              <w:spacing w:after="20" w:line="252" w:lineRule="auto"/>
+            </w:pPr>
+            <w:r>
+              <w:rPr>
+                <w:b/>
+                <w:sz w:val="17"/>
+              </w:rPr>
+              <w:t>E8</w:t>
+            </w:r>
+          </w:p>
+        </w:tc>
+        <w:tc>
+          <w:tcPr>
+            <w:tcW w:type="dxa" w:w="1020"/>
+            <w:vAlign w:val="top"/>
+            <w:shd w:val="clear" w:color="auto" w:fill="FCE8B2"/>
+          </w:tcPr>
+          <w:p>
+            <w:pPr>
+              <w:spacing w:after="20" w:line="252" w:lineRule="auto"/>
+            </w:pPr>
+            <w:r>
+              <w:rPr>
+                <w:sz w:val="17"/>
+              </w:rPr>
+              <w:t>Trung bình</w:t>
+            </w:r>
+          </w:p>
+        </w:tc>
+        <w:tc>
+          <w:tcPr>
+            <w:tcW w:type="dxa" w:w="4479"/>
+            <w:vAlign w:val="top"/>
+          </w:tcPr>
+          <w:p>
+            <w:pPr>
+              <w:spacing w:after="20" w:line="252" w:lineRule="auto"/>
+            </w:pPr>
+            <w:r>
+              <w:rPr>
+                <w:sz w:val="17"/>
+              </w:rPr>
+              <w:t>retrieval/config.yaml không có khoá retrieval.retrieval_top_k và hybrid.fusion như cấu hình chuẩn ở Sprint 6 §14.3; thay vào đó là hybrid.candidate_k và hybrid.top_k. Vấn đề lớn hơn là code của Dev 4 không đọc file này. HybridSearchConfig đặt cứng top_k = 10, candidate_k = 50, rrf_k = 60. run_dev_retrieval.py lấy giá trị mặc định từ argparse (10/50/60, chunk smoke, index legal-child-chunks-dev). retrieval_evaluation.py cũng đặt cứng model và index. Nơi duy nhất đọc config.yaml là pipeline của Dev 5 (load_retrieval_settings): đọc retrieval_top_k (nếu thiếu thì lấy hybrid.candidate_k), hybrid.rrf_k, bm25.index, bm25.text_field, dense.model. Các khoá bm25.backend, dense.backend, hybrid.top_k không ai đọc. Vì vậy sửa config.yaml không làm đổi các lần chạy của Dev 4 (report Task 4 ghi 10/50/60 từ tham số CLI). Contract của Dev 4 là “đọc retrieval_top_k và rrf_k từ config”, chưa đáp ứng. §14.3 yêu cầu Dev 4 thử rrf_k = 10 và rrf_k = 60 trên Dev set, nhưng chưa có kết quả nào. Đo trên corpus hiện tại: rrf_k = 10 không kém rrf_k = 60 ở cả 6 cấu hình. Khác biệt rõ khi nhánh Dense yếu: với bkai như hiện tại, R@10 tăng +0,045 (0,849 lên 0,894). Khi cấu hình đã tốt thì khác biệt không đáng kể: lọc as_of_date + BGE-M3 cho 0,974 / 0,741 với rrf_k = 60 và 0,981 / 0,747 với rrf_k = 10. Giảm độ sâu ứng viên từ 50 xuống 20 làm R@10 thay đổi không quá 0,016.</w:t>
+            </w:r>
+          </w:p>
+          <w:p>
+            <w:pPr>
+              <w:spacing w:after="20" w:line="252" w:lineRule="auto"/>
+            </w:pPr>
+            <w:r>
+              <w:rPr>
+                <w:b/>
+                <w:sz w:val="17"/>
+              </w:rPr>
+              <w:t xml:space="preserve">Đề xuất: </w:t>
+            </w:r>
+            <w:r>
+              <w:rPr>
+                <w:sz w:val="17"/>
+              </w:rPr>
+              <w:t>Thêm retrieval.retrieval_top_k: 50 và hybrid.fusion: rrf theo §14.3. Bỏ hybrid.candidate_k, hoặc ghi rõ đó là tên cũ; bỏ hybrid.top_k và các khoá không ai đọc. Chuyển hàm đọc config sang retrieval/, ví dụ HybridSearchConfig.from_config, để run_dev_retrieval.py, retrieval_evaluation.py và pipeline của Dev 5 cùng dùng: giá trị mặc định lấy từ config, tham số CLI chỉ dùng để ghi đè, và output ghi lại cấu hình đã dùng. Sau khi có khoá mới, Dev 5 bỏ nhánh dự phòng hybrid.candidate_k. Thêm test phía Dev 4: HybridRetriever dựng từ config phải dùng đúng retrieval_top_k và rrf_k (§14.5). Giữ rrf_k = 60 làm giá trị khởi đầu. Theo số đo hiện có, rrf_k = 10 không kém ở cấu hình nào, nên nên chốt lại khi có gold đã xác minh (D1).</w:t>
+            </w:r>
+          </w:p>
+          <w:p>
+            <w:pPr>
+              <w:spacing w:after="20" w:line="252" w:lineRule="auto"/>
+            </w:pPr>
+            <w:r>
+              <w:rPr>
+                <w:b/>
+                <w:sz w:val="17"/>
+              </w:rPr>
+              <w:t xml:space="preserve">Kiểm chứng: </w:t>
+            </w:r>
+            <w:r>
+              <w:rPr>
+                <w:sz w:val="17"/>
+              </w:rPr>
+              <w:t>Grep config.yaml, retrieval_top_k, candidate_k, rrf_k, load_retrieval_settings trong code và test (trừ RAG/, .venv). Đọc argparse của run_dev_retrieval.py và report Task 4. Đo Hybrid trên corpus hiện tại: index BM25 tạm với breadcrumb chỉ cấp Điều (E15) và 2 trường đang có tác dụng (E7), ghép RRF với các nhánh Dense đã lưu ở E2 (bkai hiện tại, bkai tách từ, BGE-M3), có và không lọc as_of_date. So rrf_k 10 và 60, độ sâu 20 và 50, trên 265 câu Dev có gold đề xuất. Kiểm định ghép cặp rrf_k 10 so với 60 ở độ sâu 50: bkai hiện tại không lọc, R@10 +0,045 (CI95 +0,015 đến +0,079; 15 câu thắng, 3 câu thua), MRR@10 +0,022; BGE-M3 có lọc, R@10 +0,008 (CI95 −0,008 đến +0,023), MRR@10 +0,006. Index tạm đã xoá.</w:t>
+            </w:r>
+          </w:p>
+        </w:tc>
+        <w:tc>
+          <w:tcPr>
+            <w:tcW w:type="dxa" w:w="1701"/>
+            <w:vAlign w:val="top"/>
+          </w:tcPr>
+          <w:p>
+            <w:pPr>
+              <w:spacing w:after="20" w:line="252" w:lineRule="auto"/>
+            </w:pPr>
+            <w:r>
+              <w:rPr>
+                <w:sz w:val="17"/>
+              </w:rPr>
+              <w:t>retrieval/config.yaml; retrieval/hybrid_retriever.py: HybridSearchConfig (dòng 131–147); retrieval/run_dev_retrieval.py (dòng 70–90); reranking/pipeline.py: load_retrieval_settings (dòng 218–247)</w:t>
+            </w:r>
+          </w:p>
+        </w:tc>
+        <w:tc>
+          <w:tcPr>
+            <w:tcW w:type="dxa" w:w="1077"/>
+            <w:vAlign w:val="top"/>
+          </w:tcPr>
+          <w:p>
+            <w:pPr>
+              <w:spacing w:after="20" w:line="252" w:lineRule="auto"/>
+            </w:pPr>
+            <w:r>
+              <w:rPr>
+                <w:sz w:val="17"/>
+              </w:rPr>
+              <w:t>Dev 4</w:t>
             </w:r>
           </w:p>
         </w:tc>
@@ -5303,7 +5527,7 @@
                 <w:b/>
                 <w:sz w:val="17"/>
               </w:rPr>
-              <w:t>E6</w:t>
+              <w:t>E11</w:t>
             </w:r>
           </w:p>
         </w:tc>
@@ -5338,7 +5562,7 @@
               <w:rPr>
                 <w:sz w:val="17"/>
               </w:rPr>
-              <w:t>Index BM25 không lưu document_id, article_id, clause_id riêng; search() suy một phần bằng cách tách chuỗi ID. Index lưu parent_id = parent_clause_id (build_bm25_index.py dòng 112, 123), nên parent_id trả về là clause_id, sai ở 1.160/1.160 so với contract §5.1 (parent_id trỏ tới ParentChunk). Kết quả còn có trường text; HybridRetriever và pipeline không đưa trường này ra output.</w:t>
+              <w:t>Còn hai thành phần của khối Retrieval/API chưa có code: Confidence Threshold Filter (LLM Judge + MMR, nhánh dự phòng Active Clarification) và Semantic Query &amp; Reranker Cache (Redis); RedisJSONCache trong hybrid_retriever.py chưa được dùng. Kế hoạch Sprint 6 không giao hai thành phần này. HybridRetriever vẫn có hai hook parent_resolver, confidence_filter chạy trước reranker; pipeline không dùng chúng. docker-compose.yml chỉ có Elasticsearch; Qdrant chạy local theo đường dẫn nên chỉ một tiến trình mở được storage.</w:t>
             </w:r>
           </w:p>
           <w:p>
@@ -5356,7 +5580,7 @@
               <w:rPr>
                 <w:sz w:val="17"/>
               </w:rPr>
-              <w:t>Lưu đủ trường contract và parent_id thật vào index; bỏ text.</w:t>
+              <w:t>Ghi Confidence Threshold Filter và Semantic Cache vào backlog sau Sprint 6, kèm owner; có thể bắt đầu bằng một ngưỡng trên điểm reranker để kích hoạt Active Clarification. Dev 4 bỏ hai hook khỏi HybridRetriever. Thêm Qdrant vào docker-compose khi cần nhiều tiến trình dùng chung index.</w:t>
             </w:r>
           </w:p>
         </w:tc>
@@ -5373,7 +5597,7 @@
               <w:rPr>
                 <w:sz w:val="17"/>
               </w:rPr>
-              <w:t>retrieval/hybrid_retriever.py: ElasticsearchBM25Retriever.search (dòng 36–61); retrieval/build_bm25_index.py: load_chunks (dòng 90–101); embedding/vector_store.py: normalize_chunk_record (dòng 86–107); retrieval/rrf.py:26–39</w:t>
+              <w:t>retrieval/hybrid_retriever.py: HybridRetriever (hook), RedisJSONCache; docker-compose.yml</w:t>
             </w:r>
           </w:p>
         </w:tc>
@@ -5390,7 +5614,7 @@
               <w:rPr>
                 <w:sz w:val="17"/>
               </w:rPr>
-              <w:t>Dev 4 + Dev 3</w:t>
+              <w:t>Chưa giao (Confidence Filter, Cache); Dev 4 (hook)</w:t>
             </w:r>
           </w:p>
         </w:tc>
@@ -5408,291 +5632,6 @@
               <w:rPr>
                 <w:sz w:val="17"/>
               </w:rPr>
-              <w:t>Còn một phần</w:t>
-            </w:r>
-          </w:p>
-        </w:tc>
-      </w:tr>
-      <w:tr>
-        <w:tc>
-          <w:tcPr>
-            <w:tcW w:type="dxa" w:w="624"/>
-            <w:vAlign w:val="top"/>
-          </w:tcPr>
-          <w:p>
-            <w:pPr>
-              <w:spacing w:after="20" w:line="252" w:lineRule="auto"/>
-            </w:pPr>
-            <w:r>
-              <w:rPr>
-                <w:b/>
-                <w:sz w:val="17"/>
-              </w:rPr>
-              <w:t>E8</w:t>
-            </w:r>
-          </w:p>
-        </w:tc>
-        <w:tc>
-          <w:tcPr>
-            <w:tcW w:type="dxa" w:w="1020"/>
-            <w:vAlign w:val="top"/>
-            <w:shd w:val="clear" w:color="auto" w:fill="FCE8B2"/>
-          </w:tcPr>
-          <w:p>
-            <w:pPr>
-              <w:spacing w:after="20" w:line="252" w:lineRule="auto"/>
-            </w:pPr>
-            <w:r>
-              <w:rPr>
-                <w:sz w:val="17"/>
-              </w:rPr>
-              <w:t>Trung bình</w:t>
-            </w:r>
-          </w:p>
-        </w:tc>
-        <w:tc>
-          <w:tcPr>
-            <w:tcW w:type="dxa" w:w="4479"/>
-            <w:vAlign w:val="top"/>
-          </w:tcPr>
-          <w:p>
-            <w:pPr>
-              <w:spacing w:after="20" w:line="252" w:lineRule="auto"/>
-            </w:pPr>
-            <w:r>
-              <w:rPr>
-                <w:sz w:val="17"/>
-              </w:rPr>
-              <w:t>retrieval/config.yaml không có khoá retrieval.retrieval_top_k và hybrid.fusion như cấu hình chuẩn ở Sprint 6 §14.3; thay vào đó là hybrid.candidate_k và hybrid.top_k. Vấn đề lớn hơn là code của Dev 4 không đọc file này. HybridSearchConfig đặt cứng top_k = 10, candidate_k = 50, rrf_k = 60. run_dev_retrieval.py lấy giá trị mặc định từ argparse (10/50/60, chunk smoke, index legal-child-chunks-dev). retrieval_evaluation.py cũng đặt cứng model và index. Nơi duy nhất đọc config.yaml là pipeline của Dev 5 (load_retrieval_settings): đọc retrieval_top_k (nếu thiếu thì lấy hybrid.candidate_k), hybrid.rrf_k, bm25.index, bm25.text_field, dense.model. Các khoá bm25.backend, dense.backend, hybrid.top_k không ai đọc. Vì vậy sửa config.yaml không làm đổi các lần chạy của Dev 4 (report Task 4 ghi 10/50/60 từ tham số CLI). Contract của Dev 4 là “đọc retrieval_top_k và rrf_k từ config”, chưa đáp ứng. §14.3 yêu cầu Dev 4 thử rrf_k = 10 và rrf_k = 60 trên Dev set, nhưng chưa có kết quả nào. Đo trên corpus hiện tại: rrf_k = 10 không kém rrf_k = 60 ở cả 6 cấu hình. Khác biệt rõ khi nhánh Dense yếu: với bkai như hiện tại, R@10 tăng +0,045 (0,849 lên 0,894). Khi cấu hình đã tốt thì khác biệt không đáng kể: lọc as_of_date + BGE-M3 cho 0,974 / 0,741 với rrf_k = 60 và 0,981 / 0,747 với rrf_k = 10. Giảm độ sâu ứng viên từ 50 xuống 20 làm R@10 thay đổi không quá 0,016.</w:t>
-            </w:r>
-          </w:p>
-          <w:p>
-            <w:pPr>
-              <w:spacing w:after="20" w:line="252" w:lineRule="auto"/>
-            </w:pPr>
-            <w:r>
-              <w:rPr>
-                <w:b/>
-                <w:sz w:val="17"/>
-              </w:rPr>
-              <w:t xml:space="preserve">Đề xuất: </w:t>
-            </w:r>
-            <w:r>
-              <w:rPr>
-                <w:sz w:val="17"/>
-              </w:rPr>
-              <w:t>Thêm retrieval.retrieval_top_k: 50 và hybrid.fusion: rrf theo §14.3. Bỏ hybrid.candidate_k, hoặc ghi rõ đó là tên cũ; bỏ hybrid.top_k và các khoá không ai đọc. Chuyển hàm đọc config sang retrieval/, ví dụ HybridSearchConfig.from_config, để run_dev_retrieval.py, retrieval_evaluation.py và pipeline của Dev 5 cùng dùng: giá trị mặc định lấy từ config, tham số CLI chỉ dùng để ghi đè, và output ghi lại cấu hình đã dùng. Sau khi có khoá mới, Dev 5 bỏ nhánh dự phòng hybrid.candidate_k. Thêm test phía Dev 4: HybridRetriever dựng từ config phải dùng đúng retrieval_top_k và rrf_k (§14.5). Giữ rrf_k = 60 làm giá trị khởi đầu. Theo số đo hiện có, rrf_k = 10 không kém ở cấu hình nào, nên nên chốt lại khi có gold đã xác minh (D1).</w:t>
-            </w:r>
-          </w:p>
-          <w:p>
-            <w:pPr>
-              <w:spacing w:after="20" w:line="252" w:lineRule="auto"/>
-            </w:pPr>
-            <w:r>
-              <w:rPr>
-                <w:b/>
-                <w:sz w:val="17"/>
-              </w:rPr>
-              <w:t xml:space="preserve">Kiểm chứng: </w:t>
-            </w:r>
-            <w:r>
-              <w:rPr>
-                <w:sz w:val="17"/>
-              </w:rPr>
-              <w:t>Grep config.yaml, retrieval_top_k, candidate_k, rrf_k, load_retrieval_settings trong code và test (trừ RAG/, .venv). Đọc argparse của run_dev_retrieval.py và report Task 4. Đo Hybrid trên corpus hiện tại: index BM25 tạm với breadcrumb chỉ cấp Điều (E15) và 2 trường đang có tác dụng (E7), ghép RRF với các nhánh Dense đã lưu ở E2 (bkai hiện tại, bkai tách từ, BGE-M3), có và không lọc as_of_date. So rrf_k 10 và 60, độ sâu 20 và 50, trên 265 câu Dev có gold đề xuất. Kiểm định ghép cặp rrf_k 10 so với 60 ở độ sâu 50: bkai hiện tại không lọc, R@10 +0,045 (CI95 +0,015 đến +0,079; 15 câu thắng, 3 câu thua), MRR@10 +0,022; BGE-M3 có lọc, R@10 +0,008 (CI95 −0,008 đến +0,023), MRR@10 +0,006. Index tạm đã xoá.</w:t>
-            </w:r>
-          </w:p>
-        </w:tc>
-        <w:tc>
-          <w:tcPr>
-            <w:tcW w:type="dxa" w:w="1701"/>
-            <w:vAlign w:val="top"/>
-          </w:tcPr>
-          <w:p>
-            <w:pPr>
-              <w:spacing w:after="20" w:line="252" w:lineRule="auto"/>
-            </w:pPr>
-            <w:r>
-              <w:rPr>
-                <w:sz w:val="17"/>
-              </w:rPr>
-              <w:t>retrieval/config.yaml; retrieval/hybrid_retriever.py: HybridSearchConfig (dòng 131–147); retrieval/run_dev_retrieval.py (dòng 70–90); reranking/pipeline.py: load_retrieval_settings (dòng 218–247)</w:t>
-            </w:r>
-          </w:p>
-        </w:tc>
-        <w:tc>
-          <w:tcPr>
-            <w:tcW w:type="dxa" w:w="1077"/>
-            <w:vAlign w:val="top"/>
-          </w:tcPr>
-          <w:p>
-            <w:pPr>
-              <w:spacing w:after="20" w:line="252" w:lineRule="auto"/>
-            </w:pPr>
-            <w:r>
-              <w:rPr>
-                <w:sz w:val="17"/>
-              </w:rPr>
-              <w:t>Dev 4</w:t>
-            </w:r>
-          </w:p>
-        </w:tc>
-        <w:tc>
-          <w:tcPr>
-            <w:tcW w:type="dxa" w:w="964"/>
-            <w:vAlign w:val="top"/>
-            <w:shd w:val="clear" w:color="auto" w:fill="FBE5D6"/>
-          </w:tcPr>
-          <w:p>
-            <w:pPr>
-              <w:spacing w:after="20" w:line="252" w:lineRule="auto"/>
-            </w:pPr>
-            <w:r>
-              <w:rPr>
-                <w:sz w:val="17"/>
-              </w:rPr>
-              <w:t>Còn</w:t>
-            </w:r>
-          </w:p>
-        </w:tc>
-      </w:tr>
-      <w:tr>
-        <w:tc>
-          <w:tcPr>
-            <w:tcW w:type="dxa" w:w="624"/>
-            <w:vAlign w:val="top"/>
-          </w:tcPr>
-          <w:p>
-            <w:pPr>
-              <w:spacing w:after="20" w:line="252" w:lineRule="auto"/>
-            </w:pPr>
-            <w:r>
-              <w:rPr>
-                <w:b/>
-                <w:sz w:val="17"/>
-              </w:rPr>
-              <w:t>E11</w:t>
-            </w:r>
-          </w:p>
-        </w:tc>
-        <w:tc>
-          <w:tcPr>
-            <w:tcW w:type="dxa" w:w="1020"/>
-            <w:vAlign w:val="top"/>
-            <w:shd w:val="clear" w:color="auto" w:fill="FCE8B2"/>
-          </w:tcPr>
-          <w:p>
-            <w:pPr>
-              <w:spacing w:after="20" w:line="252" w:lineRule="auto"/>
-            </w:pPr>
-            <w:r>
-              <w:rPr>
-                <w:sz w:val="17"/>
-              </w:rPr>
-              <w:t>Trung bình</w:t>
-            </w:r>
-          </w:p>
-        </w:tc>
-        <w:tc>
-          <w:tcPr>
-            <w:tcW w:type="dxa" w:w="4479"/>
-            <w:vAlign w:val="top"/>
-          </w:tcPr>
-          <w:p>
-            <w:pPr>
-              <w:spacing w:after="20" w:line="252" w:lineRule="auto"/>
-            </w:pPr>
-            <w:r>
-              <w:rPr>
-                <w:sz w:val="17"/>
-              </w:rPr>
-              <w:t>Còn hai thành phần của khối Retrieval/API chưa có code: Confidence Threshold Filter (LLM Judge + MMR, nhánh dự phòng Active Clarification) và Semantic Query &amp; Reranker Cache (Redis); RedisJSONCache trong hybrid_retriever.py chưa được dùng. Kế hoạch Sprint 6 không giao hai thành phần này. HybridRetriever vẫn có hai hook parent_resolver, confidence_filter chạy trước reranker; pipeline không dùng chúng. docker-compose.yml chỉ có Elasticsearch; Qdrant chạy local theo đường dẫn nên chỉ một tiến trình mở được storage.</w:t>
-            </w:r>
-          </w:p>
-          <w:p>
-            <w:pPr>
-              <w:spacing w:after="20" w:line="252" w:lineRule="auto"/>
-            </w:pPr>
-            <w:r>
-              <w:rPr>
-                <w:b/>
-                <w:sz w:val="17"/>
-              </w:rPr>
-              <w:t xml:space="preserve">Đề xuất: </w:t>
-            </w:r>
-            <w:r>
-              <w:rPr>
-                <w:sz w:val="17"/>
-              </w:rPr>
-              <w:t>Ghi Confidence Threshold Filter và Semantic Cache vào backlog sau Sprint 6, kèm owner; có thể bắt đầu bằng một ngưỡng trên điểm reranker để kích hoạt Active Clarification. Dev 4 bỏ hai hook khỏi HybridRetriever. Thêm Qdrant vào docker-compose khi cần nhiều tiến trình dùng chung index.</w:t>
-            </w:r>
-          </w:p>
-          <w:p>
-            <w:pPr>
-              <w:spacing w:after="20" w:line="252" w:lineRule="auto"/>
-            </w:pPr>
-            <w:r>
-              <w:rPr>
-                <w:b/>
-                <w:sz w:val="17"/>
-              </w:rPr>
-              <w:t xml:space="preserve">Kiểm chứng: </w:t>
-            </w:r>
-            <w:r>
-              <w:rPr>
-                <w:sz w:val="17"/>
-              </w:rPr>
-              <w:t>Parent-Context Resolver có ở 3b1b6dc (reranking/parent_context.py), chạy trong RetrievalPipeline sau reranker. Chạy thật Hybrid (BM25 + bkai) trên corpus 664634e, top-5: 4 parent được gắn, 1 dùng chung, 3.913 ký tự ngữ cảnh.</w:t>
-            </w:r>
-          </w:p>
-        </w:tc>
-        <w:tc>
-          <w:tcPr>
-            <w:tcW w:type="dxa" w:w="1701"/>
-            <w:vAlign w:val="top"/>
-          </w:tcPr>
-          <w:p>
-            <w:pPr>
-              <w:spacing w:after="20" w:line="252" w:lineRule="auto"/>
-            </w:pPr>
-            <w:r>
-              <w:rPr>
-                <w:sz w:val="17"/>
-              </w:rPr>
-              <w:t>retrieval/hybrid_retriever.py: HybridRetriever (hook), RedisJSONCache; docker-compose.yml</w:t>
-            </w:r>
-          </w:p>
-        </w:tc>
-        <w:tc>
-          <w:tcPr>
-            <w:tcW w:type="dxa" w:w="1077"/>
-            <w:vAlign w:val="top"/>
-          </w:tcPr>
-          <w:p>
-            <w:pPr>
-              <w:spacing w:after="20" w:line="252" w:lineRule="auto"/>
-            </w:pPr>
-            <w:r>
-              <w:rPr>
-                <w:sz w:val="17"/>
-              </w:rPr>
-              <w:t>Chưa giao (Confidence Filter, Cache); Dev 4 (hook)</w:t>
-            </w:r>
-          </w:p>
-        </w:tc>
-        <w:tc>
-          <w:tcPr>
-            <w:tcW w:type="dxa" w:w="964"/>
-            <w:vAlign w:val="top"/>
-          </w:tcPr>
-          <w:p>
-            <w:pPr>
-              <w:spacing w:after="20" w:line="252" w:lineRule="auto"/>
-            </w:pPr>
-            <w:r>
-              <w:rPr>
-                <w:sz w:val="17"/>
-              </w:rPr>
               <w:t>Còn một phần (3b1b6dc)</w:t>
             </w:r>
           </w:p>
@@ -5784,7 +5723,7 @@
               <w:rPr>
                 <w:sz w:val="17"/>
               </w:rPr>
-              <w:t>embedding/dense_retriever.py: search (docstring dòng 157–161). run_dev_retrieval.py lưu kết quả theo query_id từ 26e41f9.</w:t>
+              <w:t>embedding/dense_retriever.py: search (docstring dòng 157–161).</w:t>
             </w:r>
           </w:p>
         </w:tc>
@@ -5826,6 +5765,7 @@
           <w:tcPr>
             <w:tcW w:type="dxa" w:w="964"/>
             <w:vAlign w:val="top"/>
+            <w:shd w:val="clear" w:color="auto" w:fill="FFF2CC"/>
           </w:tcPr>
           <w:p>
             <w:pPr>
@@ -6042,7 +5982,7 @@
               <w:rPr>
                 <w:sz w:val="17"/>
               </w:rPr>
-              <w:t>Kết quả CTM commit (evaluation/results/bm25_dev_results.json) chưa chạy lại: 0/1.425 ID thuộc corpus hiện tại (324 ID smoke l01_, 1.101 ID kiểu cũ); R@5 = 0,386 trong file metrics không phản ánh corpus nào.</w:t>
+              <w:t>Kết quả CTM commit (evaluation/results/bm25_dev_results.json, sinh ở 72a7377) chưa chạy lại: 524/1.425 ID thuộc corpus 664634e (251/662 ID khác nhau), 213 ID smoke l01_; Recall@5 = 0,305 trong bm25_dev_metrics.json đo trên index lẫn chunk smoke nên không phản ánh corpus nào.</w:t>
             </w:r>
           </w:p>
           <w:p>
@@ -6061,24 +6001,6 @@
                 <w:sz w:val="17"/>
               </w:rPr>
               <w:t>Dựng index bằng python -m retrieval.build_bm25_index --recreate rồi chạy lại run_bm25 trên gold đã duyệt (F5).</w:t>
-            </w:r>
-          </w:p>
-          <w:p>
-            <w:pPr>
-              <w:spacing w:after="20" w:line="252" w:lineRule="auto"/>
-            </w:pPr>
-            <w:r>
-              <w:rPr>
-                <w:b/>
-                <w:sz w:val="17"/>
-              </w:rPr>
-              <w:t xml:space="preserve">Kiểm chứng: </w:t>
-            </w:r>
-            <w:r>
-              <w:rPr>
-                <w:sz w:val="17"/>
-              </w:rPr>
-              <w:t>Từ f32754e, run_bm25 không còn dựng index mặc định mỗi lần chạy và dùng đúng es_url, index_name truyền vào; build_bm25_index có --recreate, --index, --es-url.</w:t>
             </w:r>
           </w:p>
         </w:tc>
@@ -6120,6 +6042,7 @@
           <w:tcPr>
             <w:tcW w:type="dxa" w:w="964"/>
             <w:vAlign w:val="top"/>
+            <w:shd w:val="clear" w:color="auto" w:fill="FFF2CC"/>
           </w:tcPr>
           <w:p>
             <w:pPr>
@@ -6184,7 +6107,7 @@
               <w:rPr>
                 <w:sz w:val="17"/>
               </w:rPr>
-              <w:t>run_baselines.py chấm trên gold_id_proposals_300.json (PROVISIONAL_NOT_LEGALLY_VERIFIED, 31 ID không còn trong corpus) thay cho ground_truth.json. evaluation/results/bm25_dev_* (284 câu, Recall@5 0,386) sinh trên index đã lẫn chunk smoke; evaluation/bm25_dev_metrics.json (26 câu) là bản thừa.</w:t>
+              <w:t>run_baselines.py vẫn chấm trên gold_id_proposals_300.json (PROVISIONAL_NOT_LEGALLY_VERIFIED; 289/300 câu draft, 10/11 câu source_checked ghi verified_by “TEST_REVIEWER”) thay cho ground_truth.json. evaluation/results/bm25_dev_* (284 câu, Recall@5 0,305) sinh trên index đã lẫn chunk smoke (213/1.425 ID l01_); evaluation/bm25_dev_metrics.json (26 câu) là bản thừa.</w:t>
             </w:r>
           </w:p>
           <w:p>
@@ -6193,9 +6116,16 @@
             </w:pPr>
             <w:r>
               <w:rPr>
-                <w:sz w:val="17"/>
-              </w:rPr>
-              <w:t>run_baselines.py vẫn chấm trên gold_id_proposals_300.json, mà proposal khớp 0/330 ID của corpus.</w:t>
+                <w:b/>
+                <w:sz w:val="17"/>
+              </w:rPr>
+              <w:t xml:space="preserve">Đề xuất: </w:t>
+            </w:r>
+            <w:r>
+              <w:rPr>
+                <w:sz w:val="17"/>
+              </w:rPr>
+              <w:t>Chấm trên ground_truth.json (chỉ câu đã xác minh, D1) hoặc ghi rõ nhãn tạm trong tên file kết quả; xóa kết quả cũ và evaluation/bm25_dev_metrics.json.</w:t>
             </w:r>
           </w:p>
           <w:p>
@@ -6207,13 +6137,13 @@
                 <w:b/>
                 <w:sz w:val="17"/>
               </w:rPr>
-              <w:t xml:space="preserve">Đề xuất: </w:t>
-            </w:r>
-            <w:r>
-              <w:rPr>
-                <w:sz w:val="17"/>
-              </w:rPr>
-              <w:t>Chấm trên ground_truth.json (chỉ câu đã xác minh) hoặc ghi rõ nhãn tạm trong tên file kết quả; xóa kết quả cũ.</w:t>
+              <w:t xml:space="preserve">Kiểm chứng: </w:t>
+            </w:r>
+            <w:r>
+              <w:rPr>
+                <w:sz w:val="17"/>
+              </w:rPr>
+              <w:t>scripts/run_baselines.py dòng 18 vẫn trỏ gold_id_proposals_300.json.</w:t>
             </w:r>
           </w:p>
         </w:tc>
@@ -6231,6 +6161,131 @@
                 <w:sz w:val="17"/>
               </w:rPr>
               <w:t>scripts/run_baselines.py:18; evaluation/results/; evaluation/bm25_dev_metrics.json</w:t>
+            </w:r>
+          </w:p>
+        </w:tc>
+        <w:tc>
+          <w:tcPr>
+            <w:tcW w:type="dxa" w:w="1077"/>
+            <w:vAlign w:val="top"/>
+          </w:tcPr>
+          <w:p>
+            <w:pPr>
+              <w:spacing w:after="20" w:line="252" w:lineRule="auto"/>
+            </w:pPr>
+            <w:r>
+              <w:rPr>
+                <w:sz w:val="17"/>
+              </w:rPr>
+              <w:t>Dev 2</w:t>
+            </w:r>
+          </w:p>
+        </w:tc>
+        <w:tc>
+          <w:tcPr>
+            <w:tcW w:type="dxa" w:w="964"/>
+            <w:vAlign w:val="top"/>
+            <w:shd w:val="clear" w:color="auto" w:fill="FFF2CC"/>
+          </w:tcPr>
+          <w:p>
+            <w:pPr>
+              <w:spacing w:after="20" w:line="252" w:lineRule="auto"/>
+            </w:pPr>
+            <w:r>
+              <w:rPr>
+                <w:sz w:val="17"/>
+              </w:rPr>
+              <w:t>Còn một phần (146a6c9)</w:t>
+            </w:r>
+          </w:p>
+        </w:tc>
+      </w:tr>
+      <w:tr>
+        <w:tc>
+          <w:tcPr>
+            <w:tcW w:type="dxa" w:w="624"/>
+            <w:vAlign w:val="top"/>
+          </w:tcPr>
+          <w:p>
+            <w:pPr>
+              <w:spacing w:after="20" w:line="252" w:lineRule="auto"/>
+            </w:pPr>
+            <w:r>
+              <w:rPr>
+                <w:b/>
+                <w:sz w:val="17"/>
+              </w:rPr>
+              <w:t>F2</w:t>
+            </w:r>
+          </w:p>
+        </w:tc>
+        <w:tc>
+          <w:tcPr>
+            <w:tcW w:type="dxa" w:w="1020"/>
+            <w:vAlign w:val="top"/>
+            <w:shd w:val="clear" w:color="auto" w:fill="FCE8B2"/>
+          </w:tcPr>
+          <w:p>
+            <w:pPr>
+              <w:spacing w:after="20" w:line="252" w:lineRule="auto"/>
+            </w:pPr>
+            <w:r>
+              <w:rPr>
+                <w:sz w:val="17"/>
+              </w:rPr>
+              <w:t>Trung bình</w:t>
+            </w:r>
+          </w:p>
+        </w:tc>
+        <w:tc>
+          <w:tcPr>
+            <w:tcW w:type="dxa" w:w="4479"/>
+            <w:vAlign w:val="top"/>
+          </w:tcPr>
+          <w:p>
+            <w:pPr>
+              <w:spacing w:after="20" w:line="252" w:lineRule="auto"/>
+            </w:pPr>
+            <w:r>
+              <w:rPr>
+                <w:sz w:val="17"/>
+              </w:rPr>
+              <w:t>Recall tính theo tỉ lệ gold tìm được, lệch định nghĩa hit-based của §14.4; có 3 bản tính metric (evaluation/metrics.py, retrieval/retrieval_evaluation.py, scripts/evaluate_task4.py); chưa có Strict Match và Parent Match riêng.</w:t>
+            </w:r>
+          </w:p>
+          <w:p>
+            <w:pPr>
+              <w:spacing w:after="20" w:line="252" w:lineRule="auto"/>
+            </w:pPr>
+            <w:r>
+              <w:rPr>
+                <w:b/>
+                <w:sz w:val="17"/>
+              </w:rPr>
+              <w:t xml:space="preserve">Đề xuất: </w:t>
+            </w:r>
+            <w:r>
+              <w:rPr>
+                <w:sz w:val="17"/>
+              </w:rPr>
+              <w:t>Một module metric duy nhất; thêm strict/parent recall và test thiếu parent_clause_id (§13.4).</w:t>
+            </w:r>
+          </w:p>
+        </w:tc>
+        <w:tc>
+          <w:tcPr>
+            <w:tcW w:type="dxa" w:w="1701"/>
+            <w:vAlign w:val="top"/>
+          </w:tcPr>
+          <w:p>
+            <w:pPr>
+              <w:spacing w:after="20" w:line="252" w:lineRule="auto"/>
+            </w:pPr>
+            <w:r>
+              <w:rPr>
+                <w:sz w:val="17"/>
+              </w:rPr>
+              <w:t>evaluation/metrics.py</w:t>
             </w:r>
           </w:p>
         </w:tc>
@@ -6285,7 +6340,7 @@
                 <w:b/>
                 <w:sz w:val="17"/>
               </w:rPr>
-              <w:t>F2</w:t>
+              <w:t>F6</w:t>
             </w:r>
           </w:p>
         </w:tc>
@@ -6320,7 +6375,7 @@
               <w:rPr>
                 <w:sz w:val="17"/>
               </w:rPr>
-              <w:t>Recall tính theo tỉ lệ gold tìm được, lệch định nghĩa hit-based của §14.4; có 3 bản tính metric (evaluation/metrics.py, retrieval/retrieval_evaluation.py, scripts/evaluate_task4.py); chưa có Strict Match và Parent Match riêng.</w:t>
+              <w:t>Kết quả Zero-shot đã cũ: 45 câu (bộ 60 câu ban đầu) trên 285 câu Dev hiện tại, model qwen2.5:7b. Chỉ có Exact Match/token F1 so với đáp án nháp (289/300 draft, 240 đáp án là trích đoạn tự động); chưa có answer relevance/faithfulness như Sprint 6 yêu cầu.</w:t>
             </w:r>
           </w:p>
           <w:p>
@@ -6338,7 +6393,7 @@
               <w:rPr>
                 <w:sz w:val="17"/>
               </w:rPr>
-              <w:t>Một module metric duy nhất; thêm strict/parent recall và test thiếu parent_clause_id (§13.4).</w:t>
+              <w:t>Chạy lại trên Dev sau khi có đáp án đã duyệt; thêm LLM-judge hoặc chấm thủ công có rubric.</w:t>
             </w:r>
           </w:p>
         </w:tc>
@@ -6355,7 +6410,7 @@
               <w:rPr>
                 <w:sz w:val="17"/>
               </w:rPr>
-              <w:t>evaluation/metrics.py</w:t>
+              <w:t>evaluation/zero_shot.py; evaluation/results/zero_shot_dev_*</w:t>
             </w:r>
           </w:p>
         </w:tc>
@@ -6410,7 +6465,7 @@
                 <w:b/>
                 <w:sz w:val="17"/>
               </w:rPr>
-              <w:t>F6</w:t>
+              <w:t>F3</w:t>
             </w:r>
           </w:p>
         </w:tc>
@@ -6445,7 +6500,7 @@
               <w:rPr>
                 <w:sz w:val="17"/>
               </w:rPr>
-              <w:t>Kết quả Zero-shot đã cũ: 45 câu (bộ 60 câu ban đầu) trên 285 câu Dev hiện tại, model qwen2.5:7b. Chỉ có Exact Match/token F1 so với đáp án nháp (289/300 draft, 240 đáp án là trích đoạn tự động); chưa có answer relevance/faithfulness như Sprint 6 yêu cầu.</w:t>
+              <w:t>run_final_test.py chỉ chạy BM25, không kiểm cấu hình đã khóa, không kiểm SHA-256 của Test và commit trước khi chạy. evaluation/metrics.evaluate bỏ qua câu có gold rỗng mà không báo lỗi (D2), nên trên ground_truth.json hiện tại (gold_context_ids rỗng ở cả 300 câu) không câu Test nào được chấm.</w:t>
             </w:r>
           </w:p>
           <w:p>
@@ -6463,7 +6518,25 @@
               <w:rPr>
                 <w:sz w:val="17"/>
               </w:rPr>
-              <w:t>Chạy lại trên Dev sau khi có đáp án đã duyệt; thêm LLM-judge hoặc chấm thủ công có rubric.</w:t>
+              <w:t>Chạy đủ 4 phương pháp với cấu hình đã khóa; kiểm SHA-256 Test và commit trước khi chạy; báo lỗi khi một câu Test có gold rỗng.</w:t>
+            </w:r>
+          </w:p>
+          <w:p>
+            <w:pPr>
+              <w:spacing w:after="20" w:line="252" w:lineRule="auto"/>
+            </w:pPr>
+            <w:r>
+              <w:rPr>
+                <w:b/>
+                <w:sz w:val="17"/>
+              </w:rPr>
+              <w:t xml:space="preserve">Kiểm chứng: </w:t>
+            </w:r>
+            <w:r>
+              <w:rPr>
+                <w:sz w:val="17"/>
+              </w:rPr>
+              <w:t>run_final_test.py gọi run_benchmark_bm25 với top_k = 5; metrics.load_gold đọc gold_context_ids, câu có gold rỗng vào danh sách skipped.</w:t>
             </w:r>
           </w:p>
         </w:tc>
@@ -6480,7 +6553,7 @@
               <w:rPr>
                 <w:sz w:val="17"/>
               </w:rPr>
-              <w:t>evaluation/zero_shot.py; evaluation/results/zero_shot_dev_*</w:t>
+              <w:t>scripts/run_final_test.py</w:t>
             </w:r>
           </w:p>
         </w:tc>
@@ -6505,7 +6578,7 @@
           <w:tcPr>
             <w:tcW w:type="dxa" w:w="964"/>
             <w:vAlign w:val="top"/>
-            <w:shd w:val="clear" w:color="auto" w:fill="FBE5D6"/>
+            <w:shd w:val="clear" w:color="auto" w:fill="FFF2CC"/>
           </w:tcPr>
           <w:p>
             <w:pPr>
@@ -6515,132 +6588,7 @@
               <w:rPr>
                 <w:sz w:val="17"/>
               </w:rPr>
-              <w:t>Còn</w:t>
-            </w:r>
-          </w:p>
-        </w:tc>
-      </w:tr>
-      <w:tr>
-        <w:tc>
-          <w:tcPr>
-            <w:tcW w:type="dxa" w:w="624"/>
-            <w:vAlign w:val="top"/>
-          </w:tcPr>
-          <w:p>
-            <w:pPr>
-              <w:spacing w:after="20" w:line="252" w:lineRule="auto"/>
-            </w:pPr>
-            <w:r>
-              <w:rPr>
-                <w:b/>
-                <w:sz w:val="17"/>
-              </w:rPr>
-              <w:t>F3</w:t>
-            </w:r>
-          </w:p>
-        </w:tc>
-        <w:tc>
-          <w:tcPr>
-            <w:tcW w:type="dxa" w:w="1020"/>
-            <w:vAlign w:val="top"/>
-            <w:shd w:val="clear" w:color="auto" w:fill="FCE8B2"/>
-          </w:tcPr>
-          <w:p>
-            <w:pPr>
-              <w:spacing w:after="20" w:line="252" w:lineRule="auto"/>
-            </w:pPr>
-            <w:r>
-              <w:rPr>
-                <w:sz w:val="17"/>
-              </w:rPr>
-              <w:t>Trung bình</w:t>
-            </w:r>
-          </w:p>
-        </w:tc>
-        <w:tc>
-          <w:tcPr>
-            <w:tcW w:type="dxa" w:w="4479"/>
-            <w:vAlign w:val="top"/>
-          </w:tcPr>
-          <w:p>
-            <w:pPr>
-              <w:spacing w:after="20" w:line="252" w:lineRule="auto"/>
-            </w:pPr>
-            <w:r>
-              <w:rPr>
-                <w:sz w:val="17"/>
-              </w:rPr>
-              <w:t>run_final_test.py chỉ chạy BM25, không kiểm cấu hình đã khóa, và dựng lại index như F1.</w:t>
-            </w:r>
-          </w:p>
-          <w:p>
-            <w:pPr>
-              <w:spacing w:after="20" w:line="252" w:lineRule="auto"/>
-            </w:pPr>
-            <w:r>
-              <w:rPr>
-                <w:b/>
-                <w:sz w:val="17"/>
-              </w:rPr>
-              <w:t xml:space="preserve">Đề xuất: </w:t>
-            </w:r>
-            <w:r>
-              <w:rPr>
-                <w:sz w:val="17"/>
-              </w:rPr>
-              <w:t>Chạy đủ 4 phương pháp với cấu hình đã khóa; kiểm SHA-256 Test và commit trước khi chạy.</w:t>
-            </w:r>
-          </w:p>
-        </w:tc>
-        <w:tc>
-          <w:tcPr>
-            <w:tcW w:type="dxa" w:w="1701"/>
-            <w:vAlign w:val="top"/>
-          </w:tcPr>
-          <w:p>
-            <w:pPr>
-              <w:spacing w:after="20" w:line="252" w:lineRule="auto"/>
-            </w:pPr>
-            <w:r>
-              <w:rPr>
-                <w:sz w:val="17"/>
-              </w:rPr>
-              <w:t>scripts/run_final_test.py</w:t>
-            </w:r>
-          </w:p>
-        </w:tc>
-        <w:tc>
-          <w:tcPr>
-            <w:tcW w:type="dxa" w:w="1077"/>
-            <w:vAlign w:val="top"/>
-          </w:tcPr>
-          <w:p>
-            <w:pPr>
-              <w:spacing w:after="20" w:line="252" w:lineRule="auto"/>
-            </w:pPr>
-            <w:r>
-              <w:rPr>
-                <w:sz w:val="17"/>
-              </w:rPr>
-              <w:t>Dev 2</w:t>
-            </w:r>
-          </w:p>
-        </w:tc>
-        <w:tc>
-          <w:tcPr>
-            <w:tcW w:type="dxa" w:w="964"/>
-            <w:vAlign w:val="top"/>
-            <w:shd w:val="clear" w:color="auto" w:fill="FBE5D6"/>
-          </w:tcPr>
-          <w:p>
-            <w:pPr>
-              <w:spacing w:after="20" w:line="252" w:lineRule="auto"/>
-            </w:pPr>
-            <w:r>
-              <w:rPr>
-                <w:sz w:val="17"/>
-              </w:rPr>
-              <w:t>Còn</w:t>
+              <w:t>Còn một phần (f32754e)</w:t>
             </w:r>
           </w:p>
         </w:tc>
@@ -6972,7 +6920,7 @@
               <w:rPr>
                 <w:sz w:val="17"/>
               </w:rPr>
-              <w:t>Các file cũ trong reranking/results đã xóa ở 33bc4ff. Còn: chưa có kết quả Hybrid + Reranker nào trên corpus hiện tại; mục Kết quả hiện tại của README (dòng 61) vẫn ghi số Task 4 đo trên corpus 1.159 chunk với nhãn proposal.</w:t>
+              <w:t>Chưa có kết quả Hybrid + Reranker nào trên corpus hiện tại; mục Kết quả hiện tại của README (dòng 61) vẫn ghi số Task 4 đo trên corpus 1.159 chunk với nhãn proposal.</w:t>
             </w:r>
           </w:p>
           <w:p>
@@ -7050,6 +6998,7 @@
           <w:tcPr>
             <w:tcW w:type="dxa" w:w="964"/>
             <w:vAlign w:val="top"/>
+            <w:shd w:val="clear" w:color="auto" w:fill="FFF2CC"/>
           </w:tcPr>
           <w:p>
             <w:pPr>
@@ -7135,24 +7084,6 @@
               <w:t>Khi có gold đã duyệt (D1), chạy Hybrid + Reranker trên Dev với reranker.candidate_text = chunk_text và breadcrumb_chunk_text, giữ cách cho kết quả tốt hơn.</w:t>
             </w:r>
           </w:p>
-          <w:p>
-            <w:pPr>
-              <w:spacing w:after="20" w:line="252" w:lineRule="auto"/>
-            </w:pPr>
-            <w:r>
-              <w:rPr>
-                <w:b/>
-                <w:sz w:val="17"/>
-              </w:rPr>
-              <w:t xml:space="preserve">Kiểm chứng: </w:t>
-            </w:r>
-            <w:r>
-              <w:rPr>
-                <w:sz w:val="17"/>
-              </w:rPr>
-              <w:t>Tùy chọn reranker.candidate_text có từ 3b1b6dc, mặc định chunk_text.</w:t>
-            </w:r>
-          </w:p>
         </w:tc>
         <w:tc>
           <w:tcPr>
@@ -7192,6 +7123,7 @@
           <w:tcPr>
             <w:tcW w:type="dxa" w:w="964"/>
             <w:vAlign w:val="top"/>
+            <w:shd w:val="clear" w:color="auto" w:fill="FFF2CC"/>
           </w:tcPr>
           <w:p>
             <w:pPr>
@@ -7408,7 +7340,25 @@
               <w:rPr>
                 <w:sz w:val="17"/>
               </w:rPr>
-              <w:t>Parser nay dừng khi thiếu registry hoặc đứt chuỗi Điều. Vẫn nuốt lỗi: word_segment (ImportError), cleaner (except Exception rộng), parse_text_to_articles (chỉ cảnh báo rồi bỏ Điều khi dựng clause lỗi).</w:t>
+              <w:t>Vẫn nuốt lỗi: parse_text_to_articles chỉ cảnh báo rồi bỏ Điều khi dựng clause lỗi (except Exception); cleaner bắt Exception rộng ở 8 chỗ, OCR lỗi thì chỉ ghi log rồi dùng text gốc của trang, file lỗi chỉ được đếm rồi chạy tiếp; dense_retriever.py tắt tách từ câu hỏi khi thiếu underthesea (E4).</w:t>
+            </w:r>
+          </w:p>
+          <w:p>
+            <w:pPr>
+              <w:spacing w:after="20" w:line="252" w:lineRule="auto"/>
+            </w:pPr>
+            <w:r>
+              <w:rPr>
+                <w:b/>
+                <w:sz w:val="17"/>
+              </w:rPr>
+              <w:t xml:space="preserve">Đề xuất: </w:t>
+            </w:r>
+            <w:r>
+              <w:rPr>
+                <w:sz w:val="17"/>
+              </w:rPr>
+              <w:t>parse_text_to_articles raise khi dựng clause lỗi; cleaner trả mã lỗi khác 0 khi có trang hoặc file lỗi; Dense dừng khi thiếu underthesea (E4).</w:t>
             </w:r>
           </w:p>
         </w:tc>
@@ -7425,7 +7375,7 @@
               <w:rPr>
                 <w:sz w:val="17"/>
               </w:rPr>
-              <w:t>parser/parser.py:563; chunking/chunking_rules.py:212; retrieval/build_bm25_index.py:153; scripts/build_index.py:43; embedding/vector_store.py:135</w:t>
+              <w:t>parser/parser.py: parse_text_to_articles (dòng 1006–1007); parser/cleaner.py (dòng 303–501); embedding/dense_retriever.py:14–20</w:t>
             </w:r>
           </w:p>
         </w:tc>
@@ -7480,7 +7430,7 @@
                 <w:b/>
                 <w:sz w:val="17"/>
               </w:rPr>
-              <w:t>H2</w:t>
+              <w:t>H1</w:t>
             </w:r>
           </w:p>
         </w:tc>
@@ -7515,7 +7465,7 @@
               <w:rPr>
                 <w:sz w:val="17"/>
               </w:rPr>
-              <w:t>Test vẫn nằm ở 4 nơi (test/, tests/, retrieval/test/, parser/). test/test_benchmark_draft.py là bản cũ của tests/test_benchmark.py và khẳng định cả 300 câu là draft, nên sẽ fail khi có gold đã duyệt (D1).</w:t>
+              <w:t>main chậm 35 commit so với reranker; nhánh NMA đã được gộp vào reranker (ae1ce0d) nhưng chưa vào main. Dev vẫn sửa chéo module (vd parser sửa file của chunking).</w:t>
             </w:r>
           </w:p>
           <w:p>
@@ -7524,6 +7474,17 @@
             </w:pPr>
             <w:r>
               <w:rPr>
+                <w:sz w:val="17"/>
+              </w:rPr>
+              <w:t>main chậm 98 commit so với testing (948fc94).</w:t>
+            </w:r>
+          </w:p>
+          <w:p>
+            <w:pPr>
+              <w:spacing w:after="20" w:line="252" w:lineRule="auto"/>
+            </w:pPr>
+            <w:r>
+              <w:rPr>
                 <w:b/>
                 <w:sz w:val="17"/>
               </w:rPr>
@@ -7533,25 +7494,7 @@
               <w:rPr>
                 <w:sz w:val="17"/>
               </w:rPr>
-              <w:t>Cả nhóm gom test về một thư mục; Dev 1 xóa test/test_benchmark_draft.py khi duyệt gold.</w:t>
-            </w:r>
-          </w:p>
-          <w:p>
-            <w:pPr>
-              <w:spacing w:after="20" w:line="252" w:lineRule="auto"/>
-            </w:pPr>
-            <w:r>
-              <w:rPr>
-                <w:b/>
-                <w:sz w:val="17"/>
-              </w:rPr>
-              <w:t xml:space="preserve">Kiểm chứng: </w:t>
-            </w:r>
-            <w:r>
-              <w:rPr>
-                <w:sz w:val="17"/>
-              </w:rPr>
-              <w:t>Từ b7f5e30, python -m pytest parser tests test chạy chung không lỗi collect: 531 pass, 20 skip ở 3b1b6dc.</w:t>
+              <w:t>Mở PR vào main sau khi sửa nhóm Cao của A, B, C; áp dụng CODEOWNERS theo bảng owner Sprint 6.</w:t>
             </w:r>
           </w:p>
         </w:tc>
@@ -7568,7 +7511,132 @@
               <w:rPr>
                 <w:sz w:val="17"/>
               </w:rPr>
-              <w:t>test/; tests/; retrieval/test/; parser/</w:t>
+              <w:t>git</w:t>
+            </w:r>
+          </w:p>
+        </w:tc>
+        <w:tc>
+          <w:tcPr>
+            <w:tcW w:type="dxa" w:w="1077"/>
+            <w:vAlign w:val="top"/>
+          </w:tcPr>
+          <w:p>
+            <w:pPr>
+              <w:spacing w:after="20" w:line="252" w:lineRule="auto"/>
+            </w:pPr>
+            <w:r>
+              <w:rPr>
+                <w:sz w:val="17"/>
+              </w:rPr>
+              <w:t>Cả nhóm</w:t>
+            </w:r>
+          </w:p>
+        </w:tc>
+        <w:tc>
+          <w:tcPr>
+            <w:tcW w:type="dxa" w:w="964"/>
+            <w:vAlign w:val="top"/>
+            <w:shd w:val="clear" w:color="auto" w:fill="FBE5D6"/>
+          </w:tcPr>
+          <w:p>
+            <w:pPr>
+              <w:spacing w:after="20" w:line="252" w:lineRule="auto"/>
+            </w:pPr>
+            <w:r>
+              <w:rPr>
+                <w:sz w:val="17"/>
+              </w:rPr>
+              <w:t>Còn</w:t>
+            </w:r>
+          </w:p>
+        </w:tc>
+      </w:tr>
+      <w:tr>
+        <w:tc>
+          <w:tcPr>
+            <w:tcW w:type="dxa" w:w="624"/>
+            <w:vAlign w:val="top"/>
+          </w:tcPr>
+          <w:p>
+            <w:pPr>
+              <w:spacing w:after="20" w:line="252" w:lineRule="auto"/>
+            </w:pPr>
+            <w:r>
+              <w:rPr>
+                <w:b/>
+                <w:sz w:val="17"/>
+              </w:rPr>
+              <w:t>H4</w:t>
+            </w:r>
+          </w:p>
+        </w:tc>
+        <w:tc>
+          <w:tcPr>
+            <w:tcW w:type="dxa" w:w="1020"/>
+            <w:vAlign w:val="top"/>
+            <w:shd w:val="clear" w:color="auto" w:fill="E2EFDA"/>
+          </w:tcPr>
+          <w:p>
+            <w:pPr>
+              <w:spacing w:after="20" w:line="252" w:lineRule="auto"/>
+            </w:pPr>
+            <w:r>
+              <w:rPr>
+                <w:sz w:val="17"/>
+              </w:rPr>
+              <w:t>Thấp</w:t>
+            </w:r>
+          </w:p>
+        </w:tc>
+        <w:tc>
+          <w:tcPr>
+            <w:tcW w:type="dxa" w:w="4479"/>
+            <w:vAlign w:val="top"/>
+          </w:tcPr>
+          <w:p>
+            <w:pPr>
+              <w:spacing w:after="20" w:line="252" w:lineRule="auto"/>
+            </w:pPr>
+            <w:r>
+              <w:rPr>
+                <w:sz w:val="17"/>
+              </w:rPr>
+              <w:t>retrieval/retrieval.md ghi Dense dùng BGE-M3 trong khi code mặc định bkai (chờ chốt model ở E2); mục Kết quả hiện tại của README ghi số Task 4 đo trên corpus 1.159 chunk với nhãn proposal (G3).</w:t>
+            </w:r>
+          </w:p>
+          <w:p>
+            <w:pPr>
+              <w:spacing w:after="20" w:line="252" w:lineRule="auto"/>
+            </w:pPr>
+            <w:r>
+              <w:rPr>
+                <w:b/>
+                <w:sz w:val="17"/>
+              </w:rPr>
+              <w:t xml:space="preserve">Đề xuất: </w:t>
+            </w:r>
+            <w:r>
+              <w:rPr>
+                <w:sz w:val="17"/>
+              </w:rPr>
+              <w:t>Cập nhật cùng PR chốt E2 và PR chạy lại số đo (G3).</w:t>
+            </w:r>
+          </w:p>
+        </w:tc>
+        <w:tc>
+          <w:tcPr>
+            <w:tcW w:type="dxa" w:w="1701"/>
+            <w:vAlign w:val="top"/>
+          </w:tcPr>
+          <w:p>
+            <w:pPr>
+              <w:spacing w:after="20" w:line="252" w:lineRule="auto"/>
+            </w:pPr>
+            <w:r>
+              <w:rPr>
+                <w:sz w:val="17"/>
+              </w:rPr>
+              <w:t>retrieval/retrieval.md (dòng 12, 18); README.md:61</w:t>
             </w:r>
           </w:p>
         </w:tc>
@@ -7603,7 +7671,7 @@
               <w:rPr>
                 <w:sz w:val="17"/>
               </w:rPr>
-              <w:t>Còn một phần (b7f5e30)</w:t>
+              <w:t>Còn một phần (96d0086)</w:t>
             </w:r>
           </w:p>
         </w:tc>
@@ -7623,7 +7691,7 @@
                 <w:b/>
                 <w:sz w:val="17"/>
               </w:rPr>
-              <w:t>H1</w:t>
+              <w:t>H3</w:t>
             </w:r>
           </w:p>
         </w:tc>
@@ -7631,7 +7699,7 @@
           <w:tcPr>
             <w:tcW w:type="dxa" w:w="1020"/>
             <w:vAlign w:val="top"/>
-            <w:shd w:val="clear" w:color="auto" w:fill="FCE8B2"/>
+            <w:shd w:val="clear" w:color="auto" w:fill="E2EFDA"/>
           </w:tcPr>
           <w:p>
             <w:pPr>
@@ -7641,7 +7709,7 @@
               <w:rPr>
                 <w:sz w:val="17"/>
               </w:rPr>
-              <w:t>Trung bình</w:t>
+              <w:t>Thấp</w:t>
             </w:r>
           </w:p>
         </w:tc>
@@ -7658,7 +7726,7 @@
               <w:rPr>
                 <w:sz w:val="17"/>
               </w:rPr>
-              <w:t>main chậm 35 commit so với reranker; nhánh NMA đã được gộp vào reranker (ae1ce0d) nhưng chưa vào main. Dev vẫn sửa chéo module (vd parser sửa file của chunking).</w:t>
+              <w:t>Code trùng (2 BM25, 3 metric, 2 reranker); ruff báo 248 lỗi (181 tự sửa được).</w:t>
             </w:r>
           </w:p>
           <w:p>
@@ -7667,17 +7735,6 @@
             </w:pPr>
             <w:r>
               <w:rPr>
-                <w:sz w:val="17"/>
-              </w:rPr>
-              <w:t>main chậm 38 commit so với testing.</w:t>
-            </w:r>
-          </w:p>
-          <w:p>
-            <w:pPr>
-              <w:spacing w:after="20" w:line="252" w:lineRule="auto"/>
-            </w:pPr>
-            <w:r>
-              <w:rPr>
                 <w:b/>
                 <w:sz w:val="17"/>
               </w:rPr>
@@ -7687,7 +7744,7 @@
               <w:rPr>
                 <w:sz w:val="17"/>
               </w:rPr>
-              <w:t>Mở PR vào main sau khi sửa nhóm Cao của A, B, C; áp dụng CODEOWNERS theo bảng owner Sprint 6.</w:t>
+              <w:t>Chạy ruff --fix trong PR riêng; xóa bản trùng theo F1, F2, E10.</w:t>
             </w:r>
           </w:p>
         </w:tc>
@@ -7704,7 +7761,7 @@
               <w:rPr>
                 <w:sz w:val="17"/>
               </w:rPr>
-              <w:t>git</w:t>
+              <w:t>toàn repo</w:t>
             </w:r>
           </w:p>
         </w:tc>
@@ -7759,7 +7816,7 @@
                 <w:b/>
                 <w:sz w:val="17"/>
               </w:rPr>
-              <w:t>H4</w:t>
+              <w:t>H5</w:t>
             </w:r>
           </w:p>
         </w:tc>
@@ -7794,7 +7851,7 @@
               <w:rPr>
                 <w:sz w:val="17"/>
               </w:rPr>
-              <w:t>retrieval/retrieval.md ghi Dense dùng BGE-M3 trong khi code mặc định bkai (chờ chốt model ở E2); mục Kết quả hiện tại của README ghi số Task 4 đo trên corpus 1.159 chunk với nhãn proposal (G3).</w:t>
+              <w:t>origin/NMA vẫn theo dõi parser/__pycache__/cleaner.cpython-314.pyc và parser.cpython-314.pyc; lần gộp sau từ NMA có thể đưa lại hai file này vào testing.</w:t>
             </w:r>
           </w:p>
           <w:p>
@@ -7812,7 +7869,7 @@
               <w:rPr>
                 <w:sz w:val="17"/>
               </w:rPr>
-              <w:t>Cập nhật cùng PR chốt E2 và PR chạy lại số đo (G3).</w:t>
+              <w:t>NMA chạy git rm --cached các file .pyc trên nhánh của mình; CI kiểm git ls-files không có .pyc.</w:t>
             </w:r>
           </w:p>
           <w:p>
@@ -7830,7 +7887,7 @@
               <w:rPr>
                 <w:sz w:val="17"/>
               </w:rPr>
-              <w:t>docs/sprint6_benchmark.md đã cập nhật số liệu ánh xạ, lệnh test và nhật ký đóng băng ở 96d0086; chunking_strategy.md không còn link file:///.</w:t>
+              <w:t>git ls-tree origin/NMA vẫn có parser/__pycache__/cleaner.cpython-314.pyc và parser.cpython-314.pyc.</w:t>
             </w:r>
           </w:p>
         </w:tc>
@@ -7847,7 +7904,7 @@
               <w:rPr>
                 <w:sz w:val="17"/>
               </w:rPr>
-              <w:t>retrieval/retrieval.md (dòng 12, 18); README.md:61</w:t>
+              <w:t>origin/NMA: parser/__pycache__/</w:t>
             </w:r>
           </w:p>
         </w:tc>
@@ -7864,7 +7921,7 @@
               <w:rPr>
                 <w:sz w:val="17"/>
               </w:rPr>
-              <w:t>Cả nhóm</w:t>
+              <w:t>NMA</w:t>
             </w:r>
           </w:p>
         </w:tc>
@@ -7872,273 +7929,7 @@
           <w:tcPr>
             <w:tcW w:type="dxa" w:w="964"/>
             <w:vAlign w:val="top"/>
-          </w:tcPr>
-          <w:p>
-            <w:pPr>
-              <w:spacing w:after="20" w:line="252" w:lineRule="auto"/>
-            </w:pPr>
-            <w:r>
-              <w:rPr>
-                <w:sz w:val="17"/>
-              </w:rPr>
-              <w:t>Còn một phần (96d0086)</w:t>
-            </w:r>
-          </w:p>
-        </w:tc>
-      </w:tr>
-      <w:tr>
-        <w:tc>
-          <w:tcPr>
-            <w:tcW w:type="dxa" w:w="624"/>
-            <w:vAlign w:val="top"/>
-          </w:tcPr>
-          <w:p>
-            <w:pPr>
-              <w:spacing w:after="20" w:line="252" w:lineRule="auto"/>
-            </w:pPr>
-            <w:r>
-              <w:rPr>
-                <w:b/>
-                <w:sz w:val="17"/>
-              </w:rPr>
-              <w:t>H3</w:t>
-            </w:r>
-          </w:p>
-        </w:tc>
-        <w:tc>
-          <w:tcPr>
-            <w:tcW w:type="dxa" w:w="1020"/>
-            <w:vAlign w:val="top"/>
-            <w:shd w:val="clear" w:color="auto" w:fill="E2EFDA"/>
-          </w:tcPr>
-          <w:p>
-            <w:pPr>
-              <w:spacing w:after="20" w:line="252" w:lineRule="auto"/>
-            </w:pPr>
-            <w:r>
-              <w:rPr>
-                <w:sz w:val="17"/>
-              </w:rPr>
-              <w:t>Thấp</w:t>
-            </w:r>
-          </w:p>
-        </w:tc>
-        <w:tc>
-          <w:tcPr>
-            <w:tcW w:type="dxa" w:w="4479"/>
-            <w:vAlign w:val="top"/>
-          </w:tcPr>
-          <w:p>
-            <w:pPr>
-              <w:spacing w:after="20" w:line="252" w:lineRule="auto"/>
-            </w:pPr>
-            <w:r>
-              <w:rPr>
-                <w:sz w:val="17"/>
-              </w:rPr>
-              <w:t>Code trùng (2 BM25, 3 metric, 2 reranker); ruff báo 248 lỗi (181 tự sửa được).</w:t>
-            </w:r>
-          </w:p>
-          <w:p>
-            <w:pPr>
-              <w:spacing w:after="20" w:line="252" w:lineRule="auto"/>
-            </w:pPr>
-            <w:r>
-              <w:rPr>
-                <w:b/>
-                <w:sz w:val="17"/>
-              </w:rPr>
-              <w:t xml:space="preserve">Đề xuất: </w:t>
-            </w:r>
-            <w:r>
-              <w:rPr>
-                <w:sz w:val="17"/>
-              </w:rPr>
-              <w:t>Chạy ruff --fix trong PR riêng; xóa bản trùng theo F1, F2, E10.</w:t>
-            </w:r>
-          </w:p>
-        </w:tc>
-        <w:tc>
-          <w:tcPr>
-            <w:tcW w:type="dxa" w:w="1701"/>
-            <w:vAlign w:val="top"/>
-          </w:tcPr>
-          <w:p>
-            <w:pPr>
-              <w:spacing w:after="20" w:line="252" w:lineRule="auto"/>
-            </w:pPr>
-            <w:r>
-              <w:rPr>
-                <w:sz w:val="17"/>
-              </w:rPr>
-              <w:t>toàn repo</w:t>
-            </w:r>
-          </w:p>
-        </w:tc>
-        <w:tc>
-          <w:tcPr>
-            <w:tcW w:type="dxa" w:w="1077"/>
-            <w:vAlign w:val="top"/>
-          </w:tcPr>
-          <w:p>
-            <w:pPr>
-              <w:spacing w:after="20" w:line="252" w:lineRule="auto"/>
-            </w:pPr>
-            <w:r>
-              <w:rPr>
-                <w:sz w:val="17"/>
-              </w:rPr>
-              <w:t>Cả nhóm</w:t>
-            </w:r>
-          </w:p>
-        </w:tc>
-        <w:tc>
-          <w:tcPr>
-            <w:tcW w:type="dxa" w:w="964"/>
-            <w:vAlign w:val="top"/>
-            <w:shd w:val="clear" w:color="auto" w:fill="FBE5D6"/>
-          </w:tcPr>
-          <w:p>
-            <w:pPr>
-              <w:spacing w:after="20" w:line="252" w:lineRule="auto"/>
-            </w:pPr>
-            <w:r>
-              <w:rPr>
-                <w:sz w:val="17"/>
-              </w:rPr>
-              <w:t>Còn</w:t>
-            </w:r>
-          </w:p>
-        </w:tc>
-      </w:tr>
-      <w:tr>
-        <w:tc>
-          <w:tcPr>
-            <w:tcW w:type="dxa" w:w="624"/>
-            <w:vAlign w:val="top"/>
-          </w:tcPr>
-          <w:p>
-            <w:pPr>
-              <w:spacing w:after="20" w:line="252" w:lineRule="auto"/>
-            </w:pPr>
-            <w:r>
-              <w:rPr>
-                <w:b/>
-                <w:sz w:val="17"/>
-              </w:rPr>
-              <w:t>H5</w:t>
-            </w:r>
-          </w:p>
-        </w:tc>
-        <w:tc>
-          <w:tcPr>
-            <w:tcW w:type="dxa" w:w="1020"/>
-            <w:vAlign w:val="top"/>
-            <w:shd w:val="clear" w:color="auto" w:fill="E2EFDA"/>
-          </w:tcPr>
-          <w:p>
-            <w:pPr>
-              <w:spacing w:after="20" w:line="252" w:lineRule="auto"/>
-            </w:pPr>
-            <w:r>
-              <w:rPr>
-                <w:sz w:val="17"/>
-              </w:rPr>
-              <w:t>Thấp</w:t>
-            </w:r>
-          </w:p>
-        </w:tc>
-        <w:tc>
-          <w:tcPr>
-            <w:tcW w:type="dxa" w:w="4479"/>
-            <w:vAlign w:val="top"/>
-          </w:tcPr>
-          <w:p>
-            <w:pPr>
-              <w:spacing w:after="20" w:line="252" w:lineRule="auto"/>
-            </w:pPr>
-            <w:r>
-              <w:rPr>
-                <w:sz w:val="17"/>
-              </w:rPr>
-              <w:t>origin/NMA vẫn theo dõi parser/__pycache__/cleaner.cpython-314.pyc và parser.cpython-314.pyc; lần gộp sau từ NMA có thể đưa lại hai file này vào testing.</w:t>
-            </w:r>
-          </w:p>
-          <w:p>
-            <w:pPr>
-              <w:spacing w:after="20" w:line="252" w:lineRule="auto"/>
-            </w:pPr>
-            <w:r>
-              <w:rPr>
-                <w:b/>
-                <w:sz w:val="17"/>
-              </w:rPr>
-              <w:t xml:space="preserve">Đề xuất: </w:t>
-            </w:r>
-            <w:r>
-              <w:rPr>
-                <w:sz w:val="17"/>
-              </w:rPr>
-              <w:t>NMA chạy git rm --cached các file .pyc trên nhánh của mình; CI kiểm git ls-files không có .pyc.</w:t>
-            </w:r>
-          </w:p>
-          <w:p>
-            <w:pPr>
-              <w:spacing w:after="20" w:line="252" w:lineRule="auto"/>
-            </w:pPr>
-            <w:r>
-              <w:rPr>
-                <w:b/>
-                <w:sz w:val="17"/>
-              </w:rPr>
-              <w:t xml:space="preserve">Kiểm chứng: </w:t>
-            </w:r>
-            <w:r>
-              <w:rPr>
-                <w:sz w:val="17"/>
-              </w:rPr>
-              <w:t>testing bỏ theo dõi 2 file ở 5e0b9c2 (và file git diff 46 MB ở thư mục gốc ở 5e0b9c2); chạy pytest không làm đổi file nào trong git.</w:t>
-            </w:r>
-          </w:p>
-        </w:tc>
-        <w:tc>
-          <w:tcPr>
-            <w:tcW w:type="dxa" w:w="1701"/>
-            <w:vAlign w:val="top"/>
-          </w:tcPr>
-          <w:p>
-            <w:pPr>
-              <w:spacing w:after="20" w:line="252" w:lineRule="auto"/>
-            </w:pPr>
-            <w:r>
-              <w:rPr>
-                <w:sz w:val="17"/>
-              </w:rPr>
-              <w:t>origin/NMA: parser/__pycache__/</w:t>
-            </w:r>
-          </w:p>
-        </w:tc>
-        <w:tc>
-          <w:tcPr>
-            <w:tcW w:type="dxa" w:w="1077"/>
-            <w:vAlign w:val="top"/>
-          </w:tcPr>
-          <w:p>
-            <w:pPr>
-              <w:spacing w:after="20" w:line="252" w:lineRule="auto"/>
-            </w:pPr>
-            <w:r>
-              <w:rPr>
-                <w:sz w:val="17"/>
-              </w:rPr>
-              <w:t>NMA</w:t>
-            </w:r>
-          </w:p>
-        </w:tc>
-        <w:tc>
-          <w:tcPr>
-            <w:tcW w:type="dxa" w:w="964"/>
-            <w:vAlign w:val="top"/>
+            <w:shd w:val="clear" w:color="auto" w:fill="FFF2CC"/>
           </w:tcPr>
           <w:p>
             <w:pPr>
@@ -8496,7 +8287,7 @@
               <w:rPr>
                 <w:sz w:val="17"/>
               </w:rPr>
-              <w:t>32 pass, 1 fail; 840c8a3: 209 pass, 14 skip; 64b65f0: 1 fail; 25/10: 0 fail</w:t>
+              <w:t>32 pass, 1 fail; 840c8a3: 209 pass, 14 skip; 64b65f0: 1 fail; 25/10: 0 fail; 5ef41dc: 1 fail; sau bản sửa 26/10: 0 fail</w:t>
             </w:r>
           </w:p>
         </w:tc>
@@ -8513,7 +8304,7 @@
               <w:rPr>
                 <w:sz w:val="17"/>
               </w:rPr>
-              <w:t>Ở 64b65f0: test_tt02a_wrapped_chapter_title_is_complete[9-…] fail vì tiêu đề Chương III của TT 02a/2015 mất dấu phẩy khi ghép dòng (A28). Sau bản sửa A28 (77b5886): hết fail. Chưa có test cho cleaner.</w:t>
+              <w:t>Ở 64b65f0: test_tt02a_wrapped_chapter_title_is_complete[9-…] fail vì tiêu đề Chương III của TT 02a/2015 mất dấu phẩy khi ghép dòng (A28). Sau bản sửa A28 (77b5886): hết fail. Chưa có test cho cleaner. Ở 5ef41dc: test_document_metadata_matches_reference fail vì 86b55f5 đổi title của Luật 52/2014 mà không sửa REFERENCE (A16). Sau bản sửa 26/10 (Phụ lục R): hết fail.</w:t>
             </w:r>
           </w:p>
         </w:tc>
@@ -8530,7 +8321,7 @@
               <w:rPr>
                 <w:sz w:val="17"/>
               </w:rPr>
-              <w:t>A28, A7</w:t>
+              <w:t>A28, A7, A16</w:t>
             </w:r>
           </w:p>
         </w:tc>
@@ -9552,7 +9343,7 @@
               <w:rPr>
                 <w:sz w:val="17"/>
               </w:rPr>
-              <w:t>Chạy riêng từng file; chạy chung tests/ và test/ vẫn lỗi collect. Chạy test làm bẩn git trở lại vì 72a7377 commit lại parser/__pycache__/*.pyc (H5). Sau bản sửa chunking 24/10 (chunking_test): 218 pass, 2 fail (thêm 14 test của test_chunking.py; 2 fail như trên). Ở 840c8a3, parser/: 209 pass, 14 skip (hết fail của A25). Ở 64b65f0, parser/, tests/schema_test.py và test/test_chunking.py: 235 pass, 14 skip, 1 fail (A28). Sau bản sửa A28 (77b5886): 302 pass, 20 skip, 0 fail (thêm 72 test; 6 skip mới là 3 test chạy trên mọi TXT gặp 2 TT chia theo mục La Mã). Ở 3d646da (25/10, sau khi kéo CTM): parser/, tests/schema_test.py, tests/test_dense_retriever.py và test/ (trừ test_benchmark.py) 382 pass, 20 skip, 1 fail (test_bm25_retrieval, H9). Ở be28659 (25/10): 464 pass, 20 skip, 1 fail (H9) khi chạy riêng từng file; chạy chung test/ tests/ vẫn lỗi collect (H2); chạy test vẫn làm đổi parser/__pycache__/parser.cpython-314.pyc (H5) (Phụ lục M). Ở 3b1b6dc (25/10, sau đợt sửa): chạy chung python -m pytest parser tests test: 531 pass, 20 skip, 0 fail, 0 lỗi collect; chạy test không làm đổi file nào trong git (Phụ lục N).</w:t>
+              <w:t>Chạy riêng từng file; chạy chung tests/ và test/ vẫn lỗi collect. Chạy test làm bẩn git trở lại vì 72a7377 commit lại parser/__pycache__/*.pyc (H5). Sau bản sửa chunking 24/10 (chunking_test): 218 pass, 2 fail (thêm 14 test của test_chunking.py; 2 fail như trên). Ở 840c8a3, parser/: 209 pass, 14 skip (hết fail của A25). Ở 64b65f0, parser/, tests/schema_test.py và test/test_chunking.py: 235 pass, 14 skip, 1 fail (A28). Sau bản sửa A28 (77b5886): 302 pass, 20 skip, 0 fail (thêm 72 test; 6 skip mới là 3 test chạy trên mọi TXT gặp 2 TT chia theo mục La Mã). Ở 3d646da (25/10, sau khi kéo CTM): parser/, tests/schema_test.py, tests/test_dense_retriever.py và test/ (trừ test_benchmark.py) 382 pass, 20 skip, 1 fail (test_bm25_retrieval, H9). Ở be28659 (25/10): 464 pass, 20 skip, 1 fail (H9) khi chạy riêng từng file; chạy chung test/ tests/ vẫn lỗi collect (H2); chạy test vẫn làm đổi parser/__pycache__/parser.cpython-314.pyc (H5) (Phụ lục M). Ở 3b1b6dc (25/10, sau đợt sửa): chạy chung python -m pytest parser tests test: 531 pass, 20 skip, 0 fail, 0 lỗi collect; chạy test không làm đổi file nào trong git (Phụ lục N). Ở 948fc94 (kiểm lại cuối 25/10, Phụ lục O): 531 pass, 20 skip, 0 fail; git không đổi sau khi chạy. Ở 01c639e (26/10, sau khi gộp CTM 9348764, Phụ lục P): python -m pytest (testpaths = parser test) 490 pass, 20 skip, 0 fail, 64 subtest pass; ít hơn 41 test vì bỏ bản test benchmark trùng; retrieval/test/ (7 test, pass khi chạy riêng) nằm ngoài testpaths (H2). Ở 5ef41dc (26/10, sau khi gộp NMA 86b55f5, Phụ lục Q): python -m pytest 489 pass, 20 skip, 1 fail (test_document_metadata_matches_reference, A16), 64 subtest pass. Sau bản sửa A16, A7 (26/10, 856e6be..dfc025b, Phụ lục R): python -m pytest 490 pass, 20 skip, 0 fail, 64 subtest pass; retrieval/test 7 pass. Mô phỏng workflow trên bản sao sạch của các file git theo dõi, venv mới Python 3.14 trên Windows, không có cache model: cài đặt thành công, không có file .pyc, compileall không lỗi, python -m pytest 490 pass, 20 skip, 0 fail, retrieval/test 7 pass; chưa thử trên Linux. Sau 21a2385 (testpaths thêm retrieval/test, H2): python -m pytest 497 pass, 20 skip, 0 fail, 64 subtest pass, trên .venv và trên venv sạch.</w:t>
             </w:r>
           </w:p>
         </w:tc>
@@ -9591,7 +9382,7 @@
     <w:p>
       <w:pPr/>
       <w:r>
-        <w:t>Bảng dưới đây là thứ tự làm cho các lỗi còn mở, viết lại cuối ngày 25/10 trên 3b1b6dc. Mỗi bước ghi việc cụ thể, owner, điều kiện để bắt đầu và tiêu chí để coi là xong. Màu ở cột Bước: đỏ là đang chặn các bước sau, vàng là làm ngay khi có điều kiện, xanh là làm sau. Những lỗi đã sửa (mục 3) không có trong bảng. Các lỗi sửa được mà không cần bàn đã sửa xong ngày 25/10 (Phụ lục N); mọi lỗi còn lại cần quyết định, cần thỏa thuận ai làm, hoặc chờ gold đã duyệt để chạy lại số đo.</w:t>
+        <w:t>Bảng dưới đây là thứ tự làm cho các lỗi còn mở, viết lại cuối ngày 25/10 trên 3b1b6dc. Mỗi bước ghi việc cụ thể, owner, điều kiện để bắt đầu và tiêu chí để coi là xong. Màu ở cột Bước: đỏ là đang chặn các bước sau, vàng là làm ngay khi có điều kiện, xanh là làm sau. Những lỗi đã sửa (mục 3) không có trong bảng. Các lỗi sửa được mà không cần bàn đã sửa xong ngày 25/10 (Phụ lục N); mọi lỗi còn lại cần quyết định, cần thỏa thuận ai làm, hoặc chờ gold đã duyệt để chạy lại số đo. Kiểm lại trên 948fc94 (Phụ lục O): thứ tự giữ nguyên; bước 2 thêm phần E4 (Dense dừng khi thiếu underthesea), vì từ 664634e corpus đã tách từ nên máy thiếu underthesea cho kết quả Dense lệch mà không báo. Sau khi gộp CTM 9348764 (Phụ lục P): thứ tự giữ nguyên; bước 0 dùng python -m pytest, và việc gom thư mục test (H2) chỉ còn retrieval/test/. Sau khi gộp NMA 86b55f5 (Phụ lục Q): thứ tự giữ nguyên; bước 1 thêm phần A16 không cần bàn (sửa test, hai bảng ID, sinh lại corpus và Qdrant theo title mới), còn cách ghi title chờ Dev 1. Sau bản sửa 26/10 (Phụ lục R): bước 0 chỉ còn push workflow CI và bật branch protection; ở bước 1, A16 chỉ còn cách ghi title. Sau 21a2385: H2 đã sửa nên bước 0 bỏ phần H2.</w:t>
       </w:r>
     </w:p>
     <w:tbl>
@@ -9754,7 +9545,7 @@
               <w:rPr>
                 <w:sz w:val="17"/>
               </w:rPr>
-              <w:t>Thêm CI hoặc pre-commit hook chạy python -m pytest parser tests test và python -m compileall cho scripts/, evaluation/, retrieval/, reranking/, chặn merge khi fail (A7). NMA bỏ theo dõi .pyc trên nhánh của mình (H5). Thống nhất một thư mục test (H2).</w:t>
+              <w:t>Push .github/workflows/tests.yml (chạy python -m pytest, compileall và kiểm file .pyc trên mọi push và PR); admin repo bật branch protection để chặn merge khi fail (A7). NMA bỏ theo dõi .pyc trên nhánh của mình (H5).</w:t>
             </w:r>
           </w:p>
         </w:tc>
@@ -9770,7 +9561,7 @@
               <w:rPr>
                 <w:sz w:val="17"/>
               </w:rPr>
-              <w:t>A7, H5, H2</w:t>
+              <w:t>A7, H5</w:t>
             </w:r>
           </w:p>
         </w:tc>
@@ -9854,7 +9645,7 @@
               <w:rPr>
                 <w:sz w:val="17"/>
               </w:rPr>
-              <w:t>Dev 1 chốt phiên bản Luật 52/2014 (A6), cách xử lý 2 TT chia theo mục La Mã (A26), title chính thức (A16), số phận context_registry.json và duyệt 334 dòng mới của article_index (C5). Đổi các mặc định còn trỏ file smoke, xóa all_legal_chunks.json và data/parser_validated/ (B4, H7).</w:t>
+              <w:t>Dev 1 chốt phiên bản Luật 52/2014 (A6), cách xử lý 2 TT chia theo mục La Mã (A26), cách ghi title (A16: chỉ ghi trích yếu ở 5 văn bản cũ), số phận context_registry.json và duyệt 334 dòng mới của article_index (C5). Đổi các mặc định còn trỏ file smoke, xóa all_legal_chunks.json và data/parser_validated/ (B4, H7).</w:t>
             </w:r>
           </w:p>
         </w:tc>
@@ -9954,7 +9745,7 @@
               <w:rPr>
                 <w:sz w:val="17"/>
               </w:rPr>
-              <w:t>(a) Chọn 50–100 câu phân tầng, duyệt gold ở cấp Khoản, ghi tên người xác minh thật (D1); 11 câu đã duyệt của gold_id_proposals_300.json là điểm bắt đầu. (b) Lọc theo khoảng effective_from/effective_to và as_of_date trong Elasticsearch và Qdrant, bỏ bộ lọc tĩnh “Hết hiệu lực”, cho search() nhận as_of_date (E1); pipeline đã truyền as_of_date từ 3b1b6dc. (c) Tách từ câu hỏi cùng phiên bản với corpus (B2). (d) Index BM25 lưu đủ trường contract và parent_id thật (E6).</w:t>
+              <w:t>(a) Chọn 50–100 câu phân tầng, duyệt gold ở cấp Khoản, ghi tên người xác minh thật (D1); 11 câu đã duyệt của gold_id_proposals_300.json là điểm bắt đầu. (b) Lọc theo khoảng effective_from/effective_to và as_of_date trong Elasticsearch và Qdrant, bỏ bộ lọc tĩnh “Hết hiệu lực”, cho search() nhận as_of_date (E1); pipeline đã truyền as_of_date từ 3b1b6dc. (c) Tách từ câu hỏi cùng phiên bản với corpus ở BM25 (B2); Dense dừng với lỗi rõ khi model cần tách từ mà thiếu underthesea (E4). (d) Index BM25 lưu đủ trường contract và parent_id thật (E6).</w:t>
             </w:r>
           </w:p>
         </w:tc>
@@ -9970,7 +9761,7 @@
               <w:rPr>
                 <w:sz w:val="17"/>
               </w:rPr>
-              <w:t>D1, E1, B2, E6</w:t>
+              <w:t>D1, E1, B2, E4, E6</w:t>
             </w:r>
           </w:p>
         </w:tc>
@@ -9986,7 +9777,7 @@
               <w:rPr>
                 <w:sz w:val="17"/>
               </w:rPr>
-              <w:t>Dev 1 (D1); Dev 4 + Dev 3 (E1, B2, E6)</w:t>
+              <w:t>Dev 1 (D1); Dev 4 + Dev 3 (E1, B2, E6); Dev 3 (E4)</w:t>
             </w:r>
           </w:p>
         </w:tc>
@@ -10054,7 +9845,7 @@
               <w:rPr>
                 <w:sz w:val="17"/>
               </w:rPr>
-              <w:t>Một module metric chung có Strict Match và Parent Match, báo số câu được chấm (F2). Thêm retrieval.retrieval_top_k, hybrid.fusion và một hàm đọc config dùng chung (E8). Tiền xử lý Dense theo cờ của model (E4); bỏ nhánh tự chunk lại (E12); thống nhất xử lý câu hỏi rỗng (E14); rút gọn bản ghi chunk (B7, cần Dev 1 chốt C1). Khi có khoảng 100 câu đã duyệt: chọn model dense (E2), rrf_k (E8) và cách chấm của reranker (G5).</w:t>
+              <w:t>Một module metric chung có Strict Match và Parent Match, báo số câu được chấm (F2). Thêm retrieval.retrieval_top_k, hybrid.fusion và một hàm đọc config dùng chung (E8). Tiền xử lý Dense theo cờ tách từ của model (E4); bỏ nhánh tự chunk lại (E12); thống nhất xử lý câu hỏi rỗng (E14); rút gọn bản ghi chunk (B7, cần Dev 1 chốt C1). Khi có khoảng 100 câu đã duyệt: chọn model dense (E2), rrf_k (E8) và cách chấm của reranker (G5).</w:t>
             </w:r>
           </w:p>
         </w:tc>
@@ -10102,7 +9893,7 @@
               <w:rPr>
                 <w:sz w:val="17"/>
               </w:rPr>
-              <w:t>F2, E8 (khóa config), E14: ngay. E2, E4, rrf_k, G5: sau khi bước 2 có gold.</w:t>
+              <w:t>F2, E8 (khóa config), E14: ngay. E2, E4 (cờ tách từ theo model), rrf_k, G5: sau khi bước 2 có gold.</w:t>
             </w:r>
           </w:p>
         </w:tc>
@@ -10451,7 +10242,7 @@
               <w:rPr>
                 <w:sz w:val="17"/>
               </w:rPr>
-              <w:t>Sửa hết: A8, A11, A25, B3, C10, D3, D4, D5, E3, E7, E9, E10, E15, G1, G2, G6, H9. Sửa một phần: A7, B2, B4, C2, C4, C5, E11, E14, F1, G5, H2, H4, H5.</w:t>
+              <w:t>Sửa hết: A8, A11, A25, B3, C10, D3, D4, D5, E3, E7, E9, E10, E15, G1, G2, G6, H9. Sửa một phần: A7, B2, B4, C2, C4, C5, E4 (corpus 664634e), E11, E14, F1, F3, F5, G5, H2, H4, H5. Ngày 26/10 (Phụ lục R; 856e6be, 4ec0706, dfc025b): sửa thêm một phần A16 (test, hai bảng ID, NĐ 207/2025, corpus) và A7 (workflow CI). Sửa hết H2 ở 21a2385.</w:t>
             </w:r>
           </w:p>
         </w:tc>
@@ -10467,7 +10258,7 @@
               <w:rPr>
                 <w:sz w:val="17"/>
               </w:rPr>
-              <w:t>9 commit 5e0b9c2..96d0086 trên testing, chưa push (Phụ lục N). File của người khác chỉ sửa cơ học; nên báo owner trước khi gộp.</w:t>
+              <w:t>10 commit 5e0b9c2..948fc94 (gồm commit báo cáo), đã push lên origin/testing (Phụ lục N, O). File của người khác chỉ sửa cơ học; nên báo owner trước khi gộp.</w:t>
             </w:r>
           </w:p>
         </w:tc>
@@ -10502,7 +10293,7 @@
               <w:rPr>
                 <w:sz w:val="17"/>
               </w:rPr>
-              <w:t>E1, E6, E8 (khóa config), F2, B2 (phía truy vấn), B4 và H7 (mặc định, file cũ), H8, A7 (CI), H2 (gom thư mục), H5 (nhánh NMA)</w:t>
+              <w:t>E1, E4 (Dense dừng khi thiếu underthesea), E6, E8 (khóa config), F2, B2 (phía truy vấn), B4 và H7 (mặc định, file cũ), H8, A7 (push workflow, branch protection), H5 (nhánh NMA)</w:t>
             </w:r>
           </w:p>
         </w:tc>
@@ -10553,7 +10344,7 @@
               <w:rPr>
                 <w:sz w:val="17"/>
               </w:rPr>
-              <w:t>A6, A16, A26, C5 (context_registry.json, duyệt article_index), B5, B7, D1, D2 (Dev 1); E2, E4, E12 (Dev 3); E14 (câu hỏi rỗng: Dev 3 + Dev 4); E11 (backlog sau Sprint 6); H1, H3 (cả nhóm)</w:t>
+              <w:t>A6, A16 (cách ghi title), A26, C5 (context_registry.json, duyệt article_index), B5, B7, D1, D2 (Dev 1); E2, E4 (cờ tách từ theo model), E12 (Dev 3); E14 (câu hỏi rỗng: Dev 3 + Dev 4); E11 (backlog sau Sprint 6); H1, H3 (cả nhóm)</w:t>
             </w:r>
           </w:p>
         </w:tc>
@@ -10620,7 +10411,7 @@
               <w:rPr>
                 <w:sz w:val="17"/>
               </w:rPr>
-              <w:t>Code đã sửa xong ở C2, C4, F1, G5; chỉ còn chạy lại và thay file kết quả cũ. G3 cần máy đủ bộ nhớ cho cả model dense và reranker.</w:t>
+              <w:t>Code đã sửa xong ở C2, C4, F1, G5; chỉ còn chạy lại và thay file kết quả cũ. F3, F5 đã sửa phần index và ID; còn đổi nguồn gold và thêm kiểm tra trước khi chạy Test. G3 cần máy đủ bộ nhớ cho cả model dense và reranker.</w:t>
             </w:r>
           </w:p>
         </w:tc>
@@ -10787,7 +10578,7 @@
               <w:rPr>
                 <w:sz w:val="17"/>
               </w:rPr>
-              <w:t>Không còn lỗi parser sửa được mà không cần quyết định; chờ Dev 1 chốt A6, A26.</w:t>
+              <w:t>Không còn lỗi parser sửa được mà không cần quyết định; chờ Dev 1 chốt A6, A26 và cách ghi title (A16).</w:t>
             </w:r>
           </w:p>
         </w:tc>
@@ -10838,7 +10629,7 @@
               <w:rPr>
                 <w:sz w:val="17"/>
               </w:rPr>
-              <w:t>Xóa data/parser_validated/ cùng Dev 3 sửa tests/schema_test.py và prepare_all_chunk_dataset.py (B4, H7); chạy lại export khi Dev 1 chốt A6; B7 khi Dev 1 chốt C1.</w:t>
+              <w:t>Xóa data/parser_validated/ cùng Dev 3 sửa test/schema_test.py và prepare_all_chunk_dataset.py (B4, H7); chạy lại export khi Dev 1 chốt A6; B7 khi Dev 1 chốt C1.</w:t>
             </w:r>
           </w:p>
         </w:tc>
@@ -10940,7 +10731,7 @@
               <w:rPr>
                 <w:sz w:val="17"/>
               </w:rPr>
-              <w:t>E4, E12, cùng Dev 4 chốt E14; đổi mặc định smoke ở embedding/ (B4, H7); chọn model dense (E2) khi có gold.</w:t>
+              <w:t>E4 (trước hết dừng khi thiếu underthesea), E12, cùng Dev 4 chốt E14; đổi mặc định smoke ở embedding/ (B4, H7); chọn model dense (E2) khi có gold.</w:t>
             </w:r>
           </w:p>
         </w:tc>
@@ -10956,7 +10747,7 @@
               <w:rPr>
                 <w:sz w:val="17"/>
               </w:rPr>
-              <w:t>1 → 3</w:t>
+              <w:t>1 → 2 → 3</w:t>
             </w:r>
           </w:p>
         </w:tc>
@@ -11042,7 +10833,7 @@
               <w:rPr>
                 <w:sz w:val="17"/>
               </w:rPr>
-              <w:t>F2; chạy lại evaluation/results bằng code hiện tại (F1, C4, F5, F6).</w:t>
+              <w:t>F2 (gồm báo lỗi khi câu Test có gold rỗng, F3); chạy lại evaluation/results bằng code hiện tại (F1, C4, F5, F6).</w:t>
             </w:r>
           </w:p>
         </w:tc>
@@ -11169,7 +10960,7 @@
     <w:p>
       <w:pPr/>
       <w:r>
-        <w:t>Trước khi commit, kiểm 4 điều: report ghi tokenization_backend = “underthesea” và tokenization_version khớp phiên bản ghim; số chunk và parent hợp lý (chunker đã sửa trên parser 72a7377 cho 1.157 / 508 với 11 văn bản cũ và 2.003 / 923 với đủ 21 văn bản; trên parser 840c8a3 cho 2.011 / 923); Luật 52/2014 Điều 2 có đủ 5 Khoản và không chứa chú thích VBHN, NĐ 10/2015 không còn nhãn “Hướng dẫn” (A25), Điều 123 khoản 3 đúng phiên bản đã chốt (A6); tests/schema_test.py và test/test_chunking.py pass; git status không có file .pyc bị đổi (nếu có thì git checkout -- các thư mục __pycache__). Sau khi sinh lại corpus: chạy python scripts/import_chunk_index.py --input data/chunking_output/chunks.jsonl --force (test/test_reference_sync.py fail nếu quên, hoặc nếu benchmark còn chunk_id không có trong corpus), map lại candidate theo nội dung nếu chunk_id đổi, rồi dựng lại index bằng python -m retrieval.build_bm25_index --recreate và python scripts/build_index.py.</w:t>
+        <w:t>Trước khi commit, kiểm 4 điều: report ghi tokenization_backend = “underthesea” và tokenization_version khớp phiên bản ghim; số chunk và parent hợp lý (chunker đã sửa trên parser 72a7377 cho 1.157 / 508 với 11 văn bản cũ và 2.003 / 923 với đủ 21 văn bản; trên parser 840c8a3 cho 2.011 / 923); Luật 52/2014 Điều 2 có đủ 5 Khoản và không chứa chú thích VBHN, NĐ 10/2015 không còn nhãn “Hướng dẫn” (A25), Điều 123 khoản 3 đúng phiên bản đã chốt (A6); test/schema_test.py và test/test_chunking.py pass; git status không có file .pyc bị đổi (nếu có thì git checkout -- các thư mục __pycache__). Sau khi sinh lại corpus: chạy python scripts/import_chunk_index.py --input data/chunking_output/chunks.jsonl --force (test/test_reference_sync.py fail nếu quên, hoặc nếu benchmark còn chunk_id không có trong corpus), map lại candidate theo nội dung nếu chunk_id đổi, rồi dựng lại index bằng python -m retrieval.build_bm25_index --recreate và python scripts/build_index.py.</w:t>
       </w:r>
     </w:p>
     <w:p>
@@ -18038,6 +17829,1716 @@
                 <w:sz w:val="17"/>
               </w:rPr>
               <w:t>Chạy chung python -m pytest parser tests test: 531 pass, 20 skip, 0 fail; git không đổi sau khi chạy.</w:t>
+            </w:r>
+          </w:p>
+        </w:tc>
+      </w:tr>
+    </w:tbl>
+    <w:p>
+      <w:pPr>
+        <w:pStyle w:val="Heading1"/>
+      </w:pPr>
+      <w:r>
+        <w:rPr/>
+        <w:t>Phụ lục O. Kiểm lại các dòng còn mở trên 948fc94 (25/10)</w:t>
+      </w:r>
+    </w:p>
+    <w:p>
+      <w:r>
+        <w:rPr/>
+        <w:t>Kiểm lại cuối ngày 25/10/2026 trên commit 948fc94 của testing, đã push lên origin/testing (từ 3b1b6dc chỉ thêm 96d0086 tài liệu và 948fc94 báo cáo). Các nhánh remote khác không có commit mới (origin/CTM 3d646da, origin/NMA 1260ed8). Cách kiểm: đọc lại code ở cột Vị trí của từng dòng còn mở; đếm trên corpus 664634e (2.011 chunk, 21 văn bản) các chỉ số của B5, B7, E1, E4; đếm chunk_id của retrieval/results, evaluation/results, gold_id_proposals_300.json và context_registry.json thuộc corpus; git ls-files tìm .pyc trên testing và origin/NMA; chạy python -m pytest parser tests test (.venv, Python 3.14), validate_benchmark.py và ruff check trên các file .py được git theo dõi (trừ RAG/). Không sửa code.</w:t>
+      </w:r>
+    </w:p>
+    <w:tbl>
+      <w:tblPr>
+        <w:tblStyle w:val="TableGrid"/>
+        <w:tblW w:type="auto" w:w="0"/>
+        <w:jc w:val="center"/>
+        <w:tblLayout w:type="fixed"/>
+        <w:tblLook w:firstColumn="1" w:firstRow="1" w:lastColumn="0" w:lastRow="0" w:noHBand="0" w:noVBand="1" w:val="04A0"/>
+      </w:tblPr>
+      <w:tblGrid>
+        <w:gridCol w:w="1100"/>
+        <w:gridCol w:w="3200"/>
+        <w:gridCol w:w="5566"/>
+      </w:tblGrid>
+      <w:tr>
+        <w:trPr>
+          <w:tblHeader w:val="true"/>
+        </w:trPr>
+        <w:tc>
+          <w:tcPr>
+            <w:tcW w:type="dxa" w:w="1100"/>
+            <w:shd w:val="clear" w:color="auto" w:fill="DCE6F1"/>
+          </w:tcPr>
+          <w:p>
+            <w:r>
+              <w:rPr>
+                <w:b/>
+                <w:sz w:val="17"/>
+              </w:rPr>
+              <w:t>#</w:t>
+            </w:r>
+          </w:p>
+        </w:tc>
+        <w:tc>
+          <w:tcPr>
+            <w:tcW w:type="dxa" w:w="3200"/>
+            <w:shd w:val="clear" w:color="auto" w:fill="DCE6F1"/>
+          </w:tcPr>
+          <w:p>
+            <w:r>
+              <w:rPr>
+                <w:b/>
+                <w:sz w:val="17"/>
+              </w:rPr>
+              <w:t>Docx ghi</w:t>
+            </w:r>
+          </w:p>
+        </w:tc>
+        <w:tc>
+          <w:tcPr>
+            <w:tcW w:type="dxa" w:w="5566"/>
+            <w:shd w:val="clear" w:color="auto" w:fill="DCE6F1"/>
+          </w:tcPr>
+          <w:p>
+            <w:r>
+              <w:rPr>
+                <w:b/>
+                <w:sz w:val="17"/>
+              </w:rPr>
+              <w:t>Ở 948fc94 (25/10)</w:t>
+            </w:r>
+          </w:p>
+        </w:tc>
+      </w:tr>
+      <w:tr>
+        <w:tc>
+          <w:tcPr>
+            <w:tcW w:type="dxa" w:w="1100"/>
+          </w:tcPr>
+          <w:p>
+            <w:r>
+              <w:rPr>
+                <w:b/>
+                <w:sz w:val="17"/>
+              </w:rPr>
+              <w:t>E4</w:t>
+            </w:r>
+          </w:p>
+        </w:tc>
+        <w:tc>
+          <w:tcPr>
+            <w:tcW w:type="dxa" w:w="3200"/>
+          </w:tcPr>
+          <w:p>
+            <w:r>
+              <w:rPr>
+                <w:sz w:val="17"/>
+              </w:rPr>
+              <w:t>Còn; corpus chưa tách từ (1/1.164 embed_text có “_”) nên bkai tách từ câu hỏi mà không tách corpus.</w:t>
+            </w:r>
+          </w:p>
+        </w:tc>
+        <w:tc>
+          <w:tcPr>
+            <w:tcW w:type="dxa" w:w="5566"/>
+          </w:tcPr>
+          <w:p>
+            <w:r>
+              <w:rPr>
+                <w:sz w:val="17"/>
+              </w:rPr>
+              <w:t>Còn một phần (664634e). Corpus sinh lại đã tách từ: 2.011/2.011 embed_text có “_”, chunking_report.json ghi underthesea 9.5.0; bkai trên máy có underthesea nay cùng dạng ở hai phía. Còn: im lặng bỏ tách từ khi thiếu underthesea (nay lệch theo chiều ngược lại: câu hỏi thô, corpus tách từ), quyết định theo tên model, model khác bkai nhận corpus đã tách từ, index không ghi cờ tách từ.</w:t>
+            </w:r>
+          </w:p>
+        </w:tc>
+      </w:tr>
+      <w:tr>
+        <w:tc>
+          <w:tcPr>
+            <w:tcW w:type="dxa" w:w="1100"/>
+          </w:tcPr>
+          <w:p>
+            <w:r>
+              <w:rPr>
+                <w:b/>
+                <w:sz w:val="17"/>
+              </w:rPr>
+              <w:t>F5</w:t>
+            </w:r>
+          </w:p>
+        </w:tc>
+        <w:tc>
+          <w:tcPr>
+            <w:tcW w:type="dxa" w:w="3200"/>
+          </w:tcPr>
+          <w:p>
+            <w:r>
+              <w:rPr>
+                <w:sz w:val="17"/>
+              </w:rPr>
+              <w:t>Còn; proposal khớp 0/330 ID của corpus, 31 ID không còn trong corpus; Recall@5 0,386.</w:t>
+            </w:r>
+          </w:p>
+        </w:tc>
+        <w:tc>
+          <w:tcPr>
+            <w:tcW w:type="dxa" w:w="5566"/>
+          </w:tcPr>
+          <w:p>
+            <w:r>
+              <w:rPr>
+                <w:sz w:val="17"/>
+              </w:rPr>
+              <w:t>Còn một phần (146a6c9). 555/570 ID khác nhau của proposal có trong corpus, 15 ID còn lại là version_*. Còn: run_baselines.py chấm trên proposal, kết quả cũ chưa xóa. Recall@5 trong bm25_dev_metrics.json là 0,305.</w:t>
+            </w:r>
+          </w:p>
+        </w:tc>
+      </w:tr>
+      <w:tr>
+        <w:tc>
+          <w:tcPr>
+            <w:tcW w:type="dxa" w:w="1100"/>
+          </w:tcPr>
+          <w:p>
+            <w:r>
+              <w:rPr>
+                <w:b/>
+                <w:sz w:val="17"/>
+              </w:rPr>
+              <w:t>F3</w:t>
+            </w:r>
+          </w:p>
+        </w:tc>
+        <w:tc>
+          <w:tcPr>
+            <w:tcW w:type="dxa" w:w="3200"/>
+          </w:tcPr>
+          <w:p>
+            <w:r>
+              <w:rPr>
+                <w:sz w:val="17"/>
+              </w:rPr>
+              <w:t>Còn; run_final_test.py dựng lại index như F1.</w:t>
+            </w:r>
+          </w:p>
+        </w:tc>
+        <w:tc>
+          <w:tcPr>
+            <w:tcW w:type="dxa" w:w="5566"/>
+          </w:tcPr>
+          <w:p>
+            <w:r>
+              <w:rPr>
+                <w:sz w:val="17"/>
+              </w:rPr>
+              <w:t>Còn một phần (f32754e). run_bm25 không còn dựng index. Còn: chỉ chạy BM25, không kiểm cấu hình và SHA-256; 0/15 câu Test có gold trong ground_truth.json nên không câu nào được chấm.</w:t>
+            </w:r>
+          </w:p>
+        </w:tc>
+      </w:tr>
+      <w:tr>
+        <w:tc>
+          <w:tcPr>
+            <w:tcW w:type="dxa" w:w="1100"/>
+          </w:tcPr>
+          <w:p>
+            <w:r>
+              <w:rPr>
+                <w:b/>
+                <w:sz w:val="17"/>
+              </w:rPr>
+              <w:t>H8</w:t>
+            </w:r>
+          </w:p>
+        </w:tc>
+        <w:tc>
+          <w:tcPr>
+            <w:tcW w:type="dxa" w:w="3200"/>
+          </w:tcPr>
+          <w:p>
+            <w:r>
+              <w:rPr>
+                <w:sz w:val="17"/>
+              </w:rPr>
+              <w:t>Còn word_segment (ImportError), cleaner, parse_text_to_articles.</w:t>
+            </w:r>
+          </w:p>
+        </w:tc>
+        <w:tc>
+          <w:tcPr>
+            <w:tcW w:type="dxa" w:w="5566"/>
+          </w:tcPr>
+          <w:p>
+            <w:r>
+              <w:rPr>
+                <w:sz w:val="17"/>
+              </w:rPr>
+              <w:t>Còn một phần. word_segment của chunker raise RuntimeError khi thiếu underthesea (B2, 24/10). Còn: parser.py dòng 1006 bỏ Điều khi dựng clause lỗi; cleaner.py 8 chỗ except Exception; dense_retriever.py dòng 14–20 (E4). Cột Vị trí cập nhật theo code hiện tại; thêm Đề xuất.</w:t>
+            </w:r>
+          </w:p>
+        </w:tc>
+      </w:tr>
+      <w:tr>
+        <w:tc>
+          <w:tcPr>
+            <w:tcW w:type="dxa" w:w="1100"/>
+          </w:tcPr>
+          <w:p>
+            <w:r>
+              <w:rPr>
+                <w:b/>
+                <w:sz w:val="17"/>
+              </w:rPr>
+              <w:t>F1</w:t>
+            </w:r>
+          </w:p>
+        </w:tc>
+        <w:tc>
+          <w:tcPr>
+            <w:tcW w:type="dxa" w:w="3200"/>
+          </w:tcPr>
+          <w:p>
+            <w:r>
+              <w:rPr>
+                <w:sz w:val="17"/>
+              </w:rPr>
+              <w:t>0/1.425 ID thuộc corpus hiện tại (324 ID smoke l01_); R@5 = 0,386.</w:t>
+            </w:r>
+          </w:p>
+        </w:tc>
+        <w:tc>
+          <w:tcPr>
+            <w:tcW w:type="dxa" w:w="5566"/>
+          </w:tcPr>
+          <w:p>
+            <w:r>
+              <w:rPr>
+                <w:sz w:val="17"/>
+              </w:rPr>
+              <w:t>Đo lại trên corpus 664634e: 524/1.425 ID (251/662 ID khác nhau) có trong corpus, 213 ID smoke l01_; bm25_dev_metrics.json ghi Recall@5 0,305. Trạng thái không đổi.</w:t>
+            </w:r>
+          </w:p>
+        </w:tc>
+      </w:tr>
+      <w:tr>
+        <w:tc>
+          <w:tcPr>
+            <w:tcW w:type="dxa" w:w="1100"/>
+          </w:tcPr>
+          <w:p>
+            <w:r>
+              <w:rPr>
+                <w:b/>
+                <w:sz w:val="17"/>
+              </w:rPr>
+              <w:t>B5, B7</w:t>
+            </w:r>
+          </w:p>
+        </w:tc>
+        <w:tc>
+          <w:tcPr>
+            <w:tcW w:type="dxa" w:w="3200"/>
+          </w:tcPr>
+          <w:p>
+            <w:r>
+              <w:rPr>
+                <w:sz w:val="17"/>
+              </w:rPr>
+              <w:t>Số đo trên corpus 11 văn bản và corpus thử 21 văn bản.</w:t>
+            </w:r>
+          </w:p>
+        </w:tc>
+        <w:tc>
+          <w:tcPr>
+            <w:tcW w:type="dxa" w:w="5566"/>
+          </w:tcPr>
+          <w:p>
+            <w:r>
+              <w:rPr>
+                <w:sz w:val="17"/>
+              </w:rPr>
+              <w:t>Đo lại trên corpus 664634e. B5: 31 nhóm trùng nội dung (62 chunk), 128 chunk dưới 20 từ. B7: 31 trường cấp gốc, 18 trường metadata (source_status, provision_status thêm ở 3d646da), effective_to có giá trị ở 912/2.011 chunk. Trạng thái không đổi.</w:t>
+            </w:r>
+          </w:p>
+        </w:tc>
+      </w:tr>
+      <w:tr>
+        <w:tc>
+          <w:tcPr>
+            <w:tcW w:type="dxa" w:w="1100"/>
+          </w:tcPr>
+          <w:p>
+            <w:r>
+              <w:rPr>
+                <w:b/>
+                <w:sz w:val="17"/>
+              </w:rPr>
+              <w:t>E1, H1</w:t>
+            </w:r>
+          </w:p>
+        </w:tc>
+        <w:tc>
+          <w:tcPr>
+            <w:tcW w:type="dxa" w:w="3200"/>
+          </w:tcPr>
+          <w:p>
+            <w:r>
+              <w:rPr>
+                <w:sz w:val="17"/>
+              </w:rPr>
+              <w:t>Bộ lọc tĩnh loại 445/1.160 chunk; main chậm 38 commit.</w:t>
+            </w:r>
+          </w:p>
+        </w:tc>
+        <w:tc>
+          <w:tcPr>
+            <w:tcW w:type="dxa" w:w="5566"/>
+          </w:tcPr>
+          <w:p>
+            <w:r>
+              <w:rPr>
+                <w:sz w:val="17"/>
+              </w:rPr>
+              <w:t>912/2.011 chunk Hết hiệu lực vẫn bị must_not của BM25 (hybrid_retriever.py dòng 52) và build_active_legal_filter của Qdrant (vector_store.py dòng 258–276) loại ở mọi câu hỏi; main chậm 98 commit so với testing. Trạng thái không đổi.</w:t>
+            </w:r>
+          </w:p>
+        </w:tc>
+      </w:tr>
+      <w:tr>
+        <w:tc>
+          <w:tcPr>
+            <w:tcW w:type="dxa" w:w="1100"/>
+          </w:tcPr>
+          <w:p>
+            <w:r>
+              <w:rPr>
+                <w:b/>
+                <w:sz w:val="17"/>
+              </w:rPr>
+              <w:t>Không đổi</w:t>
+            </w:r>
+          </w:p>
+        </w:tc>
+        <w:tc>
+          <w:tcPr>
+            <w:tcW w:type="dxa" w:w="3200"/>
+          </w:tcPr>
+          <w:p>
+            <w:r>
+              <w:rPr>
+                <w:sz w:val="17"/>
+              </w:rPr>
+              <w:t>Như mục 3.</w:t>
+            </w:r>
+          </w:p>
+        </w:tc>
+        <w:tc>
+          <w:tcPr>
+            <w:tcW w:type="dxa" w:w="5566"/>
+          </w:tcPr>
+          <w:p>
+            <w:r>
+              <w:rPr>
+                <w:sz w:val="17"/>
+              </w:rPr>
+              <w:t>A6 (L01.txt dòng 1150 vẫn “cấp huyện”), A7 (.github/ rỗng, không được git theo dõi), A16, A26 (KNOWN_UNPARSEABLE_TXT ở test_parser_unit.py dòng 308), B2 (BM25 vẫn tìm content_segmented bằng câu hỏi thô), B4 và H7 (5 script còn trỏ file smoke hoặc data/parser_validated/), C2 (6 file retrieval/results dạng phẳng, 0 chunk_id thuộc corpus), C4, C5 (context_registry.json 0/321), D1 (300/300 câu draft, gold rỗng), D2 (Test 15 câu, chưa có docs/test_gold_freeze.json), E2 (config.yaml ghi BGE-M3, code mặc định bkai, _ensure_collection không so số chiều), E6, E8, E11, E12, E14, F2, F4, F6, G3, G5, H2, H4, H5 (origin/NMA vẫn theo dõi 2 file .pyc). H3: ruff check trên các file .py được git theo dõi (trừ RAG/) báo 317 lỗi, 219 tự sửa được; register đo 248</w:t>
+            </w:r>
+          </w:p>
+          <w:p>
+            <w:r>
+              <w:rPr>
+                <w:sz w:val="17"/>
+              </w:rPr>
+              <w:t>181, có thể trên phạm vi khác, nên giữ mô tả của register.</w:t>
+            </w:r>
+          </w:p>
+        </w:tc>
+      </w:tr>
+      <w:tr>
+        <w:tc>
+          <w:tcPr>
+            <w:tcW w:type="dxa" w:w="1100"/>
+          </w:tcPr>
+          <w:p>
+            <w:r>
+              <w:rPr>
+                <w:b/>
+                <w:sz w:val="17"/>
+              </w:rPr>
+              <w:t>Mục 5</w:t>
+            </w:r>
+          </w:p>
+        </w:tc>
+        <w:tc>
+          <w:tcPr>
+            <w:tcW w:type="dxa" w:w="3200"/>
+          </w:tcPr>
+          <w:p>
+            <w:r>
+              <w:rPr>
+                <w:sz w:val="17"/>
+              </w:rPr>
+              <w:t>Bước 2 (c) chỉ có B2.</w:t>
+            </w:r>
+          </w:p>
+        </w:tc>
+        <w:tc>
+          <w:tcPr>
+            <w:tcW w:type="dxa" w:w="5566"/>
+          </w:tcPr>
+          <w:p>
+            <w:r>
+              <w:rPr>
+                <w:sz w:val="17"/>
+              </w:rPr>
+              <w:t>Thêm E4 (Dense dừng khi thiếu underthesea) vào bước 2: từ 664634e corpus đã tách từ, máy thiếu underthesea cho kết quả Dense lệch mà không báo. Cờ tách từ theo model vẫn ở bước 3 cùng E2. Thứ tự các bước khác giữ nguyên. Bảng phân loại: F3, F5, E4 vào nhóm 1 (sửa một phần); phần dừng khi thiếu underthesea của E4 vào nhóm 2.</w:t>
+            </w:r>
+          </w:p>
+        </w:tc>
+      </w:tr>
+      <w:tr>
+        <w:tc>
+          <w:tcPr>
+            <w:tcW w:type="dxa" w:w="1100"/>
+          </w:tcPr>
+          <w:p>
+            <w:r>
+              <w:rPr>
+                <w:b/>
+                <w:sz w:val="17"/>
+              </w:rPr>
+              <w:t>Test</w:t>
+            </w:r>
+          </w:p>
+        </w:tc>
+        <w:tc>
+          <w:tcPr>
+            <w:tcW w:type="dxa" w:w="3200"/>
+          </w:tcPr>
+          <w:p>
+            <w:r>
+              <w:rPr>
+                <w:sz w:val="17"/>
+              </w:rPr>
+              <w:t>Ở 3b1b6dc: 531 pass, 20 skip, 0 fail.</w:t>
+            </w:r>
+          </w:p>
+        </w:tc>
+        <w:tc>
+          <w:tcPr>
+            <w:tcW w:type="dxa" w:w="5566"/>
+          </w:tcPr>
+          <w:p>
+            <w:r>
+              <w:rPr>
+                <w:sz w:val="17"/>
+              </w:rPr>
+              <w:t>Ở 948fc94: python -m pytest parser tests test 531 pass, 20 skip, 0 fail, 64 subtest pass; git không đổi sau khi chạy; validate_benchmark.py PASS (Dev 285, Test 15).</w:t>
+            </w:r>
+          </w:p>
+        </w:tc>
+      </w:tr>
+    </w:tbl>
+    <w:p>
+      <w:pPr>
+        <w:pStyle w:val="Heading1"/>
+      </w:pPr>
+      <w:r>
+        <w:rPr/>
+        <w:t>Phụ lục P. Kiểm lại sau khi gộp CTM 9348764 (26/10)</w:t>
+      </w:r>
+    </w:p>
+    <w:p>
+      <w:r>
+        <w:rPr/>
+        <w:t>Kiểm lại ngày 26/10/2026 sau khi gộp origin/CTM 9348764 (“feat(tests): add pytest configuration and restructure test files”) vào testing ở 411075a, cùng commit sửa 01c639e; chưa push. Từ 948fc94, CTM chỉ có commit này (cha 3d646da đã gộp ở lần trước). Cách kiểm: đọc diff của 9348764 và so với thay đổi của testing từ 3d646da trên cùng file; so nội dung tests/test_benchmark.py với bản CTM ghi lên test/test_benchmark.py (trùng nhau); chạy bản test_benchmark_draft.py cũ trên dữ liệu hiện tại; grep các chỗ còn trỏ tests/; chạy python -m pytest (.venv, Python 3.14), chạy riêng retrieval/test/, nạp schema như demo_pipeline.py. Ngoài 01c639e không sửa code.</w:t>
+      </w:r>
+    </w:p>
+    <w:tbl>
+      <w:tblPr>
+        <w:tblStyle w:val="TableGrid"/>
+        <w:tblW w:type="auto" w:w="0"/>
+        <w:jc w:val="center"/>
+        <w:tblLayout w:type="fixed"/>
+        <w:tblLook w:firstColumn="1" w:firstRow="1" w:lastColumn="0" w:lastRow="0" w:noHBand="0" w:noVBand="1" w:val="04A0"/>
+      </w:tblPr>
+      <w:tblGrid>
+        <w:gridCol w:w="1100"/>
+        <w:gridCol w:w="3200"/>
+        <w:gridCol w:w="5566"/>
+      </w:tblGrid>
+      <w:tr>
+        <w:trPr>
+          <w:tblHeader w:val="true"/>
+        </w:trPr>
+        <w:tc>
+          <w:tcPr>
+            <w:tcW w:type="dxa" w:w="1100"/>
+            <w:shd w:val="clear" w:color="auto" w:fill="DCE6F1"/>
+          </w:tcPr>
+          <w:p>
+            <w:r>
+              <w:rPr>
+                <w:b/>
+                <w:sz w:val="17"/>
+              </w:rPr>
+              <w:t>#</w:t>
+            </w:r>
+          </w:p>
+        </w:tc>
+        <w:tc>
+          <w:tcPr>
+            <w:tcW w:type="dxa" w:w="3200"/>
+            <w:shd w:val="clear" w:color="auto" w:fill="DCE6F1"/>
+          </w:tcPr>
+          <w:p>
+            <w:r>
+              <w:rPr>
+                <w:b/>
+                <w:sz w:val="17"/>
+              </w:rPr>
+              <w:t>Docx ghi</w:t>
+            </w:r>
+          </w:p>
+        </w:tc>
+        <w:tc>
+          <w:tcPr>
+            <w:tcW w:type="dxa" w:w="5566"/>
+            <w:shd w:val="clear" w:color="auto" w:fill="DCE6F1"/>
+          </w:tcPr>
+          <w:p>
+            <w:r>
+              <w:rPr>
+                <w:b/>
+                <w:sz w:val="17"/>
+              </w:rPr>
+              <w:t>Ở 01c639e (26/10)</w:t>
+            </w:r>
+          </w:p>
+        </w:tc>
+      </w:tr>
+      <w:tr>
+        <w:tc>
+          <w:tcPr>
+            <w:tcW w:type="dxa" w:w="1100"/>
+          </w:tcPr>
+          <w:p>
+            <w:r>
+              <w:rPr>
+                <w:b/>
+                <w:sz w:val="17"/>
+              </w:rPr>
+              <w:t>Conflict</w:t>
+            </w:r>
+          </w:p>
+        </w:tc>
+        <w:tc>
+          <w:tcPr>
+            <w:tcW w:type="dxa" w:w="3200"/>
+          </w:tcPr>
+          <w:p>
+            <w:r>
+              <w:rPr>
+                <w:sz w:val="17"/>
+              </w:rPr>
+              <w:t>—</w:t>
+            </w:r>
+          </w:p>
+        </w:tc>
+        <w:tc>
+          <w:tcPr>
+            <w:tcW w:type="dxa" w:w="5566"/>
+          </w:tcPr>
+          <w:p>
+            <w:r>
+              <w:rPr>
+                <w:sz w:val="17"/>
+              </w:rPr>
+              <w:t>Chỉ test/test_bm25_retrieval.py: hai bên cùng thay số 321 ghi cứng bằng số chunk đọc từ fixture (H9, testing đã sửa ở b7f5e30). Giữ bản testing; bản CTM thêm giá trị mặc định expected_count = 336 ghi cứng mà không cần.</w:t>
+            </w:r>
+          </w:p>
+        </w:tc>
+      </w:tr>
+      <w:tr>
+        <w:tc>
+          <w:tcPr>
+            <w:tcW w:type="dxa" w:w="1100"/>
+          </w:tcPr>
+          <w:p>
+            <w:r>
+              <w:rPr>
+                <w:b/>
+                <w:sz w:val="17"/>
+              </w:rPr>
+              <w:t>H2</w:t>
+            </w:r>
+          </w:p>
+        </w:tc>
+        <w:tc>
+          <w:tcPr>
+            <w:tcW w:type="dxa" w:w="3200"/>
+          </w:tcPr>
+          <w:p>
+            <w:r>
+              <w:rPr>
+                <w:sz w:val="17"/>
+              </w:rPr>
+              <w:t>Còn một phần (b7f5e30): test ở 4 nơi; test/test_benchmark_draft.py là bản cũ của tests/test_benchmark.py, sẽ fail khi có gold đã duyệt.</w:t>
+            </w:r>
+          </w:p>
+        </w:tc>
+        <w:tc>
+          <w:tcPr>
+            <w:tcW w:type="dxa" w:w="5566"/>
+          </w:tcPr>
+          <w:p>
+            <w:r>
+              <w:rPr>
+                <w:sz w:val="17"/>
+              </w:rPr>
+              <w:t>Còn một phần (01c639e). 9348764 chuyển tests/schema_test.py, tests/test_dense_retriever.py vào test/ (schema_test.py giữ regex chữ thường của 7c9211e sau khi gộp), xóa tests/test_benchmark.py và ghi nội dung của nó lên test/test_benchmark.py; vì testing đã đổi tên file này, git áp thay đổi vào test_benchmark_draft.py, nên chỉ còn một bản. Bản draft bị thay vẫn 41 pass trên dữ liệu hiện tại nhưng khẳng định không câu nào có gold đã xác minh; bản giữ lại kiểm được cả câu đã xác minh (production_verified, gold thuộc production_chunk_index.json). 01c639e đổi tên về test/test_benchmark.py. Còn: retrieval/test/ (7 test) nằm ngoài testpaths.</w:t>
+            </w:r>
+          </w:p>
+        </w:tc>
+      </w:tr>
+      <w:tr>
+        <w:tc>
+          <w:tcPr>
+            <w:tcW w:type="dxa" w:w="1100"/>
+          </w:tcPr>
+          <w:p>
+            <w:r>
+              <w:rPr>
+                <w:b/>
+                <w:sz w:val="17"/>
+              </w:rPr>
+              <w:t>B4</w:t>
+            </w:r>
+          </w:p>
+        </w:tc>
+        <w:tc>
+          <w:tcPr>
+            <w:tcW w:type="dxa" w:w="3200"/>
+          </w:tcPr>
+          <w:p>
+            <w:r>
+              <w:rPr>
+                <w:sz w:val="17"/>
+              </w:rPr>
+              <w:t>tests/schema_test.py:261 gộp clause_id của data/parser_validated/.</w:t>
+            </w:r>
+          </w:p>
+        </w:tc>
+        <w:tc>
+          <w:tcPr>
+            <w:tcW w:type="dxa" w:w="5566"/>
+          </w:tcPr>
+          <w:p>
+            <w:r>
+              <w:rPr>
+                <w:sz w:val="17"/>
+              </w:rPr>
+              <w:t>Không đổi; file nay là test/schema_test.py (dòng 261 không đổi). Cột Vấn đề và Vị trí cập nhật đường dẫn; bảng “Ai làm gì trước” và mục “Cách sinh lại corpus” cũng vậy.</w:t>
+            </w:r>
+          </w:p>
+        </w:tc>
+      </w:tr>
+      <w:tr>
+        <w:tc>
+          <w:tcPr>
+            <w:tcW w:type="dxa" w:w="1100"/>
+          </w:tcPr>
+          <w:p>
+            <w:r>
+              <w:rPr>
+                <w:b/>
+                <w:sz w:val="17"/>
+              </w:rPr>
+              <w:t>A7, mục 5</w:t>
+            </w:r>
+          </w:p>
+        </w:tc>
+        <w:tc>
+          <w:tcPr>
+            <w:tcW w:type="dxa" w:w="3200"/>
+          </w:tcPr>
+          <w:p>
+            <w:r>
+              <w:rPr>
+                <w:sz w:val="17"/>
+              </w:rPr>
+              <w:t>Lệnh chạy test python -m pytest parser tests test.</w:t>
+            </w:r>
+          </w:p>
+        </w:tc>
+        <w:tc>
+          <w:tcPr>
+            <w:tcW w:type="dxa" w:w="5566"/>
+          </w:tcPr>
+          <w:p>
+            <w:r>
+              <w:rPr>
+                <w:sz w:val="17"/>
+              </w:rPr>
+              <w:t>Đổi thành python -m pytest (testpaths = parser test). Trạng thái A7 không đổi: repo vẫn chưa có CI. Bước 0 của mục 5: phần H2 đổi thành đưa retrieval/test/ vào test/.</w:t>
+            </w:r>
+          </w:p>
+        </w:tc>
+      </w:tr>
+      <w:tr>
+        <w:tc>
+          <w:tcPr>
+            <w:tcW w:type="dxa" w:w="1100"/>
+          </w:tcPr>
+          <w:p>
+            <w:r>
+              <w:rPr>
+                <w:b/>
+                <w:sz w:val="17"/>
+              </w:rPr>
+              <w:t>Phát hiện khi gộp</w:t>
+            </w:r>
+          </w:p>
+        </w:tc>
+        <w:tc>
+          <w:tcPr>
+            <w:tcW w:type="dxa" w:w="3200"/>
+          </w:tcPr>
+          <w:p>
+            <w:r>
+              <w:rPr>
+                <w:sz w:val="17"/>
+              </w:rPr>
+              <w:t>—</w:t>
+            </w:r>
+          </w:p>
+        </w:tc>
+        <w:tc>
+          <w:tcPr>
+            <w:tcW w:type="dxa" w:w="5566"/>
+          </w:tcPr>
+          <w:p>
+            <w:r>
+              <w:rPr>
+                <w:sz w:val="17"/>
+              </w:rPr>
+              <w:t>(1) 9348764 chuyển schema_test.py nhưng không sửa demo_pipeline.py (nạp tests/schema_test.py theo đường dẫn), nên demo lỗi FileNotFoundError ngay khi chạy; pytest.ini đặt testpaths gồm tests/ đã rỗng; README, requirements.txt và 4 tài liệu (data_contract.md, sprint6_benchmark.md, sprint6_integration.md, REVIEW_VA_GIT.md) còn trỏ tests/. Đã sửa ở 01c639e. Đây là thêm một commit được đẩy lên mà không chạy kiểm tra (A7). (2) Lỗi có từ trước, 9348764 đã sửa: 55a5c4b xóa chunk_file_sha256 khỏi vector_store.py trong khi embedding/retrieval_smoke_test.py vẫn import, nên script này lỗi ImportError. (3) parser/__init__.py mới export parser.parser để from parser import … chạy được với --import-mode=importlib; Python 3.14 không còn module parser của thư viện chuẩn nên không trùng tên.</w:t>
+            </w:r>
+          </w:p>
+        </w:tc>
+      </w:tr>
+      <w:tr>
+        <w:tc>
+          <w:tcPr>
+            <w:tcW w:type="dxa" w:w="1100"/>
+          </w:tcPr>
+          <w:p>
+            <w:r>
+              <w:rPr>
+                <w:b/>
+                <w:sz w:val="17"/>
+              </w:rPr>
+              <w:t>Không đổi</w:t>
+            </w:r>
+          </w:p>
+        </w:tc>
+        <w:tc>
+          <w:tcPr>
+            <w:tcW w:type="dxa" w:w="3200"/>
+          </w:tcPr>
+          <w:p>
+            <w:r>
+              <w:rPr>
+                <w:sz w:val="17"/>
+              </w:rPr>
+              <w:t>Như mục 3.</w:t>
+            </w:r>
+          </w:p>
+        </w:tc>
+        <w:tc>
+          <w:tcPr>
+            <w:tcW w:type="dxa" w:w="5566"/>
+          </w:tcPr>
+          <w:p>
+            <w:r>
+              <w:rPr>
+                <w:sz w:val="17"/>
+              </w:rPr>
+              <w:t>Mọi dòng còn lại. 9348764 chỉ đổi test, pytest.ini, parser/__init__.py và thêm một hàm vào vector_store.py; không đổi code retrieval, reranker, parser, dữ liệu hay benchmark.</w:t>
+            </w:r>
+          </w:p>
+        </w:tc>
+      </w:tr>
+      <w:tr>
+        <w:tc>
+          <w:tcPr>
+            <w:tcW w:type="dxa" w:w="1100"/>
+          </w:tcPr>
+          <w:p>
+            <w:r>
+              <w:rPr>
+                <w:b/>
+                <w:sz w:val="17"/>
+              </w:rPr>
+              <w:t>Nhánh khác</w:t>
+            </w:r>
+          </w:p>
+        </w:tc>
+        <w:tc>
+          <w:tcPr>
+            <w:tcW w:type="dxa" w:w="3200"/>
+          </w:tcPr>
+          <w:p>
+            <w:r>
+              <w:rPr>
+                <w:sz w:val="17"/>
+              </w:rPr>
+              <w:t>Các nhánh remote khác không có commit mới.</w:t>
+            </w:r>
+          </w:p>
+        </w:tc>
+        <w:tc>
+          <w:tcPr>
+            <w:tcW w:type="dxa" w:w="5566"/>
+          </w:tcPr>
+          <w:p>
+            <w:r>
+              <w:rPr>
+                <w:sz w:val="17"/>
+              </w:rPr>
+              <w:t>origin/retrieval có commit mới 065e473 (26/10, “benchmark and optimize hybrid search pipeline”), nằm trên 948fc94 và lần gộp CTM 9348764 (8b7b0c4): sửa ground_truth.json, retrieval/config.yaml, hybrid_retriever.py, reranking/, thêm queries_test_revised.json và đưa kho Qdrant (khoảng 21 MB) cùng các file kết quả lớn vào git. Chưa gộp vào testing và chưa kiểm trong báo cáo này. origin/NMA vẫn ở 1260ed8.</w:t>
+            </w:r>
+          </w:p>
+        </w:tc>
+      </w:tr>
+      <w:tr>
+        <w:tc>
+          <w:tcPr>
+            <w:tcW w:type="dxa" w:w="1100"/>
+          </w:tcPr>
+          <w:p>
+            <w:r>
+              <w:rPr>
+                <w:b/>
+                <w:sz w:val="17"/>
+              </w:rPr>
+              <w:t>Mục 3, dòng Còn một phần</w:t>
+            </w:r>
+          </w:p>
+        </w:tc>
+        <w:tc>
+          <w:tcPr>
+            <w:tcW w:type="dxa" w:w="3200"/>
+          </w:tcPr>
+          <w:p>
+            <w:r>
+              <w:rPr>
+                <w:sz w:val="17"/>
+              </w:rPr>
+              <w:t>Một số dòng vẫn ghi phần đã sửa trong Vấn đề hoặc Kiểm chứng.</w:t>
+            </w:r>
+          </w:p>
+        </w:tc>
+        <w:tc>
+          <w:tcPr>
+            <w:tcW w:type="dxa" w:w="5566"/>
+          </w:tcPr>
+          <w:p>
+            <w:r>
+              <w:rPr>
+                <w:sz w:val="17"/>
+              </w:rPr>
+              <w:t>Bỏ phần đã sửa, chỉ giữ phần còn lỗi. Bỏ hẳn đoạn Kiểm chứng của C2, C4, C5, E11, F1, G5, H4 (chỉ ghi việc đã sửa); bỏ câu đã sửa trong Kiểm chứng của B2, B4, E4, E14, F3, F5; A7, H5 thay bằng bằng chứng cho phần còn lại (repo chưa có .github/ hay pre-commit; origin/NMA vẫn có 2 file .pyc); bỏ phần đã sửa trong mô tả của E4, G3, H8, B5. Việc đã sửa của các dòng này vẫn ghi ở Phụ lục K, L, N, O.</w:t>
+            </w:r>
+          </w:p>
+        </w:tc>
+      </w:tr>
+      <w:tr>
+        <w:tc>
+          <w:tcPr>
+            <w:tcW w:type="dxa" w:w="1100"/>
+          </w:tcPr>
+          <w:p>
+            <w:r>
+              <w:rPr>
+                <w:b/>
+                <w:sz w:val="17"/>
+              </w:rPr>
+              <w:t>Test</w:t>
+            </w:r>
+          </w:p>
+        </w:tc>
+        <w:tc>
+          <w:tcPr>
+            <w:tcW w:type="dxa" w:w="3200"/>
+          </w:tcPr>
+          <w:p>
+            <w:r>
+              <w:rPr>
+                <w:sz w:val="17"/>
+              </w:rPr>
+              <w:t>Ở 948fc94: python -m pytest parser tests test 531 pass, 20 skip, 0 fail.</w:t>
+            </w:r>
+          </w:p>
+        </w:tc>
+        <w:tc>
+          <w:tcPr>
+            <w:tcW w:type="dxa" w:w="5566"/>
+          </w:tcPr>
+          <w:p>
+            <w:r>
+              <w:rPr>
+                <w:sz w:val="17"/>
+              </w:rPr>
+              <w:t>Ở 01c639e: python -m pytest 490 pass, 20 skip, 0 fail, 64 subtest pass (ít hơn 41 vì bỏ bản test benchmark trùng); python -m pytest retrieval/test 7 pass; sau khi chạy, git không đổi file nào ngoài báo cáo này.</w:t>
+            </w:r>
+          </w:p>
+        </w:tc>
+      </w:tr>
+    </w:tbl>
+    <w:p>
+      <w:pPr>
+        <w:pStyle w:val="Heading1"/>
+      </w:pPr>
+      <w:r>
+        <w:rPr/>
+        <w:t>Phụ lục Q. Kiểm lại nhóm A sau khi gộp NMA 86b55f5 (26/10)</w:t>
+      </w:r>
+    </w:p>
+    <w:p>
+      <w:r>
+        <w:rPr/>
+        <w:t>Kiểm lại ngày 26/10/2026 sau khi gộp origin/NMA 86b55f5 (“update document title”) vào testing ở 5ef41dc; chưa push. Từ 1260ed8, NMA chỉ có commit này, và nhánh NMA nay nằm trên testing 948fc94. 86b55f5 chỉ đổi dòng title của 21/23 bản ghi trong data/reference/document_versions.json và của 19 file parsed_jsons. Cách kiểm: so title của 23 bản ghi registry với 21 parsed_jsons và với dòng trích yếu trong parser/cleaned_texts; chép parser/, chunking/, schemas/, data/reference/ của 5ef41dc sang thư mục tạm, chạy test_parser.py --skip-clean và export_legal_chunks.py, so với parsed_jsons và corpus trong repo; đo Dense bkai trên 267 câu Dev có gold đề xuất với hai corpus; so hai bảng ID của tài liệu với registry; đọc phần dùng title của build_bm25_index.py và hybrid_retriever.py; chạy python -m pytest (.venv, Python 3.14). Không sửa code hay dữ liệu.</w:t>
+      </w:r>
+    </w:p>
+    <w:tbl>
+      <w:tblPr>
+        <w:tblStyle w:val="TableGrid"/>
+        <w:tblW w:type="auto" w:w="0"/>
+        <w:jc w:val="center"/>
+        <w:tblLayout w:type="fixed"/>
+        <w:tblLook w:firstColumn="1" w:firstRow="1" w:lastColumn="0" w:lastRow="0" w:noHBand="0" w:noVBand="1" w:val="04A0"/>
+      </w:tblPr>
+      <w:tblGrid>
+        <w:gridCol w:w="1100"/>
+        <w:gridCol w:w="3200"/>
+        <w:gridCol w:w="5566"/>
+      </w:tblGrid>
+      <w:tr>
+        <w:trPr>
+          <w:tblHeader w:val="true"/>
+        </w:trPr>
+        <w:tc>
+          <w:tcPr>
+            <w:tcW w:type="dxa" w:w="1100"/>
+            <w:shd w:val="clear" w:color="auto" w:fill="DCE6F1"/>
+          </w:tcPr>
+          <w:p>
+            <w:r>
+              <w:rPr>
+                <w:b/>
+                <w:sz w:val="17"/>
+              </w:rPr>
+              <w:t>#</w:t>
+            </w:r>
+          </w:p>
+        </w:tc>
+        <w:tc>
+          <w:tcPr>
+            <w:tcW w:type="dxa" w:w="3200"/>
+            <w:shd w:val="clear" w:color="auto" w:fill="DCE6F1"/>
+          </w:tcPr>
+          <w:p>
+            <w:r>
+              <w:rPr>
+                <w:b/>
+                <w:sz w:val="17"/>
+              </w:rPr>
+              <w:t>Docx ghi</w:t>
+            </w:r>
+          </w:p>
+        </w:tc>
+        <w:tc>
+          <w:tcPr>
+            <w:tcW w:type="dxa" w:w="5566"/>
+            <w:shd w:val="clear" w:color="auto" w:fill="DCE6F1"/>
+          </w:tcPr>
+          <w:p>
+            <w:r>
+              <w:rPr>
+                <w:b/>
+                <w:sz w:val="17"/>
+              </w:rPr>
+              <w:t>Ở 5ef41dc (26/10)</w:t>
+            </w:r>
+          </w:p>
+        </w:tc>
+      </w:tr>
+      <w:tr>
+        <w:tc>
+          <w:tcPr>
+            <w:tcW w:type="dxa" w:w="1100"/>
+          </w:tcPr>
+          <w:p>
+            <w:r>
+              <w:rPr>
+                <w:b/>
+                <w:sz w:val="17"/>
+              </w:rPr>
+              <w:t>A16</w:t>
+            </w:r>
+          </w:p>
+        </w:tc>
+        <w:tc>
+          <w:tcPr>
+            <w:tcW w:type="dxa" w:w="3200"/>
+          </w:tcPr>
+          <w:p>
+            <w:r>
+              <w:rPr>
+                <w:sz w:val="17"/>
+              </w:rPr>
+              <w:t>Còn một phần: title là dạng tóm tắt của registry, không phải tên chính thức; ba Luật HNGĐ ghi năm không thống nhất; Luật 22/2000 cần hậu tố năm để không trùng title với Luật 52/2014.</w:t>
+            </w:r>
+          </w:p>
+        </w:tc>
+        <w:tc>
+          <w:tcPr>
+            <w:tcW w:type="dxa" w:w="5566"/>
+          </w:tcPr>
+          <w:p>
+            <w:r>
+              <w:rPr>
+                <w:sz w:val="17"/>
+              </w:rPr>
+              <w:t>Còn một phần (5ef41dc). Phần đã sửa: 18/18 văn bản không phải Luật trong parsed_jsons mang trích yếu của văn bản (17 khớp nguyên văn dòng trích yếu của cleaned_texts, NĐ 207/2025 thiếu “về”); ba Luật ghi “Luật Hôn nhân và gia đình 1986”, “… 2000”, “… 2014”, nên Luật 22/2000 không còn trùng title với Luật 52/2014. Parser lấy title từ registry từ f8e8311; các hàm TITLE_TYPE_RE, locate_document_title… ở cột Vị trí cũ không còn, nên cột Vị trí đổi sang registry, test và hai bảng. Còn: corpus và Qdrant chưa sinh lại (1.585/2.011 chunk, 729/923 parent), test REFERENCE fail, hai bảng ID còn title cũ ở 19/21 dòng, 5 bản ghi chép cả loại, số hiệu, ngày, NĐ 207/2025 thiếu “về”, dấu cách đầu title của TT 34/2017, TT 04/2020 và TT 15/2015 trùng title.</w:t>
+            </w:r>
+          </w:p>
+        </w:tc>
+      </w:tr>
+      <w:tr>
+        <w:tc>
+          <w:tcPr>
+            <w:tcW w:type="dxa" w:w="1100"/>
+          </w:tcPr>
+          <w:p>
+            <w:r>
+              <w:rPr>
+                <w:b/>
+                <w:sz w:val="17"/>
+              </w:rPr>
+              <w:t>A7</w:t>
+            </w:r>
+          </w:p>
+        </w:tc>
+        <w:tc>
+          <w:tcPr>
+            <w:tcW w:type="dxa" w:w="3200"/>
+          </w:tcPr>
+          <w:p>
+            <w:r>
+              <w:rPr>
+                <w:sz w:val="17"/>
+              </w:rPr>
+              <w:t>Còn một phần: chưa có CI; 72a7377, 1260ed8 commit khi pytest parser/ fail, 3d646da làm script lỗi cú pháp.</w:t>
+            </w:r>
+          </w:p>
+        </w:tc>
+        <w:tc>
+          <w:tcPr>
+            <w:tcW w:type="dxa" w:w="5566"/>
+          </w:tcPr>
+          <w:p>
+            <w:r>
+              <w:rPr>
+                <w:sz w:val="17"/>
+              </w:rPr>
+              <w:t>Còn một phần, thêm bằng chứng: 86b55f5 đổi title của Luật 52/2014 nhưng không sửa REFERENCE ở dòng 53 của test_parser_unit.py, nên test_document_metadata_matches_reference fail; commit vẫn được đẩy lên origin/NMA. Đây là lần thứ ba NMA đẩy commit khi pytest parser/ fail. Repo vẫn chưa theo dõi .github/ hay cấu hình pre-commit.</w:t>
+            </w:r>
+          </w:p>
+        </w:tc>
+      </w:tr>
+      <w:tr>
+        <w:tc>
+          <w:tcPr>
+            <w:tcW w:type="dxa" w:w="1100"/>
+          </w:tcPr>
+          <w:p>
+            <w:r>
+              <w:rPr>
+                <w:b/>
+                <w:sz w:val="17"/>
+              </w:rPr>
+              <w:t>A6</w:t>
+            </w:r>
+          </w:p>
+        </w:tc>
+        <w:tc>
+          <w:tcPr>
+            <w:tcW w:type="dxa" w:w="3200"/>
+          </w:tcPr>
+          <w:p>
+            <w:r>
+              <w:rPr>
+                <w:sz w:val="17"/>
+              </w:rPr>
+              <w:t>Đổi tính chất: L01.pdf là bản gốc 2014; Điều 123 khoản 3 “cấp huyện” lệch HN_183.</w:t>
+            </w:r>
+          </w:p>
+        </w:tc>
+        <w:tc>
+          <w:tcPr>
+            <w:tcW w:type="dxa" w:w="5566"/>
+          </w:tcPr>
+          <w:p>
+            <w:r>
+              <w:rPr>
+                <w:sz w:val="17"/>
+              </w:rPr>
+              <w:t>Không đổi. L01.pdf, cleaned_texts/L01.txt (dòng 1150 “cấp huyện”) và đáp án HN_183 (“khu vực2”) không đổi; registry chỉ đổi title thành “Luật Hôn nhân và gia đình 2014”, vẫn không có version hay consolidated_date.</w:t>
+            </w:r>
+          </w:p>
+        </w:tc>
+      </w:tr>
+      <w:tr>
+        <w:tc>
+          <w:tcPr>
+            <w:tcW w:type="dxa" w:w="1100"/>
+          </w:tcPr>
+          <w:p>
+            <w:r>
+              <w:rPr>
+                <w:b/>
+                <w:sz w:val="17"/>
+              </w:rPr>
+              <w:t>A26</w:t>
+            </w:r>
+          </w:p>
+        </w:tc>
+        <w:tc>
+          <w:tcPr>
+            <w:tcW w:type="dxa" w:w="3200"/>
+          </w:tcPr>
+          <w:p>
+            <w:r>
+              <w:rPr>
+                <w:sz w:val="17"/>
+              </w:rPr>
+              <w:t>Còn một phần: 2 TT chia theo mục La Mã không parse được.</w:t>
+            </w:r>
+          </w:p>
+        </w:tc>
+        <w:tc>
+          <w:tcPr>
+            <w:tcW w:type="dxa" w:w="5566"/>
+          </w:tcPr>
+          <w:p>
+            <w:r>
+              <w:rPr>
+                <w:sz w:val="17"/>
+              </w:rPr>
+              <w:t>Không đổi. Chạy lại parser: 21 thành công, 2 TT lỗi “Không tìm thấy Điều nào”; 86b55f5 chỉ đổi title của hai bản ghi này trong registry (title mới khớp văn bản).</w:t>
+            </w:r>
+          </w:p>
+        </w:tc>
+      </w:tr>
+      <w:tr>
+        <w:tc>
+          <w:tcPr>
+            <w:tcW w:type="dxa" w:w="1100"/>
+          </w:tcPr>
+          <w:p>
+            <w:r>
+              <w:rPr>
+                <w:b/>
+                <w:sz w:val="17"/>
+              </w:rPr>
+              <w:t>Phát hiện khi kiểm</w:t>
+            </w:r>
+          </w:p>
+        </w:tc>
+        <w:tc>
+          <w:tcPr>
+            <w:tcW w:type="dxa" w:w="3200"/>
+          </w:tcPr>
+          <w:p>
+            <w:r>
+              <w:rPr>
+                <w:sz w:val="17"/>
+              </w:rPr>
+              <w:t>—</w:t>
+            </w:r>
+          </w:p>
+        </w:tc>
+        <w:tc>
+          <w:tcPr>
+            <w:tcW w:type="dxa" w:w="5566"/>
+          </w:tcPr>
+          <w:p>
+            <w:r>
+              <w:rPr>
+                <w:sz w:val="17"/>
+              </w:rPr>
+              <w:t>(1) BM25 không bị ảnh hưởng: build_bm25_index.py lưu title nhưng HybridRetriever chỉ truy vấn content_segmented và breadcrumb; title chỉ vào Dense qua embed_text. (2) Dense bkai không kém đi khi dùng title mới (số đo ở Kiểm chứng của A16): 134/285 câu Dev gọi “Luật Hôn nhân và gia đình” kèm năm, và 4/6 câu trúng thêm là câu hỏi “theo Luật Hôn nhân và gia đình 2014”, khớp title mới của Luật 52/2014. (3) Ngoài nhóm A: origin/NMA nay nằm trên 948fc94 và không theo dõi file .pyc nào (git ls-tree), nên phần còn lại của H5 có vẻ đã hết; dòng H5 chưa sửa vì lần kiểm này chỉ làm nhóm A.</w:t>
+            </w:r>
+          </w:p>
+        </w:tc>
+      </w:tr>
+      <w:tr>
+        <w:tc>
+          <w:tcPr>
+            <w:tcW w:type="dxa" w:w="1100"/>
+          </w:tcPr>
+          <w:p>
+            <w:r>
+              <w:rPr>
+                <w:b/>
+                <w:sz w:val="17"/>
+              </w:rPr>
+              <w:t>Không đổi</w:t>
+            </w:r>
+          </w:p>
+        </w:tc>
+        <w:tc>
+          <w:tcPr>
+            <w:tcW w:type="dxa" w:w="3200"/>
+          </w:tcPr>
+          <w:p>
+            <w:r>
+              <w:rPr>
+                <w:sz w:val="17"/>
+              </w:rPr>
+              <w:t>Như mục 3.</w:t>
+            </w:r>
+          </w:p>
+        </w:tc>
+        <w:tc>
+          <w:tcPr>
+            <w:tcW w:type="dxa" w:w="5566"/>
+          </w:tcPr>
+          <w:p>
+            <w:r>
+              <w:rPr>
+                <w:sz w:val="17"/>
+              </w:rPr>
+              <w:t>Mọi dòng còn lại. 86b55f5 không đổi code, cleaned_texts, corpus, benchmark hay test.</w:t>
+            </w:r>
+          </w:p>
+        </w:tc>
+      </w:tr>
+      <w:tr>
+        <w:tc>
+          <w:tcPr>
+            <w:tcW w:type="dxa" w:w="1100"/>
+          </w:tcPr>
+          <w:p>
+            <w:r>
+              <w:rPr>
+                <w:b/>
+                <w:sz w:val="17"/>
+              </w:rPr>
+              <w:t>Nhánh khác</w:t>
+            </w:r>
+          </w:p>
+        </w:tc>
+        <w:tc>
+          <w:tcPr>
+            <w:tcW w:type="dxa" w:w="3200"/>
+          </w:tcPr>
+          <w:p>
+            <w:r>
+              <w:rPr>
+                <w:sz w:val="17"/>
+              </w:rPr>
+              <w:t>origin/retrieval có 065e473, chưa gộp; origin/NMA ở 1260ed8.</w:t>
+            </w:r>
+          </w:p>
+        </w:tc>
+        <w:tc>
+          <w:tcPr>
+            <w:tcW w:type="dxa" w:w="5566"/>
+          </w:tcPr>
+          <w:p>
+            <w:r>
+              <w:rPr>
+                <w:sz w:val="17"/>
+              </w:rPr>
+              <w:t>origin/NMA ở 86b55f5 (đã gộp). origin/retrieval vẫn ở 065e473, chưa gộp (nhận xét ở docs/retrieval_065e473_review.docx). origin/CTM vẫn ở 9348764.</w:t>
+            </w:r>
+          </w:p>
+        </w:tc>
+      </w:tr>
+      <w:tr>
+        <w:tc>
+          <w:tcPr>
+            <w:tcW w:type="dxa" w:w="1100"/>
+          </w:tcPr>
+          <w:p>
+            <w:r>
+              <w:rPr>
+                <w:b/>
+                <w:sz w:val="17"/>
+              </w:rPr>
+              <w:t>Test</w:t>
+            </w:r>
+          </w:p>
+        </w:tc>
+        <w:tc>
+          <w:tcPr>
+            <w:tcW w:type="dxa" w:w="3200"/>
+          </w:tcPr>
+          <w:p>
+            <w:r>
+              <w:rPr>
+                <w:sz w:val="17"/>
+              </w:rPr>
+              <w:t>Ở 01c639e: python -m pytest 490 pass, 20 skip, 0 fail.</w:t>
+            </w:r>
+          </w:p>
+        </w:tc>
+        <w:tc>
+          <w:tcPr>
+            <w:tcW w:type="dxa" w:w="5566"/>
+          </w:tcPr>
+          <w:p>
+            <w:r>
+              <w:rPr>
+                <w:sz w:val="17"/>
+              </w:rPr>
+              <w:t>Ở 5ef41dc: python -m pytest 489 pass, 20 skip, 1 fail (test_document_metadata_matches_reference, A16), 64 subtest pass; sau khi chạy, git không đổi file nào ngoài báo cáo này.</w:t>
+            </w:r>
+          </w:p>
+        </w:tc>
+      </w:tr>
+    </w:tbl>
+    <w:p>
+      <w:pPr>
+        <w:pStyle w:val="Heading1"/>
+      </w:pPr>
+      <w:r>
+        <w:rPr/>
+        <w:t>Phụ lục R. Sửa phần không cần bàn của A16 và A7 (26/10)</w:t>
+      </w:r>
+    </w:p>
+    <w:p>
+      <w:r>
+        <w:rPr/>
+        <w:t>Sửa ngày 26/10/2026 trên testing 5ef41dc: 856e6be (registry, test, hai bảng ID), 4ec0706 (corpus) và dfc025b (CI); chưa push. A6, A26 và cách ghi title của A16 cần Dev 1 quyết nên không sửa. Cách kiểm: chạy lại parser (test_parser.py --skip-clean) và export_legal_chunks.py trong repo, so corpus mới với corpus đã commit theo từng trường; chạy import_chunk_index.py --force; chạy test mới trước khi sửa dữ liệu để chắc nó bắt được lỗi; chạy python -m pytest và python -m pytest retrieval/test bằng .venv; mô phỏng workflow trên một bản sao sạch của các file git theo dõi, với venv mới (Python 3.14) cài đúng như workflow; đọc trạng thái branch protection qua GitHub API.</w:t>
+      </w:r>
+    </w:p>
+    <w:tbl>
+      <w:tblPr>
+        <w:tblStyle w:val="TableGrid"/>
+        <w:tblW w:type="auto" w:w="0"/>
+        <w:jc w:val="center"/>
+        <w:tblLayout w:type="fixed"/>
+        <w:tblLook w:firstColumn="1" w:firstRow="1" w:lastColumn="0" w:lastRow="0" w:noHBand="0" w:noVBand="1" w:val="04A0"/>
+      </w:tblPr>
+      <w:tblGrid>
+        <w:gridCol w:w="1100"/>
+        <w:gridCol w:w="3200"/>
+        <w:gridCol w:w="5566"/>
+      </w:tblGrid>
+      <w:tr>
+        <w:trPr>
+          <w:tblHeader w:val="true"/>
+        </w:trPr>
+        <w:tc>
+          <w:tcPr>
+            <w:tcW w:type="dxa" w:w="1100"/>
+            <w:shd w:val="clear" w:color="auto" w:fill="DCE6F1"/>
+          </w:tcPr>
+          <w:p>
+            <w:r>
+              <w:rPr>
+                <w:b/>
+                <w:sz w:val="17"/>
+              </w:rPr>
+              <w:t>#</w:t>
+            </w:r>
+          </w:p>
+        </w:tc>
+        <w:tc>
+          <w:tcPr>
+            <w:tcW w:type="dxa" w:w="3200"/>
+            <w:shd w:val="clear" w:color="auto" w:fill="DCE6F1"/>
+          </w:tcPr>
+          <w:p>
+            <w:r>
+              <w:rPr>
+                <w:b/>
+                <w:sz w:val="17"/>
+              </w:rPr>
+              <w:t>Docx ghi</w:t>
+            </w:r>
+          </w:p>
+        </w:tc>
+        <w:tc>
+          <w:tcPr>
+            <w:tcW w:type="dxa" w:w="5566"/>
+            <w:shd w:val="clear" w:color="auto" w:fill="DCE6F1"/>
+          </w:tcPr>
+          <w:p>
+            <w:r>
+              <w:rPr>
+                <w:b/>
+                <w:sz w:val="17"/>
+              </w:rPr>
+              <w:t>Sau bản sửa 26/10 (856e6be..dfc025b)</w:t>
+            </w:r>
+          </w:p>
+        </w:tc>
+      </w:tr>
+      <w:tr>
+        <w:tc>
+          <w:tcPr>
+            <w:tcW w:type="dxa" w:w="1100"/>
+          </w:tcPr>
+          <w:p>
+            <w:r>
+              <w:rPr>
+                <w:b/>
+                <w:sz w:val="17"/>
+              </w:rPr>
+              <w:t>A16</w:t>
+            </w:r>
+          </w:p>
+        </w:tc>
+        <w:tc>
+          <w:tcPr>
+            <w:tcW w:type="dxa" w:w="3200"/>
+          </w:tcPr>
+          <w:p>
+            <w:r>
+              <w:rPr>
+                <w:sz w:val="17"/>
+              </w:rPr>
+              <w:t>Còn một phần (5ef41dc): corpus chưa sinh lại, test REFERENCE fail, hai bảng ID còn title cũ, NĐ 207/2025 thiếu “về”, dấu cách đầu title TT 34/2017, 5 bản ghi chép loại, số hiệu, ngày, TT 04/2020 và TT 15/2015 trùng title.</w:t>
+            </w:r>
+          </w:p>
+        </w:tc>
+        <w:tc>
+          <w:tcPr>
+            <w:tcW w:type="dxa" w:w="5566"/>
+          </w:tcPr>
+          <w:p>
+            <w:r>
+              <w:rPr>
+                <w:sz w:val="17"/>
+              </w:rPr>
+              <w:t>Còn một phần. Đã sửa: registry thêm “về” cho NĐ 207/2025 và bỏ dấu cách đầu title TT 34/2017; chạy lại parser thì chỉ nd_207_2025_nd_cp.json đổi 1 dòng. REFERENCE của test_parser_unit.py ghi “Luật Hôn nhân và gia đình 2014”. Cột title của bảng ở mục 6 data_contract.md và bảng của data/raw_data/README.md lấy theo registry (19 dòng mỗi bảng). test_registry_and_mapping_tables_integrity so thêm cột title của hai bảng với registry và title của từng chunk với parsed_jsons; trước khi sửa dữ liệu, test này fail đúng ở L01. Corpus sinh lại: 2.011 chunk, 923 parent, cùng chunk_id; về nội dung chỉ title, metadata.title, metadata.document_title, embed_text, embed_text_raw đổi, ở 1.585 chunk. production_chunk_index.json sinh lại bằng import_chunk_index.py, chỉ đổi source_chunk_sha256. Còn: 5 bản ghi chép loại, số hiệu, ngày (Dev 1 chốt); TT 04/2020 và TT 15/2015 trùng title.</w:t>
+            </w:r>
+          </w:p>
+        </w:tc>
+      </w:tr>
+      <w:tr>
+        <w:tc>
+          <w:tcPr>
+            <w:tcW w:type="dxa" w:w="1100"/>
+          </w:tcPr>
+          <w:p>
+            <w:r>
+              <w:rPr>
+                <w:b/>
+                <w:sz w:val="17"/>
+              </w:rPr>
+              <w:t>Corpus</w:t>
+            </w:r>
+          </w:p>
+        </w:tc>
+        <w:tc>
+          <w:tcPr>
+            <w:tcW w:type="dxa" w:w="3200"/>
+          </w:tcPr>
+          <w:p>
+            <w:r>
+              <w:rPr>
+                <w:sz w:val="17"/>
+              </w:rPr>
+              <w:t>—</w:t>
+            </w:r>
+          </w:p>
+        </w:tc>
+        <w:tc>
+          <w:tcPr>
+            <w:tcW w:type="dxa" w:w="5566"/>
+          </w:tcPr>
+          <w:p>
+            <w:r>
+              <w:rPr>
+                <w:sz w:val="17"/>
+              </w:rPr>
+              <w:t>Corpus đã commit do CTM 3d646da hậu xử lý: chunk có source_status, provision_status chèn ở vị trí khác, parent không có hai trường này. Exporter hiện tại tự ghi hai trường theo thứ tự của nó, nên git diff đổi cả 2.011 dòng chunks.jsonl, và 923/923 parent có thêm source_status, provision_status; ngoài title, nội dung chunk không đổi. Trên Windows exporter ghi CRLF; core.autocrlf = true nên git chuyển về LF khi commit. import_chunk_index.py mặc định ghi docs/production_chunk_candidates.csv (không được theo dõi); file này đã xóa sau khi chạy.</w:t>
+            </w:r>
+          </w:p>
+        </w:tc>
+      </w:tr>
+      <w:tr>
+        <w:tc>
+          <w:tcPr>
+            <w:tcW w:type="dxa" w:w="1100"/>
+          </w:tcPr>
+          <w:p>
+            <w:r>
+              <w:rPr>
+                <w:b/>
+                <w:sz w:val="17"/>
+              </w:rPr>
+              <w:t>A7</w:t>
+            </w:r>
+          </w:p>
+        </w:tc>
+        <w:tc>
+          <w:tcPr>
+            <w:tcW w:type="dxa" w:w="3200"/>
+          </w:tcPr>
+          <w:p>
+            <w:r>
+              <w:rPr>
+                <w:sz w:val="17"/>
+              </w:rPr>
+              <w:t>Còn một phần: chưa có CI, nhiều commit được đẩy lên khi test fail.</w:t>
+            </w:r>
+          </w:p>
+        </w:tc>
+        <w:tc>
+          <w:tcPr>
+            <w:tcW w:type="dxa" w:w="5566"/>
+          </w:tcPr>
+          <w:p>
+            <w:r>
+              <w:rPr>
+                <w:sz w:val="17"/>
+              </w:rPr>
+              <w:t>Còn một phần. Thêm .github/workflows/tests.yml: chạy trên mọi push và PR, ubuntu-latest, Python 3.14, cài torch bản CPU rồi requirements.txt, đặt HF_HUB_OFFLINE=1 để không tải model; 4 bước: báo lỗi nếu git theo dõi file .pyc (H5), compileall cho scripts, evaluation, retrieval, reranking, embedding, chunking, parser, python -m pytest, python -m pytest retrieval/test (nằm ngoài testpaths, H2); từ 21a2385 retrieval/test nằm trong testpaths nên workflow bỏ bước cuối, còn 3 bước. Mô phỏng workflow trên bản sao sạch của các file git theo dõi, venv mới Python 3.14 trên Windows, không có cache model: cài đặt thành công, không có file .pyc, compileall không lỗi, python -m pytest 490 pass, 20 skip, 0 fail, retrieval/test 7 pass; chưa thử trên Linux. Còn: push để chạy lần đầu trên GitHub; testing và main chưa bật branch protection (GitHub API trả “protected”: false).</w:t>
+            </w:r>
+          </w:p>
+        </w:tc>
+      </w:tr>
+      <w:tr>
+        <w:tc>
+          <w:tcPr>
+            <w:tcW w:type="dxa" w:w="1100"/>
+          </w:tcPr>
+          <w:p>
+            <w:r>
+              <w:rPr>
+                <w:b/>
+                <w:sz w:val="17"/>
+              </w:rPr>
+              <w:t>H2</w:t>
+            </w:r>
+          </w:p>
+        </w:tc>
+        <w:tc>
+          <w:tcPr>
+            <w:tcW w:type="dxa" w:w="3200"/>
+          </w:tcPr>
+          <w:p>
+            <w:r>
+              <w:rPr>
+                <w:sz w:val="17"/>
+              </w:rPr>
+              <w:t>Còn một phần (01c639e): retrieval/test/ (7 test) nằm ngoài testpaths nên python -m pytest không chạy.</w:t>
+            </w:r>
+          </w:p>
+        </w:tc>
+        <w:tc>
+          <w:tcPr>
+            <w:tcW w:type="dxa" w:w="5566"/>
+          </w:tcPr>
+          <w:p>
+            <w:r>
+              <w:rPr>
+                <w:sz w:val="17"/>
+              </w:rPr>
+              <w:t>Đã sửa (21a2385), bỏ khỏi bảng. pytest.ini đặt testpaths = parser test retrieval/test; python -m pytest chạy chung 497 pass, 20 skip, 0 fail trên .venv và trên venv sạch (hai file của Dev 4 không trùng tên với test/ vì pytest chạy ở --import-mode=importlib). Workflow bỏ bước chạy riêng; docs/sprint6_integration.md ghi testpaths mới. Không chuyển file vào test/ để không conflict với origin/retrieval 065e473 đang sửa retrieval/; gom mọi test vào một thư mục là lựa chọn của nhóm, không còn là lỗi.</w:t>
+            </w:r>
+          </w:p>
+        </w:tc>
+      </w:tr>
+      <w:tr>
+        <w:tc>
+          <w:tcPr>
+            <w:tcW w:type="dxa" w:w="1100"/>
+          </w:tcPr>
+          <w:p>
+            <w:r>
+              <w:rPr>
+                <w:b/>
+                <w:sz w:val="17"/>
+              </w:rPr>
+              <w:t>Test</w:t>
+            </w:r>
+          </w:p>
+        </w:tc>
+        <w:tc>
+          <w:tcPr>
+            <w:tcW w:type="dxa" w:w="3200"/>
+          </w:tcPr>
+          <w:p>
+            <w:r>
+              <w:rPr>
+                <w:sz w:val="17"/>
+              </w:rPr>
+              <w:t>Ở 5ef41dc: 489 pass, 20 skip, 1 fail (A16).</w:t>
+            </w:r>
+          </w:p>
+        </w:tc>
+        <w:tc>
+          <w:tcPr>
+            <w:tcW w:type="dxa" w:w="5566"/>
+          </w:tcPr>
+          <w:p>
+            <w:r>
+              <w:rPr>
+                <w:sz w:val="17"/>
+              </w:rPr>
+              <w:t>python -m pytest 490 pass, 20 skip, 0 fail, 64 subtest pass; retrieval/test 7 pass. Một lần chạy khi ổ C: chỉ còn 113 MB trống có 4 test fail (3 báo MemoryError ở tiến trình con); chạy lại khi ổ C: có chỗ thì cả 4 pass, nên đó là lỗi của máy. Sau 21a2385: python -m pytest 497 pass, 20 skip, 0 fail, 64 subtest pass.</w:t>
+            </w:r>
+          </w:p>
+        </w:tc>
+      </w:tr>
+      <w:tr>
+        <w:tc>
+          <w:tcPr>
+            <w:tcW w:type="dxa" w:w="1100"/>
+          </w:tcPr>
+          <w:p>
+            <w:r>
+              <w:rPr>
+                <w:b/>
+                <w:sz w:val="17"/>
+              </w:rPr>
+              <w:t>Không sửa</w:t>
+            </w:r>
+          </w:p>
+        </w:tc>
+        <w:tc>
+          <w:tcPr>
+            <w:tcW w:type="dxa" w:w="3200"/>
+          </w:tcPr>
+          <w:p>
+            <w:r>
+              <w:rPr>
+                <w:sz w:val="17"/>
+              </w:rPr>
+              <w:t>—</w:t>
+            </w:r>
+          </w:p>
+        </w:tc>
+        <w:tc>
+          <w:tcPr>
+            <w:tcW w:type="dxa" w:w="5566"/>
+          </w:tcPr>
+          <w:p>
+            <w:r>
+              <w:rPr>
+                <w:sz w:val="17"/>
+              </w:rPr>
+              <w:t>A6, A26 và cách ghi title của A16 chờ Dev 1 chốt. Dòng H5 không sửa: workflow chặn file .pyc, nhưng dòng này thuộc nhóm H và cần kiểm riêng nhánh NMA.</w:t>
             </w:r>
           </w:p>
         </w:tc>

</xml_diff>

<commit_message>
docs(report): record the reranker check against the architecture, new G7 and the G3 memory fix in Appendix S
</commit_message>
<xml_diff>
--- a/docs/sprint6_issue_recheck_after_merge.docx
+++ b/docs/sprint6_issue_recheck_after_merge.docx
@@ -25,7 +25,7 @@
         <w:rPr>
           <w:sz w:val="19"/>
         </w:rPr>
-        <w:t>Người lập: Dev 5 (Reranker &amp; Packaging Lead)   ·   Ngày: 22/10/2026   ·   Phạm vi: nhánh testing, commit 75dd586 (gộp CTM 5b62b35 và NMA f8e8311); nhóm A kiểm lại trên e9ee31d, e64c49a, 72a7377, 840c8a3, 64b65f0, 5ef41dc; nhóm C kiểm lại trên bafe1e8, 840c8a3, 3d646da, C3 sửa ở 75e06c8; nhóm B kiểm lại và sửa trên nhánh chunking_test (1c40712); trạng thái đối chiếu lại trên be28659 (25/10); sửa trên testing be28659..96d0086 (Phụ lục N); các dòng còn mở kiểm lại trên 948fc94 (Phụ lục O); gộp CTM 9348764 kiểm trên 01c639e (Phụ lục P); gộp NMA 86b55f5 kiểm trên 5ef41dc (Phụ lục Q); sửa A16, A7, H2 ngày 26/10 (Phụ lục R)</w:t>
+        <w:t>Người lập: Dev 5 (Reranker &amp; Packaging Lead)   ·   Ngày: 22/10/2026   ·   Phạm vi: nhánh testing, commit 75dd586 (gộp CTM 5b62b35 và NMA f8e8311); nhóm A kiểm lại trên e9ee31d, e64c49a, 72a7377, 840c8a3, 64b65f0, 5ef41dc; nhóm C kiểm lại trên bafe1e8, 840c8a3, 3d646da, C3 sửa ở 75e06c8; nhóm B kiểm lại và sửa trên nhánh chunking_test (1c40712); trạng thái đối chiếu lại trên be28659 (25/10); sửa trên testing be28659..96d0086 (Phụ lục N); các dòng còn mở kiểm lại trên 948fc94 (Phụ lục O); gộp CTM 9348764 kiểm trên 01c639e (Phụ lục P); gộp NMA 86b55f5 kiểm trên 5ef41dc (Phụ lục Q); sửa A16, A7, H2 ngày 26/10 (Phụ lục R); kiểm và sửa reranker ngày 27/10 (Phụ lục S)</w:t>
       </w:r>
     </w:p>
     <w:p>
@@ -34,7 +34,7 @@
         <w:rPr>
           <w:sz w:val="19"/>
         </w:rPr>
-        <w:t>Cập nhật 23/10/2026: kiểm lại sau khi gộp origin/CTM ee755a5 vào testing (commit e64c49a). Mục 3 chỉ ghi phần còn lỗi tính tới e64c49a, gồm cả 7 lỗi mới. Cùng ngày, nhóm A được kiểm lại toàn bộ trên e64c49a (Phụ lục C); A24 và Phụ lục B (kết quả kiểm nhóm A trên e9ee31d ngày 22/10) bị mất trong lần cập nhật trước nên được ghi lại. Cũng ngày 23/10, nhóm C được kiểm lại toàn bộ trên bafe1e8, gồm phân tích lại C6 (Phụ lục D). Ngày 24/10/2026, sau khi kéo nhánh NMA mới nhất (testing fast-forward lên 72a7377), nhóm A được kiểm lại toàn bộ (Phụ lục E): A13, A23, A24 đã sửa và được bỏ khỏi bảng; thêm 2 lỗi mới A25, A26. Cũng ngày 24/10, nhóm B được kiểm lại và sửa trên nhánh chunking_test (Phụ lục F): B9, B12 đã sửa và được bỏ khỏi bảng; B1, B10, B13 đã sửa trong code nhưng còn trong bảng cho tới khi corpus trong repo được sinh lại; thêm 3 lỗi mới B14, B15, B16, đều đã sửa. Kiểm lại chunking sau commit: thêm B17 (chunker lấy câu đầu intro làm tiêu đề, đã sửa) và A27 (parser không nhận nhãn “Mục N.”, TT 04/2020 mất cấp Mục). Cuối ngày 24/10, sau khi gộp NMA (b031620–fc997a6) vào testing ở 840c8a3, nhóm C được kiểm lại toàn bộ (Phụ lục G): không lỗi nào sửa xong; C6 sửa thêm một phần (ID của Luật 1986 viết thường, test định danh cho parsed_jsons, run_experiment.py không còn ghi cứng file TTLT); các lỗi C khác không đổi vì contract, schema, code retrieval, reranker và benchmark không đổi từ bafe1e8. Cũng ở 840c8a3, nhóm A được kiểm lại toàn bộ (Phụ lục H): A21 đã sửa và được bỏ khỏi bảng; A25, A26 sửa phần lớn, nhưng mẫu cắt chú thích VBHN mới không khớp chỗ nào (chú thích nay nằm trong Luật 52/2014 Điều 2 khoản 3) và mẫu nhãn “Hướng dẫn” mới để lọt lại 3 nhãn ở NĐ 10/2015. Sau đó C3 được sửa ở 75e06c8 (bảng ánh xạ status → validity_status ở mục 3.1 của data_contract.md và test_registry_validity_status_mapping) và được bỏ khỏi bảng. Cuối ngày 24/10, sau khi gộp NMA 1260ed8 vào testing ở 64b65f0, nhóm A được kiểm lại (Phụ lục I): 11 PDF gốc được thay bằng bản có lớp text; A27 đã sửa và được bỏ khỏi bảng; A25 chỉ còn phần corpus và các mẫu cleaner thừa; L01 quay về bản gốc 2014 (A6); thêm lỗi mới A28 (ghép dòng làm mất dấu câu, làm 1 test fail). Ngày 25/10, A28 và phần test của A7 được sửa ở commit 77b5886 trên testing (Phụ lục K): A28 được bỏ khỏi bảng, A7 chỉ còn CI và test cho cleaner. Cũng ngày 25/10, corpus được sinh lại ở 664634e (21 văn bản, 2.011 chunk, tách từ underthesea): A25, A26 hết phần corpus; B1, B10, B13 đã sửa và được bỏ khỏi bảng; B2 chỉ còn phía truy vấn và requirements-bkai.txt. Cũng ngày 25/10, sau khi kéo nhánh CTM (f87a327, 4afa41e, 3d646da) vào testing, nhóm C được kiểm lại toàn bộ trên 3d646da (Phụ lục L): C6, C8, C9 đã sửa và được bỏ khỏi bảng; C2, C4, C5, C7 sửa thêm một phần và chỉ còn phần chưa sửa; thêm lỗi mới C10 (3d646da làm scripts/build_gold_300_provisional.py lỗi cú pháp; phần lỗi cú pháp sửa ở d1eaa3a). Sau đó article_index.json được bổ sung 9 văn bản còn thiếu ở d24ff2a; C5 chỉ còn context_registry.json và kiểu ID của gold_article_ids. C7 sửa xong ở 33bc4ff (xóa reranking/results cũ, bỏ ENVELOPE_FIELDS) và được bỏ khỏi bảng. Cuối ngày 25/10, trạng thái các dòng của mục 3 được đối chiếu lại với code trên be28659 (Phụ lục M): H5 chưa sửa (testing vẫn theo dõi 2 file .pyc) nên chuyển về Còn; A11, A16, B3, E3, E12, E15 đã sửa phần của register v2 nhưng còn việc nên chuyển sang Còn một phần; B3 bỏ phần đã hết (ID chữ hoa, candidate của Luật 52/2014 và NĐ 207/2025); G3 bỏ phần reranking/results đã xóa ở 33bc4ff. Mục 5 được viết lại vì parser và corpus không còn nằm trên đường găng, và có thêm bảng phân loại lỗi theo mức cần phối hợp. Cũng ngày 25/10, các lỗi sửa được mà không cần bàn với dev khác được sửa trên testing, 9 commit từ 5e0b9c2 tới 96d0086, chưa push (Phụ lục N): A8, A11, A25, B3, C10, D3, D4, D5, E3, E7, E9, E10, E15, G1, G2, G6, H9 đã sửa và được bỏ khỏi bảng; A7, B2, B4, C2, C4, C5, E11, E14, F1, G5, H2, H4, H5 chỉ còn phần chưa sửa; D1 ghi thêm 11 câu đã duyệt còn trong gold_id_proposals_300.json. Toàn bộ test chạy chung (parser/, tests/, test/): 531 pass, 20 skip, 0 fail. Mục 5 viết lại theo các lỗi còn mở. Cuối ngày 25/10, các dòng còn mở của mục 3 được kiểm lại trên 948fc94 (đã push lên origin/testing; các nhánh remote khác không có commit mới) (Phụ lục O): E4, F3, F5 đã sửa một phần ở 664634e, f32754e, 146a6c9 mà bản trước chưa ghi, nên chuyển từ Còn sang Còn một phần; H8 bỏ phần tách từ đã sửa; B5, B7, E1, F1, H1 cập nhật số đo trên corpus 664634e; các dòng khác không đổi. Bước 2 của mục 5 thêm phần E4 (Dense dừng khi thiếu underthesea). Test chạy chung: 531 pass, 20 skip, 0 fail. Ngày 26/10, sau khi gộp CTM 9348764 vào testing ở 411075a, sửa thêm ở 01c639e, chưa push (Phụ lục P): CTM gộp tests/ vào test/ và bỏ bản test benchmark trùng, nên H2 chỉ còn retrieval/test/ nằm ngoài testpaths của pytest.ini; B4 cập nhật đường dẫn test/schema_test.py; lệnh chạy test ở A7 và mục 5 đổi thành python -m pytest. Phát hiện và sửa ở 01c639e: 9348764 chuyển schema_test.py mà không sửa demo_pipeline.py, nên demo lỗi ngay khi chạy. Các dòng khác không đổi. Test chạy chung: 490 pass, 20 skip, 0 fail (bớt 41 test của bản trùng). Cuối ngày 26/10, sau khi gộp NMA 86b55f5 (“update document title”) vào testing ở 5ef41dc, chưa push, nhóm A được kiểm lại (Phụ lục Q): title của 21/23 bản ghi registry (19 văn bản có parsed_jsons) đổi sang trích yếu của văn bản, ba Luật HNGĐ cùng ghi năm, nên A16 chỉ còn phần corpus, test, hai bảng ID và cách ghi title; A7 thêm một commit được đẩy lên khi test parser fail; A6, A26 không đổi. Test chạy chung: 489 pass, 20 skip, 1 fail (A16). Cũng tối 26/10 (Phụ lục R; 856e6be, 4ec0706, dfc025b): sửa các phần không cần bàn của A16 (test, hai bảng ID, NĐ 207/2025, dấu cách TT 34/2017, sinh lại corpus) và A7 (thêm workflow CI), nên A16 chỉ còn cách ghi title của 5 văn bản cũ, A7 chỉ còn push workflow và bật branch protection. Test chạy chung: 490 pass, 20 skip, 0 fail. Sau đó H2 được sửa ở 21a2385: pytest.ini thêm retrieval/test vào testpaths, nên python -m pytest chạy cả 7 test của Dev 4 (497 pass, 20 skip, 0 fail); dòng H2 được bỏ khỏi bảng.</w:t>
+        <w:t>Cập nhật 23/10/2026: kiểm lại sau khi gộp origin/CTM ee755a5 vào testing (commit e64c49a). Mục 3 chỉ ghi phần còn lỗi tính tới e64c49a, gồm cả 7 lỗi mới. Cùng ngày, nhóm A được kiểm lại toàn bộ trên e64c49a (Phụ lục C); A24 và Phụ lục B (kết quả kiểm nhóm A trên e9ee31d ngày 22/10) bị mất trong lần cập nhật trước nên được ghi lại. Cũng ngày 23/10, nhóm C được kiểm lại toàn bộ trên bafe1e8, gồm phân tích lại C6 (Phụ lục D). Ngày 24/10/2026, sau khi kéo nhánh NMA mới nhất (testing fast-forward lên 72a7377), nhóm A được kiểm lại toàn bộ (Phụ lục E): A13, A23, A24 đã sửa và được bỏ khỏi bảng; thêm 2 lỗi mới A25, A26. Cũng ngày 24/10, nhóm B được kiểm lại và sửa trên nhánh chunking_test (Phụ lục F): B9, B12 đã sửa và được bỏ khỏi bảng; B1, B10, B13 đã sửa trong code nhưng còn trong bảng cho tới khi corpus trong repo được sinh lại; thêm 3 lỗi mới B14, B15, B16, đều đã sửa. Kiểm lại chunking sau commit: thêm B17 (chunker lấy câu đầu intro làm tiêu đề, đã sửa) và A27 (parser không nhận nhãn “Mục N.”, TT 04/2020 mất cấp Mục). Cuối ngày 24/10, sau khi gộp NMA (b031620–fc997a6) vào testing ở 840c8a3, nhóm C được kiểm lại toàn bộ (Phụ lục G): không lỗi nào sửa xong; C6 sửa thêm một phần (ID của Luật 1986 viết thường, test định danh cho parsed_jsons, run_experiment.py không còn ghi cứng file TTLT); các lỗi C khác không đổi vì contract, schema, code retrieval, reranker và benchmark không đổi từ bafe1e8. Cũng ở 840c8a3, nhóm A được kiểm lại toàn bộ (Phụ lục H): A21 đã sửa và được bỏ khỏi bảng; A25, A26 sửa phần lớn, nhưng mẫu cắt chú thích VBHN mới không khớp chỗ nào (chú thích nay nằm trong Luật 52/2014 Điều 2 khoản 3) và mẫu nhãn “Hướng dẫn” mới để lọt lại 3 nhãn ở NĐ 10/2015. Sau đó C3 được sửa ở 75e06c8 (bảng ánh xạ status → validity_status ở mục 3.1 của data_contract.md và test_registry_validity_status_mapping) và được bỏ khỏi bảng. Cuối ngày 24/10, sau khi gộp NMA 1260ed8 vào testing ở 64b65f0, nhóm A được kiểm lại (Phụ lục I): 11 PDF gốc được thay bằng bản có lớp text; A27 đã sửa và được bỏ khỏi bảng; A25 chỉ còn phần corpus và các mẫu cleaner thừa; L01 quay về bản gốc 2014 (A6); thêm lỗi mới A28 (ghép dòng làm mất dấu câu, làm 1 test fail). Ngày 25/10, A28 và phần test của A7 được sửa ở commit 77b5886 trên testing (Phụ lục K): A28 được bỏ khỏi bảng, A7 chỉ còn CI và test cho cleaner. Cũng ngày 25/10, corpus được sinh lại ở 664634e (21 văn bản, 2.011 chunk, tách từ underthesea): A25, A26 hết phần corpus; B1, B10, B13 đã sửa và được bỏ khỏi bảng; B2 chỉ còn phía truy vấn và requirements-bkai.txt. Cũng ngày 25/10, sau khi kéo nhánh CTM (f87a327, 4afa41e, 3d646da) vào testing, nhóm C được kiểm lại toàn bộ trên 3d646da (Phụ lục L): C6, C8, C9 đã sửa và được bỏ khỏi bảng; C2, C4, C5, C7 sửa thêm một phần và chỉ còn phần chưa sửa; thêm lỗi mới C10 (3d646da làm scripts/build_gold_300_provisional.py lỗi cú pháp; phần lỗi cú pháp sửa ở d1eaa3a). Sau đó article_index.json được bổ sung 9 văn bản còn thiếu ở d24ff2a; C5 chỉ còn context_registry.json và kiểu ID của gold_article_ids. C7 sửa xong ở 33bc4ff (xóa reranking/results cũ, bỏ ENVELOPE_FIELDS) và được bỏ khỏi bảng. Cuối ngày 25/10, trạng thái các dòng của mục 3 được đối chiếu lại với code trên be28659 (Phụ lục M): H5 chưa sửa (testing vẫn theo dõi 2 file .pyc) nên chuyển về Còn; A11, A16, B3, E3, E12, E15 đã sửa phần của register v2 nhưng còn việc nên chuyển sang Còn một phần; B3 bỏ phần đã hết (ID chữ hoa, candidate của Luật 52/2014 và NĐ 207/2025); G3 bỏ phần reranking/results đã xóa ở 33bc4ff. Mục 5 được viết lại vì parser và corpus không còn nằm trên đường găng, và có thêm bảng phân loại lỗi theo mức cần phối hợp. Cũng ngày 25/10, các lỗi sửa được mà không cần bàn với dev khác được sửa trên testing, 9 commit từ 5e0b9c2 tới 96d0086, chưa push (Phụ lục N): A8, A11, A25, B3, C10, D3, D4, D5, E3, E7, E9, E10, E15, G1, G2, G6, H9 đã sửa và được bỏ khỏi bảng; A7, B2, B4, C2, C4, C5, E11, E14, F1, G5, H2, H4, H5 chỉ còn phần chưa sửa; D1 ghi thêm 11 câu đã duyệt còn trong gold_id_proposals_300.json. Toàn bộ test chạy chung (parser/, tests/, test/): 531 pass, 20 skip, 0 fail. Mục 5 viết lại theo các lỗi còn mở. Cuối ngày 25/10, các dòng còn mở của mục 3 được kiểm lại trên 948fc94 (đã push lên origin/testing; các nhánh remote khác không có commit mới) (Phụ lục O): E4, F3, F5 đã sửa một phần ở 664634e, f32754e, 146a6c9 mà bản trước chưa ghi, nên chuyển từ Còn sang Còn một phần; H8 bỏ phần tách từ đã sửa; B5, B7, E1, F1, H1 cập nhật số đo trên corpus 664634e; các dòng khác không đổi. Bước 2 của mục 5 thêm phần E4 (Dense dừng khi thiếu underthesea). Test chạy chung: 531 pass, 20 skip, 0 fail. Ngày 26/10, sau khi gộp CTM 9348764 vào testing ở 411075a, sửa thêm ở 01c639e, chưa push (Phụ lục P): CTM gộp tests/ vào test/ và bỏ bản test benchmark trùng, nên H2 chỉ còn retrieval/test/ nằm ngoài testpaths của pytest.ini; B4 cập nhật đường dẫn test/schema_test.py; lệnh chạy test ở A7 và mục 5 đổi thành python -m pytest. Phát hiện và sửa ở 01c639e: 9348764 chuyển schema_test.py mà không sửa demo_pipeline.py, nên demo lỗi ngay khi chạy. Các dòng khác không đổi. Test chạy chung: 490 pass, 20 skip, 0 fail (bớt 41 test của bản trùng). Cuối ngày 26/10, sau khi gộp NMA 86b55f5 (“update document title”) vào testing ở 5ef41dc, chưa push, nhóm A được kiểm lại (Phụ lục Q): title của 21/23 bản ghi registry (19 văn bản có parsed_jsons) đổi sang trích yếu của văn bản, ba Luật HNGĐ cùng ghi năm, nên A16 chỉ còn phần corpus, test, hai bảng ID và cách ghi title; A7 thêm một commit được đẩy lên khi test parser fail; A6, A26 không đổi. Test chạy chung: 489 pass, 20 skip, 1 fail (A16). Cũng tối 26/10 (Phụ lục R; 856e6be, 4ec0706, dfc025b): sửa các phần không cần bàn của A16 (test, hai bảng ID, NĐ 207/2025, dấu cách TT 34/2017, sinh lại corpus) và A7 (thêm workflow CI), nên A16 chỉ còn cách ghi title của 5 văn bản cũ, A7 chỉ còn push workflow và bật branch protection. Test chạy chung: 490 pass, 20 skip, 0 fail. Sau đó H2 được sửa ở 21a2385: pytest.ini thêm retrieval/test vào testpaths, nên python -m pytest chạy cả 7 test của Dev 4 (497 pass, 20 skip, 0 fail); dòng H2 được bỏ khỏi bảng. Ngày 27/10 (Phụ lục S; 2559349): kiểm reranker theo sơ đồ kiến trúc. Code có Cross-Encoder bge-reranker-v2-m3 thật, nhưng reranking/config.yaml đặt backend: mock và CLI mặc định --retriever mock từ 19/10, nên lệnh run_retrieval.py --query ... --top-k 5 của kế hoạch Sprint 6 chạy toàn bộ bằng stub mà output vẫn mang nhãn *_reranker. Lỗi mới G7 này đã sửa và không thêm vào bảng. Cùng commit, reranker nạp fp16 trên GPU và có chế độ chạy hai bước, nên G3 không còn cần máy khác; G3 chỉ còn chạy lại số. Test chạy chung: 504 pass, 20 skip, 0 fail.</w:t>
       </w:r>
     </w:p>
     <w:p>
@@ -50,7 +50,7 @@
         <w:spacing w:after="80"/>
       </w:pPr>
       <w:r>
-        <w:t>Trong 67 lỗi của register v2, tính tới commit e64c49a (nhóm A tính tới 5ef41dc, nhóm B tính tới bản sửa chunking ngày 24/10 và corpus sinh lại ở 664634e, nhóm C tính tới 3d646da; trạng thái đối chiếu lại trên be28659, Phụ lục M; các lỗi sửa ngày 25/10 tính tới 3b1b6dc, Phụ lục N; các dòng còn mở kiểm lại trên 948fc94, Phụ lục O; thay đổi của CTM 9348764 tính tới 01c639e, Phụ lục P; title của NMA 86b55f5 tính tới 5ef41dc, Phụ lục Q; bản sửa A16, A7 ngày 26/10, Phụ lục R): 32 đã sửa, 1 đóng, 22 còn một phần, 1 đổi tính chất, 2 nặng hơn, 9 còn nguyên. Phát hiện thêm 21 lỗi mới: A22, A23, A24, B11, B12 (22/10; A22, A23, A24, B11 và B12 nay đã sửa), B13 (nay đã sửa), C6, C7, C8, C9, D5, H9 (23/10, sau khi gộp CTM; C6, C8, C9 nay đã sửa ở 3d646da, C7 ở 33bc4ff), A25, A26 (24/10, sau khi kéo NMA 72a7377; nay sửa một phần ở 840c8a3 và 64b65f0), B14, B15, B16, B17 (24/10, khi kiểm lại nhóm B; đã sửa) A27 (24/10, khi kiểm lại corpus thử 21 văn bản; nay đã sửa), A28 (24/10, sau khi gộp NMA 1260ed8; nay đã sửa ở 77b5886) và C10 (25/10, sau khi kéo CTM 3d646da; đã sửa ở d1eaa3a và b7f5e30; D5, H9 và A25 cũng đã sửa ngày 25/10). Trong 15 lỗi mức Cao, 8 đã sửa (A1, A12, A13, A14, B1, E15, C1, C3), 7 còn mở (B2, D1, D2, E1, E2, F1, F5). Nhóm A, B, C đã được kiểm lại lần 2 trên commit 75dd586; các chỗ đính chính ghi ở Phụ lục A. Nhóm A được kiểm lại lần 3 trên e9ee31d (Phụ lục B), lần 4 trên e64c49a (Phụ lục C) và lần 5 trên 72a7377 (Phụ lục E), lần 6 trên 840c8a3 (Phụ lục H) và lần 7 trên 64b65f0 (Phụ lục I); A28 sửa ngày 25/10 (Phụ lục K). Ngày 23/10 kiểm lại các lỗi liên quan tới thay đổi của CTM và toàn bộ nhóm A; nhóm C được kiểm lại toàn bộ trên bafe1e8 (Phụ lục D) trên 840c8a3 sau khi gộp NMA (Phụ lục G) và trên 3d646da sau khi kéo CTM (Phụ lục L); ngày 24/10 nhóm B được kiểm lại và sửa trên nhánh chunking_test (Phụ lục F); các lỗi còn lại giữ kết quả ngày 22/10.</w:t>
+        <w:t>Trong 67 lỗi của register v2, tính tới commit e64c49a (nhóm A tính tới 5ef41dc, nhóm B tính tới bản sửa chunking ngày 24/10 và corpus sinh lại ở 664634e, nhóm C tính tới 3d646da; trạng thái đối chiếu lại trên be28659, Phụ lục M; các lỗi sửa ngày 25/10 tính tới 3b1b6dc, Phụ lục N; các dòng còn mở kiểm lại trên 948fc94, Phụ lục O; thay đổi của CTM 9348764 tính tới 01c639e, Phụ lục P; title của NMA 86b55f5 tính tới 5ef41dc, Phụ lục Q; bản sửa A16, A7 ngày 26/10, Phụ lục R; reranker ngày 27/10, Phụ lục S): 32 đã sửa, 1 đóng, 22 còn một phần, 1 đổi tính chất, 2 nặng hơn, 9 còn nguyên. Phát hiện thêm 22 lỗi mới: A22, A23, A24, B11, B12 (22/10; A22, A23, A24, B11 và B12 nay đã sửa), B13 (nay đã sửa), C6, C7, C8, C9, D5, H9 (23/10, sau khi gộp CTM; C6, C8, C9 nay đã sửa ở 3d646da, C7 ở 33bc4ff), A25, A26 (24/10, sau khi kéo NMA 72a7377; nay sửa một phần ở 840c8a3 và 64b65f0), B14, B15, B16, B17 (24/10, khi kiểm lại nhóm B; đã sửa) A27 (24/10, khi kiểm lại corpus thử 21 văn bản; nay đã sửa), A28 (24/10, sau khi gộp NMA 1260ed8; nay đã sửa ở 77b5886) và C10 (25/10, sau khi kéo CTM 3d646da; đã sửa ở d1eaa3a và b7f5e30; D5, H9 và A25 cũng đã sửa ngày 25/10) và G7 (27/10, reranker mặc định là mock; đã sửa ở 2559349). Trong 15 lỗi mức Cao, 8 đã sửa (A1, A12, A13, A14, B1, E15, C1, C3), 7 còn mở (B2, D1, D2, E1, E2, F1, F5). Nhóm A, B, C đã được kiểm lại lần 2 trên commit 75dd586; các chỗ đính chính ghi ở Phụ lục A. Nhóm A được kiểm lại lần 3 trên e9ee31d (Phụ lục B), lần 4 trên e64c49a (Phụ lục C) và lần 5 trên 72a7377 (Phụ lục E), lần 6 trên 840c8a3 (Phụ lục H) và lần 7 trên 64b65f0 (Phụ lục I); A28 sửa ngày 25/10 (Phụ lục K). Ngày 23/10 kiểm lại các lỗi liên quan tới thay đổi của CTM và toàn bộ nhóm A; nhóm C được kiểm lại toàn bộ trên bafe1e8 (Phụ lục D) trên 840c8a3 sau khi gộp NMA (Phụ lục G) và trên 3d646da sau khi kéo CTM (Phụ lục L); ngày 24/10 nhóm B được kiểm lại và sửa trên nhánh chunking_test (Phụ lục F); các lỗi còn lại giữ kết quả ngày 22/10.</w:t>
       </w:r>
     </w:p>
     <w:p>
@@ -6920,7 +6920,7 @@
               <w:rPr>
                 <w:sz w:val="17"/>
               </w:rPr>
-              <w:t>Chưa có kết quả Hybrid + Reranker nào trên corpus hiện tại; mục Kết quả hiện tại của README (dòng 61) vẫn ghi số Task 4 đo trên corpus 1.159 chunk với nhãn proposal.</w:t>
+              <w:t>Chưa có kết quả Hybrid + Reranker nào trên corpus hiện tại; mục Kết quả hiện tại của README (dòng 66) vẫn ghi số Task 4 đo trên corpus 1.159 chunk với nhãn proposal.</w:t>
             </w:r>
           </w:p>
           <w:p>
@@ -6938,25 +6938,7 @@
               <w:rPr>
                 <w:sz w:val="17"/>
               </w:rPr>
-              <w:t>Chạy lại Hybrid và Hybrid + Reranker trên Dev sau D1, trên index dựng lại từ corpus 664634e, chấm ở K = 5 và 10; cập nhật README theo số mới.</w:t>
-            </w:r>
-          </w:p>
-          <w:p>
-            <w:pPr>
-              <w:spacing w:after="20" w:line="252" w:lineRule="auto"/>
-            </w:pPr>
-            <w:r>
-              <w:rPr>
-                <w:b/>
-                <w:sz w:val="17"/>
-              </w:rPr>
-              <w:t xml:space="preserve">Kiểm chứng: </w:t>
-            </w:r>
-            <w:r>
-              <w:rPr>
-                <w:sz w:val="17"/>
-              </w:rPr>
-              <w:t>Trên máy kiểm tra (GPU 4 GB, RAM 16 GB), Hybrid với bkai và bge-reranker-v2-m3 trong cùng một tiến trình bị segfault khi tải reranker (cả ở be28659, nên không do đợt sửa 25/10) hoặc hết bộ nhớ; reranker chạy riêng và Hybrid không reranker chạy được. Cần chạy trên máy đủ bộ nhớ.</w:t>
+              <w:t>Chạy lại Hybrid và Hybrid + Reranker trên Dev sau D1, trên index dựng lại từ corpus 664634e, chấm ở K = 5 và 10; nếu máy không đủ bộ nhớ cho cả model dense và reranker thì chạy hai bước (--reranker none --no-parent-context --top-k 50, rồi --retriever precomputed); cập nhật README theo số mới.</w:t>
             </w:r>
           </w:p>
         </w:tc>
@@ -6973,7 +6955,7 @@
               <w:rPr>
                 <w:sz w:val="17"/>
               </w:rPr>
-              <w:t>README.md:61</w:t>
+              <w:t>README.md:66</w:t>
             </w:r>
           </w:p>
         </w:tc>
@@ -7008,7 +6990,7 @@
               <w:rPr>
                 <w:sz w:val="17"/>
               </w:rPr>
-              <w:t>Còn một phần (33bc4ff)</w:t>
+              <w:t>Còn một phần (2559349)</w:t>
             </w:r>
           </w:p>
         </w:tc>
@@ -9945,7 +9927,7 @@
               <w:rPr>
                 <w:sz w:val="17"/>
               </w:rPr>
-              <w:t>Chia lại Dev/Test trên tập đã duyệt, khóa cả câu hỏi và gold của Test (D2). Chấm trên gold đã xác minh (F5). Chạy lại BM25 (F1), Dense, Hybrid (C2), Hybrid + Reranker ở K = 5 và 10 (G3), Zero-shot (F6) và các file của evaluation/results (C4) bằng code hiện tại, trên máy đủ bộ nhớ cho cả model dense và reranker. Viết baseline_report, cập nhật README và retrieval.md (F4, H4).</w:t>
+              <w:t>Chia lại Dev/Test trên tập đã duyệt, khóa cả câu hỏi và gold của Test (D2). Chấm trên gold đã xác minh (F5). Chạy lại BM25 (F1), Dense, Hybrid (C2), Hybrid + Reranker ở K = 5 và 10 (G3), Zero-shot (F6) và các file của evaluation/results (C4) bằng code hiện tại; Hybrid + Reranker chạy hai bước nếu máy không đủ bộ nhớ cho cả model dense và reranker (Phụ lục S). Viết baseline_report, cập nhật README và retrieval.md (F4, H4).</w:t>
             </w:r>
           </w:p>
         </w:tc>
@@ -10411,7 +10393,7 @@
               <w:rPr>
                 <w:sz w:val="17"/>
               </w:rPr>
-              <w:t>Code đã sửa xong ở C2, C4, F1, G5; chỉ còn chạy lại và thay file kết quả cũ. F3, F5 đã sửa phần index và ID; còn đổi nguồn gold và thêm kiểm tra trước khi chạy Test. G3 cần máy đủ bộ nhớ cho cả model dense và reranker.</w:t>
+              <w:t>Code đã sửa xong ở C2, C4, F1, G5; chỉ còn chạy lại và thay file kết quả cũ. F3, F5 đã sửa phần index và ID; còn đổi nguồn gold và thêm kiểm tra trước khi chạy Test. G3 chạy được trên máy hiện tại theo hai bước (Phụ lục S).</w:t>
             </w:r>
           </w:p>
         </w:tc>
@@ -10884,7 +10866,7 @@
               <w:rPr>
                 <w:sz w:val="17"/>
               </w:rPr>
-              <w:t>Đo G5 khi có gold; chạy lại Hybrid + Reranker (G3) trên máy đủ bộ nhớ.</w:t>
+              <w:t>Đo G5 khi có gold; chạy lại Hybrid + Reranker (G3), theo hai bước nếu thiếu bộ nhớ.</w:t>
             </w:r>
           </w:p>
         </w:tc>
@@ -19539,6 +19521,295 @@
                 <w:sz w:val="17"/>
               </w:rPr>
               <w:t>A6, A26 và cách ghi title của A16 chờ Dev 1 chốt. Dòng H5 không sửa: workflow chặn file .pyc, nhưng dòng này thuộc nhóm H và cần kiểm riêng nhánh NMA.</w:t>
+            </w:r>
+          </w:p>
+        </w:tc>
+      </w:tr>
+    </w:tbl>
+    <w:p>
+      <w:pPr>
+        <w:pStyle w:val="Heading1"/>
+      </w:pPr>
+      <w:r>
+        <w:rPr/>
+        <w:t>Phụ lục S. Reranker so với sơ đồ kiến trúc (27/10)</w:t>
+      </w:r>
+    </w:p>
+    <w:p>
+      <w:r>
+        <w:rPr/>
+        <w:t>Kiểm và sửa ngày 27/10/2026 trên testing e012ceb, commit 2559349 (chưa push). Sơ đồ kiến trúc: Rank Fusion (RRF) lấy Top-50, Cross-Encoder Neural Reranker (bge-reranker-v2-m3) trả Top-10, rồi Confidence Threshold Filter và Parent-Context Resolver. Cách kiểm: đọc reranking/reranker.py, pipeline.py, config.yaml, scripts/run_retrieval.py và git blame; chạy CLI với cấu hình mặc định trước và sau khi sửa; nạp model trên GPU (RTX 3050 Ti 4 GB) ở float32 và float16, đo VRAM bằng torch.cuda.max_memory_allocated và latency của 50 chunk đầu corpus ở lần gọi thứ hai; chạy python -m pytest bằng .venv với HF_HUB_OFFLINE=1.</w:t>
+      </w:r>
+    </w:p>
+    <w:tbl>
+      <w:tblPr>
+        <w:tblStyle w:val="TableGrid"/>
+        <w:tblW w:type="auto" w:w="0"/>
+        <w:jc w:val="center"/>
+        <w:tblLayout w:type="fixed"/>
+        <w:tblLook w:firstColumn="1" w:firstRow="1" w:lastColumn="0" w:lastRow="0" w:noHBand="0" w:noVBand="1" w:val="04A0"/>
+      </w:tblPr>
+      <w:tblGrid>
+        <w:gridCol w:w="1100"/>
+        <w:gridCol w:w="3200"/>
+        <w:gridCol w:w="5566"/>
+      </w:tblGrid>
+      <w:tr>
+        <w:trPr>
+          <w:tblHeader w:val="true"/>
+        </w:trPr>
+        <w:tc>
+          <w:tcPr>
+            <w:tcW w:type="dxa" w:w="1100"/>
+            <w:shd w:val="clear" w:color="auto" w:fill="DCE6F1"/>
+          </w:tcPr>
+          <w:p>
+            <w:r>
+              <w:rPr>
+                <w:b/>
+                <w:sz w:val="17"/>
+              </w:rPr>
+              <w:t>#</w:t>
+            </w:r>
+          </w:p>
+        </w:tc>
+        <w:tc>
+          <w:tcPr>
+            <w:tcW w:type="dxa" w:w="3200"/>
+            <w:shd w:val="clear" w:color="auto" w:fill="DCE6F1"/>
+          </w:tcPr>
+          <w:p>
+            <w:r>
+              <w:rPr>
+                <w:b/>
+                <w:sz w:val="17"/>
+              </w:rPr>
+              <w:t>Docx ghi</w:t>
+            </w:r>
+          </w:p>
+        </w:tc>
+        <w:tc>
+          <w:tcPr>
+            <w:tcW w:type="dxa" w:w="5566"/>
+            <w:shd w:val="clear" w:color="auto" w:fill="DCE6F1"/>
+          </w:tcPr>
+          <w:p>
+            <w:r>
+              <w:rPr>
+                <w:b/>
+                <w:sz w:val="17"/>
+              </w:rPr>
+              <w:t>Sau bản sửa 27/10 (2559349)</w:t>
+            </w:r>
+          </w:p>
+        </w:tc>
+      </w:tr>
+      <w:tr>
+        <w:tc>
+          <w:tcPr>
+            <w:tcW w:type="dxa" w:w="1100"/>
+          </w:tcPr>
+          <w:p>
+            <w:r>
+              <w:rPr>
+                <w:b/>
+                <w:sz w:val="17"/>
+              </w:rPr>
+              <w:t>Khớp sơ đồ</w:t>
+            </w:r>
+          </w:p>
+        </w:tc>
+        <w:tc>
+          <w:tcPr>
+            <w:tcW w:type="dxa" w:w="3200"/>
+          </w:tcPr>
+          <w:p>
+            <w:r>
+              <w:rPr>
+                <w:sz w:val="17"/>
+              </w:rPr>
+              <w:t>—</w:t>
+            </w:r>
+          </w:p>
+        </w:tc>
+        <w:tc>
+          <w:tcPr>
+            <w:tcW w:type="dxa" w:w="5566"/>
+          </w:tcPr>
+          <w:p>
+            <w:r>
+              <w:rPr>
+                <w:sz w:val="17"/>
+              </w:rPr>
+              <w:t>CrossEncoderScorer dùng sentence_transformers.CrossEncoder với BAAI/bge-reranker-v2-m3, chấm cặp (câu hỏi, chunk_text) trong một lần mã hóa, nên là cross-encoder đúng model của sơ đồ. Vị trí trong pipeline đúng: Hybrid RRF lấy retrieval_top_k = 50 = max_candidates, rồi reranker, rồi Parent-Context Resolver. Văn bản đưa vào là chunk_text dạng thường, không phải seg_text đã tách từ. rerank_top_k = 5 thay cho Top-10 là lệch có chủ đích (Sprint 6 mục 14.3, G1). Confidence Threshold Filter chưa có (E11).</w:t>
+            </w:r>
+          </w:p>
+        </w:tc>
+      </w:tr>
+      <w:tr>
+        <w:tc>
+          <w:tcPr>
+            <w:tcW w:type="dxa" w:w="1100"/>
+          </w:tcPr>
+          <w:p>
+            <w:r>
+              <w:rPr>
+                <w:b/>
+                <w:sz w:val="17"/>
+              </w:rPr>
+              <w:t>G7 (mới)</w:t>
+            </w:r>
+          </w:p>
+        </w:tc>
+        <w:tc>
+          <w:tcPr>
+            <w:tcW w:type="dxa" w:w="3200"/>
+          </w:tcPr>
+          <w:p>
+            <w:r>
+              <w:rPr>
+                <w:sz w:val="17"/>
+              </w:rPr>
+              <w:t>—</w:t>
+            </w:r>
+          </w:p>
+        </w:tc>
+        <w:tc>
+          <w:tcPr>
+            <w:tcW w:type="dxa" w:w="5566"/>
+          </w:tcPr>
+          <w:p>
+            <w:r>
+              <w:rPr>
+                <w:sz w:val="17"/>
+              </w:rPr>
+              <w:t>Đã sửa (2559349), không thêm vào bảng. Từ 6cf7654 và a774993 (19/10, Dev 5), reranking/config.yaml đặt backend: mock và CLI mặc định --retriever mock; 3b1b6dc (25/10) chỉ thêm cảnh báo. Lệnh kiểm hoàn thành của kế hoạch Sprint 6 (run_retrieval.py --query ... --top-k 5) vì thế chạy Dense mock và chấm bằng tỉ lệ token trùng; cross-encoder chỉ chạy khi truyền --reranker cross_encoder. Pipeline đặt nhãn &lt;retriever&gt;_reranker bất kể backend, nên output chạy mock trên fixture mang nhãn fixture_reranker, chỉ config.reranker.backend cho biết là mock. Kế hoạch cho phép mock trước khi nối model thật; model đã nối từ 19/10. Sửa: backend mặc định cross_encoder, --retriever mặc định hybrid; mock chỉ chạy khi chọn rõ và output mang nhãn &lt;retriever&gt;_mock_reranker; test và CI truyền --reranker mock. Chạy lại CLI trên fixture với cấu hình mặc định: nhãn fixture_reranker, backend cross_encoder, chunk Điều 8 khoản 1 Luật 52/2014 từ hạng retrieval 4 lên hạng 1 (điểm 0,98), chunk lạc đề xuống cuối (0,006).</w:t>
+            </w:r>
+          </w:p>
+        </w:tc>
+      </w:tr>
+      <w:tr>
+        <w:tc>
+          <w:tcPr>
+            <w:tcW w:type="dxa" w:w="1100"/>
+          </w:tcPr>
+          <w:p>
+            <w:r>
+              <w:rPr>
+                <w:b/>
+                <w:sz w:val="17"/>
+              </w:rPr>
+              <w:t>G3</w:t>
+            </w:r>
+          </w:p>
+        </w:tc>
+        <w:tc>
+          <w:tcPr>
+            <w:tcW w:type="dxa" w:w="3200"/>
+          </w:tcPr>
+          <w:p>
+            <w:r>
+              <w:rPr>
+                <w:sz w:val="17"/>
+              </w:rPr>
+              <w:t>Còn một phần (33bc4ff): chưa có kết quả Hybrid + Reranker; Hybrid với bkai và bge-reranker-v2-m3 trong một tiến trình bị segfault hoặc hết bộ nhớ, cần máy đủ bộ nhớ.</w:t>
+            </w:r>
+          </w:p>
+        </w:tc>
+        <w:tc>
+          <w:tcPr>
+            <w:tcW w:type="dxa" w:w="5566"/>
+          </w:tcPr>
+          <w:p>
+            <w:r>
+              <w:rPr>
+                <w:sz w:val="17"/>
+              </w:rPr>
+              <w:t>Còn một phần. Đã sửa phần bộ nhớ: (1) reranker.dtype: auto nạp float16 khi chạy CUDA: VRAM sau khi tải 1.083 MiB (float32: 2.166), đỉnh khi chấm 50 candidate 1.160 MiB (2.312), latency 50 candidate 406 ms (1.648 ms); điểm 6 candidate của fixture lệch tối đa 0,0006, thứ hạng giữ nguyên. (2) --retriever precomputed: lần 1 chạy Hybrid với --reranker none --no-parent-context --top-k 50 và lưu envelope, lần 2 chỉ nạp reranker và chấm theo query_id; từ chối file đã rerank, đã gắn parent_text, câu hỏi khác hoặc lưu ít hơn retrieval_top_k candidate; test kiểm kết quả hai bước trùng kết quả một bước. Segfault lúc nạp model ngày 27/10 xảy ra cả khi chạy reranker một mình ở CPU float32 lúc máy còn khoảng 1 GB bộ nhớ ảo trống, và hết khi máy còn khoảng 4,5 GB, nên là lỗi thiếu bộ nhớ của máy. Còn: chạy lại số trên Dev (cần Elasticsearch, index từ corpus hiện tại và gold D1).</w:t>
+            </w:r>
+          </w:p>
+        </w:tc>
+      </w:tr>
+      <w:tr>
+        <w:tc>
+          <w:tcPr>
+            <w:tcW w:type="dxa" w:w="1100"/>
+          </w:tcPr>
+          <w:p>
+            <w:r>
+              <w:rPr>
+                <w:b/>
+                <w:sz w:val="17"/>
+              </w:rPr>
+              <w:t>Test</w:t>
+            </w:r>
+          </w:p>
+        </w:tc>
+        <w:tc>
+          <w:tcPr>
+            <w:tcW w:type="dxa" w:w="3200"/>
+          </w:tcPr>
+          <w:p>
+            <w:r>
+              <w:rPr>
+                <w:sz w:val="17"/>
+              </w:rPr>
+              <w:t>Ở 21a2385: 497 pass, 20 skip, 0 fail.</w:t>
+            </w:r>
+          </w:p>
+        </w:tc>
+        <w:tc>
+          <w:tcPr>
+            <w:tcW w:type="dxa" w:w="5566"/>
+          </w:tcPr>
+          <w:p>
+            <w:r>
+              <w:rPr>
+                <w:sz w:val="17"/>
+              </w:rPr>
+              <w:t>python -m pytest 504 pass, 20 skip, 0 fail, 68 subtest pass. Test mới: mặc định hybrid và cross_encoder, nhãn *_mock_reranker, dtype (auto, giá trị sai, tham số truyền cho CrossEncoder bằng torch và sentence_transformers giả), chạy hai bước và các lỗi của file candidate. Lần chạy đầu khi máy thiếu bộ nhớ có 3 test CLI fail vì MemoryError; chạy lại pass.</w:t>
+            </w:r>
+          </w:p>
+        </w:tc>
+      </w:tr>
+      <w:tr>
+        <w:tc>
+          <w:tcPr>
+            <w:tcW w:type="dxa" w:w="1100"/>
+          </w:tcPr>
+          <w:p>
+            <w:r>
+              <w:rPr>
+                <w:b/>
+                <w:sz w:val="17"/>
+              </w:rPr>
+              <w:t>Không sửa</w:t>
+            </w:r>
+          </w:p>
+        </w:tc>
+        <w:tc>
+          <w:tcPr>
+            <w:tcW w:type="dxa" w:w="3200"/>
+          </w:tcPr>
+          <w:p>
+            <w:r>
+              <w:rPr>
+                <w:sz w:val="17"/>
+              </w:rPr>
+              <w:t>—</w:t>
+            </w:r>
+          </w:p>
+        </w:tc>
+        <w:tc>
+          <w:tcPr>
+            <w:tcW w:type="dxa" w:w="5566"/>
+          </w:tcPr>
+          <w:p>
+            <w:r>
+              <w:rPr>
+                <w:sz w:val="17"/>
+              </w:rPr>
+              <w:t>rerank_top_k giữ 5 (G1, chờ số đo ở K = 5 và 10). Confidence Threshold Filter giữa reranker và Parent-Context Resolver chưa có (E11, ngoài phạm vi Sprint 6). Nhánh retrieval 065e473 của Dev 4 cũng đổi backend sang cross_encoder và rerank_top_k sang 10; khi port nhánh đó chỉ còn khác rerank_top_k.</w:t>
             </w:r>
           </w:p>
         </w:tc>

</xml_diff>

<commit_message>
docs(report): record the CTM 113e356 recheck in Appendix T, drop fixed H5, trim C2, C4, C5, F5 and A7
</commit_message>
<xml_diff>
--- a/docs/sprint6_issue_recheck_after_merge.docx
+++ b/docs/sprint6_issue_recheck_after_merge.docx
@@ -25,7 +25,7 @@
         <w:rPr>
           <w:sz w:val="19"/>
         </w:rPr>
-        <w:t>Người lập: Dev 5 (Reranker &amp; Packaging Lead)   ·   Ngày: 22/10/2026   ·   Phạm vi: nhánh testing, commit 75dd586 (gộp CTM 5b62b35 và NMA f8e8311); nhóm A kiểm lại trên e9ee31d, e64c49a, 72a7377, 840c8a3, 64b65f0, 5ef41dc; nhóm C kiểm lại trên bafe1e8, 840c8a3, 3d646da, C3 sửa ở 75e06c8; nhóm B kiểm lại và sửa trên nhánh chunking_test (1c40712); trạng thái đối chiếu lại trên be28659 (25/10); sửa trên testing be28659..96d0086 (Phụ lục N); các dòng còn mở kiểm lại trên 948fc94 (Phụ lục O); gộp CTM 9348764 kiểm trên 01c639e (Phụ lục P); gộp NMA 86b55f5 kiểm trên 5ef41dc (Phụ lục Q); sửa A16, A7, H2 ngày 26/10 (Phụ lục R); kiểm và sửa reranker ngày 27/10 (Phụ lục S)</w:t>
+        <w:t>Người lập: Dev 5 (Reranker &amp; Packaging Lead)   ·   Ngày: 22/10/2026   ·   Phạm vi: nhánh testing, commit 75dd586 (gộp CTM 5b62b35 và NMA f8e8311); nhóm A kiểm lại trên e9ee31d, e64c49a, 72a7377, 840c8a3, 64b65f0, 5ef41dc; nhóm C kiểm lại trên bafe1e8, 840c8a3, 3d646da, C3 sửa ở 75e06c8; nhóm B kiểm lại và sửa trên nhánh chunking_test (1c40712); trạng thái đối chiếu lại trên be28659 (25/10); sửa trên testing be28659..96d0086 (Phụ lục N); các dòng còn mở kiểm lại trên 948fc94 (Phụ lục O); gộp CTM 9348764 kiểm trên 01c639e (Phụ lục P); gộp NMA 86b55f5 kiểm trên 5ef41dc (Phụ lục Q); sửa A16, A7, H2 ngày 26/10 (Phụ lục R); kiểm và sửa reranker ngày 27/10 (Phụ lục S); gộp CTM 113e356 kiểm trên 70a626d ngày 27/10 (Phụ lục T)</w:t>
       </w:r>
     </w:p>
     <w:p>
@@ -34,7 +34,7 @@
         <w:rPr>
           <w:sz w:val="19"/>
         </w:rPr>
-        <w:t>Cập nhật 23/10/2026: kiểm lại sau khi gộp origin/CTM ee755a5 vào testing (commit e64c49a). Mục 3 chỉ ghi phần còn lỗi tính tới e64c49a, gồm cả 7 lỗi mới. Cùng ngày, nhóm A được kiểm lại toàn bộ trên e64c49a (Phụ lục C); A24 và Phụ lục B (kết quả kiểm nhóm A trên e9ee31d ngày 22/10) bị mất trong lần cập nhật trước nên được ghi lại. Cũng ngày 23/10, nhóm C được kiểm lại toàn bộ trên bafe1e8, gồm phân tích lại C6 (Phụ lục D). Ngày 24/10/2026, sau khi kéo nhánh NMA mới nhất (testing fast-forward lên 72a7377), nhóm A được kiểm lại toàn bộ (Phụ lục E): A13, A23, A24 đã sửa và được bỏ khỏi bảng; thêm 2 lỗi mới A25, A26. Cũng ngày 24/10, nhóm B được kiểm lại và sửa trên nhánh chunking_test (Phụ lục F): B9, B12 đã sửa và được bỏ khỏi bảng; B1, B10, B13 đã sửa trong code nhưng còn trong bảng cho tới khi corpus trong repo được sinh lại; thêm 3 lỗi mới B14, B15, B16, đều đã sửa. Kiểm lại chunking sau commit: thêm B17 (chunker lấy câu đầu intro làm tiêu đề, đã sửa) và A27 (parser không nhận nhãn “Mục N.”, TT 04/2020 mất cấp Mục). Cuối ngày 24/10, sau khi gộp NMA (b031620–fc997a6) vào testing ở 840c8a3, nhóm C được kiểm lại toàn bộ (Phụ lục G): không lỗi nào sửa xong; C6 sửa thêm một phần (ID của Luật 1986 viết thường, test định danh cho parsed_jsons, run_experiment.py không còn ghi cứng file TTLT); các lỗi C khác không đổi vì contract, schema, code retrieval, reranker và benchmark không đổi từ bafe1e8. Cũng ở 840c8a3, nhóm A được kiểm lại toàn bộ (Phụ lục H): A21 đã sửa và được bỏ khỏi bảng; A25, A26 sửa phần lớn, nhưng mẫu cắt chú thích VBHN mới không khớp chỗ nào (chú thích nay nằm trong Luật 52/2014 Điều 2 khoản 3) và mẫu nhãn “Hướng dẫn” mới để lọt lại 3 nhãn ở NĐ 10/2015. Sau đó C3 được sửa ở 75e06c8 (bảng ánh xạ status → validity_status ở mục 3.1 của data_contract.md và test_registry_validity_status_mapping) và được bỏ khỏi bảng. Cuối ngày 24/10, sau khi gộp NMA 1260ed8 vào testing ở 64b65f0, nhóm A được kiểm lại (Phụ lục I): 11 PDF gốc được thay bằng bản có lớp text; A27 đã sửa và được bỏ khỏi bảng; A25 chỉ còn phần corpus và các mẫu cleaner thừa; L01 quay về bản gốc 2014 (A6); thêm lỗi mới A28 (ghép dòng làm mất dấu câu, làm 1 test fail). Ngày 25/10, A28 và phần test của A7 được sửa ở commit 77b5886 trên testing (Phụ lục K): A28 được bỏ khỏi bảng, A7 chỉ còn CI và test cho cleaner. Cũng ngày 25/10, corpus được sinh lại ở 664634e (21 văn bản, 2.011 chunk, tách từ underthesea): A25, A26 hết phần corpus; B1, B10, B13 đã sửa và được bỏ khỏi bảng; B2 chỉ còn phía truy vấn và requirements-bkai.txt. Cũng ngày 25/10, sau khi kéo nhánh CTM (f87a327, 4afa41e, 3d646da) vào testing, nhóm C được kiểm lại toàn bộ trên 3d646da (Phụ lục L): C6, C8, C9 đã sửa và được bỏ khỏi bảng; C2, C4, C5, C7 sửa thêm một phần và chỉ còn phần chưa sửa; thêm lỗi mới C10 (3d646da làm scripts/build_gold_300_provisional.py lỗi cú pháp; phần lỗi cú pháp sửa ở d1eaa3a). Sau đó article_index.json được bổ sung 9 văn bản còn thiếu ở d24ff2a; C5 chỉ còn context_registry.json và kiểu ID của gold_article_ids. C7 sửa xong ở 33bc4ff (xóa reranking/results cũ, bỏ ENVELOPE_FIELDS) và được bỏ khỏi bảng. Cuối ngày 25/10, trạng thái các dòng của mục 3 được đối chiếu lại với code trên be28659 (Phụ lục M): H5 chưa sửa (testing vẫn theo dõi 2 file .pyc) nên chuyển về Còn; A11, A16, B3, E3, E12, E15 đã sửa phần của register v2 nhưng còn việc nên chuyển sang Còn một phần; B3 bỏ phần đã hết (ID chữ hoa, candidate của Luật 52/2014 và NĐ 207/2025); G3 bỏ phần reranking/results đã xóa ở 33bc4ff. Mục 5 được viết lại vì parser và corpus không còn nằm trên đường găng, và có thêm bảng phân loại lỗi theo mức cần phối hợp. Cũng ngày 25/10, các lỗi sửa được mà không cần bàn với dev khác được sửa trên testing, 9 commit từ 5e0b9c2 tới 96d0086, chưa push (Phụ lục N): A8, A11, A25, B3, C10, D3, D4, D5, E3, E7, E9, E10, E15, G1, G2, G6, H9 đã sửa và được bỏ khỏi bảng; A7, B2, B4, C2, C4, C5, E11, E14, F1, G5, H2, H4, H5 chỉ còn phần chưa sửa; D1 ghi thêm 11 câu đã duyệt còn trong gold_id_proposals_300.json. Toàn bộ test chạy chung (parser/, tests/, test/): 531 pass, 20 skip, 0 fail. Mục 5 viết lại theo các lỗi còn mở. Cuối ngày 25/10, các dòng còn mở của mục 3 được kiểm lại trên 948fc94 (đã push lên origin/testing; các nhánh remote khác không có commit mới) (Phụ lục O): E4, F3, F5 đã sửa một phần ở 664634e, f32754e, 146a6c9 mà bản trước chưa ghi, nên chuyển từ Còn sang Còn một phần; H8 bỏ phần tách từ đã sửa; B5, B7, E1, F1, H1 cập nhật số đo trên corpus 664634e; các dòng khác không đổi. Bước 2 của mục 5 thêm phần E4 (Dense dừng khi thiếu underthesea). Test chạy chung: 531 pass, 20 skip, 0 fail. Ngày 26/10, sau khi gộp CTM 9348764 vào testing ở 411075a, sửa thêm ở 01c639e, chưa push (Phụ lục P): CTM gộp tests/ vào test/ và bỏ bản test benchmark trùng, nên H2 chỉ còn retrieval/test/ nằm ngoài testpaths của pytest.ini; B4 cập nhật đường dẫn test/schema_test.py; lệnh chạy test ở A7 và mục 5 đổi thành python -m pytest. Phát hiện và sửa ở 01c639e: 9348764 chuyển schema_test.py mà không sửa demo_pipeline.py, nên demo lỗi ngay khi chạy. Các dòng khác không đổi. Test chạy chung: 490 pass, 20 skip, 0 fail (bớt 41 test của bản trùng). Cuối ngày 26/10, sau khi gộp NMA 86b55f5 (“update document title”) vào testing ở 5ef41dc, chưa push, nhóm A được kiểm lại (Phụ lục Q): title của 21/23 bản ghi registry (19 văn bản có parsed_jsons) đổi sang trích yếu của văn bản, ba Luật HNGĐ cùng ghi năm, nên A16 chỉ còn phần corpus, test, hai bảng ID và cách ghi title; A7 thêm một commit được đẩy lên khi test parser fail; A6, A26 không đổi. Test chạy chung: 489 pass, 20 skip, 1 fail (A16). Cũng tối 26/10 (Phụ lục R; 856e6be, 4ec0706, dfc025b): sửa các phần không cần bàn của A16 (test, hai bảng ID, NĐ 207/2025, dấu cách TT 34/2017, sinh lại corpus) và A7 (thêm workflow CI), nên A16 chỉ còn cách ghi title của 5 văn bản cũ, A7 chỉ còn push workflow và bật branch protection. Test chạy chung: 490 pass, 20 skip, 0 fail. Sau đó H2 được sửa ở 21a2385: pytest.ini thêm retrieval/test vào testpaths, nên python -m pytest chạy cả 7 test của Dev 4 (497 pass, 20 skip, 0 fail); dòng H2 được bỏ khỏi bảng. Ngày 27/10 (Phụ lục S; 2559349): kiểm reranker theo sơ đồ kiến trúc. Code có Cross-Encoder bge-reranker-v2-m3 thật, nhưng reranking/config.yaml đặt backend: mock và CLI mặc định --retriever mock từ 19/10, nên lệnh run_retrieval.py --query ... --top-k 5 của kế hoạch Sprint 6 chạy toàn bộ bằng stub mà output vẫn mang nhãn *_reranker. Lỗi mới G7 này đã sửa và không thêm vào bảng. Cùng commit, reranker nạp fp16 trên GPU và có chế độ chạy hai bước, nên G3 không còn cần máy khác; G3 chỉ còn chạy lại số. Test chạy chung: 504 pass, 20 skip, 0 fail.</w:t>
+        <w:t>Cập nhật 23/10/2026: kiểm lại sau khi gộp origin/CTM ee755a5 vào testing (commit e64c49a). Mục 3 chỉ ghi phần còn lỗi tính tới e64c49a, gồm cả 7 lỗi mới. Cùng ngày, nhóm A được kiểm lại toàn bộ trên e64c49a (Phụ lục C); A24 và Phụ lục B (kết quả kiểm nhóm A trên e9ee31d ngày 22/10) bị mất trong lần cập nhật trước nên được ghi lại. Cũng ngày 23/10, nhóm C được kiểm lại toàn bộ trên bafe1e8, gồm phân tích lại C6 (Phụ lục D). Ngày 24/10/2026, sau khi kéo nhánh NMA mới nhất (testing fast-forward lên 72a7377), nhóm A được kiểm lại toàn bộ (Phụ lục E): A13, A23, A24 đã sửa và được bỏ khỏi bảng; thêm 2 lỗi mới A25, A26. Cũng ngày 24/10, nhóm B được kiểm lại và sửa trên nhánh chunking_test (Phụ lục F): B9, B12 đã sửa và được bỏ khỏi bảng; B1, B10, B13 đã sửa trong code nhưng còn trong bảng cho tới khi corpus trong repo được sinh lại; thêm 3 lỗi mới B14, B15, B16, đều đã sửa. Kiểm lại chunking sau commit: thêm B17 (chunker lấy câu đầu intro làm tiêu đề, đã sửa) và A27 (parser không nhận nhãn “Mục N.”, TT 04/2020 mất cấp Mục). Cuối ngày 24/10, sau khi gộp NMA (b031620–fc997a6) vào testing ở 840c8a3, nhóm C được kiểm lại toàn bộ (Phụ lục G): không lỗi nào sửa xong; C6 sửa thêm một phần (ID của Luật 1986 viết thường, test định danh cho parsed_jsons, run_experiment.py không còn ghi cứng file TTLT); các lỗi C khác không đổi vì contract, schema, code retrieval, reranker và benchmark không đổi từ bafe1e8. Cũng ở 840c8a3, nhóm A được kiểm lại toàn bộ (Phụ lục H): A21 đã sửa và được bỏ khỏi bảng; A25, A26 sửa phần lớn, nhưng mẫu cắt chú thích VBHN mới không khớp chỗ nào (chú thích nay nằm trong Luật 52/2014 Điều 2 khoản 3) và mẫu nhãn “Hướng dẫn” mới để lọt lại 3 nhãn ở NĐ 10/2015. Sau đó C3 được sửa ở 75e06c8 (bảng ánh xạ status → validity_status ở mục 3.1 của data_contract.md và test_registry_validity_status_mapping) và được bỏ khỏi bảng. Cuối ngày 24/10, sau khi gộp NMA 1260ed8 vào testing ở 64b65f0, nhóm A được kiểm lại (Phụ lục I): 11 PDF gốc được thay bằng bản có lớp text; A27 đã sửa và được bỏ khỏi bảng; A25 chỉ còn phần corpus và các mẫu cleaner thừa; L01 quay về bản gốc 2014 (A6); thêm lỗi mới A28 (ghép dòng làm mất dấu câu, làm 1 test fail). Ngày 25/10, A28 và phần test của A7 được sửa ở commit 77b5886 trên testing (Phụ lục K): A28 được bỏ khỏi bảng, A7 chỉ còn CI và test cho cleaner. Cũng ngày 25/10, corpus được sinh lại ở 664634e (21 văn bản, 2.011 chunk, tách từ underthesea): A25, A26 hết phần corpus; B1, B10, B13 đã sửa và được bỏ khỏi bảng; B2 chỉ còn phía truy vấn và requirements-bkai.txt. Cũng ngày 25/10, sau khi kéo nhánh CTM (f87a327, 4afa41e, 3d646da) vào testing, nhóm C được kiểm lại toàn bộ trên 3d646da (Phụ lục L): C6, C8, C9 đã sửa và được bỏ khỏi bảng; C2, C4, C5, C7 sửa thêm một phần và chỉ còn phần chưa sửa; thêm lỗi mới C10 (3d646da làm scripts/build_gold_300_provisional.py lỗi cú pháp; phần lỗi cú pháp sửa ở d1eaa3a). Sau đó article_index.json được bổ sung 9 văn bản còn thiếu ở d24ff2a; C5 chỉ còn context_registry.json và kiểu ID của gold_article_ids. C7 sửa xong ở 33bc4ff (xóa reranking/results cũ, bỏ ENVELOPE_FIELDS) và được bỏ khỏi bảng. Cuối ngày 25/10, trạng thái các dòng của mục 3 được đối chiếu lại với code trên be28659 (Phụ lục M): H5 chưa sửa (testing vẫn theo dõi 2 file .pyc) nên chuyển về Còn; A11, A16, B3, E3, E12, E15 đã sửa phần của register v2 nhưng còn việc nên chuyển sang Còn một phần; B3 bỏ phần đã hết (ID chữ hoa, candidate của Luật 52/2014 và NĐ 207/2025); G3 bỏ phần reranking/results đã xóa ở 33bc4ff. Mục 5 được viết lại vì parser và corpus không còn nằm trên đường găng, và có thêm bảng phân loại lỗi theo mức cần phối hợp. Cũng ngày 25/10, các lỗi sửa được mà không cần bàn với dev khác được sửa trên testing, 9 commit từ 5e0b9c2 tới 96d0086, chưa push (Phụ lục N): A8, A11, A25, B3, C10, D3, D4, D5, E3, E7, E9, E10, E15, G1, G2, G6, H9 đã sửa và được bỏ khỏi bảng; A7, B2, B4, C2, C4, C5, E11, E14, F1, G5, H2, H4, H5 chỉ còn phần chưa sửa; D1 ghi thêm 11 câu đã duyệt còn trong gold_id_proposals_300.json. Toàn bộ test chạy chung (parser/, tests/, test/): 531 pass, 20 skip, 0 fail. Mục 5 viết lại theo các lỗi còn mở. Cuối ngày 25/10, các dòng còn mở của mục 3 được kiểm lại trên 948fc94 (đã push lên origin/testing; các nhánh remote khác không có commit mới) (Phụ lục O): E4, F3, F5 đã sửa một phần ở 664634e, f32754e, 146a6c9 mà bản trước chưa ghi, nên chuyển từ Còn sang Còn một phần; H8 bỏ phần tách từ đã sửa; B5, B7, E1, F1, H1 cập nhật số đo trên corpus 664634e; các dòng khác không đổi. Bước 2 của mục 5 thêm phần E4 (Dense dừng khi thiếu underthesea). Test chạy chung: 531 pass, 20 skip, 0 fail. Ngày 26/10, sau khi gộp CTM 9348764 vào testing ở 411075a, sửa thêm ở 01c639e, chưa push (Phụ lục P): CTM gộp tests/ vào test/ và bỏ bản test benchmark trùng, nên H2 chỉ còn retrieval/test/ nằm ngoài testpaths của pytest.ini; B4 cập nhật đường dẫn test/schema_test.py; lệnh chạy test ở A7 và mục 5 đổi thành python -m pytest. Phát hiện và sửa ở 01c639e: 9348764 chuyển schema_test.py mà không sửa demo_pipeline.py, nên demo lỗi ngay khi chạy. Các dòng khác không đổi. Test chạy chung: 490 pass, 20 skip, 0 fail (bớt 41 test của bản trùng). Cuối ngày 26/10, sau khi gộp NMA 86b55f5 (“update document title”) vào testing ở 5ef41dc, chưa push, nhóm A được kiểm lại (Phụ lục Q): title của 21/23 bản ghi registry (19 văn bản có parsed_jsons) đổi sang trích yếu của văn bản, ba Luật HNGĐ cùng ghi năm, nên A16 chỉ còn phần corpus, test, hai bảng ID và cách ghi title; A7 thêm một commit được đẩy lên khi test parser fail; A6, A26 không đổi. Test chạy chung: 489 pass, 20 skip, 1 fail (A16). Cũng tối 26/10 (Phụ lục R; 856e6be, 4ec0706, dfc025b): sửa các phần không cần bàn của A16 (test, hai bảng ID, NĐ 207/2025, dấu cách TT 34/2017, sinh lại corpus) và A7 (thêm workflow CI), nên A16 chỉ còn cách ghi title của 5 văn bản cũ, A7 chỉ còn push workflow và bật branch protection. Test chạy chung: 490 pass, 20 skip, 0 fail. Sau đó H2 được sửa ở 21a2385: pytest.ini thêm retrieval/test vào testpaths, nên python -m pytest chạy cả 7 test của Dev 4 (497 pass, 20 skip, 0 fail); dòng H2 được bỏ khỏi bảng. Ngày 27/10 (Phụ lục S; 2559349): kiểm reranker theo sơ đồ kiến trúc. Code có Cross-Encoder bge-reranker-v2-m3 thật, nhưng reranking/config.yaml đặt backend: mock và CLI mặc định --retriever mock từ 19/10, nên lệnh run_retrieval.py --query ... --top-k 5 của kế hoạch Sprint 6 chạy toàn bộ bằng stub mà output vẫn mang nhãn *_reranker. Lỗi mới G7 này đã sửa và không thêm vào bảng. Cùng commit, reranker nạp fp16 trên GPU và có chế độ chạy hai bước, nên G3 không còn cần máy khác; G3 chỉ còn chạy lại số. Test chạy chung: 504 pass, 20 skip, 0 fail. Cũng ngày 27/10 (Phụ lục T), sau khi gộp origin/CTM 113e356 vào testing ở f031d7b (không conflict) và xóa các dấu \ nối dòng thừa mà commit này đưa lại ở 70a626d: validate_benchmark.py chỉ dùng production_chunk_index.json, nên C5 chỉ còn việc duyệt article_index; 6 file retrieval/results/dev_*.json cũ đã xóa và hai script đánh giá chỉ nhận RetrievalEnvelope, nên C2 chỉ còn sinh lại kết quả và hai file CSV cũ; C4 có script sync-clauses nhưng script ghi đè gold_clause_ids; F5 bỏ evaluation/bm25_dev_metrics.json. Workflow CI đã chạy 4 lần trên GitHub, đều thành công, nên A7 chỉ còn branch protection. origin/NMA không còn theo dõi file .pyc nên H5 đã sửa và được bỏ khỏi bảng. H4 thêm phần link tới file kết quả đã xóa. Test chạy chung: 507 pass, 20 skip, 0 fail.</w:t>
       </w:r>
     </w:p>
     <w:p>
@@ -50,7 +50,7 @@
         <w:spacing w:after="80"/>
       </w:pPr>
       <w:r>
-        <w:t>Trong 67 lỗi của register v2, tính tới commit e64c49a (nhóm A tính tới 5ef41dc, nhóm B tính tới bản sửa chunking ngày 24/10 và corpus sinh lại ở 664634e, nhóm C tính tới 3d646da; trạng thái đối chiếu lại trên be28659, Phụ lục M; các lỗi sửa ngày 25/10 tính tới 3b1b6dc, Phụ lục N; các dòng còn mở kiểm lại trên 948fc94, Phụ lục O; thay đổi của CTM 9348764 tính tới 01c639e, Phụ lục P; title của NMA 86b55f5 tính tới 5ef41dc, Phụ lục Q; bản sửa A16, A7 ngày 26/10, Phụ lục R; reranker ngày 27/10, Phụ lục S): 32 đã sửa, 1 đóng, 22 còn một phần, 1 đổi tính chất, 2 nặng hơn, 9 còn nguyên. Phát hiện thêm 22 lỗi mới: A22, A23, A24, B11, B12 (22/10; A22, A23, A24, B11 và B12 nay đã sửa), B13 (nay đã sửa), C6, C7, C8, C9, D5, H9 (23/10, sau khi gộp CTM; C6, C8, C9 nay đã sửa ở 3d646da, C7 ở 33bc4ff), A25, A26 (24/10, sau khi kéo NMA 72a7377; nay sửa một phần ở 840c8a3 và 64b65f0), B14, B15, B16, B17 (24/10, khi kiểm lại nhóm B; đã sửa) A27 (24/10, khi kiểm lại corpus thử 21 văn bản; nay đã sửa), A28 (24/10, sau khi gộp NMA 1260ed8; nay đã sửa ở 77b5886) và C10 (25/10, sau khi kéo CTM 3d646da; đã sửa ở d1eaa3a và b7f5e30; D5, H9 và A25 cũng đã sửa ngày 25/10) và G7 (27/10, reranker mặc định là mock; đã sửa ở 2559349). Trong 15 lỗi mức Cao, 8 đã sửa (A1, A12, A13, A14, B1, E15, C1, C3), 7 còn mở (B2, D1, D2, E1, E2, F1, F5). Nhóm A, B, C đã được kiểm lại lần 2 trên commit 75dd586; các chỗ đính chính ghi ở Phụ lục A. Nhóm A được kiểm lại lần 3 trên e9ee31d (Phụ lục B), lần 4 trên e64c49a (Phụ lục C) và lần 5 trên 72a7377 (Phụ lục E), lần 6 trên 840c8a3 (Phụ lục H) và lần 7 trên 64b65f0 (Phụ lục I); A28 sửa ngày 25/10 (Phụ lục K). Ngày 23/10 kiểm lại các lỗi liên quan tới thay đổi của CTM và toàn bộ nhóm A; nhóm C được kiểm lại toàn bộ trên bafe1e8 (Phụ lục D) trên 840c8a3 sau khi gộp NMA (Phụ lục G) và trên 3d646da sau khi kéo CTM (Phụ lục L); ngày 24/10 nhóm B được kiểm lại và sửa trên nhánh chunking_test (Phụ lục F); các lỗi còn lại giữ kết quả ngày 22/10.</w:t>
+        <w:t>Trong 67 lỗi của register v2, tính tới commit e64c49a (nhóm A tính tới 5ef41dc, nhóm B tính tới bản sửa chunking ngày 24/10 và corpus sinh lại ở 664634e, nhóm C tính tới 3d646da; trạng thái đối chiếu lại trên be28659, Phụ lục M; các lỗi sửa ngày 25/10 tính tới 3b1b6dc, Phụ lục N; các dòng còn mở kiểm lại trên 948fc94, Phụ lục O; thay đổi của CTM 9348764 tính tới 01c639e, Phụ lục P; title của NMA 86b55f5 tính tới 5ef41dc, Phụ lục Q; bản sửa A16, A7 ngày 26/10, Phụ lục R; reranker ngày 27/10, Phụ lục S; CTM 113e356 tính tới 70a626d, Phụ lục T): 33 đã sửa, 1 đóng, 21 còn một phần, 1 đổi tính chất, 2 nặng hơn, 9 còn nguyên. Phát hiện thêm 22 lỗi mới: A22, A23, A24, B11, B12 (22/10; A22, A23, A24, B11 và B12 nay đã sửa), B13 (nay đã sửa), C6, C7, C8, C9, D5, H9 (23/10, sau khi gộp CTM; C6, C8, C9 nay đã sửa ở 3d646da, C7 ở 33bc4ff), A25, A26 (24/10, sau khi kéo NMA 72a7377; nay sửa một phần ở 840c8a3 và 64b65f0), B14, B15, B16, B17 (24/10, khi kiểm lại nhóm B; đã sửa) A27 (24/10, khi kiểm lại corpus thử 21 văn bản; nay đã sửa), A28 (24/10, sau khi gộp NMA 1260ed8; nay đã sửa ở 77b5886) và C10 (25/10, sau khi kéo CTM 3d646da; đã sửa ở d1eaa3a và b7f5e30; D5, H9 và A25 cũng đã sửa ngày 25/10) và G7 (27/10, reranker mặc định là mock; đã sửa ở 2559349). Trong 15 lỗi mức Cao, 8 đã sửa (A1, A12, A13, A14, B1, E15, C1, C3), 7 còn mở (B2, D1, D2, E1, E2, F1, F5). Nhóm A, B, C đã được kiểm lại lần 2 trên commit 75dd586; các chỗ đính chính ghi ở Phụ lục A. Nhóm A được kiểm lại lần 3 trên e9ee31d (Phụ lục B), lần 4 trên e64c49a (Phụ lục C) và lần 5 trên 72a7377 (Phụ lục E), lần 6 trên 840c8a3 (Phụ lục H) và lần 7 trên 64b65f0 (Phụ lục I); A28 sửa ngày 25/10 (Phụ lục K). Ngày 23/10 kiểm lại các lỗi liên quan tới thay đổi của CTM và toàn bộ nhóm A; nhóm C được kiểm lại toàn bộ trên bafe1e8 (Phụ lục D) trên 840c8a3 sau khi gộp NMA (Phụ lục G) và trên 3d646da sau khi kéo CTM (Phụ lục L); ngày 24/10 nhóm B được kiểm lại và sửa trên nhánh chunking_test (Phụ lục F); các lỗi còn lại giữ kết quả ngày 22/10.</w:t>
       </w:r>
     </w:p>
     <w:p>
@@ -115,11 +115,9 @@
         <w:rPr>
           <w:b/>
         </w:rPr>
-        <w:t>Kết quả đã commit không còn dùng được (F1, G3, C2).</w:t>
+        <w:t>Kết quả đã commit không còn dùng được (F1, G3, C2). evaluation/results chỉ có 251/662 chunk_id khác nhau thuộc corpus mới; các file dev_*.json cũ của retrieval/results và reranking/results đã xóa (113e356, 33bc4ff), nên chưa có kết quả retrieval nào trên corpus hiện tại. Các số đo trong README và báo cáo cần chạy lại sau khi sửa gold.</w:t>
       </w:r>
-      <w:r>
-        <w:t xml:space="preserve"> Số chunk_id khác nhau thuộc corpus mới là 0/562 ở evaluation/results, 0/602–0/674 ở retrieval/results; reranking/results (0/743, 0/718) đã xóa ở 33bc4ff. Các số đo trong README và báo cáo cần chạy lại sau khi sửa gold.</w:t>
-      </w:r>
+      <w:r/>
     </w:p>
     <w:p>
       <w:pPr>
@@ -128,7 +126,7 @@
       </w:pPr>
       <w:r>
         <w:rPr/>
-        <w:t>Contract đã khớp registry và schema; nơi ghi kết quả chưa theo kịp (C2, C5). CTM 3d646da sửa xong C6, C8, C9: mục 2 của data_contract.md lấy document_id từ registry (ghi ngoại lệ TTLT 01/2016), bảng ID ở contract và README có đủ 21 văn bản của corpus, test mới đối chiếu registry với hai bảng và chunks.jsonl; mục 3.1 có 7 loại văn bản như schema, parser báo lỗi ngay khi registry ghi loại khác; registry bỏ type, đổi status thành source_status, và cả 2.011 chunk mang source_status, provision_status. RetrievalEnvelope nay khai báo query, config, stats; pipeline điền latency_ms, top_k; test kiểm toàn bộ output theo schema (C7). Còn: run_dev_retrieval.py vẫn ghi danh sách phẳng, trái mục 5.4 của contract (C2); validate_benchmark.py vẫn đọc context_registry.json cũ (C5; article_index.json đã bổ sung đủ 21 văn bản ở d24ff2a). Các file kết quả cũ trong reranking/results đã xóa ở 33bc4ff, C7 xong. 3d646da lại được đẩy lên mà không chạy kiểm tra: scripts/build_gold_300_provisional.py lỗi cú pháp ở dòng 44 (đã sửa ở d1eaa3a; phần còn lại ở C10); fixture BM25 vẫn lệch test (H9).</w:t>
+        <w:t>Contract đã khớp registry và schema; nơi ghi kết quả chưa theo kịp (C2, C5). CTM 3d646da sửa xong C6, C8, C9: mục 2 của data_contract.md lấy document_id từ registry (ghi ngoại lệ TTLT 01/2016), bảng ID ở contract và README có đủ 21 văn bản của corpus, test mới đối chiếu registry với hai bảng và chunks.jsonl; mục 3.1 có 7 loại văn bản như schema, parser báo lỗi ngay khi registry ghi loại khác; registry bỏ type, đổi status thành source_status, và cả 2.011 chunk mang source_status, provision_status. RetrievalEnvelope nay khai báo query, config, stats; pipeline điền latency_ms, top_k; test kiểm toàn bộ output theo schema (C7). Còn: chưa có kết quả Dev trên corpus hiện tại (C2); 334 dòng mới của article_index chưa được Dev 1 duyệt (C5). Các file kết quả cũ trong reranking/results đã xóa ở 33bc4ff, C7 xong. 3d646da lại được đẩy lên mà không chạy kiểm tra: scripts/build_gold_300_provisional.py lỗi cú pháp ở dòng 44 (đã sửa ở d1eaa3a; phần còn lại ở C10); fixture BM25 vẫn lệch test (H9).</w:t>
       </w:r>
     </w:p>
     <w:p>
@@ -1388,7 +1386,7 @@
               <w:spacing w:after="0"/>
             </w:pPr>
             <w:r>
-              <w:t>1</w:t>
+              <w:t>2</w:t>
             </w:r>
             <w:r>
               <w:rPr>
@@ -1428,7 +1426,7 @@
               <w:spacing w:after="0"/>
             </w:pPr>
             <w:r>
-              <w:t>3</w:t>
+              <w:t>2</w:t>
             </w:r>
             <w:r>
               <w:rPr>
@@ -1553,7 +1551,7 @@
                 <w:b/>
                 <w:sz w:val="17"/>
               </w:rPr>
-              <w:t>32</w:t>
+              <w:t>33</w:t>
             </w:r>
           </w:p>
         </w:tc>
@@ -1589,7 +1587,7 @@
                 <w:b/>
                 <w:sz w:val="17"/>
               </w:rPr>
-              <w:t>22</w:t>
+              <w:t>21</w:t>
             </w:r>
           </w:p>
         </w:tc>
@@ -2161,7 +2159,7 @@
         <w:spacing w:after="80"/>
       </w:pPr>
       <w:r>
-        <w:t>Các lỗi đã sửa hoặc đã đóng mà không còn việc gì được bỏ khỏi bảng (vẫn tính trong thống kê ở mục 1; kết quả kiểm nhóm A ở Phụ lục C, E, H, I và K, nhóm B ở Phụ lục F, nhóm C ở Phụ lục D, G và L; các lỗi sửa ngày 25/10 ở Phụ lục N): A1, A5, A8, A10, A11, A12, A13, A14, A15, A17, A18, A19, A20, A21, A22, A23, A24, A25, A27, A28, B1, B3, B8, B9, B10, B11, B12, B13, B14, B15, B16, B17, C1, C3, C6, C7, C8, C9, C10, D3, D4, D5, E3, E5, E7, E9, E10, E15, G1, G2, G6, H2, H9. Đề xuất CI (gồm kiểm tra chunks.jsonl khớp parsed_jsons của B11) nằm ở A7 và bước 0 của mục 5.</w:t>
+        <w:t>Các lỗi đã sửa hoặc đã đóng mà không còn việc gì được bỏ khỏi bảng (vẫn tính trong thống kê ở mục 1; kết quả kiểm nhóm A ở Phụ lục C, E, H, I và K, nhóm B ở Phụ lục F, nhóm C ở Phụ lục D, G và L; các lỗi sửa ngày 25/10 ở Phụ lục N): A1, A5, A8, A10, A11, A12, A13, A14, A15, A17, A18, A19, A20, A21, A22, A23, A24, A25, A27, A28, B1, B3, B8, B9, B10, B11, B12, B13, B14, B15, B16, B17, C1, C3, C6, C7, C8, C9, C10, D3, D4, D5, E3, E5, E7, E9, E10, E15, G1, G2, G6, H2, H5, H9. Đề xuất CI (gồm kiểm tra chunks.jsonl khớp parsed_jsons của B11) nằm ở A7 và bước 0 của mục 5.</w:t>
       </w:r>
     </w:p>
     <w:p>
@@ -2643,7 +2641,7 @@
               <w:rPr>
                 <w:sz w:val="17"/>
               </w:rPr>
-              <w:t>CI đã có (.github/workflows/tests.yml, dfc025b) nhưng chưa chặn được merge: testing và main chưa bật branch protection, nên commit có check đỏ vẫn gộp được; workflow chưa chạy lần nào trên GitHub (máy Linux) vì chưa push.</w:t>
+              <w:t>CI đã có (.github/workflows/tests.yml, dfc025b) nhưng chưa chặn được merge: testing và main chưa bật branch protection, nên commit có check đỏ vẫn gộp được.</w:t>
             </w:r>
           </w:p>
           <w:p>
@@ -2661,7 +2659,7 @@
               <w:rPr>
                 <w:sz w:val="17"/>
               </w:rPr>
-              <w:t>Push workflow lên testing và xem lần chạy đầu trên GitHub; admin repo bật branch protection cho testing và main, bắt buộc check “tests / pytest” trước khi merge.</w:t>
+              <w:t>Admin repo bật branch protection cho testing và main, bắt buộc check “tests / pytest” trước khi merge.</w:t>
             </w:r>
           </w:p>
           <w:p>
@@ -2679,7 +2677,7 @@
               <w:rPr>
                 <w:sz w:val="17"/>
               </w:rPr>
-              <w:t>GitHub API (26/10): branches/testing và branches/main đều trả “protected”: false.</w:t>
+              <w:t>Trang Branches của repo (27/10): testing và main đều có protectedByBranchProtections: false và không có ruleset.</w:t>
             </w:r>
           </w:p>
         </w:tc>
@@ -3786,7 +3784,7 @@
               <w:rPr>
                 <w:sz w:val="17"/>
               </w:rPr>
-              <w:t>6 file retrieval/results/dev_*.json vẫn là bản cũ dạng phẳng: 0/2.850 bản ghi hợp lệ theo schema và 0/602–0/754 chunk_id khác nhau thuộc corpus hiện tại (2.011 chunk). evaluate_task4.py và retrieval_evaluation.py vẫn giữ nhánh đọc dạng phẳng.</w:t>
+              <w:t>Chưa có file kết quả BM25, Dense, Hybrid nào trên corpus hiện tại (2.011 chunk). retrieval/results/metrics.csv và article_metrics.csv vẫn được theo dõi, nhưng được tính ở fbee2aa từ các file kết quả trên corpus cũ không còn trong repo.</w:t>
             </w:r>
           </w:p>
           <w:p>
@@ -3804,7 +3802,7 @@
               <w:rPr>
                 <w:sz w:val="17"/>
               </w:rPr>
-              <w:t>Dev 4 sinh lại 6 file bằng run_dev_retrieval.py sau khi chốt model dense (E2) và có gold đã duyệt (D1), rồi bỏ nhánh đọc dạng phẳng trong hai script đánh giá.</w:t>
+              <w:t>Dev 4 sinh lại kết quả bằng run_dev_retrieval.py sau khi chốt model dense (E2) và có gold đã duyệt (D1); xóa hai file CSV cũ hoặc thay bằng bản tính lại.</w:t>
             </w:r>
           </w:p>
         </w:tc>
@@ -3821,7 +3819,7 @@
               <w:rPr>
                 <w:sz w:val="17"/>
               </w:rPr>
-              <w:t>retrieval/results/*.json; scripts/evaluate_task4.py; retrieval/retrieval_evaluation.py</w:t>
+              <w:t>retrieval/results/ (metrics.csv, article_metrics.csv)</w:t>
             </w:r>
           </w:p>
         </w:tc>
@@ -3856,7 +3854,7 @@
               <w:rPr>
                 <w:sz w:val="17"/>
               </w:rPr>
-              <w:t>Còn một phần (26e41f9)</w:t>
+              <w:t>Còn một phần (113e356)</w:t>
             </w:r>
           </w:p>
         </w:tc>
@@ -3910,7 +3908,7 @@
               <w:rPr>
                 <w:sz w:val="17"/>
               </w:rPr>
-              <w:t>context_registry.json vẫn là bản smoke cũ (0/321 chunk_id thuộc corpus) mà validate_benchmark.py còn đọc: chunk_id không có trong production_chunk_index.json được tra trong bảng này, nên một ID smoke cũ vẫn qua được bước kiểm. Mục 6 của docs/sprint6_benchmark.md giữ bảng này có chủ đích để truy nguyên, nên bỏ hay sinh lại là quyết định của Dev 1. 334 dòng article_index thêm ở d24ff2a chưa được Dev 1 duyệt.</w:t>
+              <w:t>334 dòng article_index thêm ở d24ff2a chưa được Dev 1 duyệt.</w:t>
             </w:r>
           </w:p>
           <w:p>
@@ -3928,7 +3926,25 @@
               <w:rPr>
                 <w:sz w:val="17"/>
               </w:rPr>
-              <w:t>Dev 1 chọn bỏ context_registry.json khỏi validate_benchmark.py (production_chunk_index.json nay khớp 2.011/2.011 chunk của corpus), hoặc giữ làm bảng truy nguyên nhưng không cho ID smoke qua bước kiểm candidate; duyệt 334 dòng mới của article_index.</w:t>
+              <w:t>Dev 1 duyệt 334 dòng mới của article_index và cập nhật verification_status.</w:t>
+            </w:r>
+          </w:p>
+          <w:p>
+            <w:pPr>
+              <w:spacing w:after="20" w:line="252" w:lineRule="auto"/>
+            </w:pPr>
+            <w:r>
+              <w:rPr>
+                <w:b/>
+                <w:sz w:val="17"/>
+              </w:rPr>
+              <w:t xml:space="preserve">Kiểm chứng: </w:t>
+            </w:r>
+            <w:r>
+              <w:rPr>
+                <w:sz w:val="17"/>
+              </w:rPr>
+              <w:t>test_article_index_matches_parsed_json_articles chỉ so cặp số hiệu và số Điều (776 Điều của 21 parsed_jsons) và tiền tố article_id theo file_code, không so article_title; verification_status của 776/776 dòng vẫn là metadata_only_unverified (515) hoặc not_checked (261).</w:t>
             </w:r>
           </w:p>
         </w:tc>
@@ -3945,7 +3961,7 @@
               <w:rPr>
                 <w:sz w:val="17"/>
               </w:rPr>
-              <w:t>data/reference/context_registry.json; scripts/validate_benchmark.py (dòng 24–25, 117–122); data/reference/article_index.json</w:t>
+              <w:t>data/reference/article_index.json</w:t>
             </w:r>
           </w:p>
         </w:tc>
@@ -3980,7 +3996,7 @@
               <w:rPr>
                 <w:sz w:val="17"/>
               </w:rPr>
-              <w:t>Còn một phần (7c9211e)</w:t>
+              <w:t>Còn một phần (113e356)</w:t>
             </w:r>
           </w:p>
         </w:tc>
@@ -4034,7 +4050,7 @@
               <w:rPr>
                 <w:sz w:val="17"/>
               </w:rPr>
-              <w:t>4 file đã commit trong evaluation/results (bm25_dev_results, bm25_dev_metrics, zero_shot_dev_results, zero_shot_dev_scored) là bản cũ, chỉ có question_id. gold_clause_ids đã có trong schema nhưng chưa câu nào có giá trị và chưa script nào sinh gold_context_ids từ nó (D1).</w:t>
+              <w:t>4 file đã commit trong evaluation/results (bm25_dev_results, bm25_dev_metrics, zero_shot_dev_results, zero_shot_dev_scored) vẫn là kết quả cũ, chưa chạy lại (F1). gold_clause_ids rỗng ở 300/300 câu (D1). Chế độ sync-clauses của prepare_production_benchmark.py ghi đè gold_clause_ids bằng các Khoản suy từ gold_context_ids khi câu đã có gold_context_ids, nên Khoản gold chưa có chunk trong gold_context_ids bị bỏ mà không báo; chế độ này cũng ghi thẳng vào ground_truth.json, không sao lưu và không ghi người duyệt như promote-reviewed.</w:t>
             </w:r>
           </w:p>
           <w:p>
@@ -4052,7 +4068,25 @@
               <w:rPr>
                 <w:sz w:val="17"/>
               </w:rPr>
-              <w:t>Chạy lại 4 file bằng code hiện tại khi chạy lại số đo (F1, F5, F6); làm gold_clause_ids cùng D1.</w:t>
+              <w:t>Chạy lại 4 file bằng code hiện tại khi chạy lại số đo (F1, F5, F6); làm gold_clause_ids cùng D1. sync-clauses chỉ điền phía còn rỗng, báo lỗi khi hai phía lệch nhau thay vì ghi đè, và sao lưu ground_truth.json như promote-reviewed.</w:t>
+            </w:r>
+          </w:p>
+          <w:p>
+            <w:pPr>
+              <w:spacing w:after="20" w:line="252" w:lineRule="auto"/>
+            </w:pPr>
+            <w:r>
+              <w:rPr>
+                <w:b/>
+                <w:sz w:val="17"/>
+              </w:rPr>
+              <w:t xml:space="preserve">Kiểm chứng: </w:t>
+            </w:r>
+            <w:r>
+              <w:rPr>
+                <w:sz w:val="17"/>
+              </w:rPr>
+              <w:t>scripts/prepare_production_benchmark.py dòng 86: nhánh if gold_cids gán lại item['gold_clause_ids'] = derived_clauses mà không so với giá trị đang có.</w:t>
             </w:r>
           </w:p>
         </w:tc>
@@ -4069,7 +4103,7 @@
               <w:rPr>
                 <w:sz w:val="17"/>
               </w:rPr>
-              <w:t>evaluation/results/*.json; schemas/benchmark_schema.json: gold_clause_ids</w:t>
+              <w:t>evaluation/results/*.json; scripts/prepare_production_benchmark.py: sync_gold_context_ids_from_clauses (dòng 49–99)</w:t>
             </w:r>
           </w:p>
         </w:tc>
@@ -4086,7 +4120,7 @@
               <w:rPr>
                 <w:sz w:val="17"/>
               </w:rPr>
-              <w:t>Dev 2</w:t>
+              <w:t>Dev 2; Dev 1 (sync-clauses)</w:t>
             </w:r>
           </w:p>
         </w:tc>
@@ -4104,7 +4138,7 @@
               <w:rPr>
                 <w:sz w:val="17"/>
               </w:rPr>
-              <w:t>Còn một phần (f32754e)</w:t>
+              <w:t>Còn một phần (113e356)</w:t>
             </w:r>
           </w:p>
         </w:tc>
@@ -6107,7 +6141,7 @@
               <w:rPr>
                 <w:sz w:val="17"/>
               </w:rPr>
-              <w:t>run_baselines.py vẫn chấm trên gold_id_proposals_300.json (PROVISIONAL_NOT_LEGALLY_VERIFIED; 289/300 câu draft, 10/11 câu source_checked ghi verified_by “TEST_REVIEWER”) thay cho ground_truth.json. evaluation/results/bm25_dev_* (284 câu, Recall@5 0,305) sinh trên index đã lẫn chunk smoke (213/1.425 ID l01_); evaluation/bm25_dev_metrics.json (26 câu) là bản thừa.</w:t>
+              <w:t>run_baselines.py vẫn chấm trên gold_id_proposals_300.json (PROVISIONAL_NOT_LEGALLY_VERIFIED; 289/300 câu draft, 10/11 câu source_checked ghi verified_by “TEST_REVIEWER”) thay cho ground_truth.json. evaluation/results/bm25_dev_* (284 câu, Recall@5 0,305) sinh trên index đã lẫn chunk smoke (213/1.425 ID l01_).</w:t>
             </w:r>
           </w:p>
           <w:p>
@@ -6125,7 +6159,7 @@
               <w:rPr>
                 <w:sz w:val="17"/>
               </w:rPr>
-              <w:t>Chấm trên ground_truth.json (chỉ câu đã xác minh, D1) hoặc ghi rõ nhãn tạm trong tên file kết quả; xóa kết quả cũ và evaluation/bm25_dev_metrics.json.</w:t>
+              <w:t>Chấm trên ground_truth.json (chỉ câu đã xác minh, D1) hoặc ghi rõ nhãn tạm trong tên file kết quả; xóa kết quả cũ.</w:t>
             </w:r>
           </w:p>
           <w:p>
@@ -6160,7 +6194,7 @@
               <w:rPr>
                 <w:sz w:val="17"/>
               </w:rPr>
-              <w:t>scripts/run_baselines.py:18; evaluation/results/; evaluation/bm25_dev_metrics.json</w:t>
+              <w:t>scripts/run_baselines.py:18; evaluation/results/</w:t>
             </w:r>
           </w:p>
         </w:tc>
@@ -6195,7 +6229,7 @@
               <w:rPr>
                 <w:sz w:val="17"/>
               </w:rPr>
-              <w:t>Còn một phần (146a6c9)</w:t>
+              <w:t>Còn một phần (113e356)</w:t>
             </w:r>
           </w:p>
         </w:tc>
@@ -7583,7 +7617,7 @@
               <w:rPr>
                 <w:sz w:val="17"/>
               </w:rPr>
-              <w:t>retrieval/retrieval.md ghi Dense dùng BGE-M3 trong khi code mặc định bkai (chờ chốt model ở E2); mục Kết quả hiện tại của README ghi số Task 4 đo trên corpus 1.159 chunk với nhãn proposal (G3).</w:t>
+              <w:t>retrieval/retrieval.md ghi Dense dùng BGE-M3 trong khi code mặc định bkai (chờ chốt model ở E2); mục Kết quả hiện tại của README ghi số Task 4 đo trên corpus 1.159 chunk với nhãn proposal (G3). docs/retrieval_report.md (dòng 14, 56–58) và retrieval/retrieval.md (dòng 105–148) trỏ tới retrieval/results/dev_*.json và thư mục task4_proposal_300_current/ đã xóa ở 113e356, nên link “báo cáo Task 4” của README dẫn tới một báo cáo có link hỏng.</w:t>
             </w:r>
           </w:p>
           <w:p>
@@ -7601,7 +7635,7 @@
               <w:rPr>
                 <w:sz w:val="17"/>
               </w:rPr>
-              <w:t>Cập nhật cùng PR chốt E2 và PR chạy lại số đo (G3).</w:t>
+              <w:t>Cập nhật cùng PR chốt E2 và PR chạy lại số đo (G3); khi đó thay các đường dẫn tới file đã xóa bằng file kết quả mới.</w:t>
             </w:r>
           </w:p>
         </w:tc>
@@ -7618,7 +7652,7 @@
               <w:rPr>
                 <w:sz w:val="17"/>
               </w:rPr>
-              <w:t>retrieval/retrieval.md (dòng 12, 18); README.md:61</w:t>
+              <w:t>retrieval/retrieval.md (dòng 12, 18, 105–148); README.md:66; docs/retrieval_report.md (dòng 14, 56–58)</w:t>
             </w:r>
           </w:p>
         </w:tc>
@@ -7779,149 +7813,6 @@
                 <w:sz w:val="17"/>
               </w:rPr>
               <w:t>Còn</w:t>
-            </w:r>
-          </w:p>
-        </w:tc>
-      </w:tr>
-      <w:tr>
-        <w:tc>
-          <w:tcPr>
-            <w:tcW w:type="dxa" w:w="624"/>
-            <w:vAlign w:val="top"/>
-          </w:tcPr>
-          <w:p>
-            <w:pPr>
-              <w:spacing w:after="20" w:line="252" w:lineRule="auto"/>
-            </w:pPr>
-            <w:r>
-              <w:rPr>
-                <w:b/>
-                <w:sz w:val="17"/>
-              </w:rPr>
-              <w:t>H5</w:t>
-            </w:r>
-          </w:p>
-        </w:tc>
-        <w:tc>
-          <w:tcPr>
-            <w:tcW w:type="dxa" w:w="1020"/>
-            <w:vAlign w:val="top"/>
-            <w:shd w:val="clear" w:color="auto" w:fill="E2EFDA"/>
-          </w:tcPr>
-          <w:p>
-            <w:pPr>
-              <w:spacing w:after="20" w:line="252" w:lineRule="auto"/>
-            </w:pPr>
-            <w:r>
-              <w:rPr>
-                <w:sz w:val="17"/>
-              </w:rPr>
-              <w:t>Thấp</w:t>
-            </w:r>
-          </w:p>
-        </w:tc>
-        <w:tc>
-          <w:tcPr>
-            <w:tcW w:type="dxa" w:w="4479"/>
-            <w:vAlign w:val="top"/>
-          </w:tcPr>
-          <w:p>
-            <w:pPr>
-              <w:spacing w:after="20" w:line="252" w:lineRule="auto"/>
-            </w:pPr>
-            <w:r>
-              <w:rPr>
-                <w:sz w:val="17"/>
-              </w:rPr>
-              <w:t>origin/NMA vẫn theo dõi parser/__pycache__/cleaner.cpython-314.pyc và parser.cpython-314.pyc; lần gộp sau từ NMA có thể đưa lại hai file này vào testing.</w:t>
-            </w:r>
-          </w:p>
-          <w:p>
-            <w:pPr>
-              <w:spacing w:after="20" w:line="252" w:lineRule="auto"/>
-            </w:pPr>
-            <w:r>
-              <w:rPr>
-                <w:b/>
-                <w:sz w:val="17"/>
-              </w:rPr>
-              <w:t xml:space="preserve">Đề xuất: </w:t>
-            </w:r>
-            <w:r>
-              <w:rPr>
-                <w:sz w:val="17"/>
-              </w:rPr>
-              <w:t>NMA chạy git rm --cached các file .pyc trên nhánh của mình; CI kiểm git ls-files không có .pyc.</w:t>
-            </w:r>
-          </w:p>
-          <w:p>
-            <w:pPr>
-              <w:spacing w:after="20" w:line="252" w:lineRule="auto"/>
-            </w:pPr>
-            <w:r>
-              <w:rPr>
-                <w:b/>
-                <w:sz w:val="17"/>
-              </w:rPr>
-              <w:t xml:space="preserve">Kiểm chứng: </w:t>
-            </w:r>
-            <w:r>
-              <w:rPr>
-                <w:sz w:val="17"/>
-              </w:rPr>
-              <w:t>git ls-tree origin/NMA vẫn có parser/__pycache__/cleaner.cpython-314.pyc và parser.cpython-314.pyc.</w:t>
-            </w:r>
-          </w:p>
-        </w:tc>
-        <w:tc>
-          <w:tcPr>
-            <w:tcW w:type="dxa" w:w="1701"/>
-            <w:vAlign w:val="top"/>
-          </w:tcPr>
-          <w:p>
-            <w:pPr>
-              <w:spacing w:after="20" w:line="252" w:lineRule="auto"/>
-            </w:pPr>
-            <w:r>
-              <w:rPr>
-                <w:sz w:val="17"/>
-              </w:rPr>
-              <w:t>origin/NMA: parser/__pycache__/</w:t>
-            </w:r>
-          </w:p>
-        </w:tc>
-        <w:tc>
-          <w:tcPr>
-            <w:tcW w:type="dxa" w:w="1077"/>
-            <w:vAlign w:val="top"/>
-          </w:tcPr>
-          <w:p>
-            <w:pPr>
-              <w:spacing w:after="20" w:line="252" w:lineRule="auto"/>
-            </w:pPr>
-            <w:r>
-              <w:rPr>
-                <w:sz w:val="17"/>
-              </w:rPr>
-              <w:t>NMA</w:t>
-            </w:r>
-          </w:p>
-        </w:tc>
-        <w:tc>
-          <w:tcPr>
-            <w:tcW w:type="dxa" w:w="964"/>
-            <w:vAlign w:val="top"/>
-            <w:shd w:val="clear" w:color="auto" w:fill="FFF2CC"/>
-          </w:tcPr>
-          <w:p>
-            <w:pPr>
-              <w:spacing w:after="20" w:line="252" w:lineRule="auto"/>
-            </w:pPr>
-            <w:r>
-              <w:rPr>
-                <w:sz w:val="17"/>
-              </w:rPr>
-              <w:t>Còn một phần (5e0b9c2)</w:t>
             </w:r>
           </w:p>
         </w:tc>
@@ -9325,7 +9216,7 @@
               <w:rPr>
                 <w:sz w:val="17"/>
               </w:rPr>
-              <w:t>Chạy riêng từng file; chạy chung tests/ và test/ vẫn lỗi collect. Chạy test làm bẩn git trở lại vì 72a7377 commit lại parser/__pycache__/*.pyc (H5). Sau bản sửa chunking 24/10 (chunking_test): 218 pass, 2 fail (thêm 14 test của test_chunking.py; 2 fail như trên). Ở 840c8a3, parser/: 209 pass, 14 skip (hết fail của A25). Ở 64b65f0, parser/, tests/schema_test.py và test/test_chunking.py: 235 pass, 14 skip, 1 fail (A28). Sau bản sửa A28 (77b5886): 302 pass, 20 skip, 0 fail (thêm 72 test; 6 skip mới là 3 test chạy trên mọi TXT gặp 2 TT chia theo mục La Mã). Ở 3d646da (25/10, sau khi kéo CTM): parser/, tests/schema_test.py, tests/test_dense_retriever.py và test/ (trừ test_benchmark.py) 382 pass, 20 skip, 1 fail (test_bm25_retrieval, H9). Ở be28659 (25/10): 464 pass, 20 skip, 1 fail (H9) khi chạy riêng từng file; chạy chung test/ tests/ vẫn lỗi collect (H2); chạy test vẫn làm đổi parser/__pycache__/parser.cpython-314.pyc (H5) (Phụ lục M). Ở 3b1b6dc (25/10, sau đợt sửa): chạy chung python -m pytest parser tests test: 531 pass, 20 skip, 0 fail, 0 lỗi collect; chạy test không làm đổi file nào trong git (Phụ lục N). Ở 948fc94 (kiểm lại cuối 25/10, Phụ lục O): 531 pass, 20 skip, 0 fail; git không đổi sau khi chạy. Ở 01c639e (26/10, sau khi gộp CTM 9348764, Phụ lục P): python -m pytest (testpaths = parser test) 490 pass, 20 skip, 0 fail, 64 subtest pass; ít hơn 41 test vì bỏ bản test benchmark trùng; retrieval/test/ (7 test, pass khi chạy riêng) nằm ngoài testpaths (H2). Ở 5ef41dc (26/10, sau khi gộp NMA 86b55f5, Phụ lục Q): python -m pytest 489 pass, 20 skip, 1 fail (test_document_metadata_matches_reference, A16), 64 subtest pass. Sau bản sửa A16, A7 (26/10, 856e6be..dfc025b, Phụ lục R): python -m pytest 490 pass, 20 skip, 0 fail, 64 subtest pass; retrieval/test 7 pass. Mô phỏng workflow trên bản sao sạch của các file git theo dõi, venv mới Python 3.14 trên Windows, không có cache model: cài đặt thành công, không có file .pyc, compileall không lỗi, python -m pytest 490 pass, 20 skip, 0 fail, retrieval/test 7 pass; chưa thử trên Linux. Sau 21a2385 (testpaths thêm retrieval/test, H2): python -m pytest 497 pass, 20 skip, 0 fail, 64 subtest pass, trên .venv và trên venv sạch.</w:t>
+              <w:t>Chạy riêng từng file; chạy chung tests/ và test/ vẫn lỗi collect. Chạy test làm bẩn git trở lại vì 72a7377 commit lại parser/__pycache__/*.pyc (H5). Sau bản sửa chunking 24/10 (chunking_test): 218 pass, 2 fail (thêm 14 test của test_chunking.py; 2 fail như trên). Ở 840c8a3, parser/: 209 pass, 14 skip (hết fail của A25). Ở 64b65f0, parser/, tests/schema_test.py và test/test_chunking.py: 235 pass, 14 skip, 1 fail (A28). Sau bản sửa A28 (77b5886): 302 pass, 20 skip, 0 fail (thêm 72 test; 6 skip mới là 3 test chạy trên mọi TXT gặp 2 TT chia theo mục La Mã). Ở 3d646da (25/10, sau khi kéo CTM): parser/, tests/schema_test.py, tests/test_dense_retriever.py và test/ (trừ test_benchmark.py) 382 pass, 20 skip, 1 fail (test_bm25_retrieval, H9). Ở be28659 (25/10): 464 pass, 20 skip, 1 fail (H9) khi chạy riêng từng file; chạy chung test/ tests/ vẫn lỗi collect (H2); chạy test vẫn làm đổi parser/__pycache__/parser.cpython-314.pyc (H5) (Phụ lục M). Ở 3b1b6dc (25/10, sau đợt sửa): chạy chung python -m pytest parser tests test: 531 pass, 20 skip, 0 fail, 0 lỗi collect; chạy test không làm đổi file nào trong git (Phụ lục N). Ở 948fc94 (kiểm lại cuối 25/10, Phụ lục O): 531 pass, 20 skip, 0 fail; git không đổi sau khi chạy. Ở 01c639e (26/10, sau khi gộp CTM 9348764, Phụ lục P): python -m pytest (testpaths = parser test) 490 pass, 20 skip, 0 fail, 64 subtest pass; ít hơn 41 test vì bỏ bản test benchmark trùng; retrieval/test/ (7 test, pass khi chạy riêng) nằm ngoài testpaths (H2). Ở 5ef41dc (26/10, sau khi gộp NMA 86b55f5, Phụ lục Q): python -m pytest 489 pass, 20 skip, 1 fail (test_document_metadata_matches_reference, A16), 64 subtest pass. Sau bản sửa A16, A7 (26/10, 856e6be..dfc025b, Phụ lục R): python -m pytest 490 pass, 20 skip, 0 fail, 64 subtest pass; retrieval/test 7 pass. Mô phỏng workflow trên bản sao sạch của các file git theo dõi, venv mới Python 3.14 trên Windows, không có cache model: cài đặt thành công, không có file .pyc, compileall không lỗi, python -m pytest 490 pass, 20 skip, 0 fail, retrieval/test 7 pass; chưa thử trên Linux. Sau 21a2385 (testpaths thêm retrieval/test, H2): python -m pytest 497 pass, 20 skip, 0 fail, 64 subtest pass, trên .venv và trên venv sạch. Sau 2559349 (27/10, Phụ lục S): 504 pass, 20 skip, 0 fail, 68 subtest pass. Ở 70a626d (27/10, sau khi gộp CTM 113e356, Phụ lục T): python -m pytest 507 pass, 20 skip, 0 fail, 68 subtest pass; workflow CI trên GitHub thành công ở cả 4 lần chạy.</w:t>
             </w:r>
           </w:p>
         </w:tc>
@@ -9364,7 +9255,7 @@
     <w:p>
       <w:pPr/>
       <w:r>
-        <w:t>Bảng dưới đây là thứ tự làm cho các lỗi còn mở, viết lại cuối ngày 25/10 trên 3b1b6dc. Mỗi bước ghi việc cụ thể, owner, điều kiện để bắt đầu và tiêu chí để coi là xong. Màu ở cột Bước: đỏ là đang chặn các bước sau, vàng là làm ngay khi có điều kiện, xanh là làm sau. Những lỗi đã sửa (mục 3) không có trong bảng. Các lỗi sửa được mà không cần bàn đã sửa xong ngày 25/10 (Phụ lục N); mọi lỗi còn lại cần quyết định, cần thỏa thuận ai làm, hoặc chờ gold đã duyệt để chạy lại số đo. Kiểm lại trên 948fc94 (Phụ lục O): thứ tự giữ nguyên; bước 2 thêm phần E4 (Dense dừng khi thiếu underthesea), vì từ 664634e corpus đã tách từ nên máy thiếu underthesea cho kết quả Dense lệch mà không báo. Sau khi gộp CTM 9348764 (Phụ lục P): thứ tự giữ nguyên; bước 0 dùng python -m pytest, và việc gom thư mục test (H2) chỉ còn retrieval/test/. Sau khi gộp NMA 86b55f5 (Phụ lục Q): thứ tự giữ nguyên; bước 1 thêm phần A16 không cần bàn (sửa test, hai bảng ID, sinh lại corpus và Qdrant theo title mới), còn cách ghi title chờ Dev 1. Sau bản sửa 26/10 (Phụ lục R): bước 0 chỉ còn push workflow CI và bật branch protection; ở bước 1, A16 chỉ còn cách ghi title. Sau 21a2385: H2 đã sửa nên bước 0 bỏ phần H2.</w:t>
+        <w:t>Bảng dưới đây là thứ tự làm cho các lỗi còn mở, viết lại cuối ngày 25/10 trên 3b1b6dc. Mỗi bước ghi việc cụ thể, owner, điều kiện để bắt đầu và tiêu chí để coi là xong. Màu ở cột Bước: đỏ là đang chặn các bước sau, vàng là làm ngay khi có điều kiện, xanh là làm sau. Những lỗi đã sửa (mục 3) không có trong bảng. Các lỗi sửa được mà không cần bàn đã sửa xong ngày 25/10 (Phụ lục N); mọi lỗi còn lại cần quyết định, cần thỏa thuận ai làm, hoặc chờ gold đã duyệt để chạy lại số đo. Kiểm lại trên 948fc94 (Phụ lục O): thứ tự giữ nguyên; bước 2 thêm phần E4 (Dense dừng khi thiếu underthesea), vì từ 664634e corpus đã tách từ nên máy thiếu underthesea cho kết quả Dense lệch mà không báo. Sau khi gộp CTM 9348764 (Phụ lục P): thứ tự giữ nguyên; bước 0 dùng python -m pytest, và việc gom thư mục test (H2) chỉ còn retrieval/test/. Sau khi gộp NMA 86b55f5 (Phụ lục Q): thứ tự giữ nguyên; bước 1 thêm phần A16 không cần bàn (sửa test, hai bảng ID, sinh lại corpus và Qdrant theo title mới), còn cách ghi title chờ Dev 1. Sau bản sửa 26/10 (Phụ lục R): bước 0 chỉ còn push workflow CI và bật branch protection; ở bước 1, A16 chỉ còn cách ghi title. Sau 21a2385: H2 đã sửa nên bước 0 bỏ phần H2. Sau khi gộp CTM 113e356 (Phụ lục T): thứ tự giữ nguyên; bước 0 chỉ còn bật branch protection (workflow đã chạy trên GitHub, H5 đã sửa); ở bước 1, C5 chỉ còn duyệt article_index.</w:t>
       </w:r>
     </w:p>
     <w:tbl>
@@ -9527,7 +9418,7 @@
               <w:rPr>
                 <w:sz w:val="17"/>
               </w:rPr>
-              <w:t>Push .github/workflows/tests.yml (chạy python -m pytest, compileall và kiểm file .pyc trên mọi push và PR); admin repo bật branch protection để chặn merge khi fail (A7). NMA bỏ theo dõi .pyc trên nhánh của mình (H5).</w:t>
+              <w:t>Admin repo bật branch protection cho testing và main, bắt buộc check “tests / pytest” (workflow .github/workflows/tests.yml đã chạy trên mọi push từ e012ceb) (A7).</w:t>
             </w:r>
           </w:p>
         </w:tc>
@@ -9543,7 +9434,7 @@
               <w:rPr>
                 <w:sz w:val="17"/>
               </w:rPr>
-              <w:t>A7, H5</w:t>
+              <w:t>A7</w:t>
             </w:r>
           </w:p>
         </w:tc>
@@ -9559,7 +9450,7 @@
               <w:rPr>
                 <w:sz w:val="17"/>
               </w:rPr>
-              <w:t>Cả nhóm; NMA (H5); admin repo (branch protection)</w:t>
+              <w:t>Admin repo</w:t>
             </w:r>
           </w:p>
         </w:tc>
@@ -9591,7 +9482,7 @@
               <w:rPr>
                 <w:sz w:val="17"/>
               </w:rPr>
-              <w:t>Commit làm test fail hoặc có lỗi cú pháp bị chặn; origin/NMA không còn file .pyc.</w:t>
+              <w:t>Merge hoặc PR có check “tests” đỏ bị chặn.</w:t>
             </w:r>
           </w:p>
         </w:tc>
@@ -9627,7 +9518,7 @@
               <w:rPr>
                 <w:sz w:val="17"/>
               </w:rPr>
-              <w:t>Dev 1 chốt phiên bản Luật 52/2014 (A6), cách xử lý 2 TT chia theo mục La Mã (A26), cách ghi title (A16: chỉ ghi trích yếu ở 5 văn bản cũ), số phận context_registry.json và duyệt 334 dòng mới của article_index (C5). Đổi các mặc định còn trỏ file smoke, xóa all_legal_chunks.json và data/parser_validated/ (B4, H7).</w:t>
+              <w:t>Dev 1 chốt phiên bản Luật 52/2014 (A6), cách xử lý 2 TT chia theo mục La Mã (A26), cách ghi title (A16: chỉ ghi trích yếu ở 5 văn bản cũ), duyệt 334 dòng mới của article_index (C5). Đổi các mặc định còn trỏ file smoke, xóa all_legal_chunks.json và data/parser_validated/ (B4, H7).</w:t>
             </w:r>
           </w:p>
         </w:tc>
@@ -9691,7 +9582,7 @@
               <w:rPr>
                 <w:sz w:val="17"/>
               </w:rPr>
-              <w:t>validate_benchmark.py không còn cho ID smoke qua bước kiểm; không script nào đọc file smoke hay data/parser_validated/ ngoài unit test.</w:t>
+              <w:t>334 dòng mới của article_index đã duyệt; không script nào đọc file smoke hay data/parser_validated/ ngoài unit test.</w:t>
             </w:r>
           </w:p>
         </w:tc>
@@ -10224,7 +10115,7 @@
               <w:rPr>
                 <w:sz w:val="17"/>
               </w:rPr>
-              <w:t>Sửa hết: A8, A11, A25, B3, C10, D3, D4, D5, E3, E7, E9, E10, E15, G1, G2, G6, H9. Sửa một phần: A7, B2, B4, C2, C4, C5, E4 (corpus 664634e), E11, E14, F1, F3, F5, G5, H2, H4, H5. Ngày 26/10 (Phụ lục R; 856e6be, 4ec0706, dfc025b): sửa thêm một phần A16 (test, hai bảng ID, NĐ 207/2025, corpus) và A7 (workflow CI). Sửa hết H2 ở 21a2385.</w:t>
+              <w:t>Sửa hết: A8, A11, A25, B3, C10, D3, D4, D5, E3, E7, E9, E10, E15, G1, G2, G6, H9. Sửa một phần: A7, B2, B4, C2, C4, C5, E4 (corpus 664634e), E11, E14, F1, F3, F5, G5, H2, H4, H5. Ngày 26/10 (Phụ lục R; 856e6be, 4ec0706, dfc025b): sửa thêm một phần A16 (test, hai bảng ID, NĐ 207/2025, corpus) và A7 (workflow CI). Sửa hết H2 ở 21a2385. Ngày 27/10 (Phụ lục T): CTM 113e356 sửa thêm một phần C2, C4, C5, F5; H5 đã hết (origin/NMA không còn file .pyc); A7 chỉ còn branch protection.</w:t>
             </w:r>
           </w:p>
         </w:tc>
@@ -10275,7 +10166,7 @@
               <w:rPr>
                 <w:sz w:val="17"/>
               </w:rPr>
-              <w:t>E1, E4 (Dense dừng khi thiếu underthesea), E6, E8 (khóa config), F2, B2 (phía truy vấn), B4 và H7 (mặc định, file cũ), H8, A7 (push workflow, branch protection), H5 (nhánh NMA)</w:t>
+              <w:t>E1, E4 (Dense dừng khi thiếu underthesea), E6, E8 (khóa config), F2, B2 (phía truy vấn), B4 và H7 (mặc định, file cũ), H8, A7 (branch protection), C4 (sync-clauses không ghi đè)</w:t>
             </w:r>
           </w:p>
         </w:tc>
@@ -10326,7 +10217,7 @@
               <w:rPr>
                 <w:sz w:val="17"/>
               </w:rPr>
-              <w:t>A6, A16 (cách ghi title), A26, C5 (context_registry.json, duyệt article_index), B5, B7, D1, D2 (Dev 1); E2, E4 (cờ tách từ theo model), E12 (Dev 3); E14 (câu hỏi rỗng: Dev 3 + Dev 4); E11 (backlog sau Sprint 6); H1, H3 (cả nhóm)</w:t>
+              <w:t>A6, A16 (cách ghi title), A26, C5 (duyệt article_index), B5, B7, D1, D2 (Dev 1); E2, E4 (cờ tách từ theo model), E12 (Dev 3); E14 (câu hỏi rỗng: Dev 3 + Dev 4); E11 (backlog sau Sprint 6); H1, H3 (cả nhóm)</w:t>
             </w:r>
           </w:p>
         </w:tc>
@@ -10509,7 +10400,7 @@
               <w:rPr>
                 <w:sz w:val="17"/>
               </w:rPr>
-              <w:t>Duyệt gold (D1), bắt đầu từ 11 câu đã duyệt của gold_id_proposals_300.json; chốt A6, A26, A16 và context_registry.json (C5); duyệt 334 Điều mới của article_index.</w:t>
+              <w:t>Duyệt gold (D1), bắt đầu từ 11 câu đã duyệt của gold_id_proposals_300.json; chốt A6, A26, A16; duyệt 334 Điều mới của article_index.</w:t>
             </w:r>
           </w:p>
         </w:tc>
@@ -10662,7 +10553,7 @@
               <w:rPr>
                 <w:sz w:val="17"/>
               </w:rPr>
-              <w:t>NMA bỏ theo dõi .pyc trên nhánh của mình (H5).</w:t>
+              <w:t>CTM: sync-clauses chỉ điền phía còn rỗng và sao lưu trước khi ghi (C4). NMA: không còn việc riêng.</w:t>
             </w:r>
           </w:p>
         </w:tc>
@@ -10678,7 +10569,7 @@
               <w:rPr>
                 <w:sz w:val="17"/>
               </w:rPr>
-              <w:t>0</w:t>
+              <w:t>2</w:t>
             </w:r>
           </w:p>
         </w:tc>
@@ -19810,6 +19701,547 @@
                 <w:sz w:val="17"/>
               </w:rPr>
               <w:t>rerank_top_k giữ 5 (G1, chờ số đo ở K = 5 và 10). Confidence Threshold Filter giữa reranker và Parent-Context Resolver chưa có (E11, ngoài phạm vi Sprint 6). Nhánh retrieval 065e473 của Dev 4 cũng đổi backend sang cross_encoder và rerank_top_k sang 10; khi port nhánh đó chỉ còn khác rerank_top_k.</w:t>
+            </w:r>
+          </w:p>
+        </w:tc>
+      </w:tr>
+    </w:tbl>
+    <w:p>
+      <w:pPr>
+        <w:pStyle w:val="Heading1"/>
+      </w:pPr>
+      <w:r>
+        <w:rPr/>
+        <w:t>Phụ lục T. Kiểm lại sau khi gộp CTM 113e356 (27/10)</w:t>
+      </w:r>
+    </w:p>
+    <w:p>
+      <w:r>
+        <w:rPr/>
+        <w:t>Kiểm lại ngày 27/10/2026 sau khi gộp origin/CTM 113e356 (“feat(gitignore): update .gitignore …; refactor(evaluate_task4) …; refactor(retrieval_evaluation) …; delete(metrics) …”) vào testing ở f031d7b; sửa thêm ở 70a626d; chưa push. 113e356 nằm trên e012ceb; testing có thêm 2559349, 82858f5 (reranker, báo cáo); hai bên không sửa chung file nên không conflict. Cách kiểm: đọc diff của 113e356; so ground_truth.json và 4 file evaluation/results trước và sau theo từng trường; đếm chunk_id của kết quả thuộc corpus; thêm một ID smoke vào candidate để thử validate_benchmark.py; chạy sync_gold_context_ids_from_clauses trên dữ liệu thật; grep các chỗ còn trỏ tới file đã xóa; đọc trang Actions của repo trên GitHub và git ls-tree origin/NMA; chạy validate_benchmark.py, py_compile và python -m pytest (.venv, Python 3.14).</w:t>
+      </w:r>
+    </w:p>
+    <w:tbl>
+      <w:tblPr>
+        <w:tblStyle w:val="TableGrid"/>
+        <w:tblW w:type="auto" w:w="0"/>
+        <w:jc w:val="center"/>
+        <w:tblLayout w:type="fixed"/>
+        <w:tblLook w:firstColumn="1" w:firstRow="1" w:lastColumn="0" w:lastRow="0" w:noHBand="0" w:noVBand="1" w:val="04A0"/>
+      </w:tblPr>
+      <w:tblGrid>
+        <w:gridCol w:w="1100"/>
+        <w:gridCol w:w="3200"/>
+        <w:gridCol w:w="5566"/>
+      </w:tblGrid>
+      <w:tr>
+        <w:trPr>
+          <w:tblHeader w:val="true"/>
+        </w:trPr>
+        <w:tc>
+          <w:tcPr>
+            <w:tcW w:type="dxa" w:w="1100"/>
+            <w:shd w:val="clear" w:color="auto" w:fill="DCE6F1"/>
+          </w:tcPr>
+          <w:p>
+            <w:r>
+              <w:rPr>
+                <w:b/>
+                <w:sz w:val="17"/>
+              </w:rPr>
+              <w:t>#</w:t>
+            </w:r>
+          </w:p>
+        </w:tc>
+        <w:tc>
+          <w:tcPr>
+            <w:tcW w:type="dxa" w:w="3200"/>
+            <w:shd w:val="clear" w:color="auto" w:fill="DCE6F1"/>
+          </w:tcPr>
+          <w:p>
+            <w:r>
+              <w:rPr>
+                <w:b/>
+                <w:sz w:val="17"/>
+              </w:rPr>
+              <w:t>Docx ghi</w:t>
+            </w:r>
+          </w:p>
+        </w:tc>
+        <w:tc>
+          <w:tcPr>
+            <w:tcW w:type="dxa" w:w="5566"/>
+            <w:shd w:val="clear" w:color="auto" w:fill="DCE6F1"/>
+          </w:tcPr>
+          <w:p>
+            <w:r>
+              <w:rPr>
+                <w:b/>
+                <w:sz w:val="17"/>
+              </w:rPr>
+              <w:t>Ở 70a626d (27/10)</w:t>
+            </w:r>
+          </w:p>
+        </w:tc>
+      </w:tr>
+      <w:tr>
+        <w:tc>
+          <w:tcPr>
+            <w:tcW w:type="dxa" w:w="1100"/>
+          </w:tcPr>
+          <w:p>
+            <w:r>
+              <w:rPr>
+                <w:b/>
+                <w:sz w:val="17"/>
+              </w:rPr>
+              <w:t>C2</w:t>
+            </w:r>
+          </w:p>
+        </w:tc>
+        <w:tc>
+          <w:tcPr>
+            <w:tcW w:type="dxa" w:w="3200"/>
+          </w:tcPr>
+          <w:p>
+            <w:r>
+              <w:rPr>
+                <w:sz w:val="17"/>
+              </w:rPr>
+              <w:t>Còn một phần (26e41f9): 6 file retrieval/results/dev_*.json cũ dạng phẳng; evaluate_task4.py và retrieval_evaluation.py giữ nhánh đọc dạng phẳng.</w:t>
+            </w:r>
+          </w:p>
+        </w:tc>
+        <w:tc>
+          <w:tcPr>
+            <w:tcW w:type="dxa" w:w="5566"/>
+          </w:tcPr>
+          <w:p>
+            <w:r>
+              <w:rPr>
+                <w:sz w:val="17"/>
+              </w:rPr>
+              <w:t>Còn một phần (113e356). Đã sửa: xóa 3 file retrieval/results/dev_*.json và thư mục task4_proposal_300_current/ (3 file dev_*.json, ground_truth_proposal_300_chunks_only.json, metrics.csv, article_metrics.csv, report.md); evaluate_task4.normalize_results và retrieval_evaluation._normalize_dev_rows raise ValueError khi gặp bản ghi không có results; test_retrieval_evaluation.py dùng fixture dạng envelope và thêm test dạng phẳng bị từ chối. run_dev_retrieval.py đã ghi envelope (to_envelope) nên vẫn đọc được. Còn: chưa có kết quả nào trên corpus hiện tại; metrics.csv và article_metrics.csv ở retrieval/results (tính ở fbee2aa) vẫn được theo dõi.</w:t>
+            </w:r>
+          </w:p>
+        </w:tc>
+      </w:tr>
+      <w:tr>
+        <w:tc>
+          <w:tcPr>
+            <w:tcW w:type="dxa" w:w="1100"/>
+          </w:tcPr>
+          <w:p>
+            <w:r>
+              <w:rPr>
+                <w:b/>
+                <w:sz w:val="17"/>
+              </w:rPr>
+              <w:t>C5</w:t>
+            </w:r>
+          </w:p>
+        </w:tc>
+        <w:tc>
+          <w:tcPr>
+            <w:tcW w:type="dxa" w:w="3200"/>
+          </w:tcPr>
+          <w:p>
+            <w:r>
+              <w:rPr>
+                <w:sz w:val="17"/>
+              </w:rPr>
+              <w:t>Còn một phần (7c9211e): validate_benchmark.py đọc context_registry.json smoke nên ID smoke qua được bước kiểm; 334 dòng article_index chưa duyệt.</w:t>
+            </w:r>
+          </w:p>
+        </w:tc>
+        <w:tc>
+          <w:tcPr>
+            <w:tcW w:type="dxa" w:w="5566"/>
+          </w:tcPr>
+          <w:p>
+            <w:r>
+              <w:rPr>
+                <w:sz w:val="17"/>
+              </w:rPr>
+              <w:t>Còn một phần (113e356). Đã sửa: validate_benchmark.py dùng production_chunk_index.json làm bảng chunk duy nhất; thêm ID smoke l01_art_1_chunk_1 vào candidate của HN_001 thì bị báo “chunk ID không nằm trong production index”. context_registry.json vẫn trong repo để truy nguyên, không script nào đọc. Test mới test_article_index_matches_parsed_json_articles: 776 Điều của article_index khớp 21 parsed_jsons, tiền tố article_id theo file_code. Còn: Dev 1 duyệt 334 dòng mới; test không so article_title, verification_status 776/776 dòng vẫn chưa xác minh. Ghi chú: lệnh kiểm production_chunk_index.json có tồn tại đứng sau lệnh đọc file nên không bao giờ chạy; thiếu file thì script dừng ở FileNotFoundError.</w:t>
+            </w:r>
+          </w:p>
+        </w:tc>
+      </w:tr>
+      <w:tr>
+        <w:tc>
+          <w:tcPr>
+            <w:tcW w:type="dxa" w:w="1100"/>
+          </w:tcPr>
+          <w:p>
+            <w:r>
+              <w:rPr>
+                <w:b/>
+                <w:sz w:val="17"/>
+              </w:rPr>
+              <w:t>C4</w:t>
+            </w:r>
+          </w:p>
+        </w:tc>
+        <w:tc>
+          <w:tcPr>
+            <w:tcW w:type="dxa" w:w="3200"/>
+          </w:tcPr>
+          <w:p>
+            <w:r>
+              <w:rPr>
+                <w:sz w:val="17"/>
+              </w:rPr>
+              <w:t>Còn một phần (f32754e): 4 file evaluation/results cũ chỉ có question_id; gold_clause_ids chưa có giá trị và chưa script nào sinh gold_context_ids từ nó.</w:t>
+            </w:r>
+          </w:p>
+        </w:tc>
+        <w:tc>
+          <w:tcPr>
+            <w:tcW w:type="dxa" w:w="5566"/>
+          </w:tcPr>
+          <w:p>
+            <w:r>
+              <w:rPr>
+                <w:sz w:val="17"/>
+              </w:rPr>
+              <w:t>Còn một phần (113e356). Đã sửa: prepare_production_benchmark.py thêm chế độ sync-clauses (sync_gold_context_ids_from_clauses: gold_context_ids sang gold_clause_ids qua parent_clause_id của chunks.jsonl, và ngược lại khi gold_context_ids rỗng); promote-reviewed ghi gold_clause_ids từ chunk đã duyệt; test_gold_clause_ids_map_to_chunks_in_corpus kiểm Khoản gold có trong corpus và chunk gold thuộc gold_clause_ids. Cả 2.011 chunk có parent_clause_id nên ánh xạ đủ. ground_truth.json chỉ thêm gold_clause_ids: [] ở 300 câu, trường khác không đổi. 4 file evaluation/results đổi khóa question_id thành query_id (khớp evaluation/metrics.py), các trường khác không đổi, tức là chưa chạy lại. Còn: 4 file vẫn là kết quả cũ; gold_clause_ids rỗng ở 300/300 câu; lỗi mới: sync-clauses ghi đè gold_clause_ids khi đã có gold_context_ids và ghi thẳng vào ground_truth.json không sao lưu (thêm vào dòng C4).</w:t>
+            </w:r>
+          </w:p>
+        </w:tc>
+      </w:tr>
+      <w:tr>
+        <w:tc>
+          <w:tcPr>
+            <w:tcW w:type="dxa" w:w="1100"/>
+          </w:tcPr>
+          <w:p>
+            <w:r>
+              <w:rPr>
+                <w:b/>
+                <w:sz w:val="17"/>
+              </w:rPr>
+              <w:t>F5</w:t>
+            </w:r>
+          </w:p>
+        </w:tc>
+        <w:tc>
+          <w:tcPr>
+            <w:tcW w:type="dxa" w:w="3200"/>
+          </w:tcPr>
+          <w:p>
+            <w:r>
+              <w:rPr>
+                <w:sz w:val="17"/>
+              </w:rPr>
+              <w:t>Còn một phần (146a6c9): run_baselines.py chấm trên gold_id_proposals_300.json; evaluation/bm25_dev_metrics.json là bản thừa.</w:t>
+            </w:r>
+          </w:p>
+        </w:tc>
+        <w:tc>
+          <w:tcPr>
+            <w:tcW w:type="dxa" w:w="5566"/>
+          </w:tcPr>
+          <w:p>
+            <w:r>
+              <w:rPr>
+                <w:sz w:val="17"/>
+              </w:rPr>
+              <w:t>Còn một phần (113e356). evaluation/bm25_dev_metrics.json (26 câu) đã xóa. Còn: run_baselines.py dòng 18 vẫn trỏ gold_id_proposals_300.json; kết quả cũ trong evaluation/results chưa thay.</w:t>
+            </w:r>
+          </w:p>
+        </w:tc>
+      </w:tr>
+      <w:tr>
+        <w:tc>
+          <w:tcPr>
+            <w:tcW w:type="dxa" w:w="1100"/>
+          </w:tcPr>
+          <w:p>
+            <w:r>
+              <w:rPr>
+                <w:b/>
+                <w:sz w:val="17"/>
+              </w:rPr>
+              <w:t>A7</w:t>
+            </w:r>
+          </w:p>
+        </w:tc>
+        <w:tc>
+          <w:tcPr>
+            <w:tcW w:type="dxa" w:w="3200"/>
+          </w:tcPr>
+          <w:p>
+            <w:r>
+              <w:rPr>
+                <w:sz w:val="17"/>
+              </w:rPr>
+              <w:t>Còn một phần (dfc025b): workflow chưa chạy lần nào trên GitHub vì chưa push; chưa có branch protection.</w:t>
+            </w:r>
+          </w:p>
+        </w:tc>
+        <w:tc>
+          <w:tcPr>
+            <w:tcW w:type="dxa" w:w="5566"/>
+          </w:tcPr>
+          <w:p>
+            <w:r>
+              <w:rPr>
+                <w:sz w:val="17"/>
+              </w:rPr>
+              <w:t>Còn một phần. testing đã push tới 82858f5; trang Actions của repo có 4 lần chạy workflow “tests” (e012ceb hai lần, 113e356, 82858f5), cả 4 thành công, nên workflow chạy được trên Linux. Còn: branch protection. Trang Branches của repo (27/10): testing và main đều có protectedByBranchProtections: false và không có ruleset.</w:t>
+            </w:r>
+          </w:p>
+        </w:tc>
+      </w:tr>
+      <w:tr>
+        <w:tc>
+          <w:tcPr>
+            <w:tcW w:type="dxa" w:w="1100"/>
+          </w:tcPr>
+          <w:p>
+            <w:r>
+              <w:rPr>
+                <w:b/>
+                <w:sz w:val="17"/>
+              </w:rPr>
+              <w:t>H5</w:t>
+            </w:r>
+          </w:p>
+        </w:tc>
+        <w:tc>
+          <w:tcPr>
+            <w:tcW w:type="dxa" w:w="3200"/>
+          </w:tcPr>
+          <w:p>
+            <w:r>
+              <w:rPr>
+                <w:sz w:val="17"/>
+              </w:rPr>
+              <w:t>Còn một phần (5e0b9c2): origin/NMA vẫn theo dõi 2 file .pyc.</w:t>
+            </w:r>
+          </w:p>
+        </w:tc>
+        <w:tc>
+          <w:tcPr>
+            <w:tcW w:type="dxa" w:w="5566"/>
+          </w:tcPr>
+          <w:p>
+            <w:r>
+              <w:rPr>
+                <w:sz w:val="17"/>
+              </w:rPr>
+              <w:t>Đã sửa, bỏ khỏi bảng. origin/NMA (86b55f5) không theo dõi file .pyc nào (git ls-tree -r origin/NMA); workflow CI báo lỗi khi git theo dõi file .pyc, nên lần gộp sau không đưa lại được mà không bị phát hiện.</w:t>
+            </w:r>
+          </w:p>
+        </w:tc>
+      </w:tr>
+      <w:tr>
+        <w:tc>
+          <w:tcPr>
+            <w:tcW w:type="dxa" w:w="1100"/>
+          </w:tcPr>
+          <w:p>
+            <w:r>
+              <w:rPr>
+                <w:b/>
+                <w:sz w:val="17"/>
+              </w:rPr>
+              <w:t>H4</w:t>
+            </w:r>
+          </w:p>
+        </w:tc>
+        <w:tc>
+          <w:tcPr>
+            <w:tcW w:type="dxa" w:w="3200"/>
+          </w:tcPr>
+          <w:p>
+            <w:r>
+              <w:rPr>
+                <w:sz w:val="17"/>
+              </w:rPr>
+              <w:t>Còn một phần (96d0086): retrieval.md ghi BGE-M3, README ghi số Task 4 cũ.</w:t>
+            </w:r>
+          </w:p>
+        </w:tc>
+        <w:tc>
+          <w:tcPr>
+            <w:tcW w:type="dxa" w:w="5566"/>
+          </w:tcPr>
+          <w:p>
+            <w:r>
+              <w:rPr>
+                <w:sz w:val="17"/>
+              </w:rPr>
+              <w:t>Còn một phần, thêm phần mới: docs/retrieval_report.md dòng 14 link tới retrieval/results/task4_proposal_300_current/report.md và dòng 56–58 liệt kê retrieval/results/dev_*.json; retrieval/retrieval.md dòng 105–148 có lệnh và đường dẫn tới thư mục task4_proposal_300_current/; các file này đã xóa ở 113e356. README dòng 66 link tới docs/retrieval_report.md.</w:t>
+            </w:r>
+          </w:p>
+        </w:tc>
+      </w:tr>
+      <w:tr>
+        <w:tc>
+          <w:tcPr>
+            <w:tcW w:type="dxa" w:w="1100"/>
+          </w:tcPr>
+          <w:p>
+            <w:r>
+              <w:rPr>
+                <w:b/>
+                <w:sz w:val="17"/>
+              </w:rPr>
+              <w:t>Không đổi</w:t>
+            </w:r>
+          </w:p>
+        </w:tc>
+        <w:tc>
+          <w:tcPr>
+            <w:tcW w:type="dxa" w:w="3200"/>
+          </w:tcPr>
+          <w:p>
+            <w:r>
+              <w:rPr>
+                <w:sz w:val="17"/>
+              </w:rPr>
+              <w:t>Như mục 3.</w:t>
+            </w:r>
+          </w:p>
+        </w:tc>
+        <w:tc>
+          <w:tcPr>
+            <w:tcW w:type="dxa" w:w="5566"/>
+          </w:tcPr>
+          <w:p>
+            <w:r>
+              <w:rPr>
+                <w:sz w:val="17"/>
+              </w:rPr>
+              <w:t>F1: bm25_dev_results.json chỉ đổi tên khóa; vẫn 524/1.425 ID thuộc corpus (251/662 ID khác nhau), 213 ID l01_, bm25_dev_metrics.json vẫn Recall@5 0,3046 trên 284 câu. D1: ground_truth.json vẫn 300/300 câu draft, gold_context_ids rỗng. B4: retrieval_evaluation.py và run_dev_retrieval.py vẫn mặc định file smoke. Mọi dòng còn lại không đổi: 113e356 không sửa parser, chunking, corpus, retriever hay reranker. .gitignore thêm .idea/ và /data/indexes/* (git không theo dõi file nào trong data/indexes/).</w:t>
+            </w:r>
+          </w:p>
+        </w:tc>
+      </w:tr>
+      <w:tr>
+        <w:tc>
+          <w:tcPr>
+            <w:tcW w:type="dxa" w:w="1100"/>
+          </w:tcPr>
+          <w:p>
+            <w:r>
+              <w:rPr>
+                <w:b/>
+                <w:sz w:val="17"/>
+              </w:rPr>
+              <w:t>Phát hiện khi gộp</w:t>
+            </w:r>
+          </w:p>
+        </w:tc>
+        <w:tc>
+          <w:tcPr>
+            <w:tcW w:type="dxa" w:w="3200"/>
+          </w:tcPr>
+          <w:p>
+            <w:r>
+              <w:rPr>
+                <w:sz w:val="17"/>
+              </w:rPr>
+              <w:t>—</w:t>
+            </w:r>
+          </w:p>
+        </w:tc>
+        <w:tc>
+          <w:tcPr>
+            <w:tcW w:type="dxa" w:w="5566"/>
+          </w:tcPr>
+          <w:p>
+            <w:r>
+              <w:rPr>
+                <w:sz w:val="17"/>
+              </w:rPr>
+              <w:t>(1) 113e356 đưa lại 44 dấu \ nối dòng thừa vào prepare_production_benchmark.py (b7f5e30 đã xóa) và thêm 1 dấu vào validate_benchmark.py; code vẫn chạy đúng vì các dấu này nằm trong ngoặc hoặc trước dòng trống. Đã xóa ở 70a626d; so với e012ceb, diff của hai file chỉ còn thay đổi thật của CTM. (2) test_article_index_matches_parsed_json_articles ghi cứng 21 file và 776 Điều, nên sẽ fail khi thêm văn bản (vd 2 TT của A26) dù dữ liệu đúng. (3) Commit gồm 4 việc khác nhau (gitignore, hai script, xóa kết quả, benchmark) và không ghi rằng 4 file evaluation/results chỉ đổi tên khóa, chưa chạy lại.</w:t>
+            </w:r>
+          </w:p>
+        </w:tc>
+      </w:tr>
+      <w:tr>
+        <w:tc>
+          <w:tcPr>
+            <w:tcW w:type="dxa" w:w="1100"/>
+          </w:tcPr>
+          <w:p>
+            <w:r>
+              <w:rPr>
+                <w:b/>
+                <w:sz w:val="17"/>
+              </w:rPr>
+              <w:t>Kết luận gộp</w:t>
+            </w:r>
+          </w:p>
+        </w:tc>
+        <w:tc>
+          <w:tcPr>
+            <w:tcW w:type="dxa" w:w="3200"/>
+          </w:tcPr>
+          <w:p>
+            <w:r>
+              <w:rPr>
+                <w:sz w:val="17"/>
+              </w:rPr>
+              <w:t>—</w:t>
+            </w:r>
+          </w:p>
+        </w:tc>
+        <w:tc>
+          <w:tcPr>
+            <w:tcW w:type="dxa" w:w="5566"/>
+          </w:tcPr>
+          <w:p>
+            <w:r>
+              <w:rPr>
+                <w:sz w:val="17"/>
+              </w:rPr>
+              <w:t>Gộp được và đã gộp: không conflict, py_compile và validate_benchmark.py không lỗi (Dev 285, Test 15), test chạy chung không fail, CI trên GitHub (gồm compileall) thành công ở 113e356. Phần chưa xong là việc tiếp theo, không chặn gộp: sync-clauses (C4), link hỏng trong tài liệu (H4), hai file CSV cũ (C2).</w:t>
+            </w:r>
+          </w:p>
+        </w:tc>
+      </w:tr>
+      <w:tr>
+        <w:tc>
+          <w:tcPr>
+            <w:tcW w:type="dxa" w:w="1100"/>
+          </w:tcPr>
+          <w:p>
+            <w:r>
+              <w:rPr>
+                <w:b/>
+                <w:sz w:val="17"/>
+              </w:rPr>
+              <w:t>Test</w:t>
+            </w:r>
+          </w:p>
+        </w:tc>
+        <w:tc>
+          <w:tcPr>
+            <w:tcW w:type="dxa" w:w="3200"/>
+          </w:tcPr>
+          <w:p>
+            <w:r>
+              <w:rPr>
+                <w:sz w:val="17"/>
+              </w:rPr>
+              <w:t>Ở 2559349: 504 pass, 20 skip, 0 fail.</w:t>
+            </w:r>
+          </w:p>
+        </w:tc>
+        <w:tc>
+          <w:tcPr>
+            <w:tcW w:type="dxa" w:w="5566"/>
+          </w:tcPr>
+          <w:p>
+            <w:r>
+              <w:rPr>
+                <w:sz w:val="17"/>
+              </w:rPr>
+              <w:t>Ở f031d7b và 70a626d: python -m pytest 507 pass, 20 skip, 0 fail, 68 subtest pass (thêm 3 test của 113e356); sau khi chạy, git không đổi file nào ngoài báo cáo này.</w:t>
             </w:r>
           </w:p>
         </w:tc>

</xml_diff>